<commit_message>
Repository organization General germination results and figure updated
</commit_message>
<xml_diff>
--- a/doc/Ms_0.docx
+++ b/doc/Ms_0.docx
@@ -128,7 +128,7 @@
           <w:bCs/>
           <w:color w:val="000000"/>
           <w:bdr w:val="none" w:sz="0" w:space="0" w:color="auto" w:frame="1"/>
-          <w:lang w:val="es-ES" w:eastAsia="ca-ES"/>
+          <w:lang w:eastAsia="ca-ES"/>
         </w:rPr>
       </w:pPr>
       <w:r>
@@ -267,7 +267,17 @@
           <w:bdr w:val="none" w:sz="0" w:space="0" w:color="auto" w:frame="1"/>
           <w:lang w:val="es-ES" w:eastAsia="ca-ES"/>
         </w:rPr>
-        <w:t xml:space="preserve"> &amp; Jiménez-Alfaro, B</w:t>
+        <w:t xml:space="preserve"> </w:t>
+      </w:r>
+      <w:r>
+        <w:rPr>
+          <w:rFonts w:eastAsia="Times New Roman" w:cstheme="minorHAnsi"/>
+          <w:bCs/>
+          <w:color w:val="000000"/>
+          <w:bdr w:val="none" w:sz="0" w:space="0" w:color="auto" w:frame="1"/>
+          <w:lang w:eastAsia="ca-ES"/>
+        </w:rPr>
+        <w:t>&amp; Jiménez-Alfaro, B</w:t>
       </w:r>
       <w:r>
         <w:rPr>
@@ -276,7 +286,7 @@
           <w:color w:val="000000"/>
           <w:bdr w:val="none" w:sz="0" w:space="0" w:color="auto" w:frame="1"/>
           <w:vertAlign w:val="superscript"/>
-          <w:lang w:val="es-ES" w:eastAsia="ca-ES"/>
+          <w:lang w:eastAsia="ca-ES"/>
         </w:rPr>
         <w:t>1</w:t>
       </w:r>
@@ -286,7 +296,7 @@
           <w:bCs/>
           <w:color w:val="000000"/>
           <w:bdr w:val="none" w:sz="0" w:space="0" w:color="auto" w:frame="1"/>
-          <w:lang w:val="es-ES" w:eastAsia="ca-ES"/>
+          <w:lang w:eastAsia="ca-ES"/>
         </w:rPr>
         <w:t>.</w:t>
       </w:r>
@@ -301,7 +311,7 @@
           <w:bCs/>
           <w:color w:val="000000"/>
           <w:bdr w:val="none" w:sz="0" w:space="0" w:color="auto" w:frame="1"/>
-          <w:lang w:val="es-ES" w:eastAsia="ca-ES"/>
+          <w:lang w:eastAsia="ca-ES"/>
         </w:rPr>
       </w:pPr>
     </w:p>
@@ -811,7 +821,21 @@
         <w:rPr>
           <w:rFonts w:eastAsia="Arial" w:cstheme="minorHAnsi"/>
         </w:rPr>
-        <w:t xml:space="preserve"> to harsh conditions such as freezing temperatures, snow cover and strong winds, despite regional and latitudinal variation (Körner et al. 2017). Recently, it has been noted that the abundance and distribution of alpine plants strongly depends on micro-topographic variation, which accounts for drastic changes in temperature and related factors (Scherrer &amp; </w:t>
+        <w:t xml:space="preserve"> to harsh conditions such as freezing temperatures, snow cover and strong winds, despite regional and latitudinal variation (Körner et al. 2017). Recently, it has been noted that the abundance and distribution of alpine plants strongly depends on micro-topographic variation, which accounts for drastic changes in temperature and related factors (</w:t>
+      </w:r>
+      <w:proofErr w:type="spellStart"/>
+      <w:r>
+        <w:rPr>
+          <w:rFonts w:eastAsia="Arial" w:cstheme="minorHAnsi"/>
+        </w:rPr>
+        <w:t>Scherrer</w:t>
+      </w:r>
+      <w:proofErr w:type="spellEnd"/>
+      <w:r>
+        <w:rPr>
+          <w:rFonts w:eastAsia="Arial" w:cstheme="minorHAnsi"/>
+        </w:rPr>
+        <w:t xml:space="preserve"> &amp; </w:t>
       </w:r>
       <w:proofErr w:type="spellStart"/>
       <w:r>
@@ -883,23 +907,7 @@
           <w:rFonts w:eastAsia="Arial" w:cstheme="minorHAnsi"/>
           <w:highlight w:val="yellow"/>
         </w:rPr>
-        <w:t xml:space="preserve">Espinosa </w:t>
-      </w:r>
-      <w:proofErr w:type="gramStart"/>
-      <w:r>
-        <w:rPr>
-          <w:rFonts w:eastAsia="Arial" w:cstheme="minorHAnsi"/>
-          <w:highlight w:val="yellow"/>
-        </w:rPr>
-        <w:t>del</w:t>
-      </w:r>
-      <w:proofErr w:type="gramEnd"/>
-      <w:r>
-        <w:rPr>
-          <w:rFonts w:eastAsia="Arial" w:cstheme="minorHAnsi"/>
-          <w:highlight w:val="yellow"/>
-        </w:rPr>
-        <w:t xml:space="preserve"> Alba et al. 2024</w:t>
+        <w:t>Espinosa del Alba et al. 2024</w:t>
       </w:r>
       <w:r>
         <w:rPr>
@@ -5096,31 +5104,7 @@
           <w:color w:val="000000"/>
           <w:lang w:eastAsia="ca-ES"/>
         </w:rPr>
-        <w:t>alternating temperatures and constant darkness (referred to as “Darkness”)</w:t>
-      </w:r>
-      <w:r>
-        <w:rPr>
-          <w:rFonts w:eastAsia="Times New Roman" w:cstheme="minorHAnsi"/>
-          <w:color w:val="000000"/>
-          <w:lang w:eastAsia="ca-ES"/>
-        </w:rPr>
-        <w:t xml:space="preserve">, (3) </w:t>
-      </w:r>
-      <w:r>
-        <w:rPr>
-          <w:rFonts w:eastAsia="Times New Roman" w:cstheme="minorHAnsi"/>
-          <w:color w:val="000000"/>
-          <w:lang w:eastAsia="ca-ES"/>
-        </w:rPr>
-        <w:t>alternating temperature, water stress and 12h photoperiod (referred to as “Water stress”)</w:t>
-      </w:r>
-      <w:r>
-        <w:rPr>
-          <w:rFonts w:eastAsia="Times New Roman" w:cstheme="minorHAnsi"/>
-          <w:color w:val="000000"/>
-          <w:lang w:eastAsia="ca-ES"/>
-        </w:rPr>
-        <w:t xml:space="preserve"> and (4) </w:t>
+        <w:t xml:space="preserve">alternating temperatures and constant darkness (referred to as “Darkness”), (3) alternating temperature, water stress and 12h photoperiod (referred to as “Water stress”) and (4) </w:t>
       </w:r>
       <w:r>
         <w:rPr>
@@ -6883,15 +6867,15 @@
         <w:t>ref</w:t>
       </w:r>
       <w:r>
-        <w:t xml:space="preserve">) . </w:t>
+        <w:t xml:space="preserve">) . Leaves </w:t>
       </w:r>
       <w:proofErr w:type="gramStart"/>
       <w:r>
-        <w:t>Leaves were collected early in the day in the field, kept in sealed plastic bags with moist paper until further processing in the laboratory.</w:t>
+        <w:t>were collected</w:t>
       </w:r>
       <w:proofErr w:type="gramEnd"/>
       <w:r>
-        <w:t xml:space="preserve"> First fresh weight </w:t>
+        <w:t xml:space="preserve"> early in the day in the field, kept in sealed plastic bags with moist paper until further processing in the laboratory. First fresh weight </w:t>
       </w:r>
       <w:proofErr w:type="gramStart"/>
       <w:r>
@@ -6911,13 +6895,7 @@
         <w:t>) at 600 dpi</w:t>
       </w:r>
       <w:r>
-        <w:t xml:space="preserve"> and finally leaves were put in the oven at 70ºCfor </w:t>
-      </w:r>
-      <w:r>
-        <w:t>72h</w:t>
-      </w:r>
-      <w:r>
-        <w:t xml:space="preserve"> to </w:t>
+        <w:t xml:space="preserve"> and finally leaves were put in the oven at 70ºCfor 72h to </w:t>
       </w:r>
       <w:r>
         <w:lastRenderedPageBreak/>
@@ -7192,6 +7170,113 @@
         </w:rPr>
         <w:t>nomial2)</w:t>
       </w:r>
+      <w:r>
+        <w:rPr>
+          <w:rFonts w:asciiTheme="minorHAnsi" w:eastAsia="Times New Roman" w:hAnsiTheme="minorHAnsi" w:cstheme="minorHAnsi"/>
+          <w:color w:val="000000"/>
+          <w:sz w:val="22"/>
+          <w:szCs w:val="22"/>
+          <w:highlight w:val="yellow"/>
+          <w:lang w:eastAsia="ca-ES"/>
+        </w:rPr>
+        <w:t xml:space="preserve">. For representation </w:t>
+      </w:r>
+      <w:proofErr w:type="spellStart"/>
+      <w:r>
+        <w:rPr>
+          <w:rFonts w:asciiTheme="minorHAnsi" w:eastAsia="Times New Roman" w:hAnsiTheme="minorHAnsi" w:cstheme="minorHAnsi"/>
+          <w:color w:val="000000"/>
+          <w:sz w:val="22"/>
+          <w:szCs w:val="22"/>
+          <w:highlight w:val="yellow"/>
+          <w:lang w:eastAsia="ca-ES"/>
+        </w:rPr>
+        <w:t>ggplot</w:t>
+      </w:r>
+      <w:proofErr w:type="spellEnd"/>
+      <w:r>
+        <w:rPr>
+          <w:rFonts w:asciiTheme="minorHAnsi" w:eastAsia="Times New Roman" w:hAnsiTheme="minorHAnsi" w:cstheme="minorHAnsi"/>
+          <w:color w:val="000000"/>
+          <w:sz w:val="22"/>
+          <w:szCs w:val="22"/>
+          <w:highlight w:val="yellow"/>
+          <w:lang w:eastAsia="ca-ES"/>
+        </w:rPr>
+        <w:t xml:space="preserve"> (REF), </w:t>
+      </w:r>
+      <w:proofErr w:type="spellStart"/>
+      <w:r>
+        <w:rPr>
+          <w:rFonts w:asciiTheme="minorHAnsi" w:eastAsia="Times New Roman" w:hAnsiTheme="minorHAnsi" w:cstheme="minorHAnsi"/>
+          <w:color w:val="000000"/>
+          <w:sz w:val="22"/>
+          <w:szCs w:val="22"/>
+          <w:highlight w:val="yellow"/>
+          <w:lang w:eastAsia="ca-ES"/>
+        </w:rPr>
+        <w:t>ggpubr</w:t>
+      </w:r>
+      <w:proofErr w:type="spellEnd"/>
+      <w:r>
+        <w:rPr>
+          <w:rFonts w:asciiTheme="minorHAnsi" w:eastAsia="Times New Roman" w:hAnsiTheme="minorHAnsi" w:cstheme="minorHAnsi"/>
+          <w:color w:val="000000"/>
+          <w:sz w:val="22"/>
+          <w:szCs w:val="22"/>
+          <w:highlight w:val="yellow"/>
+          <w:lang w:eastAsia="ca-ES"/>
+        </w:rPr>
+        <w:t xml:space="preserve"> (REF) </w:t>
+      </w:r>
+      <w:proofErr w:type="gramStart"/>
+      <w:r>
+        <w:rPr>
+          <w:rFonts w:asciiTheme="minorHAnsi" w:eastAsia="Times New Roman" w:hAnsiTheme="minorHAnsi" w:cstheme="minorHAnsi"/>
+          <w:color w:val="000000"/>
+          <w:sz w:val="22"/>
+          <w:szCs w:val="22"/>
+          <w:highlight w:val="yellow"/>
+          <w:lang w:eastAsia="ca-ES"/>
+        </w:rPr>
+        <w:t>were used</w:t>
+      </w:r>
+      <w:proofErr w:type="gramEnd"/>
+      <w:r>
+        <w:rPr>
+          <w:rFonts w:asciiTheme="minorHAnsi" w:eastAsia="Times New Roman" w:hAnsiTheme="minorHAnsi" w:cstheme="minorHAnsi"/>
+          <w:color w:val="000000"/>
+          <w:sz w:val="22"/>
+          <w:szCs w:val="22"/>
+          <w:highlight w:val="yellow"/>
+          <w:lang w:eastAsia="ca-ES"/>
+        </w:rPr>
+        <w:t xml:space="preserve"> together with </w:t>
+      </w:r>
+      <w:proofErr w:type="spellStart"/>
+      <w:r>
+        <w:rPr>
+          <w:rFonts w:asciiTheme="minorHAnsi" w:eastAsia="Times New Roman" w:hAnsiTheme="minorHAnsi" w:cstheme="minorHAnsi"/>
+          <w:color w:val="000000"/>
+          <w:sz w:val="22"/>
+          <w:szCs w:val="22"/>
+          <w:highlight w:val="yellow"/>
+          <w:lang w:eastAsia="ca-ES"/>
+        </w:rPr>
+        <w:t>binom</w:t>
+      </w:r>
+      <w:proofErr w:type="spellEnd"/>
+      <w:r>
+        <w:rPr>
+          <w:rFonts w:asciiTheme="minorHAnsi" w:eastAsia="Times New Roman" w:hAnsiTheme="minorHAnsi" w:cstheme="minorHAnsi"/>
+          <w:color w:val="000000"/>
+          <w:sz w:val="22"/>
+          <w:szCs w:val="22"/>
+          <w:highlight w:val="yellow"/>
+          <w:lang w:eastAsia="ca-ES"/>
+        </w:rPr>
+        <w:t xml:space="preserve"> package (REF) to create the binomial confidence intervals in figure 2.</w:t>
+      </w:r>
     </w:p>
     <w:p>
       <w:pPr>
@@ -7253,8 +7338,6 @@
           <w:lang w:eastAsia="ca-ES"/>
         </w:rPr>
       </w:pPr>
-      <w:bookmarkStart w:id="5" w:name="_GoBack"/>
-      <w:bookmarkEnd w:id="5"/>
     </w:p>
     <w:p>
       <w:pPr>
@@ -7284,6 +7367,89 @@
         <w:spacing w:line="480" w:lineRule="auto"/>
         <w:jc w:val="both"/>
       </w:pPr>
+      <w:r>
+        <w:t xml:space="preserve">Germination analysis </w:t>
+      </w:r>
+      <w:proofErr w:type="gramStart"/>
+      <w:r>
+        <w:t>were performed</w:t>
+      </w:r>
+      <w:proofErr w:type="gramEnd"/>
+      <w:r>
+        <w:t xml:space="preserve"> separately for each community, nevertheless, both communities responded consistently to germination drivers. Germination does not significantly differs between control (with alternating temperatures) and constant temperatures and there is a significant </w:t>
+      </w:r>
+      <w:r>
+        <w:t>(</w:t>
+      </w:r>
+      <w:proofErr w:type="spellStart"/>
+      <w:r>
+        <w:t>pMCMC</w:t>
+      </w:r>
+      <w:proofErr w:type="spellEnd"/>
+      <w:r>
+        <w:t xml:space="preserve">&lt;0.001) </w:t>
+      </w:r>
+      <w:r>
+        <w:t>decrease of germination under water stress (MPa -0.6). In darkness, germination decreased in both communities but is significant only in the Mediterranean community (</w:t>
+      </w:r>
+      <w:proofErr w:type="spellStart"/>
+      <w:r>
+        <w:t>pMCMC</w:t>
+      </w:r>
+      <w:proofErr w:type="spellEnd"/>
+      <w:r>
+        <w:t xml:space="preserve"> &lt;0.01) see Figure 2. </w:t>
+      </w:r>
+    </w:p>
+    <w:p>
+      <w:pPr>
+        <w:spacing w:line="480" w:lineRule="auto"/>
+        <w:jc w:val="both"/>
+      </w:pPr>
+      <w:r>
+        <w:lastRenderedPageBreak/>
+        <w:pict w14:anchorId="3E91443C">
+          <v:shapetype id="_x0000_t75" coordsize="21600,21600" o:spt="75" o:preferrelative="t" path="m@4@5l@4@11@9@11@9@5xe" filled="f" stroked="f">
+            <v:stroke joinstyle="miter"/>
+            <v:formulas>
+              <v:f eqn="if lineDrawn pixelLineWidth 0"/>
+              <v:f eqn="sum @0 1 0"/>
+              <v:f eqn="sum 0 0 @1"/>
+              <v:f eqn="prod @2 1 2"/>
+              <v:f eqn="prod @3 21600 pixelWidth"/>
+              <v:f eqn="prod @3 21600 pixelHeight"/>
+              <v:f eqn="sum @0 0 1"/>
+              <v:f eqn="prod @6 1 2"/>
+              <v:f eqn="prod @7 21600 pixelWidth"/>
+              <v:f eqn="sum @8 21600 0"/>
+              <v:f eqn="prod @7 21600 pixelHeight"/>
+              <v:f eqn="sum @10 21600 0"/>
+            </v:formulas>
+            <v:path o:extrusionok="f" gradientshapeok="t" o:connecttype="rect"/>
+            <o:lock v:ext="edit" aspectratio="t"/>
+          </v:shapetype>
+          <v:shape id="_x0000_i1025" type="#_x0000_t75" style="width:424.5pt;height:253.5pt">
+            <v:imagedata r:id="rId17" o:title="fig2"/>
+          </v:shape>
+        </w:pict>
+      </w:r>
+    </w:p>
+    <w:p>
+      <w:pPr>
+        <w:spacing w:line="480" w:lineRule="auto"/>
+        <w:jc w:val="both"/>
+      </w:pPr>
+      <w:r>
+        <w:t xml:space="preserve">Figure 2. Germination responses to the four experimental treatments studied. Bars represent the mean germination observed and each treatment (in different </w:t>
+      </w:r>
+      <w:proofErr w:type="spellStart"/>
+      <w:r>
+        <w:t>colors</w:t>
+      </w:r>
+      <w:proofErr w:type="spellEnd"/>
+      <w:r>
+        <w:t xml:space="preserve">). Error bars represent binomial confidence intervals. </w:t>
+      </w:r>
     </w:p>
     <w:p>
       <w:pPr>
@@ -7292,21 +7458,15 @@
         <w:jc w:val="both"/>
       </w:pPr>
       <w:r>
-        <w:t>3.2</w:t>
-      </w:r>
-      <w:r>
-        <w:t xml:space="preserve">. </w:t>
-      </w:r>
-      <w:r>
-        <w:t xml:space="preserve">Community means in response to </w:t>
-      </w:r>
-      <w:proofErr w:type="spellStart"/>
-      <w:r>
-        <w:t>miroclimatic</w:t>
-      </w:r>
-      <w:proofErr w:type="spellEnd"/>
-      <w:r>
-        <w:t xml:space="preserve"> gradients</w:t>
+        <w:t>3.2. Community means in response to mi</w:t>
+      </w:r>
+      <w:r>
+        <w:t>c</w:t>
+      </w:r>
+      <w:bookmarkStart w:id="5" w:name="_GoBack"/>
+      <w:bookmarkEnd w:id="5"/>
+      <w:r>
+        <w:t>roclimatic gradients</w:t>
       </w:r>
     </w:p>
     <w:p>
@@ -7323,10 +7483,7 @@
         <w:jc w:val="both"/>
       </w:pPr>
       <w:r>
-        <w:t>3.3 Germination niche dissimilarity</w:t>
-      </w:r>
-      <w:r>
-        <w:t xml:space="preserve"> </w:t>
+        <w:t xml:space="preserve">3.3 Germination niche dissimilarity </w:t>
       </w:r>
     </w:p>
     <w:p>
@@ -7357,7 +7514,6 @@
       </w:pPr>
       <w:proofErr w:type="spellStart"/>
       <w:r>
-        <w:lastRenderedPageBreak/>
         <w:t>iButtons</w:t>
       </w:r>
       <w:proofErr w:type="spellEnd"/>
@@ -7395,7 +7551,7 @@
       </w:r>
     </w:p>
     <w:sectPr>
-      <w:footerReference w:type="default" r:id="rId17"/>
+      <w:footerReference w:type="default" r:id="rId18"/>
       <w:pgSz w:w="11906" w:h="16838"/>
       <w:pgMar w:top="1417" w:right="1701" w:bottom="1417" w:left="1701" w:header="708" w:footer="708" w:gutter="0"/>
       <w:lnNumType w:countBy="1" w:restart="continuous"/>
@@ -7577,7 +7733,7 @@
             <w:noProof/>
             <w:lang w:val="es-ES"/>
           </w:rPr>
-          <w:t>10</w:t>
+          <w:t>9</w:t>
         </w:r>
         <w:r>
           <w:fldChar w:fldCharType="end"/>

</xml_diff>

<commit_message>
PCA exploration for traits selection Updated scripts handling matrices
</commit_message>
<xml_diff>
--- a/doc/Ms_0.docx
+++ b/doc/Ms_0.docx
@@ -57,7 +57,6 @@
           <w:lang w:val="es-ES" w:eastAsia="ca-ES"/>
         </w:rPr>
       </w:pPr>
-      <w:proofErr w:type="spellStart"/>
       <w:r>
         <w:rPr>
           <w:b/>
@@ -65,57 +64,7 @@
           <w:bdr w:val="none" w:sz="0" w:space="0" w:color="auto" w:frame="1"/>
           <w:lang w:val="es-ES" w:eastAsia="ca-ES"/>
         </w:rPr>
-        <w:t>Prospective</w:t>
-      </w:r>
-      <w:proofErr w:type="spellEnd"/>
-      <w:r>
-        <w:rPr>
-          <w:b/>
-          <w:bCs/>
-          <w:bdr w:val="none" w:sz="0" w:space="0" w:color="auto" w:frame="1"/>
-          <w:lang w:val="es-ES" w:eastAsia="ca-ES"/>
-        </w:rPr>
-        <w:t xml:space="preserve"> </w:t>
-      </w:r>
-      <w:proofErr w:type="spellStart"/>
-      <w:r>
-        <w:rPr>
-          <w:b/>
-          <w:bCs/>
-          <w:bdr w:val="none" w:sz="0" w:space="0" w:color="auto" w:frame="1"/>
-          <w:lang w:val="es-ES" w:eastAsia="ca-ES"/>
-        </w:rPr>
-        <w:t>author</w:t>
-      </w:r>
-      <w:proofErr w:type="spellEnd"/>
-      <w:r>
-        <w:rPr>
-          <w:b/>
-          <w:bCs/>
-          <w:bdr w:val="none" w:sz="0" w:space="0" w:color="auto" w:frame="1"/>
-          <w:lang w:val="es-ES" w:eastAsia="ca-ES"/>
-        </w:rPr>
-        <w:t xml:space="preserve"> </w:t>
-      </w:r>
-      <w:proofErr w:type="spellStart"/>
-      <w:r>
-        <w:rPr>
-          <w:b/>
-          <w:bCs/>
-          <w:bdr w:val="none" w:sz="0" w:space="0" w:color="auto" w:frame="1"/>
-          <w:lang w:val="es-ES" w:eastAsia="ca-ES"/>
-        </w:rPr>
-        <w:t>list</w:t>
-      </w:r>
-      <w:proofErr w:type="spellEnd"/>
-      <w:r>
-        <w:rPr>
-          <w:b/>
-          <w:bCs/>
-          <w:bdr w:val="none" w:sz="0" w:space="0" w:color="auto" w:frame="1"/>
-          <w:lang w:val="es-ES" w:eastAsia="ca-ES"/>
-        </w:rPr>
-        <w:t xml:space="preserve">: </w:t>
+        <w:t xml:space="preserve">Prospective author list: </w:t>
       </w:r>
     </w:p>
     <w:p>
@@ -194,9 +143,8 @@
           <w:bdr w:val="none" w:sz="0" w:space="0" w:color="auto" w:frame="1"/>
           <w:lang w:val="es-ES" w:eastAsia="ca-ES"/>
         </w:rPr>
-        <w:t xml:space="preserve">, </w:t>
-      </w:r>
-      <w:proofErr w:type="spellStart"/>
+        <w:t>, G</w:t>
+      </w:r>
       <w:r>
         <w:rPr>
           <w:rFonts w:eastAsia="Times New Roman" w:cstheme="minorHAnsi"/>
@@ -205,7 +153,7 @@
           <w:bdr w:val="none" w:sz="0" w:space="0" w:color="auto" w:frame="1"/>
           <w:lang w:val="es-ES" w:eastAsia="ca-ES"/>
         </w:rPr>
-        <w:t>G</w:t>
+        <w:t>ö</w:t>
       </w:r>
       <w:r>
         <w:rPr>
@@ -215,28 +163,7 @@
           <w:bdr w:val="none" w:sz="0" w:space="0" w:color="auto" w:frame="1"/>
           <w:lang w:val="es-ES" w:eastAsia="ca-ES"/>
         </w:rPr>
-        <w:t>ö</w:t>
-      </w:r>
-      <w:r>
-        <w:rPr>
-          <w:rFonts w:eastAsia="Times New Roman" w:cstheme="minorHAnsi"/>
-          <w:bCs/>
-          <w:color w:val="000000"/>
-          <w:bdr w:val="none" w:sz="0" w:space="0" w:color="auto" w:frame="1"/>
-          <w:lang w:val="es-ES" w:eastAsia="ca-ES"/>
-        </w:rPr>
-        <w:t>tzenberger</w:t>
-      </w:r>
-      <w:proofErr w:type="spellEnd"/>
-      <w:r>
-        <w:rPr>
-          <w:rFonts w:eastAsia="Times New Roman" w:cstheme="minorHAnsi"/>
-          <w:bCs/>
-          <w:color w:val="000000"/>
-          <w:bdr w:val="none" w:sz="0" w:space="0" w:color="auto" w:frame="1"/>
-          <w:lang w:val="es-ES" w:eastAsia="ca-ES"/>
-        </w:rPr>
-        <w:t>, L</w:t>
+        <w:t>tzenberger, L</w:t>
       </w:r>
       <w:r>
         <w:rPr>
@@ -372,25 +299,7 @@
           <w:color w:val="000000"/>
           <w:lang w:val="en-US" w:eastAsia="ca-ES"/>
         </w:rPr>
-        <w:t xml:space="preserve">Biodiversity Research Institute, IMIB (Univ. Oviedo-CSIC-Princ. Asturias), 33600 </w:t>
-      </w:r>
-      <w:proofErr w:type="spellStart"/>
-      <w:r>
-        <w:rPr>
-          <w:rFonts w:eastAsia="Times New Roman" w:cstheme="minorHAnsi"/>
-          <w:color w:val="000000"/>
-          <w:lang w:val="en-US" w:eastAsia="ca-ES"/>
-        </w:rPr>
-        <w:t>Mieres</w:t>
-      </w:r>
-      <w:proofErr w:type="spellEnd"/>
-      <w:r>
-        <w:rPr>
-          <w:rFonts w:eastAsia="Times New Roman" w:cstheme="minorHAnsi"/>
-          <w:color w:val="000000"/>
-          <w:lang w:val="en-US" w:eastAsia="ca-ES"/>
-        </w:rPr>
-        <w:t xml:space="preserve">, Spain. </w:t>
+        <w:t xml:space="preserve">Biodiversity Research Institute, IMIB (Univ. Oviedo-CSIC-Princ. Asturias), 33600 Mieres, Spain. </w:t>
       </w:r>
     </w:p>
     <w:p>
@@ -454,34 +363,14 @@
           <w:lang w:val="es-ES" w:eastAsia="ca-ES"/>
         </w:rPr>
       </w:pPr>
-      <w:proofErr w:type="spellStart"/>
       <w:r>
         <w:rPr>
           <w:b/>
           <w:bCs/>
           <w:lang w:val="es-ES" w:eastAsia="ca-ES"/>
         </w:rPr>
-        <w:t>Correspondence</w:t>
-      </w:r>
-      <w:proofErr w:type="spellEnd"/>
-      <w:r>
-        <w:rPr>
-          <w:b/>
-          <w:bCs/>
-          <w:lang w:val="es-ES" w:eastAsia="ca-ES"/>
-        </w:rPr>
-        <w:t xml:space="preserve"> </w:t>
-      </w:r>
-      <w:proofErr w:type="spellStart"/>
-      <w:r>
-        <w:rPr>
-          <w:b/>
-          <w:bCs/>
-          <w:lang w:val="es-ES" w:eastAsia="ca-ES"/>
-        </w:rPr>
-        <w:t>author</w:t>
-      </w:r>
-      <w:proofErr w:type="spellEnd"/>
+        <w:t>Correspondence author</w:t>
+      </w:r>
       <w:r>
         <w:rPr>
           <w:lang w:val="es-ES" w:eastAsia="ca-ES"/>
@@ -544,7 +433,6 @@
           <w:lang w:val="es-ES" w:eastAsia="ca-ES"/>
         </w:rPr>
       </w:pPr>
-      <w:proofErr w:type="spellStart"/>
       <w:r>
         <w:rPr>
           <w:rFonts w:eastAsia="Times New Roman" w:cstheme="minorHAnsi"/>
@@ -567,7 +455,6 @@
         </w:rPr>
         <w:t>s</w:t>
       </w:r>
-      <w:proofErr w:type="spellEnd"/>
     </w:p>
     <w:p>
       <w:pPr>
@@ -656,22 +543,14 @@
         <w:rPr>
           <w:lang w:val="es-ES"/>
         </w:rPr>
-        <w:t xml:space="preserve">Lars </w:t>
-      </w:r>
-      <w:proofErr w:type="spellStart"/>
+        <w:t>Lars Götzenberg</w:t>
+      </w:r>
       <w:r>
         <w:rPr>
           <w:lang w:val="es-ES"/>
         </w:rPr>
-        <w:t>Götzenberg</w:t>
-      </w:r>
-      <w:r>
-        <w:rPr>
-          <w:lang w:val="es-ES"/>
-        </w:rPr>
         <w:t>er</w:t>
       </w:r>
-      <w:proofErr w:type="spellEnd"/>
       <w:r>
         <w:rPr>
           <w:lang w:val="es-ES"/>
@@ -770,20 +649,12 @@
         </w:rPr>
       </w:pPr>
       <w:commentRangeStart w:id="0"/>
-      <w:proofErr w:type="spellStart"/>
       <w:r>
         <w:rPr>
           <w:lang w:val="es-ES" w:eastAsia="ca-ES"/>
         </w:rPr>
         <w:lastRenderedPageBreak/>
-        <w:t>Introduction</w:t>
-      </w:r>
-      <w:proofErr w:type="spellEnd"/>
-      <w:r>
-        <w:rPr>
-          <w:lang w:val="es-ES" w:eastAsia="ca-ES"/>
-        </w:rPr>
-        <w:t xml:space="preserve"> </w:t>
+        <w:t xml:space="preserve">Introduction </w:t>
       </w:r>
       <w:commentRangeEnd w:id="0"/>
       <w:r>
@@ -807,77 +678,7 @@
         <w:rPr>
           <w:rFonts w:eastAsia="Arial" w:cstheme="minorHAnsi"/>
         </w:rPr>
-        <w:t xml:space="preserve">Worldwide, alpine plants occur above the climatic treeline and they </w:t>
-      </w:r>
-      <w:proofErr w:type="gramStart"/>
-      <w:r>
-        <w:rPr>
-          <w:rFonts w:eastAsia="Arial" w:cstheme="minorHAnsi"/>
-        </w:rPr>
-        <w:t>are generally subjected</w:t>
-      </w:r>
-      <w:proofErr w:type="gramEnd"/>
-      <w:r>
-        <w:rPr>
-          <w:rFonts w:eastAsia="Arial" w:cstheme="minorHAnsi"/>
-        </w:rPr>
-        <w:t xml:space="preserve"> to harsh conditions such as freezing temperatures, snow cover and strong winds, despite regional and latitudinal variation (Körner et al. 2017). Recently, it has been noted that the abundance and distribution of alpine plants strongly depends on micro-topographic variation, which accounts for drastic changes in temperature and related factors (</w:t>
-      </w:r>
-      <w:proofErr w:type="spellStart"/>
-      <w:r>
-        <w:rPr>
-          <w:rFonts w:eastAsia="Arial" w:cstheme="minorHAnsi"/>
-        </w:rPr>
-        <w:t>Scherrer</w:t>
-      </w:r>
-      <w:proofErr w:type="spellEnd"/>
-      <w:r>
-        <w:rPr>
-          <w:rFonts w:eastAsia="Arial" w:cstheme="minorHAnsi"/>
-        </w:rPr>
-        <w:t xml:space="preserve"> &amp; </w:t>
-      </w:r>
-      <w:proofErr w:type="spellStart"/>
-      <w:r>
-        <w:rPr>
-          <w:rFonts w:eastAsia="Arial" w:cstheme="minorHAnsi"/>
-        </w:rPr>
-        <w:t>Körner</w:t>
-      </w:r>
-      <w:proofErr w:type="spellEnd"/>
-      <w:r>
-        <w:rPr>
-          <w:rFonts w:eastAsia="Arial" w:cstheme="minorHAnsi"/>
-        </w:rPr>
-        <w:t xml:space="preserve"> 2010; </w:t>
-      </w:r>
-      <w:proofErr w:type="spellStart"/>
-      <w:r>
-        <w:rPr>
-          <w:rFonts w:eastAsia="Arial" w:cstheme="minorHAnsi"/>
-        </w:rPr>
-        <w:t>Kulonen</w:t>
-      </w:r>
-      <w:proofErr w:type="spellEnd"/>
-      <w:r>
-        <w:rPr>
-          <w:rFonts w:eastAsia="Arial" w:cstheme="minorHAnsi"/>
-        </w:rPr>
-        <w:t xml:space="preserve"> et al. 2018). An increasing number of studies have reported relationships between micro-habitat variation and the compositional and functional diversity of alpine plant communities (e.g. Choler 2005; Opedal et al. 2014; Stark et al. 2017; Blonder et al. 2018) but functional approaches have mostly focused on adult-plant traits. At the regeneration stage, studies suggested that the seed germination niche is influenced by micro-site temperature and snow cover (Fernández-Pascual et al. 2016) and soil bedrock (</w:t>
-      </w:r>
-      <w:proofErr w:type="spellStart"/>
-      <w:r>
-        <w:rPr>
-          <w:rFonts w:eastAsia="Arial" w:cstheme="minorHAnsi"/>
-        </w:rPr>
-        <w:t>Tudela-Isanta</w:t>
-      </w:r>
-      <w:proofErr w:type="spellEnd"/>
-      <w:r>
-        <w:rPr>
-          <w:rFonts w:eastAsia="Arial" w:cstheme="minorHAnsi"/>
-        </w:rPr>
-        <w:t xml:space="preserve"> et al. 2018). Relatively higher temperatures at the microsite also may determine </w:t>
+        <w:t xml:space="preserve">Worldwide, alpine plants occur above the climatic treeline and they are generally subjected to harsh conditions such as freezing temperatures, snow cover and strong winds, despite regional and latitudinal variation (Körner et al. 2017). Recently, it has been noted that the abundance and distribution of alpine plants strongly depends on micro-topographic variation, which accounts for drastic changes in temperature and related factors (Scherrer &amp; Körner 2010; Kulonen et al. 2018). An increasing number of studies have reported relationships between micro-habitat variation and the compositional and functional diversity of alpine plant communities (e.g. Choler 2005; Opedal et al. 2014; Stark et al. 2017; Blonder et al. 2018) but functional approaches have mostly focused on adult-plant traits. At the regeneration stage, studies suggested that the seed germination niche is influenced by micro-site temperature and snow cover (Fernández-Pascual et al. 2016) and soil bedrock (Tudela-Isanta et al. 2018). Relatively higher temperatures at the microsite also may determine </w:t>
       </w:r>
       <w:sdt>
         <w:sdtPr>
@@ -1001,21 +802,7 @@
         <w:rPr>
           <w:rFonts w:eastAsia="Arial" w:cstheme="minorHAnsi"/>
         </w:rPr>
-        <w:t xml:space="preserve"> co-occurring species may be useful to infer high-level processes such as species dispersal and (niche) selection (</w:t>
-      </w:r>
-      <w:proofErr w:type="spellStart"/>
-      <w:r>
-        <w:rPr>
-          <w:rFonts w:eastAsia="Arial" w:cstheme="minorHAnsi"/>
-        </w:rPr>
-        <w:t>Vellend</w:t>
-      </w:r>
-      <w:proofErr w:type="spellEnd"/>
-      <w:r>
-        <w:rPr>
-          <w:rFonts w:eastAsia="Arial" w:cstheme="minorHAnsi"/>
-        </w:rPr>
-        <w:t xml:space="preserve"> 2016). However, the conceptual framework of community assembly may be limited by the lack of seed-trait studies addressing the co-occurrence of plants as the result of regional and local processes such as dispersal, environmental filtering and species interactions (Götzenberger et al. 201</w:t>
+        <w:t xml:space="preserve"> co-occurring species may be useful to infer high-level processes such as species dispersal and (niche) selection (Vellend 2016). However, the conceptual framework of community assembly may be limited by the lack of seed-trait studies addressing the co-occurrence of plants as the result of regional and local processes such as dispersal, environmental filtering and species interactions (Götzenberger et al. 201</w:t>
       </w:r>
       <w:sdt>
         <w:sdtPr>
@@ -1073,35 +860,7 @@
         <w:rPr>
           <w:rFonts w:eastAsia="Arial" w:cstheme="minorHAnsi"/>
         </w:rPr>
-        <w:t>The question of functional filtering in seeds can be addressed by exploring niche differentiation, a process by which co-occurring species may use the environment differently to avoid competition. Alpine communities are subjected to harsh environmental conditions; therefore, plant competition is expected to be relaxed, and niche-based processes rely on abiotic filters or facilitation (Callaway et al. 2002). Since alpine habitats generally have low water and nutrient resources, niche differentiation may also be the result of multiple, independent species adaptation to harsh conditions during postglacial dispersal, ultimately explaining the relative high diversity of plants in these ecosystems. Several studies have investigated the role of niche-based processes in alpine communities using traits (</w:t>
-      </w:r>
-      <w:proofErr w:type="spellStart"/>
-      <w:r>
-        <w:rPr>
-          <w:rFonts w:eastAsia="Arial" w:cstheme="minorHAnsi"/>
-        </w:rPr>
-        <w:t>Chalmandrier</w:t>
-      </w:r>
-      <w:proofErr w:type="spellEnd"/>
-      <w:r>
-        <w:rPr>
-          <w:rFonts w:eastAsia="Arial" w:cstheme="minorHAnsi"/>
-        </w:rPr>
-        <w:t xml:space="preserve"> et al. 2017, Scherrer et al. 2019) or phylogenetic approaches (Butterfield et al. 2013) to estimate the ecological similarity of co-existing species. However, apart from seed mass, regeneration traits are hardly ever considered, despite existing evidence that life-history stages determine different plant responses across micro-habitats (</w:t>
-      </w:r>
-      <w:proofErr w:type="spellStart"/>
-      <w:r>
-        <w:rPr>
-          <w:rFonts w:eastAsia="Arial" w:cstheme="minorHAnsi"/>
-        </w:rPr>
-        <w:t>Hülber</w:t>
-      </w:r>
-      <w:proofErr w:type="spellEnd"/>
-      <w:r>
-        <w:rPr>
-          <w:rFonts w:eastAsia="Arial" w:cstheme="minorHAnsi"/>
-        </w:rPr>
-        <w:t xml:space="preserve"> et al. 2018). So far, we do not know whether regeneration stages may follow similar or different strategies in alpine plants, and if regeneration traits can provide additional insights into assembly processes, in particular at the level of microsite variation</w:t>
+        <w:t>The question of functional filtering in seeds can be addressed by exploring niche differentiation, a process by which co-occurring species may use the environment differently to avoid competition. Alpine communities are subjected to harsh environmental conditions; therefore, plant competition is expected to be relaxed, and niche-based processes rely on abiotic filters or facilitation (Callaway et al. 2002). Since alpine habitats generally have low water and nutrient resources, niche differentiation may also be the result of multiple, independent species adaptation to harsh conditions during postglacial dispersal, ultimately explaining the relative high diversity of plants in these ecosystems. Several studies have investigated the role of niche-based processes in alpine communities using traits (Chalmandrier et al. 2017, Scherrer et al. 2019) or phylogenetic approaches (Butterfield et al. 2013) to estimate the ecological similarity of co-existing species. However, apart from seed mass, regeneration traits are hardly ever considered, despite existing evidence that life-history stages determine different plant responses across micro-habitats (Hülber et al. 2018). So far, we do not know whether regeneration stages may follow similar or different strategies in alpine plants, and if regeneration traits can provide additional insights into assembly processes, in particular at the level of microsite variation</w:t>
       </w:r>
     </w:p>
     <w:p>
@@ -1116,42 +875,14 @@
         <w:rPr>
           <w:lang w:val="en-US" w:eastAsia="ca-ES"/>
         </w:rPr>
-        <w:t xml:space="preserve">The seed germination niche is the range of environmental conditions which elicit a successful transition from seed to seedling (Grubb 1977). The timing of germination depends on the shape of the germination niche, i.e. the responsiveness to a specific set of environmental germination cues that include temperature, moisture, light and chemical signals. This shape is generally determined by environmental filters to establishment and tends to match germination with the most </w:t>
-      </w:r>
-      <w:proofErr w:type="spellStart"/>
+        <w:t xml:space="preserve">The seed germination niche is the range of environmental conditions which elicit a successful transition from seed to seedling (Grubb 1977). The timing of germination depends on the shape of the germination niche, i.e. the responsiveness to a specific set of environmental germination cues that include temperature, moisture, light and chemical signals. This shape is generally determined by environmental filters to establishment and tends to match germination with the most favourable season for seedling survival (Donohue 2014; Fernández-Pascual et al. 2017b). It follows that communities that differ in their environmental filters for seedling establishment </w:t>
+      </w:r>
       <w:r>
         <w:rPr>
           <w:lang w:val="en-US" w:eastAsia="ca-ES"/>
         </w:rPr>
-        <w:t>favourable</w:t>
-      </w:r>
-      <w:proofErr w:type="spellEnd"/>
-      <w:r>
-        <w:rPr>
-          <w:lang w:val="en-US" w:eastAsia="ca-ES"/>
-        </w:rPr>
-        <w:t xml:space="preserve"> season for seedling survival (Donohue 2014; Fernández-Pascual et al. 2017b). It follows that communities that differ in their environmental filters for seedling establishment </w:t>
-      </w:r>
-      <w:r>
-        <w:rPr>
-          <w:lang w:val="en-US" w:eastAsia="ca-ES"/>
-        </w:rPr>
         <w:lastRenderedPageBreak/>
-        <w:t>should also differ in the shape of their germination niches (Jurado &amp; Flores 2005). The stronger the environmental filters are, the more homogeneous should be the germination niches of a community, reflecting shared strategies of stress tolerance. In alpine habitats, the environment imposes harsh filters such as short growing seasons, freeze-thaw cycles and drought induced by skeletal soils and frozen groundwater. Nonetheless, it has been difficult to define a single alpine germination niche (</w:t>
-      </w:r>
-      <w:proofErr w:type="spellStart"/>
-      <w:r>
-        <w:rPr>
-          <w:lang w:val="en-US" w:eastAsia="ca-ES"/>
-        </w:rPr>
-        <w:t>Schwienbacher</w:t>
-      </w:r>
-      <w:proofErr w:type="spellEnd"/>
-      <w:r>
-        <w:rPr>
-          <w:lang w:val="en-US" w:eastAsia="ca-ES"/>
-        </w:rPr>
-        <w:t xml:space="preserve"> et al. 2011). As the alpine environment is a mosaic of microhabitats, it seems natural that germination strategies need to be assessed at the microsite level. For example, many alpine species have been found able to germinate in conditions indicative of snow cover, such as 0 ºC and darkness (Giménez-Benavides et al. 2005; Shimono &amp; Kudo 2005). This has been portrayed as a strategy of snow field species, while exposed species of the same community would germinate at higher temperatures and after a dormancy-breaking season (Fernández-Pascual et al. 2017a).</w:t>
+        <w:t>should also differ in the shape of their germination niches (Jurado &amp; Flores 2005). The stronger the environmental filters are, the more homogeneous should be the germination niches of a community, reflecting shared strategies of stress tolerance. In alpine habitats, the environment imposes harsh filters such as short growing seasons, freeze-thaw cycles and drought induced by skeletal soils and frozen groundwater. Nonetheless, it has been difficult to define a single alpine germination niche (Schwienbacher et al. 2011). As the alpine environment is a mosaic of microhabitats, it seems natural that germination strategies need to be assessed at the microsite level. For example, many alpine species have been found able to germinate in conditions indicative of snow cover, such as 0 ºC and darkness (Giménez-Benavides et al. 2005; Shimono &amp; Kudo 2005). This has been portrayed as a strategy of snow field species, while exposed species of the same community would germinate at higher temperatures and after a dormancy-breaking season (Fernández-Pascual et al. 2017a).</w:t>
       </w:r>
     </w:p>
     <w:p>
@@ -1195,117 +926,7 @@
           <w:szCs w:val="22"/>
           <w:lang w:val="en-US" w:eastAsia="ca-ES"/>
         </w:rPr>
-        <w:t xml:space="preserve">We </w:t>
-      </w:r>
-      <w:proofErr w:type="spellStart"/>
-      <w:r>
-        <w:rPr>
-          <w:rFonts w:asciiTheme="minorHAnsi" w:eastAsiaTheme="minorHAnsi" w:hAnsiTheme="minorHAnsi" w:cstheme="minorBidi"/>
-          <w:color w:val="auto"/>
-          <w:sz w:val="22"/>
-          <w:szCs w:val="22"/>
-          <w:lang w:val="en-US" w:eastAsia="ca-ES"/>
-        </w:rPr>
-        <w:t>hypothesise</w:t>
-      </w:r>
-      <w:proofErr w:type="spellEnd"/>
-      <w:r>
-        <w:rPr>
-          <w:rFonts w:asciiTheme="minorHAnsi" w:eastAsiaTheme="minorHAnsi" w:hAnsiTheme="minorHAnsi" w:cstheme="minorBidi"/>
-          <w:color w:val="auto"/>
-          <w:sz w:val="22"/>
-          <w:szCs w:val="22"/>
-          <w:lang w:val="en-US" w:eastAsia="ca-ES"/>
-        </w:rPr>
-        <w:t xml:space="preserve"> that microhabitat filters will drive differences in the germination traits of species and communities. Sites with prolonged snow cover will </w:t>
-      </w:r>
-      <w:proofErr w:type="spellStart"/>
-      <w:r>
-        <w:rPr>
-          <w:rFonts w:asciiTheme="minorHAnsi" w:eastAsiaTheme="minorHAnsi" w:hAnsiTheme="minorHAnsi" w:cstheme="minorBidi"/>
-          <w:color w:val="auto"/>
-          <w:sz w:val="22"/>
-          <w:szCs w:val="22"/>
-          <w:lang w:val="en-US" w:eastAsia="ca-ES"/>
-        </w:rPr>
-        <w:t>favour</w:t>
-      </w:r>
-      <w:proofErr w:type="spellEnd"/>
-      <w:r>
-        <w:rPr>
-          <w:rFonts w:asciiTheme="minorHAnsi" w:eastAsiaTheme="minorHAnsi" w:hAnsiTheme="minorHAnsi" w:cstheme="minorBidi"/>
-          <w:color w:val="auto"/>
-          <w:sz w:val="22"/>
-          <w:szCs w:val="22"/>
-          <w:lang w:val="en-US" w:eastAsia="ca-ES"/>
-        </w:rPr>
-        <w:t xml:space="preserve"> germination in conditions of low temperature, constant temperatures and darkness. Exposed sites will </w:t>
-      </w:r>
-      <w:proofErr w:type="spellStart"/>
-      <w:r>
-        <w:rPr>
-          <w:rFonts w:asciiTheme="minorHAnsi" w:eastAsiaTheme="minorHAnsi" w:hAnsiTheme="minorHAnsi" w:cstheme="minorBidi"/>
-          <w:color w:val="auto"/>
-          <w:sz w:val="22"/>
-          <w:szCs w:val="22"/>
-          <w:lang w:val="en-US" w:eastAsia="ca-ES"/>
-        </w:rPr>
-        <w:t>favour</w:t>
-      </w:r>
-      <w:proofErr w:type="spellEnd"/>
-      <w:r>
-        <w:rPr>
-          <w:rFonts w:asciiTheme="minorHAnsi" w:eastAsiaTheme="minorHAnsi" w:hAnsiTheme="minorHAnsi" w:cstheme="minorBidi"/>
-          <w:color w:val="auto"/>
-          <w:sz w:val="22"/>
-          <w:szCs w:val="22"/>
-          <w:lang w:val="en-US" w:eastAsia="ca-ES"/>
-        </w:rPr>
-        <w:t xml:space="preserve"> germination after cold-stratification and at high temperatures. However, within communities there will be a dispersion of germination timing traits to </w:t>
-      </w:r>
-      <w:proofErr w:type="spellStart"/>
-      <w:r>
-        <w:rPr>
-          <w:rFonts w:asciiTheme="minorHAnsi" w:eastAsiaTheme="minorHAnsi" w:hAnsiTheme="minorHAnsi" w:cstheme="minorBidi"/>
-          <w:color w:val="auto"/>
-          <w:sz w:val="22"/>
-          <w:szCs w:val="22"/>
-          <w:lang w:val="en-US" w:eastAsia="ca-ES"/>
-        </w:rPr>
-        <w:t>favour</w:t>
-      </w:r>
-      <w:proofErr w:type="spellEnd"/>
-      <w:r>
-        <w:rPr>
-          <w:rFonts w:asciiTheme="minorHAnsi" w:eastAsiaTheme="minorHAnsi" w:hAnsiTheme="minorHAnsi" w:cstheme="minorBidi"/>
-          <w:color w:val="auto"/>
-          <w:sz w:val="22"/>
-          <w:szCs w:val="22"/>
-          <w:lang w:val="en-US" w:eastAsia="ca-ES"/>
-        </w:rPr>
-        <w:t xml:space="preserve"> temporal niche partition, especially in more productive snow-patch communities with deeper soils. According to the co-existence theory of Grubb (1977), niche differentiation may be different between communities with higher versus lower resources and competition (e.g. fellfields versus </w:t>
-      </w:r>
-      <w:proofErr w:type="spellStart"/>
-      <w:r>
-        <w:rPr>
-          <w:rFonts w:asciiTheme="minorHAnsi" w:eastAsiaTheme="minorHAnsi" w:hAnsiTheme="minorHAnsi" w:cstheme="minorBidi"/>
-          <w:color w:val="auto"/>
-          <w:sz w:val="22"/>
-          <w:szCs w:val="22"/>
-          <w:lang w:val="en-US" w:eastAsia="ca-ES"/>
-        </w:rPr>
-        <w:t>snowbeds</w:t>
-      </w:r>
-      <w:proofErr w:type="spellEnd"/>
-      <w:r>
-        <w:rPr>
-          <w:rFonts w:asciiTheme="minorHAnsi" w:eastAsiaTheme="minorHAnsi" w:hAnsiTheme="minorHAnsi" w:cstheme="minorBidi"/>
-          <w:color w:val="auto"/>
-          <w:sz w:val="22"/>
-          <w:szCs w:val="22"/>
-          <w:lang w:val="en-US" w:eastAsia="ca-ES"/>
-        </w:rPr>
-        <w:t>).</w:t>
+        <w:t>We hypothesise that microhabitat filters will drive differences in the germination traits of species and communities. Sites with prolonged snow cover will favour germination in conditions of low temperature, constant temperatures and darkness. Exposed sites will favour germination after cold-stratification and at high temperatures. However, within communities there will be a dispersion of germination timing traits to favour temporal niche partition, especially in more productive snow-patch communities with deeper soils. According to the co-existence theory of Grubb (1977), niche differentiation may be different between communities with higher versus lower resources and competition (e.g. fellfields versus snowbeds).</w:t>
       </w:r>
     </w:p>
     <w:p>
@@ -1403,21 +1024,7 @@
         <w:rPr>
           <w:rFonts w:cstheme="minorHAnsi"/>
         </w:rPr>
-        <w:t xml:space="preserve"> communities living between 1900 and 2500 m </w:t>
-      </w:r>
-      <w:proofErr w:type="spellStart"/>
-      <w:r>
-        <w:rPr>
-          <w:rFonts w:cstheme="minorHAnsi"/>
-        </w:rPr>
-        <w:t>a.s.l</w:t>
-      </w:r>
-      <w:proofErr w:type="spellEnd"/>
-      <w:r>
-        <w:rPr>
-          <w:rFonts w:cstheme="minorHAnsi"/>
-        </w:rPr>
-        <w:t xml:space="preserve">. in the Cantabrian Mountains. This mountain range,  running E-W in northern Spain, is considered a </w:t>
+        <w:t xml:space="preserve"> communities living between 1900 and 2500 m a.s.l. in the Cantabrian Mountains. This mountain range,  running E-W in northern Spain, is considered a </w:t>
       </w:r>
       <w:r>
         <w:rPr>
@@ -1540,7 +1147,6 @@
         </w:rPr>
         <w:t xml:space="preserve"> communities in the Cantabrian Mountains are dominated mostly by </w:t>
       </w:r>
-      <w:proofErr w:type="spellStart"/>
       <w:r>
         <w:rPr>
           <w:rFonts w:cstheme="minorHAnsi"/>
@@ -1549,14 +1155,12 @@
         </w:rPr>
         <w:t>Poaceae</w:t>
       </w:r>
-      <w:proofErr w:type="spellEnd"/>
       <w:r>
         <w:rPr>
           <w:rFonts w:cstheme="minorHAnsi"/>
         </w:rPr>
         <w:t xml:space="preserve"> and </w:t>
       </w:r>
-      <w:proofErr w:type="spellStart"/>
       <w:r>
         <w:rPr>
           <w:rFonts w:cstheme="minorHAnsi"/>
@@ -1565,7 +1169,6 @@
         </w:rPr>
         <w:t>Cyperaceae</w:t>
       </w:r>
-      <w:proofErr w:type="spellEnd"/>
       <w:r>
         <w:rPr>
           <w:rFonts w:cstheme="minorHAnsi"/>
@@ -1584,52 +1187,14 @@
         </w:rPr>
         <w:t xml:space="preserve"> are mainly Hemicryptophytes and Chamaephytes. Grazing impact is restricted to wild populations of Cantabrian chamois (</w:t>
       </w:r>
-      <w:proofErr w:type="spellStart"/>
       <w:r>
         <w:rPr>
           <w:rFonts w:cstheme="minorHAnsi"/>
           <w:i/>
           <w:iCs/>
         </w:rPr>
-        <w:t>Rupricapra</w:t>
-      </w:r>
-      <w:proofErr w:type="spellEnd"/>
-      <w:r>
-        <w:rPr>
-          <w:rFonts w:cstheme="minorHAnsi"/>
-          <w:i/>
-          <w:iCs/>
-        </w:rPr>
-        <w:t xml:space="preserve"> </w:t>
-      </w:r>
-      <w:proofErr w:type="spellStart"/>
-      <w:r>
-        <w:rPr>
-          <w:rFonts w:cstheme="minorHAnsi"/>
-          <w:i/>
-          <w:iCs/>
-        </w:rPr>
-        <w:t>pyrenaica</w:t>
-      </w:r>
-      <w:proofErr w:type="spellEnd"/>
-      <w:r>
-        <w:rPr>
-          <w:rFonts w:cstheme="minorHAnsi"/>
-          <w:i/>
-          <w:iCs/>
-        </w:rPr>
-        <w:t xml:space="preserve"> </w:t>
-      </w:r>
-      <w:proofErr w:type="spellStart"/>
-      <w:r>
-        <w:rPr>
-          <w:rFonts w:cstheme="minorHAnsi"/>
-          <w:i/>
-          <w:iCs/>
-        </w:rPr>
-        <w:t>parva</w:t>
-      </w:r>
-      <w:proofErr w:type="spellEnd"/>
+        <w:t>Rupricapra pyrenaica parva</w:t>
+      </w:r>
       <w:r>
         <w:rPr>
           <w:rFonts w:cstheme="minorHAnsi"/>
@@ -1839,21 +1404,7 @@
         <w:rPr>
           <w:rFonts w:cstheme="minorHAnsi"/>
         </w:rPr>
-        <w:t xml:space="preserve"> the </w:t>
-      </w:r>
-      <w:proofErr w:type="spellStart"/>
-      <w:r>
-        <w:rPr>
-          <w:rFonts w:cstheme="minorHAnsi"/>
-        </w:rPr>
-        <w:t>center</w:t>
-      </w:r>
-      <w:proofErr w:type="spellEnd"/>
-      <w:r>
-        <w:rPr>
-          <w:rFonts w:cstheme="minorHAnsi"/>
-        </w:rPr>
-        <w:t xml:space="preserve"> of our four sampling sites). Soil pH based on 40 samples collected in 2018, own data not shown. Mean annual air temperature, based on 47 locations from CHELSA 2.1 (bio1). Growing season length calculated from in situ soil temperature records, start and </w:t>
+        <w:t xml:space="preserve"> the center of our four sampling sites). Soil pH based on 40 samples collected in 2018, own data not shown. Mean annual air temperature, based on 47 locations from CHELSA 2.1 (bio1). Growing season length calculated from in situ soil temperature records, start and </w:t>
       </w:r>
       <w:r>
         <w:rPr>
@@ -2255,7 +1806,6 @@
                 <w:lang w:val="es-ES" w:eastAsia="es-ES"/>
               </w:rPr>
             </w:pPr>
-            <w:proofErr w:type="spellStart"/>
             <w:r>
               <w:rPr>
                 <w:rFonts w:ascii="Calibri" w:eastAsia="Times New Roman" w:hAnsi="Calibri" w:cs="Calibri"/>
@@ -2264,18 +1814,7 @@
                 <w:szCs w:val="18"/>
                 <w:lang w:val="es-ES" w:eastAsia="es-ES"/>
               </w:rPr>
-              <w:t>Soil</w:t>
-            </w:r>
-            <w:proofErr w:type="spellEnd"/>
-            <w:r>
-              <w:rPr>
-                <w:rFonts w:ascii="Calibri" w:eastAsia="Times New Roman" w:hAnsi="Calibri" w:cs="Calibri"/>
-                <w:color w:val="000000"/>
-                <w:sz w:val="18"/>
-                <w:szCs w:val="18"/>
-                <w:lang w:val="es-ES" w:eastAsia="es-ES"/>
-              </w:rPr>
-              <w:t xml:space="preserve"> pH </w:t>
+              <w:t xml:space="preserve">Soil pH </w:t>
             </w:r>
           </w:p>
         </w:tc>
@@ -2431,20 +1970,8 @@
                 <w:szCs w:val="18"/>
                 <w:lang w:val="es-ES" w:eastAsia="es-ES"/>
               </w:rPr>
-              <w:t xml:space="preserve">2.5 </w:t>
+              <w:t>2.5 ºC</w:t>
             </w:r>
-            <w:proofErr w:type="spellStart"/>
-            <w:r>
-              <w:rPr>
-                <w:rFonts w:ascii="Calibri" w:eastAsia="Times New Roman" w:hAnsi="Calibri" w:cs="Calibri"/>
-                <w:color w:val="000000"/>
-                <w:sz w:val="18"/>
-                <w:szCs w:val="18"/>
-                <w:lang w:val="es-ES" w:eastAsia="es-ES"/>
-              </w:rPr>
-              <w:t>ºC</w:t>
-            </w:r>
-            <w:proofErr w:type="spellEnd"/>
           </w:p>
         </w:tc>
         <w:tc>
@@ -2481,20 +2008,8 @@
                 <w:szCs w:val="18"/>
                 <w:lang w:val="es-ES" w:eastAsia="es-ES"/>
               </w:rPr>
-              <w:t xml:space="preserve">4.5 </w:t>
+              <w:t>4.5 ºC</w:t>
             </w:r>
-            <w:proofErr w:type="spellStart"/>
-            <w:r>
-              <w:rPr>
-                <w:rFonts w:ascii="Calibri" w:eastAsia="Times New Roman" w:hAnsi="Calibri" w:cs="Calibri"/>
-                <w:color w:val="000000"/>
-                <w:sz w:val="18"/>
-                <w:szCs w:val="18"/>
-                <w:lang w:val="es-ES" w:eastAsia="es-ES"/>
-              </w:rPr>
-              <w:t>ºC</w:t>
-            </w:r>
-            <w:proofErr w:type="spellEnd"/>
           </w:p>
         </w:tc>
       </w:tr>
@@ -2565,7 +2080,6 @@
                 <w:lang w:val="es-ES" w:eastAsia="es-ES"/>
               </w:rPr>
             </w:pPr>
-            <w:proofErr w:type="spellStart"/>
             <w:r>
               <w:rPr>
                 <w:rFonts w:ascii="Calibri" w:eastAsia="Times New Roman" w:hAnsi="Calibri" w:cs="Calibri"/>
@@ -2574,53 +2088,8 @@
                 <w:szCs w:val="18"/>
                 <w:lang w:val="es-ES" w:eastAsia="es-ES"/>
               </w:rPr>
-              <w:t>May</w:t>
+              <w:t>May - early October</w:t>
             </w:r>
-            <w:proofErr w:type="spellEnd"/>
-            <w:r>
-              <w:rPr>
-                <w:rFonts w:ascii="Calibri" w:eastAsia="Times New Roman" w:hAnsi="Calibri" w:cs="Calibri"/>
-                <w:color w:val="000000"/>
-                <w:sz w:val="18"/>
-                <w:szCs w:val="18"/>
-                <w:lang w:val="es-ES" w:eastAsia="es-ES"/>
-              </w:rPr>
-              <w:t xml:space="preserve"> - </w:t>
-            </w:r>
-            <w:proofErr w:type="spellStart"/>
-            <w:r>
-              <w:rPr>
-                <w:rFonts w:ascii="Calibri" w:eastAsia="Times New Roman" w:hAnsi="Calibri" w:cs="Calibri"/>
-                <w:color w:val="000000"/>
-                <w:sz w:val="18"/>
-                <w:szCs w:val="18"/>
-                <w:lang w:val="es-ES" w:eastAsia="es-ES"/>
-              </w:rPr>
-              <w:t>early</w:t>
-            </w:r>
-            <w:proofErr w:type="spellEnd"/>
-            <w:r>
-              <w:rPr>
-                <w:rFonts w:ascii="Calibri" w:eastAsia="Times New Roman" w:hAnsi="Calibri" w:cs="Calibri"/>
-                <w:color w:val="000000"/>
-                <w:sz w:val="18"/>
-                <w:szCs w:val="18"/>
-                <w:lang w:val="es-ES" w:eastAsia="es-ES"/>
-              </w:rPr>
-              <w:t xml:space="preserve"> </w:t>
-            </w:r>
-            <w:proofErr w:type="spellStart"/>
-            <w:r>
-              <w:rPr>
-                <w:rFonts w:ascii="Calibri" w:eastAsia="Times New Roman" w:hAnsi="Calibri" w:cs="Calibri"/>
-                <w:color w:val="000000"/>
-                <w:sz w:val="18"/>
-                <w:szCs w:val="18"/>
-                <w:lang w:val="es-ES" w:eastAsia="es-ES"/>
-              </w:rPr>
-              <w:t>October</w:t>
-            </w:r>
-            <w:proofErr w:type="spellEnd"/>
           </w:p>
         </w:tc>
         <w:tc>
@@ -2649,7 +2118,6 @@
                 <w:lang w:val="es-ES" w:eastAsia="es-ES"/>
               </w:rPr>
             </w:pPr>
-            <w:proofErr w:type="spellStart"/>
             <w:r>
               <w:rPr>
                 <w:rFonts w:ascii="Calibri" w:eastAsia="Times New Roman" w:hAnsi="Calibri" w:cs="Calibri"/>
@@ -2658,53 +2126,8 @@
                 <w:szCs w:val="18"/>
                 <w:lang w:val="es-ES" w:eastAsia="es-ES"/>
               </w:rPr>
-              <w:t>March</w:t>
+              <w:t>March – early November</w:t>
             </w:r>
-            <w:proofErr w:type="spellEnd"/>
-            <w:r>
-              <w:rPr>
-                <w:rFonts w:ascii="Calibri" w:eastAsia="Times New Roman" w:hAnsi="Calibri" w:cs="Calibri"/>
-                <w:color w:val="000000"/>
-                <w:sz w:val="18"/>
-                <w:szCs w:val="18"/>
-                <w:lang w:val="es-ES" w:eastAsia="es-ES"/>
-              </w:rPr>
-              <w:t xml:space="preserve"> – </w:t>
-            </w:r>
-            <w:proofErr w:type="spellStart"/>
-            <w:r>
-              <w:rPr>
-                <w:rFonts w:ascii="Calibri" w:eastAsia="Times New Roman" w:hAnsi="Calibri" w:cs="Calibri"/>
-                <w:color w:val="000000"/>
-                <w:sz w:val="18"/>
-                <w:szCs w:val="18"/>
-                <w:lang w:val="es-ES" w:eastAsia="es-ES"/>
-              </w:rPr>
-              <w:t>early</w:t>
-            </w:r>
-            <w:proofErr w:type="spellEnd"/>
-            <w:r>
-              <w:rPr>
-                <w:rFonts w:ascii="Calibri" w:eastAsia="Times New Roman" w:hAnsi="Calibri" w:cs="Calibri"/>
-                <w:color w:val="000000"/>
-                <w:sz w:val="18"/>
-                <w:szCs w:val="18"/>
-                <w:lang w:val="es-ES" w:eastAsia="es-ES"/>
-              </w:rPr>
-              <w:t xml:space="preserve"> </w:t>
-            </w:r>
-            <w:proofErr w:type="spellStart"/>
-            <w:r>
-              <w:rPr>
-                <w:rFonts w:ascii="Calibri" w:eastAsia="Times New Roman" w:hAnsi="Calibri" w:cs="Calibri"/>
-                <w:color w:val="000000"/>
-                <w:sz w:val="18"/>
-                <w:szCs w:val="18"/>
-                <w:lang w:val="es-ES" w:eastAsia="es-ES"/>
-              </w:rPr>
-              <w:t>November</w:t>
-            </w:r>
-            <w:proofErr w:type="spellEnd"/>
           </w:p>
         </w:tc>
       </w:tr>
@@ -2783,20 +2206,8 @@
                 <w:szCs w:val="18"/>
                 <w:lang w:val="es-ES" w:eastAsia="es-ES"/>
               </w:rPr>
-              <w:t xml:space="preserve">5.1 </w:t>
+              <w:t>5.1 ºC</w:t>
             </w:r>
-            <w:proofErr w:type="spellStart"/>
-            <w:r>
-              <w:rPr>
-                <w:rFonts w:ascii="Calibri" w:eastAsia="Times New Roman" w:hAnsi="Calibri" w:cs="Calibri"/>
-                <w:color w:val="000000"/>
-                <w:sz w:val="18"/>
-                <w:szCs w:val="18"/>
-                <w:lang w:val="es-ES" w:eastAsia="es-ES"/>
-              </w:rPr>
-              <w:t>ºC</w:t>
-            </w:r>
-            <w:proofErr w:type="spellEnd"/>
           </w:p>
         </w:tc>
         <w:tc>
@@ -2833,20 +2244,8 @@
                 <w:szCs w:val="18"/>
                 <w:lang w:val="es-ES" w:eastAsia="es-ES"/>
               </w:rPr>
-              <w:t xml:space="preserve">8.1 </w:t>
+              <w:t>8.1 ºC</w:t>
             </w:r>
-            <w:proofErr w:type="spellStart"/>
-            <w:r>
-              <w:rPr>
-                <w:rFonts w:ascii="Calibri" w:eastAsia="Times New Roman" w:hAnsi="Calibri" w:cs="Calibri"/>
-                <w:color w:val="000000"/>
-                <w:sz w:val="18"/>
-                <w:szCs w:val="18"/>
-                <w:lang w:val="es-ES" w:eastAsia="es-ES"/>
-              </w:rPr>
-              <w:t>ºC</w:t>
-            </w:r>
-            <w:proofErr w:type="spellEnd"/>
           </w:p>
         </w:tc>
       </w:tr>
@@ -3074,20 +2473,8 @@
                 <w:szCs w:val="18"/>
                 <w:lang w:val="es-ES" w:eastAsia="es-ES"/>
               </w:rPr>
-              <w:t xml:space="preserve">8 - 18 </w:t>
+              <w:t>8 - 18 species</w:t>
             </w:r>
-            <w:proofErr w:type="spellStart"/>
-            <w:r>
-              <w:rPr>
-                <w:rFonts w:ascii="Calibri" w:eastAsia="Times New Roman" w:hAnsi="Calibri" w:cs="Calibri"/>
-                <w:color w:val="000000"/>
-                <w:sz w:val="18"/>
-                <w:szCs w:val="18"/>
-                <w:lang w:val="es-ES" w:eastAsia="es-ES"/>
-              </w:rPr>
-              <w:t>species</w:t>
-            </w:r>
-            <w:proofErr w:type="spellEnd"/>
           </w:p>
         </w:tc>
         <w:tc>
@@ -3124,20 +2511,8 @@
                 <w:szCs w:val="18"/>
                 <w:lang w:val="es-ES" w:eastAsia="es-ES"/>
               </w:rPr>
-              <w:t xml:space="preserve">3 - 14 </w:t>
+              <w:t>3 - 14 species</w:t>
             </w:r>
-            <w:proofErr w:type="spellStart"/>
-            <w:r>
-              <w:rPr>
-                <w:rFonts w:ascii="Calibri" w:eastAsia="Times New Roman" w:hAnsi="Calibri" w:cs="Calibri"/>
-                <w:color w:val="000000"/>
-                <w:sz w:val="18"/>
-                <w:szCs w:val="18"/>
-                <w:lang w:val="es-ES" w:eastAsia="es-ES"/>
-              </w:rPr>
-              <w:t>species</w:t>
-            </w:r>
-            <w:proofErr w:type="spellEnd"/>
           </w:p>
         </w:tc>
       </w:tr>
@@ -3211,7 +2586,6 @@
                 <w:lang w:val="es-ES" w:eastAsia="es-ES"/>
               </w:rPr>
             </w:pPr>
-            <w:proofErr w:type="spellStart"/>
             <w:r>
               <w:rPr>
                 <w:rFonts w:ascii="Calibri" w:eastAsia="Times New Roman" w:hAnsi="Calibri" w:cs="Calibri"/>
@@ -3222,35 +2596,8 @@
                 <w:szCs w:val="18"/>
                 <w:lang w:val="es-ES" w:eastAsia="es-ES"/>
               </w:rPr>
-              <w:t>Carex</w:t>
+              <w:t>Carex sempervirens</w:t>
             </w:r>
-            <w:proofErr w:type="spellEnd"/>
-            <w:r>
-              <w:rPr>
-                <w:rFonts w:ascii="Calibri" w:eastAsia="Times New Roman" w:hAnsi="Calibri" w:cs="Calibri"/>
-                <w:i/>
-                <w:iCs/>
-                <w:color w:val="000000"/>
-                <w:sz w:val="18"/>
-                <w:szCs w:val="18"/>
-                <w:lang w:val="es-ES" w:eastAsia="es-ES"/>
-              </w:rPr>
-              <w:t xml:space="preserve"> </w:t>
-            </w:r>
-            <w:proofErr w:type="spellStart"/>
-            <w:r>
-              <w:rPr>
-                <w:rFonts w:ascii="Calibri" w:eastAsia="Times New Roman" w:hAnsi="Calibri" w:cs="Calibri"/>
-                <w:i/>
-                <w:iCs/>
-                <w:color w:val="000000"/>
-                <w:sz w:val="18"/>
-                <w:szCs w:val="18"/>
-                <w:lang w:val="es-ES" w:eastAsia="es-ES"/>
-              </w:rPr>
-              <w:t>sempervirens</w:t>
-            </w:r>
-            <w:proofErr w:type="spellEnd"/>
             <w:r>
               <w:rPr>
                 <w:rFonts w:ascii="Calibri" w:eastAsia="Times New Roman" w:hAnsi="Calibri" w:cs="Calibri"/>
@@ -3301,33 +2648,7 @@
                 <w:szCs w:val="18"/>
                 <w:lang w:val="es-ES" w:eastAsia="es-ES"/>
               </w:rPr>
-              <w:t xml:space="preserve">Luzula </w:t>
-            </w:r>
-            <w:proofErr w:type="spellStart"/>
-            <w:r>
-              <w:rPr>
-                <w:rFonts w:ascii="Calibri" w:eastAsia="Times New Roman" w:hAnsi="Calibri" w:cs="Calibri"/>
-                <w:i/>
-                <w:iCs/>
-                <w:color w:val="000000"/>
-                <w:sz w:val="18"/>
-                <w:szCs w:val="18"/>
-                <w:lang w:val="es-ES" w:eastAsia="es-ES"/>
-              </w:rPr>
-              <w:t>caespitosa</w:t>
-            </w:r>
-            <w:proofErr w:type="spellEnd"/>
-            <w:r>
-              <w:rPr>
-                <w:rFonts w:ascii="Calibri" w:eastAsia="Times New Roman" w:hAnsi="Calibri" w:cs="Calibri"/>
-                <w:i/>
-                <w:iCs/>
-                <w:color w:val="000000"/>
-                <w:sz w:val="18"/>
-                <w:szCs w:val="18"/>
-                <w:lang w:val="es-ES" w:eastAsia="es-ES"/>
-              </w:rPr>
-              <w:t xml:space="preserve"> </w:t>
+              <w:t xml:space="preserve">Luzula caespitosa </w:t>
             </w:r>
             <w:r>
               <w:rPr>
@@ -3411,33 +2732,7 @@
                 <w:szCs w:val="18"/>
                 <w:lang w:val="es-ES" w:eastAsia="es-ES"/>
               </w:rPr>
-              <w:t xml:space="preserve">Silene </w:t>
-            </w:r>
-            <w:proofErr w:type="spellStart"/>
-            <w:r>
-              <w:rPr>
-                <w:rFonts w:ascii="Calibri" w:eastAsia="Times New Roman" w:hAnsi="Calibri" w:cs="Calibri"/>
-                <w:i/>
-                <w:iCs/>
-                <w:color w:val="000000"/>
-                <w:sz w:val="18"/>
-                <w:szCs w:val="18"/>
-                <w:lang w:val="es-ES" w:eastAsia="es-ES"/>
-              </w:rPr>
-              <w:t>acaulis</w:t>
-            </w:r>
-            <w:proofErr w:type="spellEnd"/>
-            <w:r>
-              <w:rPr>
-                <w:rFonts w:ascii="Calibri" w:eastAsia="Times New Roman" w:hAnsi="Calibri" w:cs="Calibri"/>
-                <w:i/>
-                <w:iCs/>
-                <w:color w:val="000000"/>
-                <w:sz w:val="18"/>
-                <w:szCs w:val="18"/>
-                <w:lang w:val="es-ES" w:eastAsia="es-ES"/>
-              </w:rPr>
-              <w:t xml:space="preserve"> (6.46 </w:t>
+              <w:t xml:space="preserve">Silene acaulis (6.46 </w:t>
             </w:r>
             <w:r>
               <w:rPr>
@@ -3479,7 +2774,6 @@
                 <w:lang w:val="es-ES" w:eastAsia="es-ES"/>
               </w:rPr>
             </w:pPr>
-            <w:proofErr w:type="spellStart"/>
             <w:r>
               <w:rPr>
                 <w:rFonts w:ascii="Calibri" w:eastAsia="Times New Roman" w:hAnsi="Calibri" w:cs="Calibri"/>
@@ -3490,46 +2784,7 @@
                 <w:szCs w:val="18"/>
                 <w:lang w:val="es-ES" w:eastAsia="es-ES"/>
               </w:rPr>
-              <w:t>Festuca</w:t>
-            </w:r>
-            <w:proofErr w:type="spellEnd"/>
-            <w:r>
-              <w:rPr>
-                <w:rFonts w:ascii="Calibri" w:eastAsia="Times New Roman" w:hAnsi="Calibri" w:cs="Calibri"/>
-                <w:i/>
-                <w:iCs/>
-                <w:color w:val="000000"/>
-                <w:sz w:val="18"/>
-                <w:szCs w:val="18"/>
-                <w:lang w:val="es-ES" w:eastAsia="es-ES"/>
-              </w:rPr>
-              <w:t xml:space="preserve"> </w:t>
-            </w:r>
-            <w:proofErr w:type="spellStart"/>
-            <w:r>
-              <w:rPr>
-                <w:rFonts w:ascii="Calibri" w:eastAsia="Times New Roman" w:hAnsi="Calibri" w:cs="Calibri"/>
-                <w:i/>
-                <w:iCs/>
-                <w:color w:val="000000"/>
-                <w:sz w:val="18"/>
-                <w:szCs w:val="18"/>
-                <w:lang w:val="es-ES" w:eastAsia="es-ES"/>
-              </w:rPr>
-              <w:t>summilusitana</w:t>
-            </w:r>
-            <w:proofErr w:type="spellEnd"/>
-            <w:r>
-              <w:rPr>
-                <w:rFonts w:ascii="Calibri" w:eastAsia="Times New Roman" w:hAnsi="Calibri" w:cs="Calibri"/>
-                <w:i/>
-                <w:iCs/>
-                <w:color w:val="000000"/>
-                <w:sz w:val="18"/>
-                <w:szCs w:val="18"/>
-                <w:lang w:val="es-ES" w:eastAsia="es-ES"/>
-              </w:rPr>
-              <w:t xml:space="preserve"> </w:t>
+              <w:t xml:space="preserve">Festuca summilusitana </w:t>
             </w:r>
             <w:r>
               <w:rPr>
@@ -3603,7 +2858,6 @@
                 <w:lang w:val="es-ES" w:eastAsia="es-ES"/>
               </w:rPr>
             </w:pPr>
-            <w:proofErr w:type="spellStart"/>
             <w:r>
               <w:rPr>
                 <w:rFonts w:ascii="Calibri" w:eastAsia="Times New Roman" w:hAnsi="Calibri" w:cs="Calibri"/>
@@ -3614,35 +2868,8 @@
                 <w:szCs w:val="18"/>
                 <w:lang w:val="es-ES" w:eastAsia="es-ES"/>
               </w:rPr>
-              <w:t>Helianthemum</w:t>
+              <w:t>Helianthemum urrielense</w:t>
             </w:r>
-            <w:proofErr w:type="spellEnd"/>
-            <w:r>
-              <w:rPr>
-                <w:rFonts w:ascii="Calibri" w:eastAsia="Times New Roman" w:hAnsi="Calibri" w:cs="Calibri"/>
-                <w:i/>
-                <w:iCs/>
-                <w:color w:val="000000"/>
-                <w:sz w:val="18"/>
-                <w:szCs w:val="18"/>
-                <w:lang w:val="es-ES" w:eastAsia="es-ES"/>
-              </w:rPr>
-              <w:t xml:space="preserve"> </w:t>
-            </w:r>
-            <w:proofErr w:type="spellStart"/>
-            <w:r>
-              <w:rPr>
-                <w:rFonts w:ascii="Calibri" w:eastAsia="Times New Roman" w:hAnsi="Calibri" w:cs="Calibri"/>
-                <w:i/>
-                <w:iCs/>
-                <w:color w:val="000000"/>
-                <w:sz w:val="18"/>
-                <w:szCs w:val="18"/>
-                <w:lang w:val="es-ES" w:eastAsia="es-ES"/>
-              </w:rPr>
-              <w:t>urrielense</w:t>
-            </w:r>
-            <w:proofErr w:type="spellEnd"/>
             <w:r>
               <w:rPr>
                 <w:rFonts w:ascii="Calibri" w:eastAsia="Times New Roman" w:hAnsi="Calibri" w:cs="Calibri"/>
@@ -3683,7 +2910,6 @@
                 <w:lang w:val="es-ES" w:eastAsia="es-ES"/>
               </w:rPr>
             </w:pPr>
-            <w:proofErr w:type="spellStart"/>
             <w:r>
               <w:rPr>
                 <w:rFonts w:ascii="Calibri" w:eastAsia="Times New Roman" w:hAnsi="Calibri" w:cs="Calibri"/>
@@ -3694,20 +2920,7 @@
                 <w:szCs w:val="18"/>
                 <w:lang w:val="es-ES" w:eastAsia="es-ES"/>
               </w:rPr>
-              <w:t>Minuartia</w:t>
-            </w:r>
-            <w:proofErr w:type="spellEnd"/>
-            <w:r>
-              <w:rPr>
-                <w:rFonts w:ascii="Calibri" w:eastAsia="Times New Roman" w:hAnsi="Calibri" w:cs="Calibri"/>
-                <w:i/>
-                <w:iCs/>
-                <w:color w:val="000000"/>
-                <w:sz w:val="18"/>
-                <w:szCs w:val="18"/>
-                <w:lang w:val="es-ES" w:eastAsia="es-ES"/>
-              </w:rPr>
-              <w:t xml:space="preserve"> recurva</w:t>
+              <w:t>Minuartia recurva</w:t>
             </w:r>
             <w:r>
               <w:rPr>
@@ -3752,25 +2965,7 @@
           <w:color w:val="000000"/>
           <w:lang w:eastAsia="ca-ES"/>
         </w:rPr>
-        <w:t xml:space="preserve">Within each </w:t>
-      </w:r>
-      <w:proofErr w:type="gramStart"/>
-      <w:r>
-        <w:rPr>
-          <w:rFonts w:eastAsia="Times New Roman" w:cstheme="minorHAnsi"/>
-          <w:color w:val="000000"/>
-          <w:lang w:eastAsia="ca-ES"/>
-        </w:rPr>
-        <w:t>system</w:t>
-      </w:r>
-      <w:proofErr w:type="gramEnd"/>
-      <w:r>
-        <w:rPr>
-          <w:rFonts w:eastAsia="Times New Roman" w:cstheme="minorHAnsi"/>
-          <w:color w:val="000000"/>
-          <w:lang w:eastAsia="ca-ES"/>
-        </w:rPr>
-        <w:t xml:space="preserve"> we established four seed sampling sites, separated at least 500 m</w:t>
+        <w:t>Within each system we established four seed sampling sites, separated at least 500 m</w:t>
       </w:r>
       <w:r>
         <w:t>. To measure the spatial microenvironmental gradients</w:t>
@@ -3842,65 +3037,19 @@
         <w:t>d</w:t>
       </w:r>
       <w:r>
-        <w:t xml:space="preserve"> at 5 cm deep, </w:t>
-      </w:r>
-      <w:proofErr w:type="spellStart"/>
-      <w:r>
-        <w:t>iButton</w:t>
-      </w:r>
-      <w:proofErr w:type="spellEnd"/>
-      <w:r>
-        <w:t xml:space="preserve"> </w:t>
-      </w:r>
-      <w:proofErr w:type="spellStart"/>
-      <w:r>
-        <w:t>dataloggers</w:t>
-      </w:r>
-      <w:proofErr w:type="spellEnd"/>
-      <w:r>
-        <w:t xml:space="preserve"> (</w:t>
-      </w:r>
-      <w:proofErr w:type="spellStart"/>
+        <w:t xml:space="preserve"> at 5 cm deep, iButton dataloggers (</w:t>
+      </w:r>
       <w:r>
         <w:rPr>
           <w:rFonts w:eastAsiaTheme="majorEastAsia"/>
         </w:rPr>
-        <w:t>Thermochron</w:t>
-      </w:r>
-      <w:proofErr w:type="spellEnd"/>
-      <w:r>
-        <w:rPr>
-          <w:rFonts w:eastAsiaTheme="majorEastAsia"/>
-        </w:rPr>
-        <w:t xml:space="preserve">, </w:t>
-      </w:r>
-      <w:proofErr w:type="spellStart"/>
-      <w:r>
-        <w:rPr>
-          <w:rFonts w:eastAsiaTheme="majorEastAsia"/>
-        </w:rPr>
-        <w:t>iButton</w:t>
-      </w:r>
-      <w:proofErr w:type="spellEnd"/>
-      <w:r>
-        <w:rPr>
-          <w:rFonts w:eastAsiaTheme="majorEastAsia"/>
-        </w:rPr>
-        <w:t>, Newbury, UK; accuracy: +/- 0.5 ºC from -10 ºC to +65 ºC, resolution: 0.5 ºC, records every four hours</w:t>
+        <w:t>Thermochron, iButton, Newbury, UK; accuracy: +/- 0.5 ºC from -10 ºC to +65 ºC, resolution: 0.5 ºC, records every four hours</w:t>
       </w:r>
       <w:r>
         <w:t xml:space="preserve">). </w:t>
       </w:r>
       <w:r>
-        <w:t xml:space="preserve">In the temperate system the </w:t>
-      </w:r>
-      <w:proofErr w:type="spellStart"/>
-      <w:r>
-        <w:t>iButtons</w:t>
-      </w:r>
-      <w:proofErr w:type="spellEnd"/>
-      <w:r>
-        <w:t xml:space="preserve"> recording period when </w:t>
+        <w:t xml:space="preserve">In the temperate system the iButtons recording period when </w:t>
       </w:r>
       <w:r>
         <w:rPr>
@@ -3938,15 +3087,7 @@
         <w:t xml:space="preserve"> (330 days). </w:t>
       </w:r>
       <w:r>
-        <w:t xml:space="preserve">The recording period for the </w:t>
-      </w:r>
-      <w:proofErr w:type="spellStart"/>
-      <w:r>
-        <w:t>iButtons</w:t>
-      </w:r>
-      <w:proofErr w:type="spellEnd"/>
-      <w:r>
-        <w:t xml:space="preserve"> </w:t>
+        <w:t xml:space="preserve">The recording period for the iButtons </w:t>
       </w:r>
       <w:r>
         <w:rPr>
@@ -4000,15 +3141,7 @@
         <w:t xml:space="preserve"> plots </w:t>
       </w:r>
       <w:r>
-        <w:t xml:space="preserve">per system. Not all </w:t>
-      </w:r>
-      <w:proofErr w:type="spellStart"/>
-      <w:r>
-        <w:t>iButtons</w:t>
-      </w:r>
-      <w:proofErr w:type="spellEnd"/>
-      <w:r>
-        <w:t xml:space="preserve"> could be recovered, thus we obtained</w:t>
+        <w:t>per system. Not all iButtons could be recovered, thus we obtained</w:t>
       </w:r>
       <w:r>
         <w:t xml:space="preserve"> environmental data from 7</w:t>
@@ -4041,13 +3174,8 @@
       <w:r>
         <w:t xml:space="preserve">From the </w:t>
       </w:r>
-      <w:proofErr w:type="spellStart"/>
-      <w:r>
-        <w:t>iButtons</w:t>
-      </w:r>
-      <w:proofErr w:type="spellEnd"/>
-      <w:r>
-        <w:t xml:space="preserve"> </w:t>
+      <w:r>
+        <w:t xml:space="preserve">iButtons </w:t>
       </w:r>
       <w:r>
         <w:t>environmental data</w:t>
@@ -4069,23 +3197,7 @@
       </w:r>
       <w:commentRangeStart w:id="3"/>
       <w:r>
-        <w:t xml:space="preserve">We calculated bioclimatic indices based on standard variables used by </w:t>
-      </w:r>
-      <w:proofErr w:type="spellStart"/>
-      <w:r>
-        <w:t>WorldClim</w:t>
-      </w:r>
-      <w:proofErr w:type="spellEnd"/>
-      <w:r>
-        <w:t xml:space="preserve"> (Fick &amp; </w:t>
-      </w:r>
-      <w:proofErr w:type="spellStart"/>
-      <w:r>
-        <w:t>Hijmans</w:t>
-      </w:r>
-      <w:proofErr w:type="spellEnd"/>
-      <w:r>
-        <w:t xml:space="preserve"> 2017), together with other variables with a relevant function on alpine topographic gradients. The selected variables were: (1) bio1 = annual mean temperature; (2) bio2 = mean diurnal range, i.e. the mean of the monthly differences between maximum and minimum temperatures; (3) bio7 = temperature annual range; i.e. the difference between the maximum temperature of the warmest month and the minimum temperature of the coldest month; (4) snow = the number of days of snow cover, when temperature is around 0 ºC, calculated for the period in which the maximum temperature was &lt; 0.5 ºC and the minimum temperature was &gt; -0.5 ºC; (5) FDD = freezing degree days, i.e. the sum of daily mean temperatures for days in which the mean temperature was below 0 ºC (Choler 2018); and (6) GDD = growing degree days, i.e. the sum of daily mean temperatures for days in which the soil mean temperature at five cm deep was above 5 ºC (Körner 2021). For FDD, we transformed the values from negative to positive, so higher values represent more freezing.</w:t>
+        <w:t>We calculated bioclimatic indices based on standard variables used by WorldClim (Fick &amp; Hijmans 2017), together with other variables with a relevant function on alpine topographic gradients. The selected variables were: (1) bio1 = annual mean temperature; (2) bio2 = mean diurnal range, i.e. the mean of the monthly differences between maximum and minimum temperatures; (3) bio7 = temperature annual range; i.e. the difference between the maximum temperature of the warmest month and the minimum temperature of the coldest month; (4) snow = the number of days of snow cover, when temperature is around 0 ºC, calculated for the period in which the maximum temperature was &lt; 0.5 ºC and the minimum temperature was &gt; -0.5 ºC; (5) FDD = freezing degree days, i.e. the sum of daily mean temperatures for days in which the mean temperature was below 0 ºC (Choler 2018); and (6) GDD = growing degree days, i.e. the sum of daily mean temperatures for days in which the soil mean temperature at five cm deep was above 5 ºC (Körner 2021). For FDD, we transformed the values from negative to positive, so higher values represent more freezing.</w:t>
       </w:r>
       <w:commentRangeEnd w:id="3"/>
       <w:r>
@@ -4127,11 +3239,25 @@
         <w:t>To identify main gradients of species climatic preferences we conducted a principal component analysis (PCA) with the full set of bioclimatic indices</w:t>
       </w:r>
       <w:r>
-        <w:t xml:space="preserve"> (fig xx)</w:t>
+        <w:t xml:space="preserve"> </w:t>
+      </w:r>
+      <w:r>
+        <w:rPr>
+          <w:highlight w:val="yellow"/>
+        </w:rPr>
+        <w:t>(fig xx)</w:t>
+      </w:r>
+      <w:r>
+        <w:rPr>
+          <w:highlight w:val="yellow"/>
+        </w:rPr>
+        <w:t xml:space="preserve"> UPDATE</w:t>
       </w:r>
       <w:r>
         <w:t>.</w:t>
       </w:r>
+      <w:bookmarkStart w:id="4" w:name="_GoBack"/>
+      <w:bookmarkEnd w:id="4"/>
     </w:p>
     <w:p>
       <w:pPr>
@@ -4959,7 +4085,6 @@
         </w:rPr>
         <w:t xml:space="preserve"> </w:t>
       </w:r>
-      <w:proofErr w:type="gramStart"/>
       <w:r>
         <w:rPr>
           <w:rFonts w:eastAsia="Times New Roman" w:cstheme="minorHAnsi"/>
@@ -4968,7 +4093,6 @@
         </w:rPr>
         <w:t>4</w:t>
       </w:r>
-      <w:proofErr w:type="gramEnd"/>
       <w:r>
         <w:rPr>
           <w:rFonts w:eastAsia="Times New Roman" w:cstheme="minorHAnsi"/>
@@ -5217,9 +4341,416 @@
           <w:highlight w:val="yellow"/>
           <w:lang w:eastAsia="ca-ES"/>
         </w:rPr>
-        <w:t xml:space="preserve">Espinosa </w:t>
-      </w:r>
-      <w:proofErr w:type="gramStart"/>
+        <w:t>Espinosa del Alba et al. 2024</w:t>
+      </w:r>
+      <w:r>
+        <w:rPr>
+          <w:rFonts w:eastAsia="Times New Roman" w:cstheme="minorHAnsi"/>
+          <w:color w:val="000000"/>
+          <w:lang w:eastAsia="ca-ES"/>
+        </w:rPr>
+        <w:t xml:space="preserve"> found </w:t>
+      </w:r>
+      <w:r>
+        <w:rPr>
+          <w:rFonts w:eastAsia="Times New Roman" w:cstheme="minorHAnsi"/>
+          <w:color w:val="000000"/>
+          <w:lang w:eastAsia="ca-ES"/>
+        </w:rPr>
+        <w:t xml:space="preserve">that </w:t>
+      </w:r>
+      <w:r>
+        <w:rPr>
+          <w:rFonts w:eastAsia="Times New Roman" w:cstheme="minorHAnsi"/>
+          <w:color w:val="000000"/>
+          <w:lang w:eastAsia="ca-ES"/>
+        </w:rPr>
+        <w:t xml:space="preserve">all </w:t>
+      </w:r>
+      <w:r>
+        <w:rPr>
+          <w:rFonts w:eastAsia="Times New Roman" w:cstheme="minorHAnsi"/>
+          <w:color w:val="000000"/>
+          <w:lang w:eastAsia="ca-ES"/>
+        </w:rPr>
+        <w:t xml:space="preserve">species could be divided </w:t>
+      </w:r>
+      <w:r>
+        <w:rPr>
+          <w:rFonts w:eastAsia="Times New Roman" w:cstheme="minorHAnsi"/>
+          <w:color w:val="000000"/>
+          <w:lang w:eastAsia="ca-ES"/>
+        </w:rPr>
+        <w:t xml:space="preserve">in two </w:t>
+      </w:r>
+      <w:r>
+        <w:rPr>
+          <w:rFonts w:eastAsia="Times New Roman" w:cstheme="minorHAnsi"/>
+          <w:color w:val="000000"/>
+          <w:lang w:eastAsia="ca-ES"/>
+        </w:rPr>
+        <w:t xml:space="preserve">optimal </w:t>
+      </w:r>
+      <w:r>
+        <w:rPr>
+          <w:rFonts w:eastAsia="Times New Roman" w:cstheme="minorHAnsi"/>
+          <w:color w:val="000000"/>
+          <w:lang w:eastAsia="ca-ES"/>
+        </w:rPr>
+        <w:t xml:space="preserve">germination </w:t>
+      </w:r>
+      <w:r>
+        <w:rPr>
+          <w:rFonts w:eastAsia="Times New Roman" w:cstheme="minorHAnsi"/>
+          <w:color w:val="000000"/>
+          <w:lang w:eastAsia="ca-ES"/>
+        </w:rPr>
+        <w:t>temperatures</w:t>
+      </w:r>
+      <w:r>
+        <w:rPr>
+          <w:rFonts w:eastAsia="Times New Roman" w:cstheme="minorHAnsi"/>
+          <w:color w:val="000000"/>
+          <w:lang w:eastAsia="ca-ES"/>
+        </w:rPr>
+        <w:t>: (1)</w:t>
+      </w:r>
+      <w:r>
+        <w:rPr>
+          <w:rFonts w:eastAsia="Times New Roman" w:cstheme="minorHAnsi"/>
+          <w:color w:val="000000"/>
+          <w:lang w:eastAsia="ca-ES"/>
+        </w:rPr>
+        <w:t xml:space="preserve"> cold</w:t>
+      </w:r>
+      <w:r>
+        <w:rPr>
+          <w:rFonts w:eastAsia="Times New Roman" w:cstheme="minorHAnsi"/>
+          <w:color w:val="000000"/>
+          <w:lang w:eastAsia="ca-ES"/>
+        </w:rPr>
+        <w:t xml:space="preserve"> (15 - 5 ºC)</w:t>
+      </w:r>
+      <w:r>
+        <w:rPr>
+          <w:rFonts w:eastAsia="Times New Roman" w:cstheme="minorHAnsi"/>
+          <w:color w:val="000000"/>
+          <w:lang w:eastAsia="ca-ES"/>
+        </w:rPr>
+        <w:t xml:space="preserve"> and </w:t>
+      </w:r>
+      <w:r>
+        <w:rPr>
+          <w:rFonts w:eastAsia="Times New Roman" w:cstheme="minorHAnsi"/>
+          <w:color w:val="000000"/>
+          <w:lang w:eastAsia="ca-ES"/>
+        </w:rPr>
+        <w:t xml:space="preserve">(2) </w:t>
+      </w:r>
+      <w:r>
+        <w:rPr>
+          <w:rFonts w:eastAsia="Times New Roman" w:cstheme="minorHAnsi"/>
+          <w:color w:val="000000"/>
+          <w:lang w:eastAsia="ca-ES"/>
+        </w:rPr>
+        <w:t>warm</w:t>
+      </w:r>
+      <w:r>
+        <w:rPr>
+          <w:rFonts w:eastAsia="Times New Roman" w:cstheme="minorHAnsi"/>
+          <w:color w:val="000000"/>
+          <w:lang w:eastAsia="ca-ES"/>
+        </w:rPr>
+        <w:t xml:space="preserve"> (22 - 12ºC)</w:t>
+      </w:r>
+      <w:r>
+        <w:rPr>
+          <w:rFonts w:eastAsia="Times New Roman" w:cstheme="minorHAnsi"/>
+          <w:color w:val="000000"/>
+          <w:lang w:eastAsia="ca-ES"/>
+        </w:rPr>
+        <w:t xml:space="preserve"> </w:t>
+      </w:r>
+      <w:r>
+        <w:rPr>
+          <w:rFonts w:eastAsia="Times New Roman" w:cstheme="minorHAnsi"/>
+          <w:color w:val="000000"/>
+          <w:lang w:eastAsia="ca-ES"/>
+        </w:rPr>
+        <w:t>temperatures</w:t>
+      </w:r>
+      <w:r>
+        <w:rPr>
+          <w:rFonts w:eastAsia="Times New Roman" w:cstheme="minorHAnsi"/>
+          <w:color w:val="000000"/>
+          <w:lang w:eastAsia="ca-ES"/>
+        </w:rPr>
+        <w:t>. The two temperature regimes</w:t>
+      </w:r>
+      <w:r>
+        <w:rPr>
+          <w:rFonts w:eastAsia="Times New Roman" w:cstheme="minorHAnsi"/>
+          <w:color w:val="000000"/>
+          <w:lang w:eastAsia="ca-ES"/>
+        </w:rPr>
+        <w:t xml:space="preserve"> were programmed</w:t>
+      </w:r>
+      <w:r>
+        <w:rPr>
+          <w:rFonts w:eastAsia="Times New Roman" w:cstheme="minorHAnsi"/>
+          <w:color w:val="000000"/>
+          <w:lang w:eastAsia="ca-ES"/>
+        </w:rPr>
+        <w:t xml:space="preserve"> in </w:t>
+      </w:r>
+      <w:r>
+        <w:rPr>
+          <w:rFonts w:eastAsia="Times New Roman" w:cstheme="minorHAnsi"/>
+          <w:color w:val="000000"/>
+          <w:lang w:eastAsia="ca-ES"/>
+        </w:rPr>
+        <w:t>four</w:t>
+      </w:r>
+      <w:r>
+        <w:rPr>
+          <w:rFonts w:eastAsia="Times New Roman" w:cstheme="minorHAnsi"/>
+          <w:color w:val="000000"/>
+          <w:lang w:eastAsia="ca-ES"/>
+        </w:rPr>
+        <w:t xml:space="preserve"> </w:t>
+      </w:r>
+      <w:r>
+        <w:rPr>
+          <w:rFonts w:eastAsia="Times New Roman" w:cstheme="minorHAnsi"/>
+          <w:color w:val="000000"/>
+          <w:lang w:eastAsia="ca-ES"/>
+        </w:rPr>
+        <w:t>different</w:t>
+      </w:r>
+      <w:r>
+        <w:rPr>
+          <w:rFonts w:eastAsia="Times New Roman" w:cstheme="minorHAnsi"/>
+          <w:color w:val="000000"/>
+          <w:lang w:eastAsia="ca-ES"/>
+        </w:rPr>
+        <w:t xml:space="preserve"> climatic</w:t>
+      </w:r>
+      <w:r>
+        <w:rPr>
+          <w:rFonts w:eastAsia="Times New Roman" w:cstheme="minorHAnsi"/>
+          <w:color w:val="000000"/>
+          <w:lang w:eastAsia="ca-ES"/>
+        </w:rPr>
+        <w:t xml:space="preserve"> chambers</w:t>
+      </w:r>
+      <w:r>
+        <w:rPr>
+          <w:rFonts w:eastAsia="Times New Roman" w:cstheme="minorHAnsi"/>
+          <w:color w:val="000000"/>
+          <w:lang w:eastAsia="ca-ES"/>
+        </w:rPr>
+        <w:t xml:space="preserve"> </w:t>
+      </w:r>
+      <w:r>
+        <w:rPr>
+          <w:rFonts w:eastAsia="Times New Roman" w:cstheme="minorHAnsi"/>
+          <w:color w:val="000000"/>
+          <w:lang w:eastAsia="ca-ES"/>
+        </w:rPr>
+        <w:t>i.e. there</w:t>
+      </w:r>
+      <w:r>
+        <w:rPr>
+          <w:rFonts w:eastAsia="Times New Roman" w:cstheme="minorHAnsi"/>
+          <w:color w:val="000000"/>
+          <w:lang w:eastAsia="ca-ES"/>
+        </w:rPr>
+        <w:t xml:space="preserve"> were</w:t>
+      </w:r>
+      <w:r>
+        <w:rPr>
+          <w:rFonts w:eastAsia="Times New Roman" w:cstheme="minorHAnsi"/>
+          <w:color w:val="000000"/>
+          <w:lang w:eastAsia="ca-ES"/>
+        </w:rPr>
+        <w:t xml:space="preserve"> two constant</w:t>
+      </w:r>
+      <w:r>
+        <w:rPr>
+          <w:rFonts w:eastAsia="Times New Roman" w:cstheme="minorHAnsi"/>
+          <w:color w:val="000000"/>
+          <w:lang w:eastAsia="ca-ES"/>
+        </w:rPr>
+        <w:t xml:space="preserve"> (10</w:t>
+      </w:r>
+      <w:r>
+        <w:rPr>
+          <w:rFonts w:eastAsia="Times New Roman" w:cstheme="minorHAnsi"/>
+          <w:color w:val="000000"/>
+          <w:lang w:eastAsia="ca-ES"/>
+        </w:rPr>
+        <w:t>ºC</w:t>
+      </w:r>
+      <w:r>
+        <w:rPr>
+          <w:rFonts w:eastAsia="Times New Roman" w:cstheme="minorHAnsi"/>
+          <w:color w:val="000000"/>
+          <w:lang w:eastAsia="ca-ES"/>
+        </w:rPr>
+        <w:t xml:space="preserve"> vs 17 ºC)</w:t>
+      </w:r>
+      <w:r>
+        <w:rPr>
+          <w:rFonts w:eastAsia="Times New Roman" w:cstheme="minorHAnsi"/>
+          <w:color w:val="000000"/>
+          <w:lang w:eastAsia="ca-ES"/>
+        </w:rPr>
+        <w:t xml:space="preserve"> and two alternating temperature regimes</w:t>
+      </w:r>
+      <w:r>
+        <w:rPr>
+          <w:rFonts w:eastAsia="Times New Roman" w:cstheme="minorHAnsi"/>
+          <w:color w:val="000000"/>
+          <w:lang w:eastAsia="ca-ES"/>
+        </w:rPr>
+        <w:t>.</w:t>
+      </w:r>
+      <w:r>
+        <w:rPr>
+          <w:rFonts w:eastAsia="Times New Roman" w:cstheme="minorHAnsi"/>
+          <w:color w:val="000000"/>
+          <w:lang w:eastAsia="ca-ES"/>
+        </w:rPr>
+        <w:t xml:space="preserve"> </w:t>
+      </w:r>
+      <w:r>
+        <w:rPr>
+          <w:rFonts w:eastAsia="Times New Roman" w:cstheme="minorHAnsi"/>
+          <w:color w:val="000000"/>
+          <w:lang w:eastAsia="ca-ES"/>
+        </w:rPr>
+        <w:t>Before the start of the experiment</w:t>
+      </w:r>
+      <w:r>
+        <w:rPr>
+          <w:rFonts w:eastAsia="Times New Roman" w:cstheme="minorHAnsi"/>
+          <w:color w:val="000000"/>
+          <w:lang w:eastAsia="ca-ES"/>
+        </w:rPr>
+        <w:t xml:space="preserve">, we subjected all seed lots to </w:t>
+      </w:r>
+      <w:r>
+        <w:rPr>
+          <w:rFonts w:eastAsia="Times New Roman" w:cstheme="minorHAnsi"/>
+          <w:color w:val="000000"/>
+          <w:lang w:eastAsia="ca-ES"/>
+        </w:rPr>
+        <w:t xml:space="preserve">a common </w:t>
+      </w:r>
+      <w:r>
+        <w:rPr>
+          <w:rFonts w:eastAsia="Times New Roman" w:cstheme="minorHAnsi"/>
+          <w:color w:val="000000"/>
+          <w:lang w:eastAsia="ca-ES"/>
+        </w:rPr>
+        <w:t>5-month long</w:t>
+      </w:r>
+      <w:r>
+        <w:rPr>
+          <w:rFonts w:eastAsia="Times New Roman" w:cstheme="minorHAnsi"/>
+          <w:color w:val="000000"/>
+          <w:lang w:eastAsia="ca-ES"/>
+        </w:rPr>
+        <w:t xml:space="preserve"> (November</w:t>
+      </w:r>
+      <w:r>
+        <w:rPr>
+          <w:rFonts w:eastAsia="Times New Roman" w:cstheme="minorHAnsi"/>
+          <w:color w:val="000000"/>
+          <w:lang w:eastAsia="ca-ES"/>
+        </w:rPr>
+        <w:t xml:space="preserve"> – </w:t>
+      </w:r>
+      <w:r>
+        <w:rPr>
+          <w:rFonts w:eastAsia="Times New Roman" w:cstheme="minorHAnsi"/>
+          <w:color w:val="000000"/>
+          <w:lang w:eastAsia="ca-ES"/>
+        </w:rPr>
+        <w:t>March</w:t>
+      </w:r>
+      <w:r>
+        <w:rPr>
+          <w:rFonts w:eastAsia="Times New Roman" w:cstheme="minorHAnsi"/>
+          <w:color w:val="000000"/>
+          <w:lang w:eastAsia="ca-ES"/>
+        </w:rPr>
+        <w:t>)</w:t>
+      </w:r>
+      <w:r>
+        <w:rPr>
+          <w:rFonts w:eastAsia="Times New Roman" w:cstheme="minorHAnsi"/>
+          <w:color w:val="000000"/>
+          <w:lang w:eastAsia="ca-ES"/>
+        </w:rPr>
+        <w:t xml:space="preserve"> </w:t>
+      </w:r>
+      <w:r>
+        <w:rPr>
+          <w:rFonts w:eastAsia="Times New Roman" w:cstheme="minorHAnsi"/>
+          <w:color w:val="000000"/>
+          <w:lang w:eastAsia="ca-ES"/>
+        </w:rPr>
+        <w:t>cold-stratification pretreatment</w:t>
+      </w:r>
+      <w:r>
+        <w:rPr>
+          <w:rFonts w:eastAsia="Times New Roman" w:cstheme="minorHAnsi"/>
+          <w:color w:val="000000"/>
+          <w:lang w:eastAsia="ca-ES"/>
+        </w:rPr>
+        <w:t xml:space="preserve"> at 0ºC and darkness</w:t>
+      </w:r>
+      <w:r>
+        <w:rPr>
+          <w:rFonts w:eastAsia="Times New Roman" w:cstheme="minorHAnsi"/>
+          <w:color w:val="000000"/>
+          <w:lang w:eastAsia="ca-ES"/>
+        </w:rPr>
+        <w:t>.</w:t>
+      </w:r>
+      <w:r>
+        <w:rPr>
+          <w:rFonts w:eastAsia="Times New Roman" w:cstheme="minorHAnsi"/>
+          <w:color w:val="000000"/>
+          <w:lang w:eastAsia="ca-ES"/>
+        </w:rPr>
+        <w:t xml:space="preserve"> The pretreatment goal was to mimic </w:t>
+      </w:r>
+      <w:r>
+        <w:rPr>
+          <w:rFonts w:eastAsia="Times New Roman" w:cstheme="minorHAnsi"/>
+          <w:color w:val="000000"/>
+          <w:lang w:eastAsia="ca-ES"/>
+        </w:rPr>
+        <w:t xml:space="preserve">natural </w:t>
+      </w:r>
+      <w:r>
+        <w:rPr>
+          <w:rFonts w:eastAsia="Times New Roman" w:cstheme="minorHAnsi"/>
+          <w:color w:val="000000"/>
+          <w:lang w:eastAsia="ca-ES"/>
+        </w:rPr>
+        <w:t>snow conditions registered in the area</w:t>
+      </w:r>
+      <w:r>
+        <w:rPr>
+          <w:rFonts w:eastAsia="Times New Roman" w:cstheme="minorHAnsi"/>
+          <w:color w:val="000000"/>
+          <w:lang w:eastAsia="ca-ES"/>
+        </w:rPr>
+        <w:t xml:space="preserve"> (</w:t>
+      </w:r>
       <w:r>
         <w:rPr>
           <w:rFonts w:eastAsia="Times New Roman" w:cstheme="minorHAnsi"/>
@@ -5227,464 +4758,7 @@
           <w:highlight w:val="yellow"/>
           <w:lang w:eastAsia="ca-ES"/>
         </w:rPr>
-        <w:t>del</w:t>
-      </w:r>
-      <w:proofErr w:type="gramEnd"/>
-      <w:r>
-        <w:rPr>
-          <w:rFonts w:eastAsia="Times New Roman" w:cstheme="minorHAnsi"/>
-          <w:color w:val="000000"/>
-          <w:highlight w:val="yellow"/>
-          <w:lang w:eastAsia="ca-ES"/>
-        </w:rPr>
-        <w:t xml:space="preserve"> Alba et al. 2024</w:t>
-      </w:r>
-      <w:r>
-        <w:rPr>
-          <w:rFonts w:eastAsia="Times New Roman" w:cstheme="minorHAnsi"/>
-          <w:color w:val="000000"/>
-          <w:lang w:eastAsia="ca-ES"/>
-        </w:rPr>
-        <w:t xml:space="preserve"> found </w:t>
-      </w:r>
-      <w:r>
-        <w:rPr>
-          <w:rFonts w:eastAsia="Times New Roman" w:cstheme="minorHAnsi"/>
-          <w:color w:val="000000"/>
-          <w:lang w:eastAsia="ca-ES"/>
-        </w:rPr>
-        <w:t xml:space="preserve">that </w:t>
-      </w:r>
-      <w:r>
-        <w:rPr>
-          <w:rFonts w:eastAsia="Times New Roman" w:cstheme="minorHAnsi"/>
-          <w:color w:val="000000"/>
-          <w:lang w:eastAsia="ca-ES"/>
-        </w:rPr>
-        <w:t xml:space="preserve">all </w:t>
-      </w:r>
-      <w:r>
-        <w:rPr>
-          <w:rFonts w:eastAsia="Times New Roman" w:cstheme="minorHAnsi"/>
-          <w:color w:val="000000"/>
-          <w:lang w:eastAsia="ca-ES"/>
-        </w:rPr>
-        <w:t xml:space="preserve">species could be divided </w:t>
-      </w:r>
-      <w:r>
-        <w:rPr>
-          <w:rFonts w:eastAsia="Times New Roman" w:cstheme="minorHAnsi"/>
-          <w:color w:val="000000"/>
-          <w:lang w:eastAsia="ca-ES"/>
-        </w:rPr>
-        <w:t xml:space="preserve">in two </w:t>
-      </w:r>
-      <w:r>
-        <w:rPr>
-          <w:rFonts w:eastAsia="Times New Roman" w:cstheme="minorHAnsi"/>
-          <w:color w:val="000000"/>
-          <w:lang w:eastAsia="ca-ES"/>
-        </w:rPr>
-        <w:t xml:space="preserve">optimal </w:t>
-      </w:r>
-      <w:r>
-        <w:rPr>
-          <w:rFonts w:eastAsia="Times New Roman" w:cstheme="minorHAnsi"/>
-          <w:color w:val="000000"/>
-          <w:lang w:eastAsia="ca-ES"/>
-        </w:rPr>
-        <w:t xml:space="preserve">germination </w:t>
-      </w:r>
-      <w:r>
-        <w:rPr>
-          <w:rFonts w:eastAsia="Times New Roman" w:cstheme="minorHAnsi"/>
-          <w:color w:val="000000"/>
-          <w:lang w:eastAsia="ca-ES"/>
-        </w:rPr>
-        <w:t>temperatures</w:t>
-      </w:r>
-      <w:r>
-        <w:rPr>
-          <w:rFonts w:eastAsia="Times New Roman" w:cstheme="minorHAnsi"/>
-          <w:color w:val="000000"/>
-          <w:lang w:eastAsia="ca-ES"/>
-        </w:rPr>
-        <w:t>: (1)</w:t>
-      </w:r>
-      <w:r>
-        <w:rPr>
-          <w:rFonts w:eastAsia="Times New Roman" w:cstheme="minorHAnsi"/>
-          <w:color w:val="000000"/>
-          <w:lang w:eastAsia="ca-ES"/>
-        </w:rPr>
-        <w:t xml:space="preserve"> cold</w:t>
-      </w:r>
-      <w:r>
-        <w:rPr>
-          <w:rFonts w:eastAsia="Times New Roman" w:cstheme="minorHAnsi"/>
-          <w:color w:val="000000"/>
-          <w:lang w:eastAsia="ca-ES"/>
-        </w:rPr>
-        <w:t xml:space="preserve"> (15 - 5 ºC)</w:t>
-      </w:r>
-      <w:r>
-        <w:rPr>
-          <w:rFonts w:eastAsia="Times New Roman" w:cstheme="minorHAnsi"/>
-          <w:color w:val="000000"/>
-          <w:lang w:eastAsia="ca-ES"/>
-        </w:rPr>
-        <w:t xml:space="preserve"> and </w:t>
-      </w:r>
-      <w:r>
-        <w:rPr>
-          <w:rFonts w:eastAsia="Times New Roman" w:cstheme="minorHAnsi"/>
-          <w:color w:val="000000"/>
-          <w:lang w:eastAsia="ca-ES"/>
-        </w:rPr>
-        <w:t xml:space="preserve">(2) </w:t>
-      </w:r>
-      <w:r>
-        <w:rPr>
-          <w:rFonts w:eastAsia="Times New Roman" w:cstheme="minorHAnsi"/>
-          <w:color w:val="000000"/>
-          <w:lang w:eastAsia="ca-ES"/>
-        </w:rPr>
-        <w:t>warm</w:t>
-      </w:r>
-      <w:r>
-        <w:rPr>
-          <w:rFonts w:eastAsia="Times New Roman" w:cstheme="minorHAnsi"/>
-          <w:color w:val="000000"/>
-          <w:lang w:eastAsia="ca-ES"/>
-        </w:rPr>
-        <w:t xml:space="preserve"> (22 - 12ºC)</w:t>
-      </w:r>
-      <w:r>
-        <w:rPr>
-          <w:rFonts w:eastAsia="Times New Roman" w:cstheme="minorHAnsi"/>
-          <w:color w:val="000000"/>
-          <w:lang w:eastAsia="ca-ES"/>
-        </w:rPr>
-        <w:t xml:space="preserve"> </w:t>
-      </w:r>
-      <w:r>
-        <w:rPr>
-          <w:rFonts w:eastAsia="Times New Roman" w:cstheme="minorHAnsi"/>
-          <w:color w:val="000000"/>
-          <w:lang w:eastAsia="ca-ES"/>
-        </w:rPr>
-        <w:t>temperatures</w:t>
-      </w:r>
-      <w:r>
-        <w:rPr>
-          <w:rFonts w:eastAsia="Times New Roman" w:cstheme="minorHAnsi"/>
-          <w:color w:val="000000"/>
-          <w:lang w:eastAsia="ca-ES"/>
-        </w:rPr>
-        <w:t>. The two temperature regimes</w:t>
-      </w:r>
-      <w:r>
-        <w:rPr>
-          <w:rFonts w:eastAsia="Times New Roman" w:cstheme="minorHAnsi"/>
-          <w:color w:val="000000"/>
-          <w:lang w:eastAsia="ca-ES"/>
-        </w:rPr>
-        <w:t xml:space="preserve"> </w:t>
-      </w:r>
-      <w:proofErr w:type="gramStart"/>
-      <w:r>
-        <w:rPr>
-          <w:rFonts w:eastAsia="Times New Roman" w:cstheme="minorHAnsi"/>
-          <w:color w:val="000000"/>
-          <w:lang w:eastAsia="ca-ES"/>
-        </w:rPr>
-        <w:t>were programmed</w:t>
-      </w:r>
-      <w:proofErr w:type="gramEnd"/>
-      <w:r>
-        <w:rPr>
-          <w:rFonts w:eastAsia="Times New Roman" w:cstheme="minorHAnsi"/>
-          <w:color w:val="000000"/>
-          <w:lang w:eastAsia="ca-ES"/>
-        </w:rPr>
-        <w:t xml:space="preserve"> in </w:t>
-      </w:r>
-      <w:r>
-        <w:rPr>
-          <w:rFonts w:eastAsia="Times New Roman" w:cstheme="minorHAnsi"/>
-          <w:color w:val="000000"/>
-          <w:lang w:eastAsia="ca-ES"/>
-        </w:rPr>
-        <w:t>four</w:t>
-      </w:r>
-      <w:r>
-        <w:rPr>
-          <w:rFonts w:eastAsia="Times New Roman" w:cstheme="minorHAnsi"/>
-          <w:color w:val="000000"/>
-          <w:lang w:eastAsia="ca-ES"/>
-        </w:rPr>
-        <w:t xml:space="preserve"> </w:t>
-      </w:r>
-      <w:r>
-        <w:rPr>
-          <w:rFonts w:eastAsia="Times New Roman" w:cstheme="minorHAnsi"/>
-          <w:color w:val="000000"/>
-          <w:lang w:eastAsia="ca-ES"/>
-        </w:rPr>
-        <w:t>different</w:t>
-      </w:r>
-      <w:r>
-        <w:rPr>
-          <w:rFonts w:eastAsia="Times New Roman" w:cstheme="minorHAnsi"/>
-          <w:color w:val="000000"/>
-          <w:lang w:eastAsia="ca-ES"/>
-        </w:rPr>
-        <w:t xml:space="preserve"> climatic</w:t>
-      </w:r>
-      <w:r>
-        <w:rPr>
-          <w:rFonts w:eastAsia="Times New Roman" w:cstheme="minorHAnsi"/>
-          <w:color w:val="000000"/>
-          <w:lang w:eastAsia="ca-ES"/>
-        </w:rPr>
-        <w:t xml:space="preserve"> chambers</w:t>
-      </w:r>
-      <w:r>
-        <w:rPr>
-          <w:rFonts w:eastAsia="Times New Roman" w:cstheme="minorHAnsi"/>
-          <w:color w:val="000000"/>
-          <w:lang w:eastAsia="ca-ES"/>
-        </w:rPr>
-        <w:t xml:space="preserve"> </w:t>
-      </w:r>
-      <w:r>
-        <w:rPr>
-          <w:rFonts w:eastAsia="Times New Roman" w:cstheme="minorHAnsi"/>
-          <w:color w:val="000000"/>
-          <w:lang w:eastAsia="ca-ES"/>
-        </w:rPr>
-        <w:t>i.e. there</w:t>
-      </w:r>
-      <w:r>
-        <w:rPr>
-          <w:rFonts w:eastAsia="Times New Roman" w:cstheme="minorHAnsi"/>
-          <w:color w:val="000000"/>
-          <w:lang w:eastAsia="ca-ES"/>
-        </w:rPr>
-        <w:t xml:space="preserve"> were</w:t>
-      </w:r>
-      <w:r>
-        <w:rPr>
-          <w:rFonts w:eastAsia="Times New Roman" w:cstheme="minorHAnsi"/>
-          <w:color w:val="000000"/>
-          <w:lang w:eastAsia="ca-ES"/>
-        </w:rPr>
-        <w:t xml:space="preserve"> two constant</w:t>
-      </w:r>
-      <w:r>
-        <w:rPr>
-          <w:rFonts w:eastAsia="Times New Roman" w:cstheme="minorHAnsi"/>
-          <w:color w:val="000000"/>
-          <w:lang w:eastAsia="ca-ES"/>
-        </w:rPr>
-        <w:t xml:space="preserve"> (10</w:t>
-      </w:r>
-      <w:r>
-        <w:rPr>
-          <w:rFonts w:eastAsia="Times New Roman" w:cstheme="minorHAnsi"/>
-          <w:color w:val="000000"/>
-          <w:lang w:eastAsia="ca-ES"/>
-        </w:rPr>
-        <w:t>ºC</w:t>
-      </w:r>
-      <w:r>
-        <w:rPr>
-          <w:rFonts w:eastAsia="Times New Roman" w:cstheme="minorHAnsi"/>
-          <w:color w:val="000000"/>
-          <w:lang w:eastAsia="ca-ES"/>
-        </w:rPr>
-        <w:t xml:space="preserve"> vs 17 ºC)</w:t>
-      </w:r>
-      <w:r>
-        <w:rPr>
-          <w:rFonts w:eastAsia="Times New Roman" w:cstheme="minorHAnsi"/>
-          <w:color w:val="000000"/>
-          <w:lang w:eastAsia="ca-ES"/>
-        </w:rPr>
-        <w:t xml:space="preserve"> and two alternating temperature regimes</w:t>
-      </w:r>
-      <w:r>
-        <w:rPr>
-          <w:rFonts w:eastAsia="Times New Roman" w:cstheme="minorHAnsi"/>
-          <w:color w:val="000000"/>
-          <w:lang w:eastAsia="ca-ES"/>
-        </w:rPr>
-        <w:t>.</w:t>
-      </w:r>
-      <w:r>
-        <w:rPr>
-          <w:rFonts w:eastAsia="Times New Roman" w:cstheme="minorHAnsi"/>
-          <w:color w:val="000000"/>
-          <w:lang w:eastAsia="ca-ES"/>
-        </w:rPr>
-        <w:t xml:space="preserve"> </w:t>
-      </w:r>
-      <w:r>
-        <w:rPr>
-          <w:rFonts w:eastAsia="Times New Roman" w:cstheme="minorHAnsi"/>
-          <w:color w:val="000000"/>
-          <w:lang w:eastAsia="ca-ES"/>
-        </w:rPr>
-        <w:t>Before the start of the experiment</w:t>
-      </w:r>
-      <w:r>
-        <w:rPr>
-          <w:rFonts w:eastAsia="Times New Roman" w:cstheme="minorHAnsi"/>
-          <w:color w:val="000000"/>
-          <w:lang w:eastAsia="ca-ES"/>
-        </w:rPr>
-        <w:t xml:space="preserve">, we subjected all seed lots to </w:t>
-      </w:r>
-      <w:r>
-        <w:rPr>
-          <w:rFonts w:eastAsia="Times New Roman" w:cstheme="minorHAnsi"/>
-          <w:color w:val="000000"/>
-          <w:lang w:eastAsia="ca-ES"/>
-        </w:rPr>
-        <w:t xml:space="preserve">a common </w:t>
-      </w:r>
-      <w:r>
-        <w:rPr>
-          <w:rFonts w:eastAsia="Times New Roman" w:cstheme="minorHAnsi"/>
-          <w:color w:val="000000"/>
-          <w:lang w:eastAsia="ca-ES"/>
-        </w:rPr>
-        <w:t>5-month long</w:t>
-      </w:r>
-      <w:r>
-        <w:rPr>
-          <w:rFonts w:eastAsia="Times New Roman" w:cstheme="minorHAnsi"/>
-          <w:color w:val="000000"/>
-          <w:lang w:eastAsia="ca-ES"/>
-        </w:rPr>
-        <w:t xml:space="preserve"> (November</w:t>
-      </w:r>
-      <w:r>
-        <w:rPr>
-          <w:rFonts w:eastAsia="Times New Roman" w:cstheme="minorHAnsi"/>
-          <w:color w:val="000000"/>
-          <w:lang w:eastAsia="ca-ES"/>
-        </w:rPr>
-        <w:t xml:space="preserve"> – </w:t>
-      </w:r>
-      <w:r>
-        <w:rPr>
-          <w:rFonts w:eastAsia="Times New Roman" w:cstheme="minorHAnsi"/>
-          <w:color w:val="000000"/>
-          <w:lang w:eastAsia="ca-ES"/>
-        </w:rPr>
-        <w:t>March</w:t>
-      </w:r>
-      <w:r>
-        <w:rPr>
-          <w:rFonts w:eastAsia="Times New Roman" w:cstheme="minorHAnsi"/>
-          <w:color w:val="000000"/>
-          <w:lang w:eastAsia="ca-ES"/>
-        </w:rPr>
-        <w:t>)</w:t>
-      </w:r>
-      <w:r>
-        <w:rPr>
-          <w:rFonts w:eastAsia="Times New Roman" w:cstheme="minorHAnsi"/>
-          <w:color w:val="000000"/>
-          <w:lang w:eastAsia="ca-ES"/>
-        </w:rPr>
-        <w:t xml:space="preserve"> </w:t>
-      </w:r>
-      <w:r>
-        <w:rPr>
-          <w:rFonts w:eastAsia="Times New Roman" w:cstheme="minorHAnsi"/>
-          <w:color w:val="000000"/>
-          <w:lang w:eastAsia="ca-ES"/>
-        </w:rPr>
-        <w:t>cold-stratification pretreatment</w:t>
-      </w:r>
-      <w:r>
-        <w:rPr>
-          <w:rFonts w:eastAsia="Times New Roman" w:cstheme="minorHAnsi"/>
-          <w:color w:val="000000"/>
-          <w:lang w:eastAsia="ca-ES"/>
-        </w:rPr>
-        <w:t xml:space="preserve"> at 0ºC and darkness</w:t>
-      </w:r>
-      <w:r>
-        <w:rPr>
-          <w:rFonts w:eastAsia="Times New Roman" w:cstheme="minorHAnsi"/>
-          <w:color w:val="000000"/>
-          <w:lang w:eastAsia="ca-ES"/>
-        </w:rPr>
-        <w:t>.</w:t>
-      </w:r>
-      <w:r>
-        <w:rPr>
-          <w:rFonts w:eastAsia="Times New Roman" w:cstheme="minorHAnsi"/>
-          <w:color w:val="000000"/>
-          <w:lang w:eastAsia="ca-ES"/>
-        </w:rPr>
-        <w:t xml:space="preserve"> The pretreatment goal was to mimic </w:t>
-      </w:r>
-      <w:r>
-        <w:rPr>
-          <w:rFonts w:eastAsia="Times New Roman" w:cstheme="minorHAnsi"/>
-          <w:color w:val="000000"/>
-          <w:lang w:eastAsia="ca-ES"/>
-        </w:rPr>
-        <w:t xml:space="preserve">natural </w:t>
-      </w:r>
-      <w:r>
-        <w:rPr>
-          <w:rFonts w:eastAsia="Times New Roman" w:cstheme="minorHAnsi"/>
-          <w:color w:val="000000"/>
-          <w:lang w:eastAsia="ca-ES"/>
-        </w:rPr>
-        <w:t>snow conditions registered in the area</w:t>
-      </w:r>
-      <w:r>
-        <w:rPr>
-          <w:rFonts w:eastAsia="Times New Roman" w:cstheme="minorHAnsi"/>
-          <w:color w:val="000000"/>
-          <w:lang w:eastAsia="ca-ES"/>
-        </w:rPr>
-        <w:t xml:space="preserve"> (</w:t>
-      </w:r>
-      <w:r>
-        <w:rPr>
-          <w:rFonts w:eastAsia="Times New Roman" w:cstheme="minorHAnsi"/>
-          <w:color w:val="000000"/>
-          <w:highlight w:val="yellow"/>
-          <w:lang w:eastAsia="ca-ES"/>
-        </w:rPr>
-        <w:t xml:space="preserve">Espinosa </w:t>
-      </w:r>
-      <w:proofErr w:type="gramStart"/>
-      <w:r>
-        <w:rPr>
-          <w:rFonts w:eastAsia="Times New Roman" w:cstheme="minorHAnsi"/>
-          <w:color w:val="000000"/>
-          <w:highlight w:val="yellow"/>
-          <w:lang w:eastAsia="ca-ES"/>
-        </w:rPr>
-        <w:t>del</w:t>
-      </w:r>
-      <w:proofErr w:type="gramEnd"/>
-      <w:r>
-        <w:rPr>
-          <w:rFonts w:eastAsia="Times New Roman" w:cstheme="minorHAnsi"/>
-          <w:color w:val="000000"/>
-          <w:highlight w:val="yellow"/>
-          <w:lang w:eastAsia="ca-ES"/>
-        </w:rPr>
-        <w:t xml:space="preserve"> Alba et al. 2024</w:t>
+        <w:t>Espinosa del Alba et al. 2024</w:t>
       </w:r>
       <w:r>
         <w:rPr>
@@ -6109,25 +5183,7 @@
           <w:color w:val="000000"/>
           <w:lang w:eastAsia="ca-ES"/>
         </w:rPr>
-        <w:t xml:space="preserve">Once the </w:t>
-      </w:r>
-      <w:proofErr w:type="spellStart"/>
-      <w:r>
-        <w:rPr>
-          <w:rFonts w:eastAsia="Times New Roman" w:cstheme="minorHAnsi"/>
-          <w:color w:val="000000"/>
-          <w:lang w:eastAsia="ca-ES"/>
-        </w:rPr>
-        <w:t>pretreatment</w:t>
-      </w:r>
-      <w:proofErr w:type="spellEnd"/>
-      <w:r>
-        <w:rPr>
-          <w:rFonts w:eastAsia="Times New Roman" w:cstheme="minorHAnsi"/>
-          <w:color w:val="000000"/>
-          <w:lang w:eastAsia="ca-ES"/>
-        </w:rPr>
-        <w:t xml:space="preserve"> ended</w:t>
+        <w:t>Once the pretreatment ended</w:t>
       </w:r>
       <w:r>
         <w:rPr>
@@ -6143,16 +5199,39 @@
           <w:color w:val="000000"/>
           <w:lang w:eastAsia="ca-ES"/>
         </w:rPr>
-        <w:t xml:space="preserve">seed </w:t>
-      </w:r>
-      <w:proofErr w:type="gramStart"/>
-      <w:r>
-        <w:rPr>
-          <w:rFonts w:eastAsia="Times New Roman" w:cstheme="minorHAnsi"/>
-          <w:color w:val="000000"/>
-          <w:lang w:eastAsia="ca-ES"/>
-        </w:rPr>
-        <w:t>were</w:t>
+        <w:t>n</w:t>
+      </w:r>
+      <w:r>
+        <w:rPr>
+          <w:rFonts w:eastAsia="Times New Roman" w:cstheme="minorHAnsi"/>
+          <w:color w:val="000000"/>
+          <w:lang w:eastAsia="ca-ES"/>
+        </w:rPr>
+        <w:t xml:space="preserve">on-germinated </w:t>
+      </w:r>
+      <w:r>
+        <w:rPr>
+          <w:rFonts w:eastAsia="Times New Roman" w:cstheme="minorHAnsi"/>
+          <w:color w:val="000000"/>
+          <w:lang w:eastAsia="ca-ES"/>
+        </w:rPr>
+        <w:t>seed</w:t>
+      </w:r>
+      <w:r>
+        <w:rPr>
+          <w:rFonts w:eastAsia="Times New Roman" w:cstheme="minorHAnsi"/>
+          <w:color w:val="000000"/>
+          <w:lang w:eastAsia="ca-ES"/>
+        </w:rPr>
+        <w:t>s</w:t>
+      </w:r>
+      <w:r>
+        <w:rPr>
+          <w:rFonts w:eastAsia="Times New Roman" w:cstheme="minorHAnsi"/>
+          <w:color w:val="000000"/>
+          <w:lang w:eastAsia="ca-ES"/>
+        </w:rPr>
+        <w:t xml:space="preserve"> were</w:t>
       </w:r>
       <w:r>
         <w:rPr>
@@ -6173,410 +5252,386 @@
       <w:r>
         <w:t>90 mm Ø Petri dishes with two layers of filter paper (</w:t>
       </w:r>
-      <w:proofErr w:type="spellStart"/>
-      <w:r>
-        <w:rPr>
-          <w:rFonts w:eastAsia="Times New Roman" w:cstheme="minorHAnsi"/>
-          <w:color w:val="000000"/>
-          <w:lang w:eastAsia="ca-ES"/>
-        </w:rPr>
-        <w:t>Filtros</w:t>
-      </w:r>
-      <w:proofErr w:type="spellEnd"/>
-      <w:r>
-        <w:rPr>
-          <w:rFonts w:eastAsia="Times New Roman" w:cstheme="minorHAnsi"/>
-          <w:color w:val="000000"/>
-          <w:lang w:eastAsia="ca-ES"/>
-        </w:rPr>
+      <w:r>
+        <w:rPr>
+          <w:rFonts w:eastAsia="Times New Roman" w:cstheme="minorHAnsi"/>
+          <w:color w:val="000000"/>
+          <w:lang w:eastAsia="ca-ES"/>
+        </w:rPr>
+        <w:t>Filtros Anoia S.A. paper for germination assays, Ref.518G085</w:t>
+      </w:r>
+      <w:r>
+        <w:t>)</w:t>
+      </w:r>
+      <w:r>
+        <w:t xml:space="preserve"> and sealed with parafilm</w:t>
+      </w:r>
+      <w:r>
+        <w:t>.</w:t>
+      </w:r>
+      <w:r>
         <w:t xml:space="preserve"> </w:t>
       </w:r>
-      <w:proofErr w:type="spellStart"/>
-      <w:r>
-        <w:rPr>
-          <w:rFonts w:eastAsia="Times New Roman" w:cstheme="minorHAnsi"/>
-          <w:color w:val="000000"/>
-          <w:lang w:eastAsia="ca-ES"/>
-        </w:rPr>
-        <w:t>Anoia</w:t>
-      </w:r>
-      <w:proofErr w:type="spellEnd"/>
-      <w:r>
-        <w:rPr>
-          <w:rFonts w:eastAsia="Times New Roman" w:cstheme="minorHAnsi"/>
-          <w:color w:val="000000"/>
-          <w:lang w:eastAsia="ca-ES"/>
-        </w:rPr>
-        <w:t xml:space="preserve"> S.A. paper for germination assays, Ref.518G085</w:t>
-      </w:r>
-      <w:r>
-        <w:t>)</w:t>
+      <w:r>
+        <w:t xml:space="preserve">Firstly, </w:t>
+      </w:r>
+      <w:r>
+        <w:t xml:space="preserve">we transferred </w:t>
+      </w:r>
+      <w:r>
+        <w:t xml:space="preserve">the </w:t>
+      </w:r>
+      <w:r>
+        <w:t>seed</w:t>
+      </w:r>
+      <w:r>
+        <w:t>s</w:t>
+      </w:r>
+      <w:r>
+        <w:t xml:space="preserve"> for </w:t>
+      </w:r>
+      <w:r>
+        <w:t>Darkness</w:t>
+      </w:r>
+      <w:r>
+        <w:t xml:space="preserve"> treatment, </w:t>
+      </w:r>
+      <w:r>
+        <w:t xml:space="preserve">added 6ml of distilled water, sealed with parafilm </w:t>
+      </w:r>
+      <w:r>
+        <w:t xml:space="preserve">and </w:t>
+      </w:r>
+      <w:r>
+        <w:t>immediately</w:t>
+      </w:r>
+      <w:r>
+        <w:t xml:space="preserve"> cover them with two layers aluminium foil</w:t>
+      </w:r>
+      <w:r>
+        <w:t xml:space="preserve">. </w:t>
+      </w:r>
+      <w:r>
+        <w:t xml:space="preserve">Next, we transfer the seeds for the </w:t>
+      </w:r>
+      <w:r>
+        <w:t>Water stress</w:t>
+      </w:r>
+      <w:r>
+        <w:t xml:space="preserve"> </w:t>
+      </w:r>
+      <w:r>
+        <w:t>treatme</w:t>
+      </w:r>
+      <w:r>
+        <w:t>nt</w:t>
+      </w:r>
+      <w:r>
+        <w:t xml:space="preserve">, where instead of distilled water we added 6ml of </w:t>
+      </w:r>
+      <w:r>
+        <w:t>a polyethylene solution (PEG</w:t>
+      </w:r>
+      <w:r>
+        <w:t xml:space="preserve"> 6000</w:t>
+      </w:r>
+      <w:r>
+        <w:t xml:space="preserve">) </w:t>
+      </w:r>
+      <w:r>
+        <w:t xml:space="preserve">to simulate a -0.6 </w:t>
+      </w:r>
+      <w:r>
+        <w:lastRenderedPageBreak/>
+        <w:t>Mpa of water potential</w:t>
       </w:r>
       <w:r>
         <w:t xml:space="preserve"> and sealed with parafilm</w:t>
       </w:r>
-      <w:proofErr w:type="gramEnd"/>
-      <w:r>
-        <w:t>.</w:t>
+      <w:r>
+        <w:t xml:space="preserve">. </w:t>
+      </w:r>
+      <w:r>
+        <w:t xml:space="preserve">As </w:t>
+      </w:r>
+      <w:r>
+        <w:t>PEG solutions depend on experimental temperatures, t</w:t>
+      </w:r>
+      <w:r>
+        <w:t xml:space="preserve">wo </w:t>
+      </w:r>
+      <w:r>
+        <w:t xml:space="preserve">PEG solutions </w:t>
+      </w:r>
+      <w:r>
+        <w:t xml:space="preserve">were prepared </w:t>
+      </w:r>
+      <w:r>
+        <w:t xml:space="preserve">according to </w:t>
+      </w:r>
+      <w:r>
+        <w:fldChar w:fldCharType="begin" w:fldLock="1"/>
+      </w:r>
+      <w:r>
+        <w:instrText>ADDIN CSL_CITATION {"citationItems":[{"id":"ITEM-1","itemData":{"author":[{"dropping-particle":"","family":"Michel","given":"Burlyn E","non-dropping-particle":"","parse-names":false,"suffix":""},{"dropping-particle":"","family":"Kaufmann","given":"Merrill R","non-dropping-particle":"","parse-names":false,"suffix":""}],"id":"ITEM-1","issued":{"date-parts":[["1973"]]},"page":"914-916","title":"The Osmotic Potential of Polyethylene Glycol 60001","type":"article-journal"},"uris":["http://www.mendeley.com/documents/?uuid=5dcd3d1a-bbf4-4c97-b53e-728b84b2c212","http://www.mendeley.com/documents/?uuid=8bae9792-5df1-46d8-a9f4-b2080aa2e458"]}],"mendeley":{"formattedCitation":"(Michel &amp; Kaufmann 1973)","manualFormatting":"Michel &amp; Kaufmann (1973)","plainTextFormattedCitation":"(Michel &amp; Kaufmann 1973)","previouslyFormattedCitation":"(Michel &amp; Kaufmann 1973)"},"properties":{"noteIndex":0},"schema":"https://github.com/citation-style-language/schema/raw/master/csl-citation.json"}</w:instrText>
+      </w:r>
+      <w:r>
+        <w:fldChar w:fldCharType="separate"/>
+      </w:r>
+      <w:r>
+        <w:rPr>
+          <w:noProof/>
+        </w:rPr>
+        <w:t>Michel &amp; Kaufmann (1973)</w:t>
+      </w:r>
+      <w:r>
+        <w:fldChar w:fldCharType="end"/>
+      </w:r>
+      <w:r>
+        <w:t xml:space="preserve"> and </w:t>
+      </w:r>
+      <w:r>
+        <w:fldChar w:fldCharType="begin" w:fldLock="1"/>
+      </w:r>
+      <w:r>
+        <w:instrText>ADDIN CSL_CITATION {"citationItems":[{"id":"ITEM-1","itemData":{"ISBN":"1678-3921","ISSN":"1678-3921","abstract":"Um expressivo número de pesquisas vem sendo desenvolvido na área de pré-condicionamento em sementes. Na busca de contribuir com os técnicos envolvidos em pes­quisas nesta área, procurou-se através da inter-relação entre a Termodinâmica e a Tecnologia de Sementes caracterizar potenciais hídrico, osmótico, mátrico e de pressão e, a partir do tra­balho de Michel &amp; Kaufmann (1973), construir uma tabela associando potencial osmótico, concentração de polietileno glicol 6000 e temperatura.","author":[{"dropping-particle":"","family":"Villela","given":"Francisco Amaral","non-dropping-particle":"","parse-names":false,"suffix":""},{"dropping-particle":"","family":"Doni Filho","given":"Luiz","non-dropping-particle":"","parse-names":false,"suffix":""},{"dropping-particle":"","family":"Sequeira","given":"Eliseo Lecrerc","non-dropping-particle":"","parse-names":false,"suffix":""}],"container-title":"Pesquisa Agropecuária Brasileira","id":"ITEM-1","issue":"11/12","issued":{"date-parts":[["1991"]]},"page":"1957-1968","title":"Tabela de potencial osmótico em função da concentração de polietileno glicol 6.000 e da temperatura","type":"article-journal","volume":"26"},"uris":["http://www.mendeley.com/documents/?uuid=309ba047-c4bd-4f3c-8de0-e44ba85df0c4"]}],"mendeley":{"formattedCitation":"(Villela et al. 1991)","manualFormatting":"Villela et al. (1991)","plainTextFormattedCitation":"(Villela et al. 1991)","previouslyFormattedCitation":"(Villela et al. 1991)"},"properties":{"noteIndex":0},"schema":"https://github.com/citation-style-language/schema/raw/master/csl-citation.json"}</w:instrText>
+      </w:r>
+      <w:r>
+        <w:fldChar w:fldCharType="separate"/>
+      </w:r>
+      <w:r>
+        <w:rPr>
+          <w:noProof/>
+        </w:rPr>
+        <w:t xml:space="preserve">Villela et al. </w:t>
+      </w:r>
+      <w:r>
+        <w:rPr>
+          <w:noProof/>
+        </w:rPr>
+        <w:t>(</w:t>
+      </w:r>
+      <w:r>
+        <w:rPr>
+          <w:noProof/>
+        </w:rPr>
+        <w:t>1991)</w:t>
+      </w:r>
+      <w:r>
+        <w:fldChar w:fldCharType="end"/>
+      </w:r>
+      <w:r>
+        <w:t xml:space="preserve"> to reach desired osmotic potentials at </w:t>
+      </w:r>
+      <w:r>
+        <w:t xml:space="preserve">10 ºC </w:t>
+      </w:r>
+      <w:r>
+        <w:t xml:space="preserve">and </w:t>
+      </w:r>
+      <w:r>
+        <w:t>17</w:t>
+      </w:r>
+      <w:r>
+        <w:t>ºC</w:t>
       </w:r>
       <w:r>
         <w:t xml:space="preserve"> </w:t>
       </w:r>
       <w:r>
-        <w:t xml:space="preserve">Firstly, </w:t>
-      </w:r>
-      <w:r>
-        <w:t xml:space="preserve">we transferred </w:t>
-      </w:r>
-      <w:r>
-        <w:t xml:space="preserve">the </w:t>
-      </w:r>
-      <w:r>
-        <w:t>seed</w:t>
+        <w:t xml:space="preserve">depending on species optimal germination temperature. </w:t>
+      </w:r>
+      <w:r>
+        <w:t xml:space="preserve"> </w:t>
+      </w:r>
+      <w:r>
+        <w:t xml:space="preserve">Finally, </w:t>
+      </w:r>
+      <w:r>
+        <w:t>the rest of the seed</w:t>
       </w:r>
       <w:r>
         <w:t>s</w:t>
       </w:r>
       <w:r>
-        <w:t xml:space="preserve"> for </w:t>
-      </w:r>
-      <w:r>
-        <w:t>Darkness</w:t>
-      </w:r>
-      <w:r>
-        <w:t xml:space="preserve"> treatment, </w:t>
-      </w:r>
-      <w:r>
-        <w:t xml:space="preserve">added 6ml of distilled water, sealed with parafilm </w:t>
-      </w:r>
-      <w:r>
-        <w:t xml:space="preserve">and </w:t>
-      </w:r>
-      <w:r>
-        <w:t>immediately</w:t>
-      </w:r>
-      <w:r>
-        <w:t xml:space="preserve"> cover them with two layers aluminium foil</w:t>
+        <w:t xml:space="preserve"> were divided between </w:t>
+      </w:r>
+      <w:r>
+        <w:t>control</w:t>
+      </w:r>
+      <w:r>
+        <w:t xml:space="preserve"> and constant</w:t>
+      </w:r>
+      <w:r>
+        <w:t xml:space="preserve"> temperature</w:t>
+      </w:r>
+      <w:r>
+        <w:t xml:space="preserve"> treatments</w:t>
+      </w:r>
+      <w:r>
+        <w:t xml:space="preserve">, </w:t>
+      </w:r>
+      <w:r>
+        <w:t>added 6ml of distilled water and sealed with parafilm</w:t>
       </w:r>
       <w:r>
         <w:t xml:space="preserve">. </w:t>
       </w:r>
       <w:r>
-        <w:t xml:space="preserve">Next, we transfer the seeds for the </w:t>
-      </w:r>
-      <w:r>
-        <w:t>Water stress</w:t>
-      </w:r>
-      <w:r>
+        <w:rPr>
+          <w:rFonts w:cstheme="minorHAnsi"/>
+        </w:rPr>
+        <w:t xml:space="preserve">We checked </w:t>
+      </w:r>
+      <w:r>
+        <w:rPr>
+          <w:rFonts w:cstheme="minorHAnsi"/>
+        </w:rPr>
+        <w:t xml:space="preserve">germination </w:t>
+      </w:r>
+      <w:r>
+        <w:rPr>
+          <w:rFonts w:cstheme="minorHAnsi"/>
+        </w:rPr>
+        <w:t>right after cold stratification pretreatment</w:t>
+      </w:r>
+      <w:r>
+        <w:rPr>
+          <w:rFonts w:cstheme="minorHAnsi"/>
+        </w:rPr>
+        <w:t>, as a proxy of species ability to germinate under snow-like conditions</w:t>
+      </w:r>
+      <w:r>
+        <w:rPr>
+          <w:rFonts w:cstheme="minorHAnsi"/>
+        </w:rPr>
+        <w:t xml:space="preserve"> to have extra information</w:t>
+      </w:r>
+      <w:r>
+        <w:rPr>
+          <w:rFonts w:cstheme="minorHAnsi"/>
+        </w:rPr>
+        <w:t xml:space="preserve"> to include in niche dissimilarity analysis, </w:t>
+      </w:r>
+      <w:r>
+        <w:rPr>
+          <w:rFonts w:eastAsia="Times New Roman" w:cstheme="minorHAnsi"/>
+          <w:color w:val="000000"/>
+          <w:lang w:eastAsia="ca-ES"/>
+        </w:rPr>
+        <w:t>one species (</w:t>
+      </w:r>
+      <w:r>
+        <w:rPr>
+          <w:rFonts w:eastAsia="Times New Roman" w:cstheme="minorHAnsi"/>
+          <w:i/>
+          <w:color w:val="000000"/>
+          <w:lang w:eastAsia="ca-ES"/>
+        </w:rPr>
+        <w:t>Teesdalia conferta</w:t>
+      </w:r>
+      <w:r>
+        <w:rPr>
+          <w:rFonts w:eastAsia="Times New Roman" w:cstheme="minorHAnsi"/>
+          <w:color w:val="000000"/>
+          <w:lang w:eastAsia="ca-ES"/>
+        </w:rPr>
+        <w:t>) germinated to 100% thus was removed from germination treatments analysis</w:t>
+      </w:r>
+      <w:r>
+        <w:rPr>
+          <w:rFonts w:cstheme="minorHAnsi"/>
+        </w:rPr>
+        <w:t>. Fr</w:t>
+      </w:r>
+      <w:r>
+        <w:rPr>
+          <w:rFonts w:cstheme="minorHAnsi"/>
+        </w:rPr>
+        <w:t>o</w:t>
+      </w:r>
+      <w:r>
+        <w:rPr>
+          <w:rFonts w:cstheme="minorHAnsi"/>
+        </w:rPr>
+        <w:t>m there</w:t>
+      </w:r>
+      <w:r>
+        <w:rPr>
+          <w:rFonts w:cstheme="minorHAnsi"/>
+        </w:rPr>
+        <w:t xml:space="preserve"> on,</w:t>
+      </w:r>
+      <w:r>
+        <w:rPr>
+          <w:rFonts w:cstheme="minorHAnsi"/>
+        </w:rPr>
+        <w:t xml:space="preserve"> we checked</w:t>
+      </w:r>
+      <w:r>
+        <w:rPr>
+          <w:rFonts w:cstheme="minorHAnsi"/>
+        </w:rPr>
         <w:t xml:space="preserve"> </w:t>
       </w:r>
       <w:r>
-        <w:t>treatme</w:t>
-      </w:r>
-      <w:r>
-        <w:t>nt</w:t>
-      </w:r>
-      <w:r>
-        <w:t xml:space="preserve">, where instead of distilled water we added 6ml of </w:t>
-      </w:r>
-      <w:r>
-        <w:t>a polyethylene solution (PEG</w:t>
-      </w:r>
-      <w:r>
-        <w:t xml:space="preserve"> 6000</w:t>
-      </w:r>
-      <w:r>
-        <w:t xml:space="preserve">) </w:t>
-      </w:r>
-      <w:r>
-        <w:t xml:space="preserve">to simulate a -0.6 </w:t>
-      </w:r>
-      <w:proofErr w:type="spellStart"/>
-      <w:r>
-        <w:t>Mpa</w:t>
-      </w:r>
-      <w:proofErr w:type="spellEnd"/>
-      <w:r>
-        <w:t xml:space="preserve"> of water potential</w:t>
-      </w:r>
-      <w:r>
-        <w:t xml:space="preserve"> and sealed </w:t>
-      </w:r>
-      <w:r>
-        <w:lastRenderedPageBreak/>
-        <w:t>with parafilm</w:t>
-      </w:r>
-      <w:r>
-        <w:t xml:space="preserve">. </w:t>
-      </w:r>
-      <w:r>
-        <w:t xml:space="preserve">As </w:t>
-      </w:r>
-      <w:r>
-        <w:t>PEG solutions depend on experimental temperatures, t</w:t>
-      </w:r>
-      <w:r>
-        <w:t xml:space="preserve">wo </w:t>
-      </w:r>
-      <w:r>
-        <w:t xml:space="preserve">PEG solutions </w:t>
-      </w:r>
-      <w:r>
-        <w:t xml:space="preserve">were prepared </w:t>
-      </w:r>
-      <w:r>
-        <w:t xml:space="preserve">according to </w:t>
-      </w:r>
-      <w:r>
-        <w:fldChar w:fldCharType="begin" w:fldLock="1"/>
-      </w:r>
-      <w:r>
-        <w:instrText>ADDIN CSL_CITATION {"citationItems":[{"id":"ITEM-1","itemData":{"author":[{"dropping-particle":"","family":"Michel","given":"Burlyn E","non-dropping-particle":"","parse-names":false,"suffix":""},{"dropping-particle":"","family":"Kaufmann","given":"Merrill R","non-dropping-particle":"","parse-names":false,"suffix":""}],"id":"ITEM-1","issued":{"date-parts":[["1973"]]},"page":"914-916","title":"The Osmotic Potential of Polyethylene Glycol 60001","type":"article-journal"},"uris":["http://www.mendeley.com/documents/?uuid=5dcd3d1a-bbf4-4c97-b53e-728b84b2c212","http://www.mendeley.com/documents/?uuid=8bae9792-5df1-46d8-a9f4-b2080aa2e458"]}],"mendeley":{"formattedCitation":"(Michel &amp; Kaufmann 1973)","manualFormatting":"Michel &amp; Kaufmann (1973)","plainTextFormattedCitation":"(Michel &amp; Kaufmann 1973)","previouslyFormattedCitation":"(Michel &amp; Kaufmann 1973)"},"properties":{"noteIndex":0},"schema":"https://github.com/citation-style-language/schema/raw/master/csl-citation.json"}</w:instrText>
-      </w:r>
-      <w:r>
-        <w:fldChar w:fldCharType="separate"/>
-      </w:r>
-      <w:r>
-        <w:rPr>
-          <w:noProof/>
-        </w:rPr>
-        <w:t>Michel &amp; Kaufmann (1973)</w:t>
-      </w:r>
-      <w:r>
-        <w:fldChar w:fldCharType="end"/>
-      </w:r>
-      <w:r>
-        <w:t xml:space="preserve"> and </w:t>
-      </w:r>
-      <w:r>
-        <w:fldChar w:fldCharType="begin" w:fldLock="1"/>
-      </w:r>
-      <w:r>
-        <w:instrText>ADDIN CSL_CITATION {"citationItems":[{"id":"ITEM-1","itemData":{"ISBN":"1678-3921","ISSN":"1678-3921","abstract":"Um expressivo número de pesquisas vem sendo desenvolvido na área de pré-condicionamento em sementes. Na busca de contribuir com os técnicos envolvidos em pes­quisas nesta área, procurou-se através da inter-relação entre a Termodinâmica e a Tecnologia de Sementes caracterizar potenciais hídrico, osmótico, mátrico e de pressão e, a partir do tra­balho de Michel &amp; Kaufmann (1973), construir uma tabela associando potencial osmótico, concentração de polietileno glicol 6000 e temperatura.","author":[{"dropping-particle":"","family":"Villela","given":"Francisco Amaral","non-dropping-particle":"","parse-names":false,"suffix":""},{"dropping-particle":"","family":"Doni Filho","given":"Luiz","non-dropping-particle":"","parse-names":false,"suffix":""},{"dropping-particle":"","family":"Sequeira","given":"Eliseo Lecrerc","non-dropping-particle":"","parse-names":false,"suffix":""}],"container-title":"Pesquisa Agropecuária Brasileira","id":"ITEM-1","issue":"11/12","issued":{"date-parts":[["1991"]]},"page":"1957-1968","title":"Tabela de potencial osmótico em função da concentração de polietileno glicol 6.000 e da temperatura","type":"article-journal","volume":"26"},"uris":["http://www.mendeley.com/documents/?uuid=309ba047-c4bd-4f3c-8de0-e44ba85df0c4"]}],"mendeley":{"formattedCitation":"(Villela et al. 1991)","manualFormatting":"Villela et al. (1991)","plainTextFormattedCitation":"(Villela et al. 1991)","previouslyFormattedCitation":"(Villela et al. 1991)"},"properties":{"noteIndex":0},"schema":"https://github.com/citation-style-language/schema/raw/master/csl-citation.json"}</w:instrText>
-      </w:r>
-      <w:r>
-        <w:fldChar w:fldCharType="separate"/>
-      </w:r>
-      <w:r>
-        <w:rPr>
-          <w:noProof/>
-        </w:rPr>
-        <w:t xml:space="preserve">Villela et al. </w:t>
-      </w:r>
-      <w:r>
-        <w:rPr>
-          <w:noProof/>
-        </w:rPr>
-        <w:t>(</w:t>
-      </w:r>
-      <w:r>
-        <w:rPr>
-          <w:noProof/>
-        </w:rPr>
-        <w:t>1991)</w:t>
-      </w:r>
-      <w:r>
-        <w:fldChar w:fldCharType="end"/>
-      </w:r>
-      <w:r>
-        <w:t xml:space="preserve"> to reach desired osmotic potentials at </w:t>
-      </w:r>
-      <w:r>
-        <w:t xml:space="preserve">10 ºC </w:t>
-      </w:r>
-      <w:r>
-        <w:t xml:space="preserve">and </w:t>
-      </w:r>
-      <w:r>
-        <w:t>17</w:t>
-      </w:r>
-      <w:r>
-        <w:t>ºC</w:t>
-      </w:r>
-      <w:r>
+        <w:rPr>
+          <w:rFonts w:cstheme="minorHAnsi"/>
+        </w:rPr>
+        <w:t>germination</w:t>
+      </w:r>
+      <w:r>
+        <w:rPr>
+          <w:rFonts w:eastAsia="Times New Roman" w:cstheme="minorHAnsi"/>
+          <w:color w:val="000000"/>
+          <w:lang w:eastAsia="ca-ES"/>
+        </w:rPr>
         <w:t xml:space="preserve"> </w:t>
       </w:r>
       <w:r>
-        <w:t xml:space="preserve">depending on species optimal germination temperature. </w:t>
-      </w:r>
-      <w:r>
-        <w:t xml:space="preserve"> </w:t>
-      </w:r>
-      <w:r>
-        <w:t xml:space="preserve">Finally, </w:t>
-      </w:r>
-      <w:r>
-        <w:t xml:space="preserve">the rest of the seed </w:t>
-      </w:r>
-      <w:proofErr w:type="gramStart"/>
-      <w:r>
-        <w:t>were divided</w:t>
-      </w:r>
-      <w:proofErr w:type="gramEnd"/>
-      <w:r>
-        <w:t xml:space="preserve"> between </w:t>
-      </w:r>
-      <w:r>
-        <w:t>control</w:t>
-      </w:r>
-      <w:r>
-        <w:t xml:space="preserve"> and constant</w:t>
-      </w:r>
-      <w:r>
-        <w:t xml:space="preserve"> temperature</w:t>
-      </w:r>
-      <w:r>
-        <w:t xml:space="preserve"> treatments</w:t>
-      </w:r>
-      <w:r>
-        <w:t xml:space="preserve">, </w:t>
-      </w:r>
-      <w:r>
-        <w:t>added 6ml of distilled water and sealed with parafilm</w:t>
-      </w:r>
-      <w:r>
-        <w:t xml:space="preserve">. </w:t>
-      </w:r>
-      <w:r>
         <w:rPr>
           <w:rFonts w:cstheme="minorHAnsi"/>
         </w:rPr>
-        <w:t xml:space="preserve">We checked </w:t>
+        <w:t xml:space="preserve">every </w:t>
       </w:r>
       <w:r>
         <w:rPr>
           <w:rFonts w:cstheme="minorHAnsi"/>
         </w:rPr>
-        <w:t xml:space="preserve">germination </w:t>
+        <w:t xml:space="preserve">week </w:t>
       </w:r>
       <w:r>
         <w:rPr>
           <w:rFonts w:cstheme="minorHAnsi"/>
         </w:rPr>
-        <w:t>right after cold stratification pretreatment</w:t>
+        <w:t>until the end of the experiment</w:t>
       </w:r>
       <w:r>
         <w:rPr>
           <w:rFonts w:cstheme="minorHAnsi"/>
         </w:rPr>
-        <w:t>, as a proxy of species ability to germinate under snow-like conditions</w:t>
+        <w:t xml:space="preserve"> (6 weeks)</w:t>
       </w:r>
       <w:r>
         <w:rPr>
           <w:rFonts w:cstheme="minorHAnsi"/>
         </w:rPr>
-        <w:t xml:space="preserve"> to have extra information</w:t>
+        <w:t xml:space="preserve">. We removed seeds from the petri dishes once </w:t>
+      </w:r>
+      <w:r>
+        <w:rPr>
+          <w:rFonts w:eastAsia="Times New Roman" w:cstheme="minorHAnsi"/>
+          <w:color w:val="000000"/>
+          <w:lang w:eastAsia="ca-ES"/>
+        </w:rPr>
+        <w:t>germination occurred (radicle &gt; 1.5 mm long). At the end of the experiment, we cut open non-germinated seeds under the binocular loupe to visually assess if they were empty, infected, or seemed normal. We considered seeds</w:t>
       </w:r>
       <w:r>
         <w:rPr>
           <w:rFonts w:cstheme="minorHAnsi"/>
-        </w:rPr>
-        <w:t>. Fr</w:t>
-      </w:r>
-      <w:r>
-        <w:rPr>
-          <w:rFonts w:cstheme="minorHAnsi"/>
-        </w:rPr>
-        <w:t>o</w:t>
-      </w:r>
-      <w:r>
-        <w:rPr>
-          <w:rFonts w:cstheme="minorHAnsi"/>
-        </w:rPr>
-        <w:t>m there</w:t>
-      </w:r>
-      <w:r>
-        <w:rPr>
-          <w:rFonts w:cstheme="minorHAnsi"/>
-        </w:rPr>
-        <w:t xml:space="preserve"> on,</w:t>
-      </w:r>
-      <w:r>
-        <w:rPr>
-          <w:rFonts w:cstheme="minorHAnsi"/>
-        </w:rPr>
-        <w:t xml:space="preserve"> we checked</w:t>
-      </w:r>
-      <w:r>
-        <w:rPr>
-          <w:rFonts w:cstheme="minorHAnsi"/>
-        </w:rPr>
-        <w:t xml:space="preserve"> </w:t>
-      </w:r>
-      <w:r>
-        <w:rPr>
-          <w:rFonts w:cstheme="minorHAnsi"/>
-        </w:rPr>
-        <w:t>germination</w:t>
-      </w:r>
-      <w:r>
-        <w:rPr>
-          <w:rFonts w:eastAsia="Times New Roman" w:cstheme="minorHAnsi"/>
-          <w:color w:val="000000"/>
-          <w:lang w:eastAsia="ca-ES"/>
-        </w:rPr>
-        <w:t xml:space="preserve"> </w:t>
-      </w:r>
-      <w:r>
-        <w:rPr>
-          <w:rFonts w:cstheme="minorHAnsi"/>
-        </w:rPr>
-        <w:t xml:space="preserve">every </w:t>
-      </w:r>
-      <w:r>
-        <w:rPr>
-          <w:rFonts w:cstheme="minorHAnsi"/>
-        </w:rPr>
-        <w:t xml:space="preserve">week </w:t>
-      </w:r>
-      <w:r>
-        <w:rPr>
-          <w:rFonts w:cstheme="minorHAnsi"/>
-        </w:rPr>
-        <w:t>until the end of the experiment</w:t>
-      </w:r>
-      <w:r>
-        <w:rPr>
-          <w:rFonts w:cstheme="minorHAnsi"/>
-        </w:rPr>
-        <w:t xml:space="preserve"> (6 weeks)</w:t>
-      </w:r>
-      <w:r>
-        <w:rPr>
-          <w:rFonts w:cstheme="minorHAnsi"/>
-        </w:rPr>
-        <w:t xml:space="preserve">. We removed seeds from the petri dishes once </w:t>
-      </w:r>
-      <w:r>
-        <w:rPr>
-          <w:rFonts w:eastAsia="Times New Roman" w:cstheme="minorHAnsi"/>
-          <w:color w:val="000000"/>
-          <w:lang w:eastAsia="ca-ES"/>
-        </w:rPr>
-        <w:t>germination occurred (radicle &gt; 1.5 mm long). At the end of the experiment, we cut open non-germinated seeds under the binocular loupe to visually assess if they were empty, infected, or seemed normal. We considered seeds</w:t>
-      </w:r>
-      <w:r>
-        <w:rPr>
-          <w:rFonts w:cstheme="minorHAnsi"/>
-          <w:color w:val="000000"/>
-        </w:rPr>
-        <w:t xml:space="preserve"> with white and firm embryos viable, i.e. potentially </w:t>
-      </w:r>
-      <w:proofErr w:type="spellStart"/>
-      <w:r>
-        <w:rPr>
-          <w:rFonts w:cstheme="minorHAnsi"/>
-          <w:color w:val="000000"/>
-        </w:rPr>
-        <w:t>germinable</w:t>
-      </w:r>
-      <w:proofErr w:type="spellEnd"/>
-      <w:r>
-        <w:rPr>
-          <w:rFonts w:cstheme="minorHAnsi"/>
-          <w:color w:val="000000"/>
-        </w:rPr>
-        <w:t xml:space="preserve"> </w:t>
+          <w:color w:val="000000"/>
+        </w:rPr>
+        <w:t xml:space="preserve"> with white and firm embryos viable, i.e. potentially germinable </w:t>
       </w:r>
       <w:r>
         <w:rPr>
@@ -6801,34 +5856,26 @@
         <w:rPr>
           <w:rFonts w:cstheme="minorHAnsi"/>
         </w:rPr>
-        <w:t xml:space="preserve"> species representing 21 plant families. </w:t>
-      </w:r>
-      <w:proofErr w:type="gramStart"/>
+        <w:t xml:space="preserve"> species representing 21 plant families. A total of 1</w:t>
+      </w:r>
       <w:r>
         <w:rPr>
           <w:rFonts w:cstheme="minorHAnsi"/>
         </w:rPr>
-        <w:t>A total of 1</w:t>
+        <w:t>8</w:t>
       </w:r>
       <w:r>
         <w:rPr>
           <w:rFonts w:cstheme="minorHAnsi"/>
         </w:rPr>
-        <w:t>8</w:t>
+        <w:t>,</w:t>
       </w:r>
       <w:r>
         <w:rPr>
           <w:rFonts w:cstheme="minorHAnsi"/>
         </w:rPr>
-        <w:t>,</w:t>
-      </w:r>
-      <w:r>
-        <w:rPr>
-          <w:rFonts w:cstheme="minorHAnsi"/>
-        </w:rPr>
         <w:t>371</w:t>
       </w:r>
-      <w:proofErr w:type="gramEnd"/>
       <w:r>
         <w:rPr>
           <w:rFonts w:cstheme="minorHAnsi"/>
@@ -6850,15 +5897,13 @@
         <w:jc w:val="both"/>
       </w:pPr>
       <w:r>
-        <w:t>From all the species included in the germination experiments we also measure seeds mass, as the average dry weight of 5 replicates of 50 seeds, plant and floral height in peak season in the field (</w:t>
-      </w:r>
-      <w:proofErr w:type="spellStart"/>
-      <w:r>
-        <w:t>june</w:t>
-      </w:r>
-      <w:proofErr w:type="spellEnd"/>
-      <w:r>
-        <w:t>) and leaf traits (leaf area, LDMC and SLA) from 2 leaves of 10 individuals of each species following standard procedures (</w:t>
+        <w:t xml:space="preserve">From all the species included in the germination experiments we also measure seeds mass, as the average dry weight of 5 replicates of 50 seeds, plant height </w:t>
+      </w:r>
+      <w:r>
+        <w:t xml:space="preserve">from 10 individuals </w:t>
+      </w:r>
+      <w:r>
+        <w:t>in peak season in the field (june) and leaf traits (leaf area, LDMC and SLA) from 2 leaves of 10 individuals of each species following standard procedures (</w:t>
       </w:r>
       <w:r>
         <w:rPr>
@@ -6867,23 +5912,11 @@
         <w:t>ref</w:t>
       </w:r>
       <w:r>
-        <w:t xml:space="preserve">) . Leaves </w:t>
-      </w:r>
-      <w:proofErr w:type="gramStart"/>
-      <w:r>
-        <w:t>were collected</w:t>
-      </w:r>
-      <w:proofErr w:type="gramEnd"/>
-      <w:r>
-        <w:t xml:space="preserve"> early in the day in the field, kept in sealed plastic bags with moist paper until further processing in the laboratory. First fresh weight </w:t>
-      </w:r>
-      <w:proofErr w:type="gramStart"/>
-      <w:r>
-        <w:t>was measured</w:t>
-      </w:r>
-      <w:proofErr w:type="gramEnd"/>
-      <w:r>
-        <w:t>, removing any visible droplets of water, then leaves were scanned with Epson Canon scanner (</w:t>
+        <w:t xml:space="preserve">) . Leaves were collected early in the day in the field, kept in sealed plastic bags with moist paper until further processing in the laboratory. First fresh weight was measured, removing any visible droplets of water, then leaves were </w:t>
+      </w:r>
+      <w:r>
+        <w:lastRenderedPageBreak/>
+        <w:t>scanned with Epson Canon scanner (</w:t>
       </w:r>
       <w:r>
         <w:rPr>
@@ -6895,11 +5928,7 @@
         <w:t>) at 600 dpi</w:t>
       </w:r>
       <w:r>
-        <w:t xml:space="preserve"> and finally leaves were put in the oven at 70ºCfor 72h to </w:t>
-      </w:r>
-      <w:r>
-        <w:lastRenderedPageBreak/>
-        <w:t>calculate dry weight. Leaves images where analysed using WINDDIAS version 3 software (</w:t>
+        <w:t xml:space="preserve"> and finally leaves were put in the oven at 70ºCfor 72h to calculate dry weight. Leaves images where analysed using WINDDIAS version 3 software (</w:t>
       </w:r>
       <w:r>
         <w:rPr>
@@ -6944,7 +5973,7 @@
         </w:rPr>
         <w:t xml:space="preserve"> </w:t>
       </w:r>
-      <w:commentRangeStart w:id="4"/>
+      <w:commentRangeStart w:id="5"/>
       <w:r>
         <w:rPr>
           <w:rFonts w:eastAsia="Times New Roman"/>
@@ -6953,14 +5982,14 @@
         </w:rPr>
         <w:t>Statistical analysis</w:t>
       </w:r>
-      <w:commentRangeEnd w:id="4"/>
+      <w:commentRangeEnd w:id="5"/>
       <w:r>
         <w:rPr>
           <w:rStyle w:val="Refdecomentario"/>
           <w:rFonts w:ascii="Calibri" w:eastAsia="Calibri" w:hAnsi="Calibri" w:cs="Calibri"/>
           <w:color w:val="auto"/>
         </w:rPr>
-        <w:commentReference w:id="4"/>
+        <w:commentReference w:id="5"/>
       </w:r>
     </w:p>
     <w:p>
@@ -6999,7 +6028,6 @@
         </w:rPr>
         <w:t xml:space="preserve">e </w:t>
       </w:r>
-      <w:proofErr w:type="spellStart"/>
       <w:r>
         <w:rPr>
           <w:rFonts w:asciiTheme="minorHAnsi" w:eastAsia="Times New Roman" w:hAnsiTheme="minorHAnsi" w:cstheme="minorHAnsi"/>
@@ -7009,9 +6037,8 @@
           <w:highlight w:val="yellow"/>
           <w:lang w:eastAsia="ca-ES"/>
         </w:rPr>
-        <w:t>analyzed</w:t>
-      </w:r>
-      <w:proofErr w:type="spellEnd"/>
+        <w:t>analysed</w:t>
+      </w:r>
       <w:r>
         <w:rPr>
           <w:rFonts w:asciiTheme="minorHAnsi" w:eastAsia="Times New Roman" w:hAnsiTheme="minorHAnsi" w:cstheme="minorHAnsi"/>
@@ -7043,9 +6070,8 @@
           <w:highlight w:val="yellow"/>
           <w:lang w:eastAsia="ca-ES"/>
         </w:rPr>
-        <w:t xml:space="preserve"> data by fitting Markov Chain Monte Carlo generalized linear mixed models (</w:t>
-      </w:r>
-      <w:proofErr w:type="spellStart"/>
+        <w:t xml:space="preserve"> data by fitting Markov Chain Monte Carlo generalized linear mixed models (MCMCglmm) with Bayesian estimation using the R package MCMCGLMM </w:t>
+      </w:r>
       <w:r>
         <w:rPr>
           <w:rFonts w:asciiTheme="minorHAnsi" w:eastAsia="Times New Roman" w:hAnsiTheme="minorHAnsi" w:cstheme="minorHAnsi"/>
@@ -7055,9 +6081,8 @@
           <w:highlight w:val="yellow"/>
           <w:lang w:eastAsia="ca-ES"/>
         </w:rPr>
-        <w:t>MCMCglmm</w:t>
-      </w:r>
-      <w:proofErr w:type="spellEnd"/>
+        <w:fldChar w:fldCharType="begin" w:fldLock="1"/>
+      </w:r>
       <w:r>
         <w:rPr>
           <w:rFonts w:asciiTheme="minorHAnsi" w:eastAsia="Times New Roman" w:hAnsiTheme="minorHAnsi" w:cstheme="minorHAnsi"/>
@@ -7067,7 +6092,7 @@
           <w:highlight w:val="yellow"/>
           <w:lang w:eastAsia="ca-ES"/>
         </w:rPr>
-        <w:t xml:space="preserve">) with Bayesian estimation using the R package MCMCGLMM </w:t>
+        <w:instrText>ADDIN CSL_CITATION {"citationItems":[{"id":"ITEM-1","itemData":{"ISBN":"9781439811870","ISSN":"19390068","PMID":"18291371","abstract":"Generalized linear mixed models provide a flexible framework for modeling a range of data, although with non-Gaussian response variables the likelihood cannot be obtained in closed form. Markov chain Monte Carlo methods solve this problem by sampling from a series of simpler conditional distributions that can be evaluated. The R package MCMCglmm implements such an algorithm for a range of model fitting problems. More than one response variable can be analyzed simultaneously, and these variables are allowed to follow Gaussian, Poisson, multi(bi)nominal, exponential, zero-inflated and censored dis-tributions. A range of variance structures are permitted for the random effects, including interactions with categorical or continuous variables (i.e., random regression), and more complicated variance structures that arise through shared ancestry, either through a pedi-gree or through a phylogeny. Missing values are permitted in the response variable(s) and data can be known up to some level of measurement error as in meta-analysis. All simu-lation is done in C/ C++ using the CSparse library for sparse linear systems.","author":[{"dropping-particle":"","family":"Hadfield","given":"Jarrod D","non-dropping-particle":"","parse-names":false,"suffix":""}],"container-title":"Journal of Statistical Software","id":"ITEM-1","issue":"2","issued":{"date-parts":[["2010"]]},"page":"1-22","title":"MCMCglmm: MCMC Methods for Multi-Response GLMMs in R","type":"article-journal","volume":"33"},"uris":["http://www.mendeley.com/documents/?uuid=41627bcd-fb59-4a4f-8935-c58d22662a04"]}],"mendeley":{"formattedCitation":"(Hadfield, 2010)","plainTextFormattedCitation":"(Hadfield, 2010)","previouslyFormattedCitation":"(Hadfield, 2010)"},"properties":{"noteIndex":0},"schema":"https://github.com/citation-style-language/schema/raw/master/csl-citation.json"}</w:instrText>
       </w:r>
       <w:r>
         <w:rPr>
@@ -7078,7 +6103,7 @@
           <w:highlight w:val="yellow"/>
           <w:lang w:eastAsia="ca-ES"/>
         </w:rPr>
-        <w:fldChar w:fldCharType="begin" w:fldLock="1"/>
+        <w:fldChar w:fldCharType="separate"/>
       </w:r>
       <w:r>
         <w:rPr>
@@ -7089,7 +6114,7 @@
           <w:highlight w:val="yellow"/>
           <w:lang w:eastAsia="ca-ES"/>
         </w:rPr>
-        <w:instrText>ADDIN CSL_CITATION {"citationItems":[{"id":"ITEM-1","itemData":{"ISBN":"9781439811870","ISSN":"19390068","PMID":"18291371","abstract":"Generalized linear mixed models provide a flexible framework for modeling a range of data, although with non-Gaussian response variables the likelihood cannot be obtained in closed form. Markov chain Monte Carlo methods solve this problem by sampling from a series of simpler conditional distributions that can be evaluated. The R package MCMCglmm implements such an algorithm for a range of model fitting problems. More than one response variable can be analyzed simultaneously, and these variables are allowed to follow Gaussian, Poisson, multi(bi)nominal, exponential, zero-inflated and censored dis-tributions. A range of variance structures are permitted for the random effects, including interactions with categorical or continuous variables (i.e., random regression), and more complicated variance structures that arise through shared ancestry, either through a pedi-gree or through a phylogeny. Missing values are permitted in the response variable(s) and data can be known up to some level of measurement error as in meta-analysis. All simu-lation is done in C/ C++ using the CSparse library for sparse linear systems.","author":[{"dropping-particle":"","family":"Hadfield","given":"Jarrod D","non-dropping-particle":"","parse-names":false,"suffix":""}],"container-title":"Journal of Statistical Software","id":"ITEM-1","issue":"2","issued":{"date-parts":[["2010"]]},"page":"1-22","title":"MCMCglmm: MCMC Methods for Multi-Response GLMMs in R","type":"article-journal","volume":"33"},"uris":["http://www.mendeley.com/documents/?uuid=41627bcd-fb59-4a4f-8935-c58d22662a04"]}],"mendeley":{"formattedCitation":"(Hadfield, 2010)","plainTextFormattedCitation":"(Hadfield, 2010)","previouslyFormattedCitation":"(Hadfield, 2010)"},"properties":{"noteIndex":0},"schema":"https://github.com/citation-style-language/schema/raw/master/csl-citation.json"}</w:instrText>
+        <w:t>(Hadfield, 2010)</w:t>
       </w:r>
       <w:r>
         <w:rPr>
@@ -7100,7 +6125,7 @@
           <w:highlight w:val="yellow"/>
           <w:lang w:eastAsia="ca-ES"/>
         </w:rPr>
-        <w:fldChar w:fldCharType="separate"/>
+        <w:fldChar w:fldCharType="end"/>
       </w:r>
       <w:r>
         <w:rPr>
@@ -7111,7 +6136,7 @@
           <w:highlight w:val="yellow"/>
           <w:lang w:eastAsia="ca-ES"/>
         </w:rPr>
-        <w:t>(Hadfield, 2010)</w:t>
+        <w:t>. To model germination, we used binomial MCMCglmms (</w:t>
       </w:r>
       <w:r>
         <w:rPr>
@@ -7122,7 +6147,7 @@
           <w:highlight w:val="yellow"/>
           <w:lang w:eastAsia="ca-ES"/>
         </w:rPr>
-        <w:fldChar w:fldCharType="end"/>
+        <w:t xml:space="preserve">cbind (finalgermination, viable seeds – finalgermination) ~ germination treatment, </w:t>
       </w:r>
       <w:r>
         <w:rPr>
@@ -7133,9 +6158,8 @@
           <w:highlight w:val="yellow"/>
           <w:lang w:eastAsia="ca-ES"/>
         </w:rPr>
-        <w:t xml:space="preserve">. To model germination, we used binomial </w:t>
-      </w:r>
-      <w:proofErr w:type="spellStart"/>
+        <w:t>family = multi</w:t>
+      </w:r>
       <w:r>
         <w:rPr>
           <w:rFonts w:asciiTheme="minorHAnsi" w:eastAsia="Times New Roman" w:hAnsiTheme="minorHAnsi" w:cstheme="minorHAnsi"/>
@@ -7145,9 +6169,8 @@
           <w:highlight w:val="yellow"/>
           <w:lang w:eastAsia="ca-ES"/>
         </w:rPr>
-        <w:t>MCMCglmms</w:t>
-      </w:r>
-      <w:proofErr w:type="spellEnd"/>
+        <w:t>nomial2)</w:t>
+      </w:r>
       <w:r>
         <w:rPr>
           <w:rFonts w:asciiTheme="minorHAnsi" w:eastAsia="Times New Roman" w:hAnsiTheme="minorHAnsi" w:cstheme="minorHAnsi"/>
@@ -7157,125 +6180,7 @@
           <w:highlight w:val="yellow"/>
           <w:lang w:eastAsia="ca-ES"/>
         </w:rPr>
-        <w:t xml:space="preserve"> (family = multi</w:t>
-      </w:r>
-      <w:r>
-        <w:rPr>
-          <w:rFonts w:asciiTheme="minorHAnsi" w:eastAsia="Times New Roman" w:hAnsiTheme="minorHAnsi" w:cstheme="minorHAnsi"/>
-          <w:color w:val="000000"/>
-          <w:sz w:val="22"/>
-          <w:szCs w:val="22"/>
-          <w:highlight w:val="yellow"/>
-          <w:lang w:eastAsia="ca-ES"/>
-        </w:rPr>
-        <w:t>nomial2)</w:t>
-      </w:r>
-      <w:r>
-        <w:rPr>
-          <w:rFonts w:asciiTheme="minorHAnsi" w:eastAsia="Times New Roman" w:hAnsiTheme="minorHAnsi" w:cstheme="minorHAnsi"/>
-          <w:color w:val="000000"/>
-          <w:sz w:val="22"/>
-          <w:szCs w:val="22"/>
-          <w:highlight w:val="yellow"/>
-          <w:lang w:eastAsia="ca-ES"/>
-        </w:rPr>
-        <w:t xml:space="preserve">. For representation </w:t>
-      </w:r>
-      <w:proofErr w:type="spellStart"/>
-      <w:r>
-        <w:rPr>
-          <w:rFonts w:asciiTheme="minorHAnsi" w:eastAsia="Times New Roman" w:hAnsiTheme="minorHAnsi" w:cstheme="minorHAnsi"/>
-          <w:color w:val="000000"/>
-          <w:sz w:val="22"/>
-          <w:szCs w:val="22"/>
-          <w:highlight w:val="yellow"/>
-          <w:lang w:eastAsia="ca-ES"/>
-        </w:rPr>
-        <w:t>ggplot</w:t>
-      </w:r>
-      <w:proofErr w:type="spellEnd"/>
-      <w:r>
-        <w:rPr>
-          <w:rFonts w:asciiTheme="minorHAnsi" w:eastAsia="Times New Roman" w:hAnsiTheme="minorHAnsi" w:cstheme="minorHAnsi"/>
-          <w:color w:val="000000"/>
-          <w:sz w:val="22"/>
-          <w:szCs w:val="22"/>
-          <w:highlight w:val="yellow"/>
-          <w:lang w:eastAsia="ca-ES"/>
-        </w:rPr>
-        <w:t xml:space="preserve"> (REF), </w:t>
-      </w:r>
-      <w:proofErr w:type="spellStart"/>
-      <w:r>
-        <w:rPr>
-          <w:rFonts w:asciiTheme="minorHAnsi" w:eastAsia="Times New Roman" w:hAnsiTheme="minorHAnsi" w:cstheme="minorHAnsi"/>
-          <w:color w:val="000000"/>
-          <w:sz w:val="22"/>
-          <w:szCs w:val="22"/>
-          <w:highlight w:val="yellow"/>
-          <w:lang w:eastAsia="ca-ES"/>
-        </w:rPr>
-        <w:t>ggpubr</w:t>
-      </w:r>
-      <w:proofErr w:type="spellEnd"/>
-      <w:r>
-        <w:rPr>
-          <w:rFonts w:asciiTheme="minorHAnsi" w:eastAsia="Times New Roman" w:hAnsiTheme="minorHAnsi" w:cstheme="minorHAnsi"/>
-          <w:color w:val="000000"/>
-          <w:sz w:val="22"/>
-          <w:szCs w:val="22"/>
-          <w:highlight w:val="yellow"/>
-          <w:lang w:eastAsia="ca-ES"/>
-        </w:rPr>
-        <w:t xml:space="preserve"> (REF) </w:t>
-      </w:r>
-      <w:proofErr w:type="gramStart"/>
-      <w:r>
-        <w:rPr>
-          <w:rFonts w:asciiTheme="minorHAnsi" w:eastAsia="Times New Roman" w:hAnsiTheme="minorHAnsi" w:cstheme="minorHAnsi"/>
-          <w:color w:val="000000"/>
-          <w:sz w:val="22"/>
-          <w:szCs w:val="22"/>
-          <w:highlight w:val="yellow"/>
-          <w:lang w:eastAsia="ca-ES"/>
-        </w:rPr>
-        <w:t>were used</w:t>
-      </w:r>
-      <w:proofErr w:type="gramEnd"/>
-      <w:r>
-        <w:rPr>
-          <w:rFonts w:asciiTheme="minorHAnsi" w:eastAsia="Times New Roman" w:hAnsiTheme="minorHAnsi" w:cstheme="minorHAnsi"/>
-          <w:color w:val="000000"/>
-          <w:sz w:val="22"/>
-          <w:szCs w:val="22"/>
-          <w:highlight w:val="yellow"/>
-          <w:lang w:eastAsia="ca-ES"/>
-        </w:rPr>
-        <w:t xml:space="preserve"> together with </w:t>
-      </w:r>
-      <w:proofErr w:type="spellStart"/>
-      <w:r>
-        <w:rPr>
-          <w:rFonts w:asciiTheme="minorHAnsi" w:eastAsia="Times New Roman" w:hAnsiTheme="minorHAnsi" w:cstheme="minorHAnsi"/>
-          <w:color w:val="000000"/>
-          <w:sz w:val="22"/>
-          <w:szCs w:val="22"/>
-          <w:highlight w:val="yellow"/>
-          <w:lang w:eastAsia="ca-ES"/>
-        </w:rPr>
-        <w:t>binom</w:t>
-      </w:r>
-      <w:proofErr w:type="spellEnd"/>
-      <w:r>
-        <w:rPr>
-          <w:rFonts w:asciiTheme="minorHAnsi" w:eastAsia="Times New Roman" w:hAnsiTheme="minorHAnsi" w:cstheme="minorHAnsi"/>
-          <w:color w:val="000000"/>
-          <w:sz w:val="22"/>
-          <w:szCs w:val="22"/>
-          <w:highlight w:val="yellow"/>
-          <w:lang w:eastAsia="ca-ES"/>
-        </w:rPr>
-        <w:t xml:space="preserve"> package (REF) to create the binomial confidence intervals in figure 2.</w:t>
+        <w:t>. For representation ggplot (REF), ggpubr (REF) were used together with binom package (REF) to create the binomial confidence intervals in figure 2.</w:t>
       </w:r>
     </w:p>
     <w:p>
@@ -7309,23 +6214,7 @@
           <w:highlight w:val="yellow"/>
           <w:lang w:eastAsia="ca-ES"/>
         </w:rPr>
-        <w:t xml:space="preserve">To calculate niche dissimilarity we followed the procedure detailed in (book Lars) with coverage data using </w:t>
-      </w:r>
-      <w:proofErr w:type="spellStart"/>
-      <w:r>
-        <w:rPr>
-          <w:highlight w:val="yellow"/>
-          <w:lang w:eastAsia="ca-ES"/>
-        </w:rPr>
-        <w:t>pacakage</w:t>
-      </w:r>
-      <w:proofErr w:type="spellEnd"/>
-      <w:r>
-        <w:rPr>
-          <w:highlight w:val="yellow"/>
-          <w:lang w:eastAsia="ca-ES"/>
-        </w:rPr>
-        <w:t xml:space="preserve"> xxx….</w:t>
+        <w:t>To calculate niche dissimilarity we followed the procedure detailed in (book Lars) with coverage data using pacakage xxx….</w:t>
       </w:r>
     </w:p>
     <w:p>
@@ -7368,37 +6257,41 @@
         <w:jc w:val="both"/>
       </w:pPr>
       <w:r>
-        <w:t xml:space="preserve">Germination analysis </w:t>
-      </w:r>
-      <w:proofErr w:type="gramStart"/>
-      <w:r>
-        <w:t>were performed</w:t>
-      </w:r>
-      <w:proofErr w:type="gramEnd"/>
-      <w:r>
-        <w:t xml:space="preserve"> separately for each community, nevertheless, both communities responded consistently to germination drivers. Germination does not significantly differs between control (with alternating temperatures) and constant temperatures and there is a significant </w:t>
-      </w:r>
-      <w:r>
-        <w:t>(</w:t>
-      </w:r>
-      <w:proofErr w:type="spellStart"/>
-      <w:r>
-        <w:t>pMCMC</w:t>
-      </w:r>
-      <w:proofErr w:type="spellEnd"/>
-      <w:r>
-        <w:t xml:space="preserve">&lt;0.001) </w:t>
-      </w:r>
-      <w:r>
-        <w:t>decrease of germination under water stress (MPa -0.6). In darkness, germination decreased in both communities but is significant only in the Mediterranean community (</w:t>
-      </w:r>
-      <w:proofErr w:type="spellStart"/>
-      <w:r>
-        <w:t>pMCMC</w:t>
-      </w:r>
-      <w:proofErr w:type="spellEnd"/>
-      <w:r>
-        <w:t xml:space="preserve"> &lt;0.01) see Figure 2. </w:t>
+        <w:t xml:space="preserve">During cold stratification (pretreatment), there was approximately </w:t>
+      </w:r>
+      <w:r>
+        <w:t>30% germination in species from the Mediterranean community, while less 10% germinated in the Temperate community (see Figure 2</w:t>
+      </w:r>
+      <w:r>
+        <w:t>A</w:t>
+      </w:r>
+      <w:r>
+        <w:t>)</w:t>
+      </w:r>
+      <w:r>
+        <w:t xml:space="preserve">. </w:t>
+      </w:r>
+      <w:r>
+        <w:t>Germination analysis</w:t>
+      </w:r>
+      <w:r>
+        <w:t xml:space="preserve"> (MCMC-GLMM)</w:t>
+      </w:r>
+      <w:r>
+        <w:t xml:space="preserve"> were performed separately for each community, nevertheless, both communities responded consistently to germination drivers. Germination does not significantly differs between control (with alternating temperatures) and constant temperatures and there is a significant (pMCMC&lt;0.001) decrease of germination under </w:t>
+      </w:r>
+      <w:r>
+        <w:lastRenderedPageBreak/>
+        <w:t>water stress (MPa -0.6). In darkness, germination decreased in both communities but is significant only in the Mediterranean commun</w:t>
+      </w:r>
+      <w:r>
+        <w:t>ity (pMCMC &lt;0.01) see Figure 2</w:t>
+      </w:r>
+      <w:r>
+        <w:t>B</w:t>
+      </w:r>
+      <w:r>
+        <w:t xml:space="preserve">. </w:t>
       </w:r>
     </w:p>
     <w:p>
@@ -7407,8 +6300,7 @@
         <w:jc w:val="both"/>
       </w:pPr>
       <w:r>
-        <w:lastRenderedPageBreak/>
-        <w:pict w14:anchorId="3E91443C">
+        <w:pict w14:anchorId="1AEECF2C">
           <v:shapetype id="_x0000_t75" coordsize="21600,21600" o:spt="75" o:preferrelative="t" path="m@4@5l@4@11@9@11@9@5xe" filled="f" stroked="f">
             <v:stroke joinstyle="miter"/>
             <v:formulas>
@@ -7428,7 +6320,7 @@
             <v:path o:extrusionok="f" gradientshapeok="t" o:connecttype="rect"/>
             <o:lock v:ext="edit" aspectratio="t"/>
           </v:shapetype>
-          <v:shape id="_x0000_i1025" type="#_x0000_t75" style="width:424.5pt;height:253.5pt">
+          <v:shape id="_x0000_i1025" type="#_x0000_t75" style="width:424.8pt;height:237.6pt">
             <v:imagedata r:id="rId17" o:title="fig2"/>
           </v:shape>
         </w:pict>
@@ -7440,15 +6332,28 @@
         <w:jc w:val="both"/>
       </w:pPr>
       <w:r>
-        <w:t xml:space="preserve">Figure 2. Germination responses to the four experimental treatments studied. Bars represent the mean germination observed and each treatment (in different </w:t>
-      </w:r>
-      <w:proofErr w:type="spellStart"/>
-      <w:r>
-        <w:t>colors</w:t>
-      </w:r>
-      <w:proofErr w:type="spellEnd"/>
-      <w:r>
-        <w:t xml:space="preserve">). Error bars represent binomial confidence intervals. </w:t>
+        <w:t xml:space="preserve">Figure 2. </w:t>
+      </w:r>
+      <w:r>
+        <w:t xml:space="preserve">(A) Germination during cold stratification pretreatment. </w:t>
+      </w:r>
+      <w:r>
+        <w:t>(</w:t>
+      </w:r>
+      <w:r>
+        <w:t>B</w:t>
+      </w:r>
+      <w:r>
+        <w:t xml:space="preserve">) </w:t>
+      </w:r>
+      <w:r>
+        <w:t xml:space="preserve">Germination responses to the four experimental </w:t>
+      </w:r>
+      <w:r>
+        <w:t xml:space="preserve">germination </w:t>
+      </w:r>
+      <w:r>
+        <w:t xml:space="preserve">treatments studied. Bars represent the mean germination observed and each treatment (in different colors). Error bars represent binomial confidence intervals. </w:t>
       </w:r>
     </w:p>
     <w:p>
@@ -7463,8 +6368,6 @@
       <w:r>
         <w:t>c</w:t>
       </w:r>
-      <w:bookmarkStart w:id="5" w:name="_GoBack"/>
-      <w:bookmarkEnd w:id="5"/>
       <w:r>
         <w:t>roclimatic gradients</w:t>
       </w:r>
@@ -7512,13 +6415,8 @@
         <w:spacing w:line="480" w:lineRule="auto"/>
         <w:jc w:val="both"/>
       </w:pPr>
-      <w:proofErr w:type="spellStart"/>
-      <w:r>
-        <w:t>iButtons</w:t>
-      </w:r>
-      <w:proofErr w:type="spellEnd"/>
-      <w:r>
-        <w:t xml:space="preserve"> recording period from different years! However</w:t>
+      <w:r>
+        <w:t>iButtons recording period from different years! However</w:t>
       </w:r>
       <w:r>
         <w:t>,</w:t>
@@ -7539,15 +6437,7 @@
         <w:t>climatic chambers</w:t>
       </w:r>
       <w:r>
-        <w:t xml:space="preserve"> </w:t>
-      </w:r>
-      <w:proofErr w:type="spellStart"/>
-      <w:r>
-        <w:t>chambers</w:t>
-      </w:r>
-      <w:proofErr w:type="spellEnd"/>
-      <w:r>
-        <w:t>.</w:t>
+        <w:t xml:space="preserve"> chambers.</w:t>
       </w:r>
     </w:p>
     <w:sectPr>
@@ -7628,7 +6518,7 @@
       </w:r>
     </w:p>
   </w:comment>
-  <w:comment w:id="4" w:author="CLARA ESPINOSA DEL ALBA" w:date="2024-01-30T15:27:00Z" w:initials="CE">
+  <w:comment w:id="5" w:author="CLARA ESPINOSA DEL ALBA" w:date="2024-01-30T15:27:00Z" w:initials="CE">
     <w:p>
       <w:pPr>
         <w:pStyle w:val="Textocomentario"/>
@@ -7733,7 +6623,7 @@
             <w:noProof/>
             <w:lang w:val="es-ES"/>
           </w:rPr>
-          <w:t>9</w:t>
+          <w:t>10</w:t>
         </w:r>
         <w:r>
           <w:fldChar w:fldCharType="end"/>

</xml_diff>

<commit_message>
Bioclimatic indices PCA in script 2
</commit_message>
<xml_diff>
--- a/doc/Ms_0.docx
+++ b/doc/Ms_0.docx
@@ -1740,25 +1740,15 @@
           <w:bdr w:val="none" w:sz="0" w:space="0" w:color="auto" w:frame="1"/>
           <w:lang w:eastAsia="ca-ES"/>
         </w:rPr>
-        <w:t xml:space="preserve">2.1 </w:t>
-      </w:r>
-      <w:commentRangeStart w:id="2"/>
+        <w:t xml:space="preserve">2.1 Study </w:t>
+      </w:r>
       <w:r>
         <w:rPr>
           <w:rFonts w:eastAsia="Times New Roman"/>
           <w:bdr w:val="none" w:sz="0" w:space="0" w:color="auto" w:frame="1"/>
           <w:lang w:eastAsia="ca-ES"/>
         </w:rPr>
-        <w:t>Study system</w:t>
-      </w:r>
-      <w:commentRangeEnd w:id="2"/>
-      <w:r>
-        <w:rPr>
-          <w:rStyle w:val="Refdecomentario"/>
-          <w:rFonts w:ascii="Calibri" w:eastAsia="Calibri" w:hAnsi="Calibri" w:cs="Calibri"/>
-          <w:color w:val="auto"/>
-        </w:rPr>
-        <w:commentReference w:id="2"/>
+        <w:t>area</w:t>
       </w:r>
     </w:p>
     <w:p>
@@ -1773,7 +1763,13 @@
         <w:rPr>
           <w:rFonts w:cstheme="minorHAnsi"/>
         </w:rPr>
-        <w:t xml:space="preserve">Our study focuses on alpine </w:t>
+        <w:t>The</w:t>
+      </w:r>
+      <w:r>
+        <w:rPr>
+          <w:rFonts w:cstheme="minorHAnsi"/>
+        </w:rPr>
+        <w:t xml:space="preserve"> study focuses on alpine </w:t>
       </w:r>
       <w:r>
         <w:rPr>
@@ -1785,7 +1781,7 @@
         <w:rPr>
           <w:rFonts w:cstheme="minorHAnsi"/>
         </w:rPr>
-        <w:t xml:space="preserve"> communities living between 1900 and 2500 m </w:t>
+        <w:t xml:space="preserve"> communities between 1900 and 2500 m </w:t>
       </w:r>
       <w:proofErr w:type="spellStart"/>
       <w:r>
@@ -1799,20 +1795,50 @@
         <w:rPr>
           <w:rFonts w:cstheme="minorHAnsi"/>
         </w:rPr>
-        <w:t xml:space="preserve">. in the Cantabrian Mountains. This mountain range,  running E-W in northern Spain, is considered a </w:t>
-      </w:r>
+        <w:t>. in the Cantabrian Mountains</w:t>
+      </w:r>
+      <w:r>
+        <w:rPr>
+          <w:rFonts w:cstheme="minorHAnsi"/>
+        </w:rPr>
+        <w:t xml:space="preserve"> (NW Spain)</w:t>
+      </w:r>
+      <w:r>
+        <w:rPr>
+          <w:rFonts w:cstheme="minorHAnsi"/>
+        </w:rPr>
+        <w:t xml:space="preserve">. </w:t>
+      </w:r>
+      <w:r>
+        <w:rPr>
+          <w:rFonts w:cstheme="minorHAnsi"/>
+        </w:rPr>
+        <w:t>In this southwestern Europe</w:t>
+      </w:r>
+      <w:r>
+        <w:rPr>
+          <w:rFonts w:cstheme="minorHAnsi"/>
+        </w:rPr>
+        <w:t xml:space="preserve"> mountain range,</w:t>
+      </w:r>
+      <w:r>
+        <w:rPr>
+          <w:rFonts w:cstheme="minorHAnsi"/>
+        </w:rPr>
+        <w:t xml:space="preserve"> </w:t>
+      </w:r>
+      <w:r>
+        <w:rPr>
+          <w:rFonts w:cstheme="minorHAnsi"/>
+        </w:rPr>
+        <w:t xml:space="preserve">the </w:t>
+      </w:r>
+      <w:proofErr w:type="spellStart"/>
       <w:r>
         <w:rPr>
           <w:rFonts w:cstheme="minorHAnsi"/>
         </w:rPr>
         <w:lastRenderedPageBreak/>
-        <w:t xml:space="preserve">transitional biogeographical hub between </w:t>
-      </w:r>
-      <w:proofErr w:type="spellStart"/>
-      <w:r>
-        <w:rPr>
-          <w:rFonts w:cstheme="minorHAnsi"/>
-        </w:rPr>
         <w:t>Eurosiberian</w:t>
       </w:r>
       <w:proofErr w:type="spellEnd"/>
@@ -1820,7 +1846,7 @@
         <w:rPr>
           <w:rFonts w:cstheme="minorHAnsi"/>
         </w:rPr>
-        <w:t xml:space="preserve"> and Mediterranean regions </w:t>
+        <w:t xml:space="preserve"> and Mediterranean regions meet </w:t>
       </w:r>
       <w:r>
         <w:rPr>
@@ -1872,37 +1898,117 @@
         <w:rPr>
           <w:rFonts w:cstheme="minorHAnsi"/>
         </w:rPr>
-        <w:t xml:space="preserve">, influenced by </w:t>
-      </w:r>
-      <w:r>
-        <w:rPr>
-          <w:rFonts w:cstheme="minorHAnsi"/>
-        </w:rPr>
-        <w:t xml:space="preserve">a </w:t>
-      </w:r>
-      <w:r>
-        <w:rPr>
-          <w:rFonts w:cstheme="minorHAnsi"/>
-        </w:rPr>
-        <w:t xml:space="preserve">Mediterranean-like climate in southern slopes and temperate climate in northern slopes. The particularity of its geographic location facilitates the coexistence of a complex array of communities with species adapted to both climates. We established one study system </w:t>
-      </w:r>
-      <w:r>
-        <w:rPr>
-          <w:rFonts w:cstheme="minorHAnsi"/>
-        </w:rPr>
-        <w:t>within each climate</w:t>
-      </w:r>
-      <w:r>
-        <w:rPr>
-          <w:rFonts w:cstheme="minorHAnsi"/>
-        </w:rPr>
-        <w:t xml:space="preserve">: (1) temperate alpine calcareous grasslands in the </w:t>
+        <w:t xml:space="preserve">, </w:t>
+      </w:r>
+      <w:r>
+        <w:rPr>
+          <w:rFonts w:cstheme="minorHAnsi"/>
+        </w:rPr>
+        <w:t>allowing the coexistence of floras from both origins</w:t>
+      </w:r>
+      <w:r>
+        <w:rPr>
+          <w:rFonts w:cstheme="minorHAnsi"/>
+        </w:rPr>
+        <w:t xml:space="preserve">. We </w:t>
+      </w:r>
+      <w:r>
+        <w:rPr>
+          <w:rFonts w:cstheme="minorHAnsi"/>
+        </w:rPr>
+        <w:t xml:space="preserve">used two </w:t>
+      </w:r>
+      <w:r>
+        <w:rPr>
+          <w:rFonts w:cstheme="minorHAnsi"/>
+        </w:rPr>
+        <w:t xml:space="preserve">contrasting </w:t>
+      </w:r>
+      <w:r>
+        <w:rPr>
+          <w:rFonts w:cstheme="minorHAnsi"/>
+        </w:rPr>
+        <w:t>study communities one from each macroclimatic region</w:t>
+      </w:r>
+      <w:r>
+        <w:rPr>
+          <w:rFonts w:cstheme="minorHAnsi"/>
+        </w:rPr>
+        <w:t xml:space="preserve">: (1) </w:t>
+      </w:r>
+      <w:r>
+        <w:rPr>
+          <w:rFonts w:cstheme="minorHAnsi"/>
+        </w:rPr>
+        <w:t xml:space="preserve">acidic grasslands </w:t>
+      </w:r>
+      <w:r>
+        <w:rPr>
+          <w:rFonts w:cstheme="minorHAnsi"/>
+        </w:rPr>
+        <w:t xml:space="preserve">in the </w:t>
+      </w:r>
+      <w:r>
+        <w:rPr>
+          <w:rFonts w:cstheme="minorHAnsi"/>
+        </w:rPr>
+        <w:t xml:space="preserve">Valles de </w:t>
       </w:r>
       <w:proofErr w:type="spellStart"/>
       <w:r>
         <w:rPr>
           <w:rFonts w:cstheme="minorHAnsi"/>
         </w:rPr>
+        <w:t>Omaña</w:t>
+      </w:r>
+      <w:proofErr w:type="spellEnd"/>
+      <w:r>
+        <w:rPr>
+          <w:rFonts w:cstheme="minorHAnsi"/>
+        </w:rPr>
+        <w:t xml:space="preserve"> and Luna Biosphere Reserve</w:t>
+      </w:r>
+      <w:r>
+        <w:rPr>
+          <w:rFonts w:cstheme="minorHAnsi"/>
+        </w:rPr>
+        <w:t xml:space="preserve"> from </w:t>
+      </w:r>
+      <w:r>
+        <w:rPr>
+          <w:rFonts w:cstheme="minorHAnsi"/>
+        </w:rPr>
+        <w:t xml:space="preserve">the </w:t>
+      </w:r>
+      <w:r>
+        <w:rPr>
+          <w:rFonts w:cstheme="minorHAnsi"/>
+        </w:rPr>
+        <w:t xml:space="preserve">Mediterranean region </w:t>
+      </w:r>
+      <w:r>
+        <w:rPr>
+          <w:rFonts w:cstheme="minorHAnsi"/>
+        </w:rPr>
+        <w:t xml:space="preserve">with Mediterranean type climate </w:t>
+      </w:r>
+      <w:r>
+        <w:rPr>
+          <w:rFonts w:cstheme="minorHAnsi"/>
+        </w:rPr>
+        <w:t>and (2) calcareous grasslands in</w:t>
+      </w:r>
+      <w:r>
+        <w:rPr>
+          <w:rFonts w:cstheme="minorHAnsi"/>
+        </w:rPr>
+        <w:t xml:space="preserve"> </w:t>
+      </w:r>
+      <w:proofErr w:type="spellStart"/>
+      <w:r>
+        <w:rPr>
+          <w:rFonts w:cstheme="minorHAnsi"/>
+        </w:rPr>
         <w:t>Picos</w:t>
       </w:r>
       <w:proofErr w:type="spellEnd"/>
@@ -1910,87 +2016,62 @@
         <w:rPr>
           <w:rFonts w:cstheme="minorHAnsi"/>
         </w:rPr>
-        <w:t xml:space="preserve"> de Europa National Park (NE of the Cantabrian </w:t>
-      </w:r>
-      <w:proofErr w:type="gramStart"/>
-      <w:r>
-        <w:rPr>
-          <w:rFonts w:cstheme="minorHAnsi"/>
-        </w:rPr>
-        <w:t>mountains</w:t>
-      </w:r>
-      <w:proofErr w:type="gramEnd"/>
-      <w:r>
-        <w:rPr>
-          <w:rFonts w:cstheme="minorHAnsi"/>
-        </w:rPr>
-        <w:t xml:space="preserve">, </w:t>
-      </w:r>
-      <w:r>
-        <w:rPr>
-          <w:rFonts w:cstheme="minorHAnsi"/>
-          <w:highlight w:val="yellow"/>
-        </w:rPr>
-        <w:t>Fig.1a</w:t>
-      </w:r>
-      <w:r>
-        <w:rPr>
-          <w:rFonts w:cstheme="minorHAnsi"/>
-        </w:rPr>
-        <w:t xml:space="preserve"> in green); and (2) Mediterranean high mountain acidic grasslands in the Valles de </w:t>
+        <w:t xml:space="preserve"> de Europa National Park</w:t>
+      </w:r>
+      <w:r>
+        <w:rPr>
+          <w:rFonts w:cstheme="minorHAnsi"/>
+        </w:rPr>
+        <w:t xml:space="preserve"> </w:t>
+      </w:r>
+      <w:r>
+        <w:rPr>
+          <w:rFonts w:cstheme="minorHAnsi"/>
+        </w:rPr>
+        <w:t xml:space="preserve">from </w:t>
       </w:r>
       <w:proofErr w:type="spellStart"/>
       <w:r>
         <w:rPr>
           <w:rFonts w:cstheme="minorHAnsi"/>
         </w:rPr>
-        <w:t>Omaña</w:t>
+        <w:t>Eurosiberian</w:t>
       </w:r>
       <w:proofErr w:type="spellEnd"/>
       <w:r>
         <w:rPr>
           <w:rFonts w:cstheme="minorHAnsi"/>
         </w:rPr>
-        <w:t xml:space="preserve"> and Luna Biosphere Reserve (SW of the Cantabrian mountains, </w:t>
-      </w:r>
-      <w:r>
-        <w:rPr>
-          <w:rFonts w:cstheme="minorHAnsi"/>
-          <w:highlight w:val="yellow"/>
-        </w:rPr>
-        <w:t>Fig.1a</w:t>
-      </w:r>
-      <w:r>
-        <w:rPr>
-          <w:rFonts w:cstheme="minorHAnsi"/>
-        </w:rPr>
-        <w:t xml:space="preserve"> in yellow). </w:t>
-      </w:r>
-      <w:proofErr w:type="gramStart"/>
-      <w:r>
-        <w:rPr>
-          <w:rFonts w:cstheme="minorHAnsi"/>
-        </w:rPr>
-        <w:t xml:space="preserve">Alpine </w:t>
-      </w:r>
-      <w:r>
-        <w:rPr>
-          <w:rFonts w:cstheme="minorHAnsi"/>
-        </w:rPr>
-        <w:t>grassland</w:t>
-      </w:r>
-      <w:r>
-        <w:rPr>
-          <w:rFonts w:cstheme="minorHAnsi"/>
-        </w:rPr>
-        <w:t xml:space="preserve"> communities in the Cantabrian Mountains are dominated mostly by </w:t>
+        <w:t xml:space="preserve"> region and a </w:t>
+      </w:r>
+      <w:r>
+        <w:rPr>
+          <w:rFonts w:cstheme="minorHAnsi"/>
+        </w:rPr>
+        <w:t xml:space="preserve">temperate alpine </w:t>
+      </w:r>
+      <w:r>
+        <w:rPr>
+          <w:rFonts w:cstheme="minorHAnsi"/>
+        </w:rPr>
+        <w:t>climate</w:t>
+      </w:r>
+      <w:r>
+        <w:rPr>
+          <w:rFonts w:cstheme="minorHAnsi"/>
+        </w:rPr>
+        <w:t xml:space="preserve"> (more details in table 1)</w:t>
+      </w:r>
+      <w:r>
+        <w:rPr>
+          <w:rFonts w:cstheme="minorHAnsi"/>
+        </w:rPr>
+        <w:t xml:space="preserve">. Mostly </w:t>
       </w:r>
       <w:proofErr w:type="spellStart"/>
       <w:r>
         <w:rPr>
           <w:rFonts w:cstheme="minorHAnsi"/>
-          <w:i/>
-          <w:iCs/>
         </w:rPr>
         <w:t>Poaceae</w:t>
       </w:r>
@@ -2005,18 +2086,43 @@
       <w:r>
         <w:rPr>
           <w:rFonts w:cstheme="minorHAnsi"/>
-          <w:i/>
-          <w:iCs/>
         </w:rPr>
         <w:t>Cyperaceae</w:t>
       </w:r>
       <w:proofErr w:type="spellEnd"/>
-      <w:proofErr w:type="gramEnd"/>
-      <w:r>
-        <w:rPr>
-          <w:rFonts w:cstheme="minorHAnsi"/>
-        </w:rPr>
-        <w:t xml:space="preserve">, and </w:t>
+      <w:r>
+        <w:rPr>
+          <w:rFonts w:cstheme="minorHAnsi"/>
+        </w:rPr>
+        <w:t xml:space="preserve"> dominate both grassland communities, and </w:t>
+      </w:r>
+      <w:proofErr w:type="spellStart"/>
+      <w:r>
+        <w:rPr>
+          <w:rFonts w:cstheme="minorHAnsi"/>
+        </w:rPr>
+        <w:t>Hemicryptophytes</w:t>
+      </w:r>
+      <w:proofErr w:type="spellEnd"/>
+      <w:r>
+        <w:rPr>
+          <w:rFonts w:cstheme="minorHAnsi"/>
+        </w:rPr>
+        <w:t xml:space="preserve"> and </w:t>
+      </w:r>
+      <w:proofErr w:type="spellStart"/>
+      <w:r>
+        <w:rPr>
+          <w:rFonts w:cstheme="minorHAnsi"/>
+        </w:rPr>
+        <w:t>Chamaephytes</w:t>
+      </w:r>
+      <w:proofErr w:type="spellEnd"/>
+      <w:r>
+        <w:rPr>
+          <w:rFonts w:cstheme="minorHAnsi"/>
+        </w:rPr>
+        <w:t xml:space="preserve"> are the most common </w:t>
       </w:r>
       <w:r>
         <w:rPr>
@@ -2028,252 +2134,7 @@
         <w:rPr>
           <w:rFonts w:cstheme="minorHAnsi"/>
         </w:rPr>
-        <w:t xml:space="preserve"> are mainly </w:t>
-      </w:r>
-      <w:proofErr w:type="spellStart"/>
-      <w:r>
-        <w:rPr>
-          <w:rFonts w:cstheme="minorHAnsi"/>
-        </w:rPr>
-        <w:t>Hemicryptophytes</w:t>
-      </w:r>
-      <w:proofErr w:type="spellEnd"/>
-      <w:r>
-        <w:rPr>
-          <w:rFonts w:cstheme="minorHAnsi"/>
-        </w:rPr>
-        <w:t xml:space="preserve"> and </w:t>
-      </w:r>
-      <w:proofErr w:type="spellStart"/>
-      <w:r>
-        <w:rPr>
-          <w:rFonts w:cstheme="minorHAnsi"/>
-        </w:rPr>
-        <w:t>Chamaephytes</w:t>
-      </w:r>
-      <w:proofErr w:type="spellEnd"/>
-      <w:r>
-        <w:rPr>
-          <w:rFonts w:cstheme="minorHAnsi"/>
-        </w:rPr>
-        <w:t>. Grazing impact is restricted to wild populations of Cantabrian chamois (</w:t>
-      </w:r>
-      <w:proofErr w:type="spellStart"/>
-      <w:r>
-        <w:rPr>
-          <w:rFonts w:cstheme="minorHAnsi"/>
-          <w:i/>
-          <w:iCs/>
-        </w:rPr>
-        <w:t>Rupricapra</w:t>
-      </w:r>
-      <w:proofErr w:type="spellEnd"/>
-      <w:r>
-        <w:rPr>
-          <w:rFonts w:cstheme="minorHAnsi"/>
-          <w:i/>
-          <w:iCs/>
-        </w:rPr>
-        <w:t xml:space="preserve"> </w:t>
-      </w:r>
-      <w:proofErr w:type="spellStart"/>
-      <w:r>
-        <w:rPr>
-          <w:rFonts w:cstheme="minorHAnsi"/>
-          <w:i/>
-          <w:iCs/>
-        </w:rPr>
-        <w:t>pyrenaica</w:t>
-      </w:r>
-      <w:proofErr w:type="spellEnd"/>
-      <w:r>
-        <w:rPr>
-          <w:rFonts w:cstheme="minorHAnsi"/>
-          <w:i/>
-          <w:iCs/>
-        </w:rPr>
-        <w:t xml:space="preserve"> </w:t>
-      </w:r>
-      <w:proofErr w:type="spellStart"/>
-      <w:r>
-        <w:rPr>
-          <w:rFonts w:cstheme="minorHAnsi"/>
-          <w:i/>
-          <w:iCs/>
-        </w:rPr>
-        <w:t>parva</w:t>
-      </w:r>
-      <w:proofErr w:type="spellEnd"/>
-      <w:r>
-        <w:rPr>
-          <w:rFonts w:cstheme="minorHAnsi"/>
-        </w:rPr>
-        <w:t>) in both systems.</w:t>
-      </w:r>
-      <w:r>
-        <w:rPr>
-          <w:noProof/>
-          <w:lang w:val="ca-ES" w:eastAsia="ca-ES"/>
-        </w:rPr>
-        <w:drawing>
-          <wp:inline distT="0" distB="0" distL="0" distR="0" wp14:anchorId="3ED5C28A" wp14:editId="2994EF77">
-            <wp:extent cx="5381625" cy="1695450"/>
-            <wp:effectExtent l="0" t="0" r="9525" b="0"/>
-            <wp:docPr id="1335175674" name="Imagen 5"/>
-            <wp:cNvGraphicFramePr>
-              <a:graphicFrameLocks xmlns:a="http://schemas.openxmlformats.org/drawingml/2006/main" noChangeAspect="1"/>
-            </wp:cNvGraphicFramePr>
-            <a:graphic xmlns:a="http://schemas.openxmlformats.org/drawingml/2006/main">
-              <a:graphicData uri="http://schemas.openxmlformats.org/drawingml/2006/picture">
-                <pic:pic xmlns:pic="http://schemas.openxmlformats.org/drawingml/2006/picture">
-                  <pic:nvPicPr>
-                    <pic:cNvPr id="0" name="Picture 9"/>
-                    <pic:cNvPicPr>
-                      <a:picLocks noChangeAspect="1" noChangeArrowheads="1"/>
-                    </pic:cNvPicPr>
-                  </pic:nvPicPr>
-                  <pic:blipFill>
-                    <a:blip r:embed="rId13" cstate="print">
-                      <a:extLst>
-                        <a:ext uri="{28A0092B-C50C-407E-A947-70E740481C1C}">
-                          <a14:useLocalDpi xmlns:a14="http://schemas.microsoft.com/office/drawing/2010/main" val="0"/>
-                        </a:ext>
-                      </a:extLst>
-                    </a:blip>
-                    <a:srcRect/>
-                    <a:stretch>
-                      <a:fillRect/>
-                    </a:stretch>
-                  </pic:blipFill>
-                  <pic:spPr bwMode="auto">
-                    <a:xfrm>
-                      <a:off x="0" y="0"/>
-                      <a:ext cx="5381625" cy="1695450"/>
-                    </a:xfrm>
-                    <a:prstGeom prst="rect">
-                      <a:avLst/>
-                    </a:prstGeom>
-                    <a:noFill/>
-                    <a:ln>
-                      <a:noFill/>
-                    </a:ln>
-                  </pic:spPr>
-                </pic:pic>
-              </a:graphicData>
-            </a:graphic>
-          </wp:inline>
-        </w:drawing>
-      </w:r>
-      <w:r>
-        <w:rPr>
-          <w:noProof/>
-          <w:lang w:val="ca-ES" w:eastAsia="ca-ES"/>
-        </w:rPr>
-        <w:drawing>
-          <wp:inline distT="0" distB="0" distL="0" distR="0" wp14:anchorId="1FB788B9" wp14:editId="5F04F008">
-            <wp:extent cx="2923302" cy="1685925"/>
-            <wp:effectExtent l="0" t="0" r="0" b="0"/>
-            <wp:docPr id="424347263" name="Imagen 6"/>
-            <wp:cNvGraphicFramePr>
-              <a:graphicFrameLocks xmlns:a="http://schemas.openxmlformats.org/drawingml/2006/main" noChangeAspect="1"/>
-            </wp:cNvGraphicFramePr>
-            <a:graphic xmlns:a="http://schemas.openxmlformats.org/drawingml/2006/main">
-              <a:graphicData uri="http://schemas.openxmlformats.org/drawingml/2006/picture">
-                <pic:pic xmlns:pic="http://schemas.openxmlformats.org/drawingml/2006/picture">
-                  <pic:nvPicPr>
-                    <pic:cNvPr id="0" name="Picture 10"/>
-                    <pic:cNvPicPr>
-                      <a:picLocks noChangeAspect="1" noChangeArrowheads="1"/>
-                    </pic:cNvPicPr>
-                  </pic:nvPicPr>
-                  <pic:blipFill rotWithShape="1">
-                    <a:blip r:embed="rId14" cstate="print">
-                      <a:extLst>
-                        <a:ext uri="{28A0092B-C50C-407E-A947-70E740481C1C}">
-                          <a14:useLocalDpi xmlns:a14="http://schemas.microsoft.com/office/drawing/2010/main" val="0"/>
-                        </a:ext>
-                      </a:extLst>
-                    </a:blip>
-                    <a:srcRect t="18454"/>
-                    <a:stretch/>
-                  </pic:blipFill>
-                  <pic:spPr bwMode="auto">
-                    <a:xfrm>
-                      <a:off x="0" y="0"/>
-                      <a:ext cx="2923699" cy="1686154"/>
-                    </a:xfrm>
-                    <a:prstGeom prst="rect">
-                      <a:avLst/>
-                    </a:prstGeom>
-                    <a:noFill/>
-                    <a:ln>
-                      <a:noFill/>
-                    </a:ln>
-                    <a:extLst>
-                      <a:ext uri="{53640926-AAD7-44D8-BBD7-CCE9431645EC}">
-                        <a14:shadowObscured xmlns:a14="http://schemas.microsoft.com/office/drawing/2010/main"/>
-                      </a:ext>
-                    </a:extLst>
-                  </pic:spPr>
-                </pic:pic>
-              </a:graphicData>
-            </a:graphic>
-          </wp:inline>
-        </w:drawing>
-      </w:r>
-      <w:r>
-        <w:rPr>
-          <w:noProof/>
-          <w:lang w:val="ca-ES" w:eastAsia="ca-ES"/>
-        </w:rPr>
-        <w:drawing>
-          <wp:inline distT="0" distB="0" distL="0" distR="0" wp14:anchorId="02B64153" wp14:editId="24F4AE46">
-            <wp:extent cx="2419752" cy="1711325"/>
-            <wp:effectExtent l="0" t="0" r="0" b="3175"/>
-            <wp:docPr id="261550396" name="Imagen 7"/>
-            <wp:cNvGraphicFramePr>
-              <a:graphicFrameLocks xmlns:a="http://schemas.openxmlformats.org/drawingml/2006/main" noChangeAspect="1"/>
-            </wp:cNvGraphicFramePr>
-            <a:graphic xmlns:a="http://schemas.openxmlformats.org/drawingml/2006/main">
-              <a:graphicData uri="http://schemas.openxmlformats.org/drawingml/2006/picture">
-                <pic:pic xmlns:pic="http://schemas.openxmlformats.org/drawingml/2006/picture">
-                  <pic:nvPicPr>
-                    <pic:cNvPr id="0" name="Picture 11"/>
-                    <pic:cNvPicPr>
-                      <a:picLocks noChangeAspect="1" noChangeArrowheads="1"/>
-                    </pic:cNvPicPr>
-                  </pic:nvPicPr>
-                  <pic:blipFill>
-                    <a:blip r:embed="rId15" cstate="print">
-                      <a:extLst>
-                        <a:ext uri="{28A0092B-C50C-407E-A947-70E740481C1C}">
-                          <a14:useLocalDpi xmlns:a14="http://schemas.microsoft.com/office/drawing/2010/main" val="0"/>
-                        </a:ext>
-                      </a:extLst>
-                    </a:blip>
-                    <a:srcRect/>
-                    <a:stretch>
-                      <a:fillRect/>
-                    </a:stretch>
-                  </pic:blipFill>
-                  <pic:spPr bwMode="auto">
-                    <a:xfrm>
-                      <a:off x="0" y="0"/>
-                      <a:ext cx="2433080" cy="1720751"/>
-                    </a:xfrm>
-                    <a:prstGeom prst="rect">
-                      <a:avLst/>
-                    </a:prstGeom>
-                    <a:noFill/>
-                    <a:ln>
-                      <a:noFill/>
-                    </a:ln>
-                  </pic:spPr>
-                </pic:pic>
-              </a:graphicData>
-            </a:graphic>
-          </wp:inline>
-        </w:drawing>
+        <w:t xml:space="preserve">. </w:t>
       </w:r>
     </w:p>
     <w:p>
@@ -2282,6 +2143,61 @@
         <w:jc w:val="both"/>
         <w:rPr>
           <w:rFonts w:cstheme="minorHAnsi"/>
+        </w:rPr>
+      </w:pPr>
+      <w:r>
+        <w:rPr>
+          <w:rFonts w:cstheme="minorHAnsi"/>
+          <w:highlight w:val="yellow"/>
+        </w:rPr>
+        <w:t xml:space="preserve">Figure 1. </w:t>
+      </w:r>
+      <w:proofErr w:type="gramStart"/>
+      <w:r>
+        <w:rPr>
+          <w:rFonts w:cstheme="minorHAnsi"/>
+          <w:highlight w:val="yellow"/>
+        </w:rPr>
+        <w:t xml:space="preserve">Map from other publications with </w:t>
+      </w:r>
+      <w:proofErr w:type="spellStart"/>
+      <w:r>
+        <w:rPr>
+          <w:rFonts w:cstheme="minorHAnsi"/>
+          <w:highlight w:val="yellow"/>
+        </w:rPr>
+        <w:t>Eurosiberian</w:t>
+      </w:r>
+      <w:proofErr w:type="spellEnd"/>
+      <w:r>
+        <w:rPr>
+          <w:rFonts w:cstheme="minorHAnsi"/>
+          <w:highlight w:val="yellow"/>
+        </w:rPr>
+        <w:t xml:space="preserve"> and Mediterranean regions</w:t>
+      </w:r>
+      <w:r>
+        <w:rPr>
+          <w:rFonts w:cstheme="minorHAnsi"/>
+          <w:highlight w:val="yellow"/>
+        </w:rPr>
+        <w:t xml:space="preserve"> with our study communities locations</w:t>
+      </w:r>
+      <w:r>
+        <w:rPr>
+          <w:rFonts w:cstheme="minorHAnsi"/>
+          <w:highlight w:val="yellow"/>
+        </w:rPr>
+        <w:t>?</w:t>
+      </w:r>
+      <w:proofErr w:type="gramEnd"/>
+    </w:p>
+    <w:p>
+      <w:pPr>
+        <w:spacing w:line="480" w:lineRule="auto"/>
+        <w:jc w:val="both"/>
+        <w:rPr>
+          <w:rFonts w:cstheme="minorHAnsi"/>
           <w:lang w:val="en-US"/>
         </w:rPr>
       </w:pPr>
@@ -2351,14 +2267,7 @@
         <w:rPr>
           <w:rFonts w:cstheme="minorHAnsi"/>
         </w:rPr>
-        <w:t xml:space="preserve"> days with </w:t>
-      </w:r>
-      <w:r>
-        <w:rPr>
-          <w:rFonts w:cstheme="minorHAnsi"/>
-        </w:rPr>
-        <w:lastRenderedPageBreak/>
-        <w:t>mean temperature &gt; 5ºC at 5 cm deep in the soil (</w:t>
+        <w:t xml:space="preserve"> days with mean temperature &gt; 5ºC at 5 cm deep in the soil (</w:t>
       </w:r>
       <w:proofErr w:type="spellStart"/>
       <w:r>
@@ -2374,6 +2283,12 @@
         </w:rPr>
         <w:t xml:space="preserve">, 2021). Mean annual soil temperature at 5 cm deep, based on </w:t>
       </w:r>
+      <w:r>
+        <w:rPr>
+          <w:rFonts w:cstheme="minorHAnsi"/>
+        </w:rPr>
+        <w:t xml:space="preserve">the average of </w:t>
+      </w:r>
       <w:proofErr w:type="gramStart"/>
       <w:r>
         <w:rPr>
@@ -2386,7 +2301,19 @@
         <w:rPr>
           <w:rFonts w:cstheme="minorHAnsi"/>
         </w:rPr>
-        <w:t xml:space="preserve"> location per system and 3+ years (own data not shown). Summer precipitation, based on 47 locations from CHELSA 2.1 (bio 17). Local richness calculated from floristic </w:t>
+        <w:t xml:space="preserve"> location</w:t>
+      </w:r>
+      <w:r>
+        <w:rPr>
+          <w:rFonts w:cstheme="minorHAnsi"/>
+        </w:rPr>
+        <w:t>s</w:t>
+      </w:r>
+      <w:r>
+        <w:rPr>
+          <w:rFonts w:cstheme="minorHAnsi"/>
+        </w:rPr>
+        <w:t xml:space="preserve"> per system (own data not shown). Summer precipitation, based on 47 locations from CHELSA 2.1 (bio 17). Local richness calculated from floristic </w:t>
       </w:r>
       <w:proofErr w:type="spellStart"/>
       <w:r>
@@ -2433,7 +2360,7 @@
         <w:rPr>
           <w:rFonts w:cstheme="minorHAnsi"/>
         </w:rPr>
-        <w:t xml:space="preserve"> Dominant species also based on the same floristic </w:t>
+        <w:t xml:space="preserve"> Dominant species based on the same floristic </w:t>
       </w:r>
       <w:proofErr w:type="spellStart"/>
       <w:r>
@@ -3580,6 +3507,7 @@
                 <w:szCs w:val="18"/>
                 <w:lang w:val="en-US" w:eastAsia="es-ES"/>
               </w:rPr>
+              <w:lastRenderedPageBreak/>
               <w:t xml:space="preserve">Local richness </w:t>
             </w:r>
           </w:p>
@@ -4305,7 +4233,7 @@
           <w:color w:val="000000"/>
           <w:lang w:eastAsia="ca-ES"/>
         </w:rPr>
-        <w:t>system</w:t>
+        <w:t>community</w:t>
       </w:r>
       <w:proofErr w:type="gramEnd"/>
       <w:r>
@@ -4314,7 +4242,7 @@
           <w:color w:val="000000"/>
           <w:lang w:eastAsia="ca-ES"/>
         </w:rPr>
-        <w:t xml:space="preserve"> we established four seed sampling sites, separated at least 500 m</w:t>
+        <w:t xml:space="preserve"> we established four sampling sites, separated at least 500 m</w:t>
       </w:r>
       <w:r>
         <w:t xml:space="preserve">. To measure the spatial </w:t>
@@ -4331,7 +4259,7 @@
         <w:t>,</w:t>
       </w:r>
       <w:r>
-        <w:t xml:space="preserve"> we established 20 additional plots </w:t>
+        <w:t xml:space="preserve"> we established 20 plots </w:t>
       </w:r>
       <w:r>
         <w:t>(1m</w:t>
@@ -4346,13 +4274,30 @@
         <w:t>)</w:t>
       </w:r>
       <w:r>
-        <w:t xml:space="preserve"> per each sampling site, five plots in each cardinal direction with a 10 m separation (</w:t>
+        <w:t xml:space="preserve"> per each sampling site</w:t>
+      </w:r>
+      <w:r>
+        <w:t xml:space="preserve"> (4 sites x 20 plots)</w:t>
+      </w:r>
+      <w:r>
+        <w:t xml:space="preserve">, </w:t>
+      </w:r>
+      <w:proofErr w:type="gramStart"/>
+      <w:r>
+        <w:t>five</w:t>
+      </w:r>
+      <w:proofErr w:type="gramEnd"/>
+      <w:r>
+        <w:t xml:space="preserve"> plots in each cardinal direction with a 10 m separation (</w:t>
       </w:r>
       <w:r>
         <w:rPr>
           <w:highlight w:val="yellow"/>
         </w:rPr>
-        <w:t>cross design, fig x</w:t>
+        <w:t xml:space="preserve">cross design, fig </w:t>
+      </w:r>
+      <w:r>
+        <w:t>2</w:t>
       </w:r>
       <w:r>
         <w:t xml:space="preserve">). Here, we also did floristic </w:t>
@@ -4383,10 +4328,7 @@
         <w:t>centre</w:t>
       </w:r>
       <w:r>
-        <w:t xml:space="preserve"> of these addition</w:t>
-      </w:r>
-      <w:r>
-        <w:t>al</w:t>
+        <w:t xml:space="preserve"> of these</w:t>
       </w:r>
       <w:r>
         <w:t xml:space="preserve"> plots</w:t>
@@ -4454,7 +4396,13 @@
         <w:t xml:space="preserve">). </w:t>
       </w:r>
       <w:r>
-        <w:t xml:space="preserve">In the temperate system the </w:t>
+        <w:t xml:space="preserve">In the temperate </w:t>
+      </w:r>
+      <w:r>
+        <w:t>community</w:t>
+      </w:r>
+      <w:r>
+        <w:t xml:space="preserve"> the </w:t>
       </w:r>
       <w:proofErr w:type="spellStart"/>
       <w:r>
@@ -4546,11 +4494,10 @@
         <w:t xml:space="preserve"> (321 days)</w:t>
       </w:r>
       <w:r>
-        <w:t xml:space="preserve"> in the </w:t>
-      </w:r>
-      <w:r>
-        <w:lastRenderedPageBreak/>
-        <w:t>Mediterranean system</w:t>
+        <w:t xml:space="preserve"> in the Mediterranean </w:t>
+      </w:r>
+      <w:r>
+        <w:t>community</w:t>
       </w:r>
       <w:r>
         <w:t>. In total, we collected floristic data from 8</w:t>
@@ -4562,53 +4509,140 @@
         <w:t xml:space="preserve"> plots </w:t>
       </w:r>
       <w:r>
-        <w:t xml:space="preserve">per system. Not all </w:t>
-      </w:r>
-      <w:proofErr w:type="spellStart"/>
-      <w:r>
-        <w:t>iButtons</w:t>
-      </w:r>
-      <w:proofErr w:type="spellEnd"/>
-      <w:r>
-        <w:t xml:space="preserve"> </w:t>
-      </w:r>
-      <w:proofErr w:type="gramStart"/>
-      <w:r>
-        <w:t>could be recovered</w:t>
-      </w:r>
-      <w:proofErr w:type="gramEnd"/>
-      <w:r>
-        <w:t>, thus we obtained</w:t>
-      </w:r>
-      <w:r>
-        <w:t xml:space="preserve"> environmental data from 7</w:t>
-      </w:r>
-      <w:r>
-        <w:t>5</w:t>
-      </w:r>
-      <w:r>
-        <w:t xml:space="preserve"> </w:t>
-      </w:r>
-      <w:r>
-        <w:t xml:space="preserve">and 78 plots </w:t>
-      </w:r>
-      <w:r>
-        <w:t>(</w:t>
-      </w:r>
-      <w:r>
-        <w:t>in the Mediterranean and Temperate system, respectively</w:t>
-      </w:r>
-      <w:r>
-        <w:t>).</w:t>
+        <w:t xml:space="preserve">per system. </w:t>
       </w:r>
     </w:p>
     <w:p>
       <w:pPr>
         <w:spacing w:line="480" w:lineRule="auto"/>
-        <w:ind w:firstLine="709"/>
         <w:jc w:val="both"/>
       </w:pPr>
       <w:r>
+        <w:rPr>
+          <w:noProof/>
+          <w:lang w:val="ca-ES" w:eastAsia="ca-ES"/>
+        </w:rPr>
+        <w:t xml:space="preserve"> </w:t>
+      </w:r>
+      <w:r>
+        <w:rPr>
+          <w:noProof/>
+          <w:lang w:val="ca-ES" w:eastAsia="ca-ES"/>
+        </w:rPr>
+        <w:drawing>
+          <wp:inline distT="0" distB="0" distL="0" distR="0" wp14:anchorId="1E01EEB9" wp14:editId="4B2FF0FE">
+            <wp:extent cx="2923302" cy="1685925"/>
+            <wp:effectExtent l="0" t="0" r="0" b="0"/>
+            <wp:docPr id="424347263" name="Imagen 6"/>
+            <wp:cNvGraphicFramePr>
+              <a:graphicFrameLocks xmlns:a="http://schemas.openxmlformats.org/drawingml/2006/main" noChangeAspect="1"/>
+            </wp:cNvGraphicFramePr>
+            <a:graphic xmlns:a="http://schemas.openxmlformats.org/drawingml/2006/main">
+              <a:graphicData uri="http://schemas.openxmlformats.org/drawingml/2006/picture">
+                <pic:pic xmlns:pic="http://schemas.openxmlformats.org/drawingml/2006/picture">
+                  <pic:nvPicPr>
+                    <pic:cNvPr id="0" name="Picture 10"/>
+                    <pic:cNvPicPr>
+                      <a:picLocks noChangeAspect="1" noChangeArrowheads="1"/>
+                    </pic:cNvPicPr>
+                  </pic:nvPicPr>
+                  <pic:blipFill rotWithShape="1">
+                    <a:blip r:embed="rId13" cstate="print">
+                      <a:extLst>
+                        <a:ext uri="{28A0092B-C50C-407E-A947-70E740481C1C}">
+                          <a14:useLocalDpi xmlns:a14="http://schemas.microsoft.com/office/drawing/2010/main" val="0"/>
+                        </a:ext>
+                      </a:extLst>
+                    </a:blip>
+                    <a:srcRect t="18454"/>
+                    <a:stretch/>
+                  </pic:blipFill>
+                  <pic:spPr bwMode="auto">
+                    <a:xfrm>
+                      <a:off x="0" y="0"/>
+                      <a:ext cx="2923699" cy="1686154"/>
+                    </a:xfrm>
+                    <a:prstGeom prst="rect">
+                      <a:avLst/>
+                    </a:prstGeom>
+                    <a:noFill/>
+                    <a:ln>
+                      <a:noFill/>
+                    </a:ln>
+                    <a:extLst>
+                      <a:ext uri="{53640926-AAD7-44D8-BBD7-CCE9431645EC}">
+                        <a14:shadowObscured xmlns:a14="http://schemas.microsoft.com/office/drawing/2010/main"/>
+                      </a:ext>
+                    </a:extLst>
+                  </pic:spPr>
+                </pic:pic>
+              </a:graphicData>
+            </a:graphic>
+          </wp:inline>
+        </w:drawing>
+      </w:r>
+      <w:r>
+        <w:rPr>
+          <w:noProof/>
+          <w:lang w:val="ca-ES" w:eastAsia="ca-ES"/>
+        </w:rPr>
+        <w:drawing>
+          <wp:inline distT="0" distB="0" distL="0" distR="0" wp14:anchorId="3D491CA3" wp14:editId="38DC6EB5">
+            <wp:extent cx="2419752" cy="1711325"/>
+            <wp:effectExtent l="0" t="0" r="0" b="3175"/>
+            <wp:docPr id="261550396" name="Imagen 7"/>
+            <wp:cNvGraphicFramePr>
+              <a:graphicFrameLocks xmlns:a="http://schemas.openxmlformats.org/drawingml/2006/main" noChangeAspect="1"/>
+            </wp:cNvGraphicFramePr>
+            <a:graphic xmlns:a="http://schemas.openxmlformats.org/drawingml/2006/main">
+              <a:graphicData uri="http://schemas.openxmlformats.org/drawingml/2006/picture">
+                <pic:pic xmlns:pic="http://schemas.openxmlformats.org/drawingml/2006/picture">
+                  <pic:nvPicPr>
+                    <pic:cNvPr id="0" name="Picture 11"/>
+                    <pic:cNvPicPr>
+                      <a:picLocks noChangeAspect="1" noChangeArrowheads="1"/>
+                    </pic:cNvPicPr>
+                  </pic:nvPicPr>
+                  <pic:blipFill>
+                    <a:blip r:embed="rId14" cstate="print">
+                      <a:extLst>
+                        <a:ext uri="{28A0092B-C50C-407E-A947-70E740481C1C}">
+                          <a14:useLocalDpi xmlns:a14="http://schemas.microsoft.com/office/drawing/2010/main" val="0"/>
+                        </a:ext>
+                      </a:extLst>
+                    </a:blip>
+                    <a:srcRect/>
+                    <a:stretch>
+                      <a:fillRect/>
+                    </a:stretch>
+                  </pic:blipFill>
+                  <pic:spPr bwMode="auto">
+                    <a:xfrm>
+                      <a:off x="0" y="0"/>
+                      <a:ext cx="2433080" cy="1720751"/>
+                    </a:xfrm>
+                    <a:prstGeom prst="rect">
+                      <a:avLst/>
+                    </a:prstGeom>
+                    <a:noFill/>
+                    <a:ln>
+                      <a:noFill/>
+                    </a:ln>
+                  </pic:spPr>
+                </pic:pic>
+              </a:graphicData>
+            </a:graphic>
+          </wp:inline>
+        </w:drawing>
+      </w:r>
+    </w:p>
+    <w:p>
+      <w:pPr>
+        <w:pStyle w:val="Textoindependiente"/>
+        <w:spacing w:before="120" w:after="0" w:line="480" w:lineRule="auto"/>
+        <w:jc w:val="both"/>
+      </w:pPr>
+      <w:r>
         <w:t xml:space="preserve">From the </w:t>
       </w:r>
       <w:proofErr w:type="spellStart"/>
@@ -4635,133 +4669,261 @@
         <w:t>Jiménez-Alfaro et al. (2024, JVA</w:t>
       </w:r>
       <w:r>
-        <w:t xml:space="preserve">). </w:t>
-      </w:r>
-      <w:commentRangeStart w:id="3"/>
-      <w:r>
-        <w:t xml:space="preserve">We calculated bioclimatic indices based on standard variables used by </w:t>
+        <w:t>)</w:t>
+      </w:r>
+      <w:r>
+        <w:t xml:space="preserve"> focusing on climatic variables with a relevant function. </w:t>
+      </w:r>
+      <w:r>
+        <w:t xml:space="preserve"> </w:t>
+      </w:r>
+      <w:r>
+        <w:t>Five</w:t>
+      </w:r>
+      <w:r>
+        <w:t xml:space="preserve"> </w:t>
       </w:r>
       <w:proofErr w:type="spellStart"/>
       <w:r>
-        <w:t>WorldClim</w:t>
+        <w:t>iButtons</w:t>
       </w:r>
       <w:proofErr w:type="spellEnd"/>
       <w:r>
-        <w:t xml:space="preserve"> (Fick &amp; </w:t>
-      </w:r>
-      <w:proofErr w:type="spellStart"/>
-      <w:r>
-        <w:t>Hijmans</w:t>
-      </w:r>
-      <w:proofErr w:type="spellEnd"/>
-      <w:r>
-        <w:t xml:space="preserve"> 2017), together with other variables with a relevant function on alpine topographic gradients. </w:t>
+        <w:t xml:space="preserve"> </w:t>
       </w:r>
       <w:proofErr w:type="gramStart"/>
       <w:r>
-        <w:t>The selected variables were: (1) bio1 = annual mean temperature; (2) bio2 = mean diurnal range, i.e. the mean of the monthly differences between maximum and minimum temperatures; (3) bio7 = temperature annual range; i.e. the difference between the maximum temperature of the warmest month and the minimum temperature of the coldest month; (4) snow = the number of days of snow cover, when temperature is around 0 ºC, calculated for the period in which the maximum temperature was &lt; 0.5 ºC and the minimum temperature was &gt; -0.5 ºC; (5) FDD = freezing degree days, i.e. the sum of daily mean temperatures for days in which the mean temperature was below 0 ºC (Choler 2018); and (6) GDD = growing degree days, i.e. the sum of daily mean temperatures for days in which the soil mean temperature at five cm deep was above 5 ºC (</w:t>
-      </w:r>
-      <w:proofErr w:type="spellStart"/>
-      <w:r>
-        <w:t>Körner</w:t>
-      </w:r>
-      <w:proofErr w:type="spellEnd"/>
-      <w:r>
-        <w:t xml:space="preserve"> 2021).</w:t>
+        <w:t>could be recovered</w:t>
       </w:r>
       <w:proofErr w:type="gramEnd"/>
       <w:r>
-        <w:t xml:space="preserve"> For FDD, we transformed the values from negative to positive, so higher values represent more freezing.</w:t>
-      </w:r>
-      <w:commentRangeEnd w:id="3"/>
+        <w:t xml:space="preserve"> in the Mediterranean community</w:t>
+      </w:r>
+      <w:r>
+        <w:t>, thus we obtained</w:t>
+      </w:r>
+      <w:r>
+        <w:t xml:space="preserve"> environmental data from 7</w:t>
+      </w:r>
+      <w:r>
+        <w:t>5</w:t>
+      </w:r>
+      <w:r>
+        <w:t xml:space="preserve"> </w:t>
+      </w:r>
+      <w:r>
+        <w:t xml:space="preserve">plots. </w:t>
+      </w:r>
+      <w:commentRangeStart w:id="2"/>
+      <w:r>
+        <w:rPr>
+          <w:highlight w:val="yellow"/>
+        </w:rPr>
+        <w:t xml:space="preserve">We </w:t>
+      </w:r>
+      <w:proofErr w:type="gramStart"/>
+      <w:r>
+        <w:rPr>
+          <w:highlight w:val="yellow"/>
+        </w:rPr>
+        <w:t xml:space="preserve">calculated </w:t>
+      </w:r>
+      <w:r>
+        <w:rPr>
+          <w:highlight w:val="yellow"/>
+        </w:rPr>
+        <w:t xml:space="preserve"> a</w:t>
+      </w:r>
+      <w:proofErr w:type="gramEnd"/>
+      <w:r>
+        <w:rPr>
+          <w:highlight w:val="yellow"/>
+        </w:rPr>
+        <w:t xml:space="preserve"> </w:t>
+      </w:r>
+      <w:commentRangeEnd w:id="2"/>
       <w:r>
         <w:rPr>
           <w:rStyle w:val="Refdecomentario"/>
           <w:rFonts w:ascii="Calibri" w:eastAsia="Calibri" w:hAnsi="Calibri" w:cs="Calibri"/>
         </w:rPr>
-        <w:commentReference w:id="3"/>
+        <w:commentReference w:id="2"/>
+      </w:r>
+      <w:r>
+        <w:rPr>
+          <w:highlight w:val="yellow"/>
+        </w:rPr>
+        <w:t xml:space="preserve">set </w:t>
+      </w:r>
+      <w:r>
+        <w:rPr>
+          <w:highlight w:val="yellow"/>
+        </w:rPr>
+        <w:t>bioclimatic indices ba</w:t>
+      </w:r>
+      <w:bookmarkStart w:id="3" w:name="_GoBack"/>
+      <w:bookmarkEnd w:id="3"/>
+      <w:r>
+        <w:rPr>
+          <w:highlight w:val="yellow"/>
+        </w:rPr>
+        <w:t xml:space="preserve">sed on standard </w:t>
+      </w:r>
+      <w:r>
+        <w:rPr>
+          <w:highlight w:val="yellow"/>
+        </w:rPr>
+        <w:lastRenderedPageBreak/>
+        <w:t xml:space="preserve">variables used by </w:t>
+      </w:r>
+      <w:proofErr w:type="spellStart"/>
+      <w:r>
+        <w:rPr>
+          <w:highlight w:val="yellow"/>
+        </w:rPr>
+        <w:t>WorldClim</w:t>
+      </w:r>
+      <w:proofErr w:type="spellEnd"/>
+      <w:r>
+        <w:rPr>
+          <w:highlight w:val="yellow"/>
+        </w:rPr>
+        <w:t xml:space="preserve"> (Fick &amp; </w:t>
+      </w:r>
+      <w:proofErr w:type="spellStart"/>
+      <w:r>
+        <w:rPr>
+          <w:highlight w:val="yellow"/>
+        </w:rPr>
+        <w:t>Hijmans</w:t>
+      </w:r>
+      <w:proofErr w:type="spellEnd"/>
+      <w:r>
+        <w:rPr>
+          <w:highlight w:val="yellow"/>
+        </w:rPr>
+        <w:t xml:space="preserve"> 2017), together with other variables with a relevant function on alpine topographic gradients. </w:t>
+      </w:r>
+      <w:proofErr w:type="gramStart"/>
+      <w:r>
+        <w:rPr>
+          <w:highlight w:val="yellow"/>
+        </w:rPr>
+        <w:t xml:space="preserve">The selected variables were: (1) bio1 = annual mean temperature; (2) bio2 = mean diurnal range, i.e. the mean of the monthly differences between maximum and minimum temperatures; (3) bio7 = temperature annual range; i.e. the difference between the maximum temperature of the warmest month and the minimum temperature of the coldest month; (4) </w:t>
+      </w:r>
+      <w:r>
+        <w:t>“Snow”</w:t>
+      </w:r>
+      <w:r>
+        <w:t xml:space="preserve"> </w:t>
+      </w:r>
+      <w:r>
+        <w:t xml:space="preserve">as </w:t>
+      </w:r>
+      <w:r>
+        <w:t xml:space="preserve">the number of days </w:t>
+      </w:r>
+      <w:r>
+        <w:t>with</w:t>
+      </w:r>
+      <w:r>
+        <w:t xml:space="preserve"> snow cover,</w:t>
+      </w:r>
+      <w:r>
+        <w:t xml:space="preserve"> based on</w:t>
+      </w:r>
+      <w:r>
+        <w:t xml:space="preserve"> the period in which the maximum temperature</w:t>
+      </w:r>
+      <w:r>
+        <w:t>s</w:t>
+      </w:r>
+      <w:r>
+        <w:t xml:space="preserve"> w</w:t>
+      </w:r>
+      <w:r>
+        <w:t>ere</w:t>
+      </w:r>
+      <w:r>
+        <w:t xml:space="preserve"> &lt; 0.5 ºC and the minimum temperature w</w:t>
+      </w:r>
+      <w:r>
+        <w:t>ere &gt; -0.5 ºC (</w:t>
+      </w:r>
+      <w:r>
+        <w:rPr>
+          <w:highlight w:val="yellow"/>
+        </w:rPr>
+        <w:t>REF</w:t>
+      </w:r>
+      <w:r>
+        <w:t>)</w:t>
+      </w:r>
+      <w:r>
+        <w:rPr>
+          <w:highlight w:val="yellow"/>
+        </w:rPr>
+        <w:t>; (5) FDD = freezing degree days, i.e. the sum of daily mean temperatures for days in which the mean temperature was below 0 ºC (Choler 2018); and (6) GDD = growing degree days, i.e. the sum of daily mean temperatures for days in which the soil mean temperature at five cm deep was above 5 ºC (</w:t>
+      </w:r>
+      <w:proofErr w:type="spellStart"/>
+      <w:r>
+        <w:rPr>
+          <w:highlight w:val="yellow"/>
+        </w:rPr>
+        <w:t>Körner</w:t>
+      </w:r>
+      <w:proofErr w:type="spellEnd"/>
+      <w:r>
+        <w:rPr>
+          <w:highlight w:val="yellow"/>
+        </w:rPr>
+        <w:t xml:space="preserve"> 2021).</w:t>
+      </w:r>
+      <w:proofErr w:type="gramEnd"/>
+      <w:r>
+        <w:rPr>
+          <w:highlight w:val="yellow"/>
+        </w:rPr>
+        <w:t xml:space="preserve"> For FDD, we transformed the values from negative to positive, so higher values represent more freezing. To identify the main gradients of microclimatic variability at both temporal and spatial scales, we conducted a principal component analysis (PCA) with the </w:t>
+      </w:r>
+      <w:r>
+        <w:rPr>
+          <w:highlight w:val="yellow"/>
+        </w:rPr>
+        <w:t>full set of bioclimatic indices</w:t>
+      </w:r>
+      <w:r>
+        <w:t xml:space="preserve"> </w:t>
+      </w:r>
+      <w:r>
+        <w:rPr>
+          <w:highlight w:val="yellow"/>
+        </w:rPr>
+        <w:t>(fig xx)</w:t>
+      </w:r>
+      <w:r>
+        <w:rPr>
+          <w:highlight w:val="yellow"/>
+        </w:rPr>
+        <w:t xml:space="preserve"> UPDATE</w:t>
+      </w:r>
+      <w:r>
+        <w:t>.</w:t>
       </w:r>
     </w:p>
     <w:p>
       <w:pPr>
         <w:spacing w:line="480" w:lineRule="auto"/>
-        <w:ind w:firstLine="709"/>
         <w:jc w:val="both"/>
-      </w:pPr>
-      <w:r>
-        <w:t xml:space="preserve">We then used the floristic </w:t>
-      </w:r>
-      <w:proofErr w:type="spellStart"/>
-      <w:r>
-        <w:t>relevés</w:t>
-      </w:r>
-      <w:proofErr w:type="spellEnd"/>
-      <w:r>
-        <w:t xml:space="preserve"> and the bioclimatic indices calculated to estimate species climatic preferences (adult plants realized niche</w:t>
-      </w:r>
-      <w:r>
-        <w:t>/species niche centroids</w:t>
-      </w:r>
-      <w:r>
-        <w:t>). For that purpose, we considered only</w:t>
-      </w:r>
-      <w:r>
-        <w:t xml:space="preserve"> the environmental data of the</w:t>
-      </w:r>
-      <w:r>
-        <w:t xml:space="preserve"> plots where the species had at least 10% coverage and the climatic indices </w:t>
-      </w:r>
-      <w:proofErr w:type="gramStart"/>
-      <w:r>
-        <w:t>were weighted</w:t>
-      </w:r>
-      <w:proofErr w:type="gramEnd"/>
-      <w:r>
-        <w:t xml:space="preserve"> per </w:t>
-      </w:r>
-      <w:r>
-        <w:t xml:space="preserve">each species </w:t>
-      </w:r>
-      <w:r>
-        <w:t xml:space="preserve">coverage. </w:t>
-      </w:r>
-      <w:r>
-        <w:t>To identify main gradients of species climatic preferences we conducted a principal component analysis (PCA) with the full set of bioclimatic indices</w:t>
-      </w:r>
-      <w:r>
-        <w:t xml:space="preserve"> </w:t>
-      </w:r>
-      <w:r>
-        <w:rPr>
-          <w:highlight w:val="yellow"/>
-        </w:rPr>
-        <w:t>(fig xx)</w:t>
-      </w:r>
-      <w:r>
-        <w:rPr>
-          <w:highlight w:val="yellow"/>
-        </w:rPr>
-        <w:t xml:space="preserve"> UPDATE</w:t>
-      </w:r>
-      <w:r>
-        <w:t>.</w:t>
-      </w:r>
-    </w:p>
-    <w:p>
-      <w:pPr>
-        <w:spacing w:line="480" w:lineRule="auto"/>
-        <w:jc w:val="both"/>
         <w:rPr>
           <w:lang w:val="es-ES"/>
         </w:rPr>
       </w:pPr>
       <w:r>
         <w:rPr>
-          <w:noProof/>
-          <w:lang w:val="ca-ES" w:eastAsia="ca-ES"/>
-        </w:rPr>
-        <w:lastRenderedPageBreak/>
-        <w:pict w14:anchorId="24448AEF">
+          <w:lang w:val="es-ES"/>
+        </w:rPr>
+        <w:pict w14:anchorId="3E3E074F">
           <v:shapetype id="_x0000_t75" coordsize="21600,21600" o:spt="75" o:preferrelative="t" path="m@4@5l@4@11@9@11@9@5xe" filled="f" stroked="f">
             <v:stroke joinstyle="miter"/>
             <v:formulas>
@@ -4781,8 +4943,8 @@
             <v:path o:extrusionok="f" gradientshapeok="t" o:connecttype="rect"/>
             <o:lock v:ext="edit" aspectratio="t"/>
           </v:shapetype>
-          <v:shape id="_x0000_i1025" type="#_x0000_t75" style="width:424.5pt;height:217.6pt">
-            <v:imagedata r:id="rId16" o:title="Species climatic preferences"/>
+          <v:shape id="_x0000_i1026" type="#_x0000_t75" style="width:425pt;height:181.05pt">
+            <v:imagedata r:id="rId15" o:title="Bioclimatic indices PCA"/>
           </v:shape>
         </w:pict>
       </w:r>
@@ -5045,33 +5207,24 @@
           <w:color w:val="000000"/>
           <w:lang w:eastAsia="ca-ES"/>
         </w:rPr>
-        <w:t>at peak</w:t>
-      </w:r>
-      <w:r>
-        <w:rPr>
-          <w:rFonts w:eastAsia="Times New Roman" w:cstheme="minorHAnsi"/>
-          <w:color w:val="000000"/>
-          <w:lang w:eastAsia="ca-ES"/>
-        </w:rPr>
-        <w:t xml:space="preserve"> reproductive season and sampled ripe seeds or fruits (hereafter ‘seeds’ for simplicity) </w:t>
-      </w:r>
-      <w:proofErr w:type="gramStart"/>
-      <w:r>
-        <w:rPr>
-          <w:rFonts w:eastAsia="Times New Roman" w:cstheme="minorHAnsi"/>
-          <w:color w:val="000000"/>
-          <w:lang w:eastAsia="ca-ES"/>
-        </w:rPr>
-        <w:t>directly</w:t>
-      </w:r>
-      <w:proofErr w:type="gramEnd"/>
-      <w:r>
-        <w:rPr>
-          <w:rFonts w:eastAsia="Times New Roman" w:cstheme="minorHAnsi"/>
-          <w:color w:val="000000"/>
-          <w:lang w:eastAsia="ca-ES"/>
-        </w:rPr>
-        <w:t xml:space="preserve"> from the mother plants according to </w:t>
+        <w:t xml:space="preserve">at </w:t>
+      </w:r>
+      <w:r>
+        <w:rPr>
+          <w:rFonts w:eastAsia="Times New Roman" w:cstheme="minorHAnsi"/>
+          <w:color w:val="000000"/>
+          <w:lang w:eastAsia="ca-ES"/>
+        </w:rPr>
+        <w:lastRenderedPageBreak/>
+        <w:t>peak</w:t>
+      </w:r>
+      <w:r>
+        <w:rPr>
+          <w:rFonts w:eastAsia="Times New Roman" w:cstheme="minorHAnsi"/>
+          <w:color w:val="000000"/>
+          <w:lang w:eastAsia="ca-ES"/>
+        </w:rPr>
+        <w:t xml:space="preserve"> reproductive season and sampled ripe seeds or fruits (hereafter ‘seeds’ for simplicity) directly from the mother plants according to </w:t>
       </w:r>
       <w:r>
         <w:rPr>
@@ -5713,956 +5866,964 @@
           <w:color w:val="000000"/>
           <w:lang w:eastAsia="ca-ES"/>
         </w:rPr>
+        <w:t>(referred to as “</w:t>
+      </w:r>
+      <w:r>
+        <w:rPr>
+          <w:rFonts w:eastAsia="Times New Roman" w:cstheme="minorHAnsi"/>
+          <w:color w:val="000000"/>
+          <w:lang w:eastAsia="ca-ES"/>
+        </w:rPr>
+        <w:t>Control</w:t>
+      </w:r>
+      <w:r>
+        <w:rPr>
+          <w:rFonts w:eastAsia="Times New Roman" w:cstheme="minorHAnsi"/>
+          <w:color w:val="000000"/>
+          <w:lang w:eastAsia="ca-ES"/>
+        </w:rPr>
+        <w:t>”)</w:t>
+      </w:r>
+      <w:r>
+        <w:rPr>
+          <w:rFonts w:eastAsia="Times New Roman" w:cstheme="minorHAnsi"/>
+          <w:color w:val="000000"/>
+          <w:lang w:eastAsia="ca-ES"/>
+        </w:rPr>
+        <w:t>, (2</w:t>
+      </w:r>
+      <w:r>
+        <w:rPr>
+          <w:rFonts w:eastAsia="Times New Roman" w:cstheme="minorHAnsi"/>
+          <w:color w:val="000000"/>
+          <w:lang w:eastAsia="ca-ES"/>
+        </w:rPr>
+        <w:t xml:space="preserve">) </w:t>
+      </w:r>
+      <w:r>
+        <w:rPr>
+          <w:rFonts w:eastAsia="Times New Roman" w:cstheme="minorHAnsi"/>
+          <w:color w:val="000000"/>
+          <w:lang w:eastAsia="ca-ES"/>
+        </w:rPr>
+        <w:t xml:space="preserve">alternating temperatures and constant darkness (referred to as “Darkness”), (3) alternating temperature, water stress and 12h photoperiod (referred to as “Water stress”) and (4) </w:t>
+      </w:r>
+      <w:r>
+        <w:rPr>
+          <w:rFonts w:eastAsia="Times New Roman" w:cstheme="minorHAnsi"/>
+          <w:color w:val="000000"/>
+          <w:lang w:eastAsia="ca-ES"/>
+        </w:rPr>
+        <w:t xml:space="preserve">constant temperatures and </w:t>
+      </w:r>
+      <w:r>
+        <w:rPr>
+          <w:rFonts w:eastAsia="Times New Roman" w:cstheme="minorHAnsi"/>
+          <w:color w:val="000000"/>
+          <w:lang w:eastAsia="ca-ES"/>
+        </w:rPr>
+        <w:t xml:space="preserve">12h photoperiod </w:t>
+      </w:r>
+      <w:r>
+        <w:rPr>
+          <w:rFonts w:eastAsia="Times New Roman" w:cstheme="minorHAnsi"/>
+          <w:color w:val="000000"/>
+          <w:lang w:eastAsia="ca-ES"/>
+        </w:rPr>
+        <w:t>(referred to as “</w:t>
+      </w:r>
+      <w:r>
+        <w:rPr>
+          <w:rFonts w:eastAsia="Times New Roman" w:cstheme="minorHAnsi"/>
+          <w:color w:val="000000"/>
+          <w:lang w:eastAsia="ca-ES"/>
+        </w:rPr>
+        <w:t>Constant Temperature</w:t>
+      </w:r>
+      <w:r>
+        <w:rPr>
+          <w:rFonts w:eastAsia="Times New Roman" w:cstheme="minorHAnsi"/>
+          <w:color w:val="000000"/>
+          <w:lang w:eastAsia="ca-ES"/>
+        </w:rPr>
+        <w:t>”</w:t>
+      </w:r>
+      <w:r>
+        <w:rPr>
+          <w:rFonts w:eastAsia="Times New Roman" w:cstheme="minorHAnsi"/>
+          <w:color w:val="000000"/>
+          <w:lang w:eastAsia="ca-ES"/>
+        </w:rPr>
+        <w:t>)</w:t>
+      </w:r>
+      <w:r>
+        <w:rPr>
+          <w:rFonts w:eastAsia="Times New Roman" w:cstheme="minorHAnsi"/>
+          <w:color w:val="000000"/>
+          <w:lang w:eastAsia="ca-ES"/>
+        </w:rPr>
+        <w:t>.</w:t>
+      </w:r>
+      <w:r>
+        <w:rPr>
+          <w:rFonts w:eastAsia="Times New Roman" w:cstheme="minorHAnsi"/>
+          <w:color w:val="000000"/>
+          <w:lang w:eastAsia="ca-ES"/>
+        </w:rPr>
+        <w:t xml:space="preserve"> </w:t>
+      </w:r>
+      <w:r>
+        <w:rPr>
+          <w:rFonts w:eastAsia="Times New Roman" w:cstheme="minorHAnsi"/>
+          <w:color w:val="000000"/>
+          <w:lang w:eastAsia="ca-ES"/>
+        </w:rPr>
+        <w:t>Pre</w:t>
+      </w:r>
+      <w:r>
+        <w:rPr>
+          <w:rFonts w:eastAsia="Times New Roman" w:cstheme="minorHAnsi"/>
+          <w:color w:val="000000"/>
+          <w:lang w:eastAsia="ca-ES"/>
+        </w:rPr>
+        <w:t>ceding</w:t>
+      </w:r>
+      <w:r>
+        <w:rPr>
+          <w:rFonts w:eastAsia="Times New Roman" w:cstheme="minorHAnsi"/>
+          <w:color w:val="000000"/>
+          <w:lang w:eastAsia="ca-ES"/>
+        </w:rPr>
+        <w:t xml:space="preserve"> </w:t>
+      </w:r>
+      <w:r>
+        <w:rPr>
+          <w:rFonts w:eastAsia="Times New Roman" w:cstheme="minorHAnsi"/>
+          <w:color w:val="000000"/>
+          <w:lang w:eastAsia="ca-ES"/>
+        </w:rPr>
+        <w:t xml:space="preserve">germination research </w:t>
+      </w:r>
+      <w:r>
+        <w:rPr>
+          <w:rFonts w:eastAsia="Times New Roman" w:cstheme="minorHAnsi"/>
+          <w:color w:val="000000"/>
+          <w:lang w:eastAsia="ca-ES"/>
+        </w:rPr>
+        <w:t xml:space="preserve">by </w:t>
+      </w:r>
+      <w:r>
+        <w:rPr>
+          <w:rFonts w:eastAsia="Times New Roman" w:cstheme="minorHAnsi"/>
+          <w:color w:val="000000"/>
+          <w:highlight w:val="yellow"/>
+          <w:lang w:eastAsia="ca-ES"/>
+        </w:rPr>
+        <w:t xml:space="preserve">Espinosa </w:t>
+      </w:r>
+      <w:proofErr w:type="gramStart"/>
+      <w:r>
+        <w:rPr>
+          <w:rFonts w:eastAsia="Times New Roman" w:cstheme="minorHAnsi"/>
+          <w:color w:val="000000"/>
+          <w:highlight w:val="yellow"/>
+          <w:lang w:eastAsia="ca-ES"/>
+        </w:rPr>
+        <w:t>del</w:t>
+      </w:r>
+      <w:proofErr w:type="gramEnd"/>
+      <w:r>
+        <w:rPr>
+          <w:rFonts w:eastAsia="Times New Roman" w:cstheme="minorHAnsi"/>
+          <w:color w:val="000000"/>
+          <w:highlight w:val="yellow"/>
+          <w:lang w:eastAsia="ca-ES"/>
+        </w:rPr>
+        <w:t xml:space="preserve"> Alba et al. 2024</w:t>
+      </w:r>
+      <w:r>
+        <w:rPr>
+          <w:rFonts w:eastAsia="Times New Roman" w:cstheme="minorHAnsi"/>
+          <w:color w:val="000000"/>
+          <w:lang w:eastAsia="ca-ES"/>
+        </w:rPr>
+        <w:t xml:space="preserve"> found </w:t>
+      </w:r>
+      <w:r>
+        <w:rPr>
+          <w:rFonts w:eastAsia="Times New Roman" w:cstheme="minorHAnsi"/>
+          <w:color w:val="000000"/>
+          <w:lang w:eastAsia="ca-ES"/>
+        </w:rPr>
+        <w:t xml:space="preserve">that </w:t>
+      </w:r>
+      <w:r>
+        <w:rPr>
+          <w:rFonts w:eastAsia="Times New Roman" w:cstheme="minorHAnsi"/>
+          <w:color w:val="000000"/>
+          <w:lang w:eastAsia="ca-ES"/>
+        </w:rPr>
+        <w:t xml:space="preserve">all </w:t>
+      </w:r>
+      <w:r>
+        <w:rPr>
+          <w:rFonts w:eastAsia="Times New Roman" w:cstheme="minorHAnsi"/>
+          <w:color w:val="000000"/>
+          <w:lang w:eastAsia="ca-ES"/>
+        </w:rPr>
+        <w:t xml:space="preserve">species could be divided </w:t>
+      </w:r>
+      <w:r>
+        <w:rPr>
+          <w:rFonts w:eastAsia="Times New Roman" w:cstheme="minorHAnsi"/>
+          <w:color w:val="000000"/>
+          <w:lang w:eastAsia="ca-ES"/>
+        </w:rPr>
+        <w:t xml:space="preserve">in two </w:t>
+      </w:r>
+      <w:r>
+        <w:rPr>
+          <w:rFonts w:eastAsia="Times New Roman" w:cstheme="minorHAnsi"/>
+          <w:color w:val="000000"/>
+          <w:lang w:eastAsia="ca-ES"/>
+        </w:rPr>
+        <w:t xml:space="preserve">optimal </w:t>
+      </w:r>
+      <w:r>
+        <w:rPr>
+          <w:rFonts w:eastAsia="Times New Roman" w:cstheme="minorHAnsi"/>
+          <w:color w:val="000000"/>
+          <w:lang w:eastAsia="ca-ES"/>
+        </w:rPr>
+        <w:t xml:space="preserve">germination </w:t>
+      </w:r>
+      <w:r>
+        <w:rPr>
+          <w:rFonts w:eastAsia="Times New Roman" w:cstheme="minorHAnsi"/>
+          <w:color w:val="000000"/>
+          <w:lang w:eastAsia="ca-ES"/>
+        </w:rPr>
+        <w:t>temperatures</w:t>
+      </w:r>
+      <w:r>
+        <w:rPr>
+          <w:rFonts w:eastAsia="Times New Roman" w:cstheme="minorHAnsi"/>
+          <w:color w:val="000000"/>
+          <w:lang w:eastAsia="ca-ES"/>
+        </w:rPr>
+        <w:t>: (1)</w:t>
+      </w:r>
+      <w:r>
+        <w:rPr>
+          <w:rFonts w:eastAsia="Times New Roman" w:cstheme="minorHAnsi"/>
+          <w:color w:val="000000"/>
+          <w:lang w:eastAsia="ca-ES"/>
+        </w:rPr>
+        <w:t xml:space="preserve"> cold</w:t>
+      </w:r>
+      <w:r>
+        <w:rPr>
+          <w:rFonts w:eastAsia="Times New Roman" w:cstheme="minorHAnsi"/>
+          <w:color w:val="000000"/>
+          <w:lang w:eastAsia="ca-ES"/>
+        </w:rPr>
+        <w:t xml:space="preserve"> (15 - 5 ºC)</w:t>
+      </w:r>
+      <w:r>
+        <w:rPr>
+          <w:rFonts w:eastAsia="Times New Roman" w:cstheme="minorHAnsi"/>
+          <w:color w:val="000000"/>
+          <w:lang w:eastAsia="ca-ES"/>
+        </w:rPr>
+        <w:t xml:space="preserve"> and </w:t>
+      </w:r>
+      <w:r>
+        <w:rPr>
+          <w:rFonts w:eastAsia="Times New Roman" w:cstheme="minorHAnsi"/>
+          <w:color w:val="000000"/>
+          <w:lang w:eastAsia="ca-ES"/>
+        </w:rPr>
+        <w:t xml:space="preserve">(2) </w:t>
+      </w:r>
+      <w:r>
+        <w:rPr>
+          <w:rFonts w:eastAsia="Times New Roman" w:cstheme="minorHAnsi"/>
+          <w:color w:val="000000"/>
+          <w:lang w:eastAsia="ca-ES"/>
+        </w:rPr>
+        <w:t>warm</w:t>
+      </w:r>
+      <w:r>
+        <w:rPr>
+          <w:rFonts w:eastAsia="Times New Roman" w:cstheme="minorHAnsi"/>
+          <w:color w:val="000000"/>
+          <w:lang w:eastAsia="ca-ES"/>
+        </w:rPr>
+        <w:t xml:space="preserve"> (22 - 12ºC)</w:t>
+      </w:r>
+      <w:r>
+        <w:rPr>
+          <w:rFonts w:eastAsia="Times New Roman" w:cstheme="minorHAnsi"/>
+          <w:color w:val="000000"/>
+          <w:lang w:eastAsia="ca-ES"/>
+        </w:rPr>
+        <w:t xml:space="preserve"> </w:t>
+      </w:r>
+      <w:r>
+        <w:rPr>
+          <w:rFonts w:eastAsia="Times New Roman" w:cstheme="minorHAnsi"/>
+          <w:color w:val="000000"/>
+          <w:lang w:eastAsia="ca-ES"/>
+        </w:rPr>
+        <w:t>temperatures</w:t>
+      </w:r>
+      <w:r>
+        <w:rPr>
+          <w:rFonts w:eastAsia="Times New Roman" w:cstheme="minorHAnsi"/>
+          <w:color w:val="000000"/>
+          <w:lang w:eastAsia="ca-ES"/>
+        </w:rPr>
+        <w:t>. The two temperature regimes</w:t>
+      </w:r>
+      <w:r>
+        <w:rPr>
+          <w:rFonts w:eastAsia="Times New Roman" w:cstheme="minorHAnsi"/>
+          <w:color w:val="000000"/>
+          <w:lang w:eastAsia="ca-ES"/>
+        </w:rPr>
+        <w:t xml:space="preserve"> </w:t>
+      </w:r>
+      <w:proofErr w:type="gramStart"/>
+      <w:r>
+        <w:rPr>
+          <w:rFonts w:eastAsia="Times New Roman" w:cstheme="minorHAnsi"/>
+          <w:color w:val="000000"/>
+          <w:lang w:eastAsia="ca-ES"/>
+        </w:rPr>
+        <w:t>were programmed</w:t>
+      </w:r>
+      <w:proofErr w:type="gramEnd"/>
+      <w:r>
+        <w:rPr>
+          <w:rFonts w:eastAsia="Times New Roman" w:cstheme="minorHAnsi"/>
+          <w:color w:val="000000"/>
+          <w:lang w:eastAsia="ca-ES"/>
+        </w:rPr>
+        <w:t xml:space="preserve"> in </w:t>
+      </w:r>
+      <w:r>
+        <w:rPr>
+          <w:rFonts w:eastAsia="Times New Roman" w:cstheme="minorHAnsi"/>
+          <w:color w:val="000000"/>
+          <w:lang w:eastAsia="ca-ES"/>
+        </w:rPr>
+        <w:t>four</w:t>
+      </w:r>
+      <w:r>
+        <w:rPr>
+          <w:rFonts w:eastAsia="Times New Roman" w:cstheme="minorHAnsi"/>
+          <w:color w:val="000000"/>
+          <w:lang w:eastAsia="ca-ES"/>
+        </w:rPr>
+        <w:t xml:space="preserve"> </w:t>
+      </w:r>
+      <w:r>
+        <w:rPr>
+          <w:rFonts w:eastAsia="Times New Roman" w:cstheme="minorHAnsi"/>
+          <w:color w:val="000000"/>
+          <w:lang w:eastAsia="ca-ES"/>
+        </w:rPr>
+        <w:t>different</w:t>
+      </w:r>
+      <w:r>
+        <w:rPr>
+          <w:rFonts w:eastAsia="Times New Roman" w:cstheme="minorHAnsi"/>
+          <w:color w:val="000000"/>
+          <w:lang w:eastAsia="ca-ES"/>
+        </w:rPr>
+        <w:t xml:space="preserve"> climatic</w:t>
+      </w:r>
+      <w:r>
+        <w:rPr>
+          <w:rFonts w:eastAsia="Times New Roman" w:cstheme="minorHAnsi"/>
+          <w:color w:val="000000"/>
+          <w:lang w:eastAsia="ca-ES"/>
+        </w:rPr>
+        <w:t xml:space="preserve"> chambers</w:t>
+      </w:r>
+      <w:r>
+        <w:rPr>
+          <w:rFonts w:eastAsia="Times New Roman" w:cstheme="minorHAnsi"/>
+          <w:color w:val="000000"/>
+          <w:lang w:eastAsia="ca-ES"/>
+        </w:rPr>
+        <w:t xml:space="preserve"> </w:t>
+      </w:r>
+      <w:r>
+        <w:rPr>
+          <w:rFonts w:eastAsia="Times New Roman" w:cstheme="minorHAnsi"/>
+          <w:color w:val="000000"/>
+          <w:lang w:eastAsia="ca-ES"/>
+        </w:rPr>
+        <w:t>i.e. there</w:t>
+      </w:r>
+      <w:r>
+        <w:rPr>
+          <w:rFonts w:eastAsia="Times New Roman" w:cstheme="minorHAnsi"/>
+          <w:color w:val="000000"/>
+          <w:lang w:eastAsia="ca-ES"/>
+        </w:rPr>
+        <w:t xml:space="preserve"> were</w:t>
+      </w:r>
+      <w:r>
+        <w:rPr>
+          <w:rFonts w:eastAsia="Times New Roman" w:cstheme="minorHAnsi"/>
+          <w:color w:val="000000"/>
+          <w:lang w:eastAsia="ca-ES"/>
+        </w:rPr>
+        <w:t xml:space="preserve"> two constant</w:t>
+      </w:r>
+      <w:r>
+        <w:rPr>
+          <w:rFonts w:eastAsia="Times New Roman" w:cstheme="minorHAnsi"/>
+          <w:color w:val="000000"/>
+          <w:lang w:eastAsia="ca-ES"/>
+        </w:rPr>
+        <w:t xml:space="preserve"> (10</w:t>
+      </w:r>
+      <w:r>
+        <w:rPr>
+          <w:rFonts w:eastAsia="Times New Roman" w:cstheme="minorHAnsi"/>
+          <w:color w:val="000000"/>
+          <w:lang w:eastAsia="ca-ES"/>
+        </w:rPr>
+        <w:t>ºC</w:t>
+      </w:r>
+      <w:r>
+        <w:rPr>
+          <w:rFonts w:eastAsia="Times New Roman" w:cstheme="minorHAnsi"/>
+          <w:color w:val="000000"/>
+          <w:lang w:eastAsia="ca-ES"/>
+        </w:rPr>
+        <w:t xml:space="preserve"> vs 17 ºC)</w:t>
+      </w:r>
+      <w:r>
+        <w:rPr>
+          <w:rFonts w:eastAsia="Times New Roman" w:cstheme="minorHAnsi"/>
+          <w:color w:val="000000"/>
+          <w:lang w:eastAsia="ca-ES"/>
+        </w:rPr>
+        <w:t xml:space="preserve"> and two alternating temperature regimes</w:t>
+      </w:r>
+      <w:r>
+        <w:rPr>
+          <w:rFonts w:eastAsia="Times New Roman" w:cstheme="minorHAnsi"/>
+          <w:color w:val="000000"/>
+          <w:lang w:eastAsia="ca-ES"/>
+        </w:rPr>
+        <w:t>.</w:t>
+      </w:r>
+      <w:r>
+        <w:rPr>
+          <w:rFonts w:eastAsia="Times New Roman" w:cstheme="minorHAnsi"/>
+          <w:color w:val="000000"/>
+          <w:lang w:eastAsia="ca-ES"/>
+        </w:rPr>
+        <w:t xml:space="preserve"> </w:t>
+      </w:r>
+      <w:r>
+        <w:rPr>
+          <w:rFonts w:eastAsia="Times New Roman" w:cstheme="minorHAnsi"/>
+          <w:color w:val="000000"/>
+          <w:lang w:eastAsia="ca-ES"/>
+        </w:rPr>
+        <w:t>Before the start of the experiment</w:t>
+      </w:r>
+      <w:r>
+        <w:rPr>
+          <w:rFonts w:eastAsia="Times New Roman" w:cstheme="minorHAnsi"/>
+          <w:color w:val="000000"/>
+          <w:lang w:eastAsia="ca-ES"/>
+        </w:rPr>
+        <w:t xml:space="preserve">, we subjected all seed lots to </w:t>
+      </w:r>
+      <w:r>
+        <w:rPr>
+          <w:rFonts w:eastAsia="Times New Roman" w:cstheme="minorHAnsi"/>
+          <w:color w:val="000000"/>
+          <w:lang w:eastAsia="ca-ES"/>
+        </w:rPr>
+        <w:t xml:space="preserve">a common </w:t>
+      </w:r>
+      <w:r>
+        <w:rPr>
+          <w:rFonts w:eastAsia="Times New Roman" w:cstheme="minorHAnsi"/>
+          <w:color w:val="000000"/>
+          <w:lang w:eastAsia="ca-ES"/>
+        </w:rPr>
+        <w:t>5-month long</w:t>
+      </w:r>
+      <w:r>
+        <w:rPr>
+          <w:rFonts w:eastAsia="Times New Roman" w:cstheme="minorHAnsi"/>
+          <w:color w:val="000000"/>
+          <w:lang w:eastAsia="ca-ES"/>
+        </w:rPr>
+        <w:t xml:space="preserve"> (November</w:t>
+      </w:r>
+      <w:r>
+        <w:rPr>
+          <w:rFonts w:eastAsia="Times New Roman" w:cstheme="minorHAnsi"/>
+          <w:color w:val="000000"/>
+          <w:lang w:eastAsia="ca-ES"/>
+        </w:rPr>
+        <w:t xml:space="preserve"> – </w:t>
+      </w:r>
+      <w:r>
+        <w:rPr>
+          <w:rFonts w:eastAsia="Times New Roman" w:cstheme="minorHAnsi"/>
+          <w:color w:val="000000"/>
+          <w:lang w:eastAsia="ca-ES"/>
+        </w:rPr>
+        <w:t>March</w:t>
+      </w:r>
+      <w:r>
+        <w:rPr>
+          <w:rFonts w:eastAsia="Times New Roman" w:cstheme="minorHAnsi"/>
+          <w:color w:val="000000"/>
+          <w:lang w:eastAsia="ca-ES"/>
+        </w:rPr>
+        <w:t>)</w:t>
+      </w:r>
+      <w:r>
+        <w:rPr>
+          <w:rFonts w:eastAsia="Times New Roman" w:cstheme="minorHAnsi"/>
+          <w:color w:val="000000"/>
+          <w:lang w:eastAsia="ca-ES"/>
+        </w:rPr>
+        <w:t xml:space="preserve"> </w:t>
+      </w:r>
+      <w:r>
+        <w:rPr>
+          <w:rFonts w:eastAsia="Times New Roman" w:cstheme="minorHAnsi"/>
+          <w:color w:val="000000"/>
+          <w:lang w:eastAsia="ca-ES"/>
+        </w:rPr>
+        <w:t xml:space="preserve">cold-stratification </w:t>
+      </w:r>
+      <w:proofErr w:type="spellStart"/>
+      <w:r>
+        <w:rPr>
+          <w:rFonts w:eastAsia="Times New Roman" w:cstheme="minorHAnsi"/>
+          <w:color w:val="000000"/>
+          <w:lang w:eastAsia="ca-ES"/>
+        </w:rPr>
+        <w:t>pretreatment</w:t>
+      </w:r>
+      <w:proofErr w:type="spellEnd"/>
+      <w:r>
+        <w:rPr>
+          <w:rFonts w:eastAsia="Times New Roman" w:cstheme="minorHAnsi"/>
+          <w:color w:val="000000"/>
+          <w:lang w:eastAsia="ca-ES"/>
+        </w:rPr>
+        <w:t xml:space="preserve"> at </w:t>
+      </w:r>
+      <w:proofErr w:type="gramStart"/>
+      <w:r>
+        <w:rPr>
+          <w:rFonts w:eastAsia="Times New Roman" w:cstheme="minorHAnsi"/>
+          <w:color w:val="000000"/>
+          <w:lang w:eastAsia="ca-ES"/>
+        </w:rPr>
+        <w:t>0º</w:t>
+      </w:r>
+      <w:proofErr w:type="gramEnd"/>
+      <w:r>
+        <w:rPr>
+          <w:rFonts w:eastAsia="Times New Roman" w:cstheme="minorHAnsi"/>
+          <w:color w:val="000000"/>
+          <w:lang w:eastAsia="ca-ES"/>
+        </w:rPr>
+        <w:t>C and darkness</w:t>
+      </w:r>
+      <w:r>
+        <w:rPr>
+          <w:rFonts w:eastAsia="Times New Roman" w:cstheme="minorHAnsi"/>
+          <w:color w:val="000000"/>
+          <w:lang w:eastAsia="ca-ES"/>
+        </w:rPr>
+        <w:t>.</w:t>
+      </w:r>
+      <w:r>
+        <w:rPr>
+          <w:rFonts w:eastAsia="Times New Roman" w:cstheme="minorHAnsi"/>
+          <w:color w:val="000000"/>
+          <w:lang w:eastAsia="ca-ES"/>
+        </w:rPr>
+        <w:t xml:space="preserve"> The </w:t>
+      </w:r>
+      <w:proofErr w:type="spellStart"/>
+      <w:r>
+        <w:rPr>
+          <w:rFonts w:eastAsia="Times New Roman" w:cstheme="minorHAnsi"/>
+          <w:color w:val="000000"/>
+          <w:lang w:eastAsia="ca-ES"/>
+        </w:rPr>
+        <w:t>pretreatment</w:t>
+      </w:r>
+      <w:proofErr w:type="spellEnd"/>
+      <w:r>
+        <w:rPr>
+          <w:rFonts w:eastAsia="Times New Roman" w:cstheme="minorHAnsi"/>
+          <w:color w:val="000000"/>
+          <w:lang w:eastAsia="ca-ES"/>
+        </w:rPr>
+        <w:t xml:space="preserve"> goal was to mimic </w:t>
+      </w:r>
+      <w:r>
+        <w:rPr>
+          <w:rFonts w:eastAsia="Times New Roman" w:cstheme="minorHAnsi"/>
+          <w:color w:val="000000"/>
+          <w:lang w:eastAsia="ca-ES"/>
+        </w:rPr>
+        <w:t xml:space="preserve">natural </w:t>
+      </w:r>
+      <w:r>
+        <w:rPr>
+          <w:rFonts w:eastAsia="Times New Roman" w:cstheme="minorHAnsi"/>
+          <w:color w:val="000000"/>
+          <w:lang w:eastAsia="ca-ES"/>
+        </w:rPr>
+        <w:t>snow conditions registered in the area</w:t>
+      </w:r>
+      <w:r>
+        <w:rPr>
+          <w:rFonts w:eastAsia="Times New Roman" w:cstheme="minorHAnsi"/>
+          <w:color w:val="000000"/>
+          <w:lang w:eastAsia="ca-ES"/>
+        </w:rPr>
+        <w:t xml:space="preserve"> (</w:t>
+      </w:r>
+      <w:r>
+        <w:rPr>
+          <w:rFonts w:eastAsia="Times New Roman" w:cstheme="minorHAnsi"/>
+          <w:color w:val="000000"/>
+          <w:highlight w:val="yellow"/>
+          <w:lang w:eastAsia="ca-ES"/>
+        </w:rPr>
+        <w:t xml:space="preserve">Espinosa </w:t>
+      </w:r>
+      <w:proofErr w:type="gramStart"/>
+      <w:r>
+        <w:rPr>
+          <w:rFonts w:eastAsia="Times New Roman" w:cstheme="minorHAnsi"/>
+          <w:color w:val="000000"/>
+          <w:highlight w:val="yellow"/>
+          <w:lang w:eastAsia="ca-ES"/>
+        </w:rPr>
+        <w:t>del</w:t>
+      </w:r>
+      <w:proofErr w:type="gramEnd"/>
+      <w:r>
+        <w:rPr>
+          <w:rFonts w:eastAsia="Times New Roman" w:cstheme="minorHAnsi"/>
+          <w:color w:val="000000"/>
+          <w:highlight w:val="yellow"/>
+          <w:lang w:eastAsia="ca-ES"/>
+        </w:rPr>
+        <w:t xml:space="preserve"> Alba et al. 2024</w:t>
+      </w:r>
+      <w:r>
+        <w:rPr>
+          <w:rFonts w:eastAsia="Times New Roman" w:cstheme="minorHAnsi"/>
+          <w:color w:val="000000"/>
+          <w:lang w:eastAsia="ca-ES"/>
+        </w:rPr>
+        <w:t xml:space="preserve">) and ensure dormancy breaking. For the </w:t>
+      </w:r>
+      <w:proofErr w:type="spellStart"/>
+      <w:r>
+        <w:rPr>
+          <w:rFonts w:eastAsia="Times New Roman" w:cstheme="minorHAnsi"/>
+          <w:color w:val="000000"/>
+          <w:lang w:eastAsia="ca-ES"/>
+        </w:rPr>
+        <w:t>pretreatment</w:t>
+      </w:r>
+      <w:proofErr w:type="spellEnd"/>
+      <w:r>
+        <w:rPr>
+          <w:rFonts w:eastAsia="Times New Roman" w:cstheme="minorHAnsi"/>
+          <w:color w:val="000000"/>
+          <w:lang w:eastAsia="ca-ES"/>
+        </w:rPr>
+        <w:t xml:space="preserve">, </w:t>
+      </w:r>
+      <w:r>
+        <w:rPr>
+          <w:rFonts w:eastAsia="Times New Roman" w:cstheme="minorHAnsi"/>
+          <w:color w:val="000000"/>
+          <w:lang w:eastAsia="ca-ES"/>
+        </w:rPr>
+        <w:t xml:space="preserve">each </w:t>
+      </w:r>
+      <w:r>
+        <w:rPr>
+          <w:rFonts w:eastAsia="Times New Roman" w:cstheme="minorHAnsi"/>
+          <w:color w:val="000000"/>
+          <w:lang w:eastAsia="ca-ES"/>
+        </w:rPr>
+        <w:t xml:space="preserve">seed lot </w:t>
+      </w:r>
+      <w:r>
+        <w:rPr>
+          <w:rFonts w:eastAsia="Times New Roman" w:cstheme="minorHAnsi"/>
+          <w:color w:val="000000"/>
+          <w:lang w:eastAsia="ca-ES"/>
+        </w:rPr>
+        <w:t>w</w:t>
+      </w:r>
+      <w:r>
+        <w:rPr>
+          <w:rFonts w:eastAsia="Times New Roman" w:cstheme="minorHAnsi"/>
+          <w:color w:val="000000"/>
+          <w:lang w:eastAsia="ca-ES"/>
+        </w:rPr>
+        <w:t>as</w:t>
+      </w:r>
+      <w:r>
+        <w:rPr>
+          <w:rFonts w:eastAsia="Times New Roman" w:cstheme="minorHAnsi"/>
+          <w:color w:val="000000"/>
+          <w:lang w:eastAsia="ca-ES"/>
+        </w:rPr>
+        <w:t xml:space="preserve"> </w:t>
+      </w:r>
+      <w:r>
+        <w:rPr>
+          <w:rFonts w:eastAsia="Times New Roman" w:cstheme="minorHAnsi"/>
+          <w:color w:val="000000"/>
+          <w:lang w:eastAsia="ca-ES"/>
+        </w:rPr>
+        <w:t xml:space="preserve">sowed </w:t>
+      </w:r>
+      <w:r>
+        <w:rPr>
+          <w:rFonts w:eastAsia="Times New Roman" w:cstheme="minorHAnsi"/>
+          <w:color w:val="000000"/>
+          <w:lang w:eastAsia="ca-ES"/>
+        </w:rPr>
+        <w:t xml:space="preserve">in 16 </w:t>
+      </w:r>
+      <w:r>
+        <w:rPr>
+          <w:rFonts w:eastAsia="Times New Roman" w:cstheme="minorHAnsi"/>
+          <w:color w:val="000000"/>
+          <w:lang w:eastAsia="ca-ES"/>
+        </w:rPr>
+        <w:t>Petri</w:t>
+      </w:r>
+      <w:r>
+        <w:rPr>
+          <w:rFonts w:eastAsia="Times New Roman" w:cstheme="minorHAnsi"/>
+          <w:color w:val="000000"/>
+          <w:lang w:eastAsia="ca-ES"/>
+        </w:rPr>
+        <w:t xml:space="preserve"> dishes </w:t>
+      </w:r>
+      <w:r>
+        <w:rPr>
+          <w:rFonts w:eastAsia="Times New Roman" w:cstheme="minorHAnsi"/>
+          <w:color w:val="000000"/>
+          <w:lang w:eastAsia="ca-ES"/>
+        </w:rPr>
+        <w:t>replicates</w:t>
+      </w:r>
+      <w:r>
+        <w:rPr>
+          <w:rFonts w:eastAsia="Times New Roman" w:cstheme="minorHAnsi"/>
+          <w:color w:val="000000"/>
+          <w:lang w:eastAsia="ca-ES"/>
+        </w:rPr>
+        <w:t xml:space="preserve"> (</w:t>
+      </w:r>
+      <w:r>
+        <w:rPr>
+          <w:rFonts w:eastAsia="Times New Roman" w:cstheme="minorHAnsi"/>
+          <w:color w:val="000000"/>
+          <w:lang w:eastAsia="ca-ES"/>
+        </w:rPr>
+        <w:t>90</w:t>
+      </w:r>
+      <w:r>
+        <w:rPr>
+          <w:rFonts w:eastAsia="Times New Roman" w:cstheme="minorHAnsi"/>
+          <w:color w:val="000000"/>
+          <w:lang w:eastAsia="ca-ES"/>
+        </w:rPr>
+        <w:t xml:space="preserve"> </w:t>
+      </w:r>
+      <w:r>
+        <w:rPr>
+          <w:rFonts w:eastAsia="Times New Roman" w:cstheme="minorHAnsi"/>
+          <w:color w:val="000000"/>
+          <w:lang w:eastAsia="ca-ES"/>
+        </w:rPr>
+        <w:t>m</w:t>
+      </w:r>
+      <w:r>
+        <w:rPr>
+          <w:rFonts w:eastAsia="Times New Roman" w:cstheme="minorHAnsi"/>
+          <w:color w:val="000000"/>
+          <w:lang w:eastAsia="ca-ES"/>
+        </w:rPr>
+        <w:t>m</w:t>
+      </w:r>
+      <w:r>
+        <w:rPr>
+          <w:rFonts w:eastAsia="Times New Roman" w:cstheme="minorHAnsi"/>
+          <w:color w:val="000000"/>
+          <w:lang w:eastAsia="ca-ES"/>
+        </w:rPr>
+        <w:t xml:space="preserve"> </w:t>
+      </w:r>
+      <w:r>
+        <w:rPr>
+          <w:rFonts w:eastAsia="Times New Roman" w:cstheme="minorHAnsi"/>
+          <w:color w:val="000000"/>
+          <w:lang w:eastAsia="ca-ES"/>
+        </w:rPr>
+        <w:t>Ø</w:t>
+      </w:r>
+      <w:r>
+        <w:rPr>
+          <w:rFonts w:eastAsia="Times New Roman" w:cstheme="minorHAnsi"/>
+          <w:color w:val="000000"/>
+          <w:lang w:eastAsia="ca-ES"/>
+        </w:rPr>
+        <w:t>)</w:t>
+      </w:r>
+      <w:r>
+        <w:rPr>
+          <w:rFonts w:eastAsia="Times New Roman" w:cstheme="minorHAnsi"/>
+          <w:color w:val="000000"/>
+          <w:lang w:eastAsia="ca-ES"/>
+        </w:rPr>
+        <w:t xml:space="preserve"> </w:t>
+      </w:r>
+      <w:r>
+        <w:rPr>
+          <w:rFonts w:eastAsia="Times New Roman" w:cstheme="minorHAnsi"/>
+          <w:color w:val="000000"/>
+          <w:lang w:eastAsia="ca-ES"/>
+        </w:rPr>
+        <w:t xml:space="preserve">with </w:t>
+      </w:r>
+      <w:r>
+        <w:rPr>
+          <w:rFonts w:eastAsia="Times New Roman" w:cstheme="minorHAnsi"/>
+          <w:color w:val="000000"/>
+          <w:lang w:eastAsia="ca-ES"/>
+        </w:rPr>
+        <w:t xml:space="preserve">25 seeds </w:t>
+      </w:r>
+      <w:r>
+        <w:rPr>
+          <w:rFonts w:eastAsia="Times New Roman" w:cstheme="minorHAnsi"/>
+          <w:color w:val="000000"/>
+          <w:lang w:eastAsia="ca-ES"/>
+        </w:rPr>
+        <w:t>each</w:t>
+      </w:r>
+      <w:r>
+        <w:rPr>
+          <w:rFonts w:eastAsia="Times New Roman" w:cstheme="minorHAnsi"/>
+          <w:color w:val="000000"/>
+          <w:lang w:eastAsia="ca-ES"/>
+        </w:rPr>
+        <w:t xml:space="preserve"> (numbers were adapted for seed lots with fewer seeds available) </w:t>
+      </w:r>
+      <w:r>
+        <w:rPr>
+          <w:rFonts w:eastAsia="Times New Roman" w:cstheme="minorHAnsi"/>
+          <w:color w:val="000000"/>
+          <w:lang w:eastAsia="ca-ES"/>
+        </w:rPr>
+        <w:t>on</w:t>
+      </w:r>
+      <w:r>
+        <w:rPr>
+          <w:rFonts w:eastAsia="Times New Roman" w:cstheme="minorHAnsi"/>
+          <w:color w:val="000000"/>
+          <w:lang w:eastAsia="ca-ES"/>
+        </w:rPr>
+        <w:t xml:space="preserve"> </w:t>
+      </w:r>
+      <w:r>
+        <w:rPr>
+          <w:rFonts w:eastAsia="Times New Roman" w:cstheme="minorHAnsi"/>
+          <w:color w:val="000000"/>
+          <w:lang w:eastAsia="ca-ES"/>
+        </w:rPr>
+        <w:t>agar 1%</w:t>
+      </w:r>
+      <w:r>
+        <w:rPr>
+          <w:rFonts w:eastAsia="Times New Roman" w:cstheme="minorHAnsi"/>
+          <w:color w:val="000000"/>
+          <w:lang w:eastAsia="ca-ES"/>
+        </w:rPr>
+        <w:t xml:space="preserve"> (1</w:t>
+      </w:r>
+      <w:r>
+        <w:rPr>
+          <w:rFonts w:eastAsia="Times New Roman" w:cstheme="minorHAnsi"/>
+          <w:color w:val="000000"/>
+          <w:lang w:eastAsia="ca-ES"/>
+        </w:rPr>
+        <w:t xml:space="preserve">0 gr agar in </w:t>
+      </w:r>
+      <w:r>
+        <w:rPr>
+          <w:rFonts w:eastAsia="Times New Roman" w:cstheme="minorHAnsi"/>
+          <w:color w:val="000000"/>
+          <w:lang w:eastAsia="ca-ES"/>
+        </w:rPr>
+        <w:t xml:space="preserve">1L </w:t>
+      </w:r>
+      <w:r>
+        <w:rPr>
+          <w:rFonts w:eastAsia="Times New Roman" w:cstheme="minorHAnsi"/>
+          <w:color w:val="000000"/>
+          <w:lang w:eastAsia="ca-ES"/>
+        </w:rPr>
+        <w:t xml:space="preserve">of </w:t>
+      </w:r>
+      <w:r>
+        <w:rPr>
+          <w:rFonts w:eastAsia="Times New Roman" w:cstheme="minorHAnsi"/>
+          <w:color w:val="000000"/>
+          <w:lang w:eastAsia="ca-ES"/>
+        </w:rPr>
+        <w:t>distilled water)</w:t>
+      </w:r>
+      <w:r>
+        <w:rPr>
+          <w:rFonts w:eastAsia="Times New Roman" w:cstheme="minorHAnsi"/>
+          <w:color w:val="000000"/>
+          <w:lang w:eastAsia="ca-ES"/>
+        </w:rPr>
+        <w:t xml:space="preserve"> </w:t>
+      </w:r>
+      <w:r>
+        <w:rPr>
+          <w:rFonts w:eastAsia="Times New Roman" w:cstheme="minorHAnsi"/>
+          <w:color w:val="000000"/>
+          <w:lang w:eastAsia="ca-ES"/>
+        </w:rPr>
         <w:lastRenderedPageBreak/>
-        <w:t>(referred to as “</w:t>
-      </w:r>
-      <w:r>
-        <w:rPr>
-          <w:rFonts w:eastAsia="Times New Roman" w:cstheme="minorHAnsi"/>
-          <w:color w:val="000000"/>
-          <w:lang w:eastAsia="ca-ES"/>
-        </w:rPr>
-        <w:t>Control</w:t>
-      </w:r>
-      <w:r>
-        <w:rPr>
-          <w:rFonts w:eastAsia="Times New Roman" w:cstheme="minorHAnsi"/>
-          <w:color w:val="000000"/>
-          <w:lang w:eastAsia="ca-ES"/>
-        </w:rPr>
-        <w:t>”)</w:t>
-      </w:r>
-      <w:r>
-        <w:rPr>
-          <w:rFonts w:eastAsia="Times New Roman" w:cstheme="minorHAnsi"/>
-          <w:color w:val="000000"/>
-          <w:lang w:eastAsia="ca-ES"/>
-        </w:rPr>
-        <w:t>, (2</w:t>
-      </w:r>
-      <w:r>
-        <w:rPr>
-          <w:rFonts w:eastAsia="Times New Roman" w:cstheme="minorHAnsi"/>
-          <w:color w:val="000000"/>
-          <w:lang w:eastAsia="ca-ES"/>
-        </w:rPr>
-        <w:t xml:space="preserve">) </w:t>
-      </w:r>
-      <w:r>
-        <w:rPr>
-          <w:rFonts w:eastAsia="Times New Roman" w:cstheme="minorHAnsi"/>
-          <w:color w:val="000000"/>
-          <w:lang w:eastAsia="ca-ES"/>
-        </w:rPr>
-        <w:t xml:space="preserve">alternating temperatures and constant darkness (referred to as “Darkness”), (3) alternating temperature, water stress and 12h photoperiod (referred to as “Water stress”) and (4) </w:t>
-      </w:r>
-      <w:r>
-        <w:rPr>
-          <w:rFonts w:eastAsia="Times New Roman" w:cstheme="minorHAnsi"/>
-          <w:color w:val="000000"/>
-          <w:lang w:eastAsia="ca-ES"/>
-        </w:rPr>
-        <w:t xml:space="preserve">constant temperatures and </w:t>
-      </w:r>
-      <w:r>
-        <w:rPr>
-          <w:rFonts w:eastAsia="Times New Roman" w:cstheme="minorHAnsi"/>
-          <w:color w:val="000000"/>
-          <w:lang w:eastAsia="ca-ES"/>
-        </w:rPr>
-        <w:t xml:space="preserve">12h photoperiod </w:t>
-      </w:r>
-      <w:r>
-        <w:rPr>
-          <w:rFonts w:eastAsia="Times New Roman" w:cstheme="minorHAnsi"/>
-          <w:color w:val="000000"/>
-          <w:lang w:eastAsia="ca-ES"/>
-        </w:rPr>
-        <w:t>(referred to as “</w:t>
-      </w:r>
-      <w:r>
-        <w:rPr>
-          <w:rFonts w:eastAsia="Times New Roman" w:cstheme="minorHAnsi"/>
-          <w:color w:val="000000"/>
-          <w:lang w:eastAsia="ca-ES"/>
-        </w:rPr>
-        <w:t>Constant Temperature</w:t>
-      </w:r>
-      <w:r>
-        <w:rPr>
-          <w:rFonts w:eastAsia="Times New Roman" w:cstheme="minorHAnsi"/>
-          <w:color w:val="000000"/>
-          <w:lang w:eastAsia="ca-ES"/>
-        </w:rPr>
-        <w:t>”</w:t>
-      </w:r>
-      <w:r>
-        <w:rPr>
-          <w:rFonts w:eastAsia="Times New Roman" w:cstheme="minorHAnsi"/>
-          <w:color w:val="000000"/>
-          <w:lang w:eastAsia="ca-ES"/>
-        </w:rPr>
-        <w:t>)</w:t>
-      </w:r>
-      <w:r>
-        <w:rPr>
-          <w:rFonts w:eastAsia="Times New Roman" w:cstheme="minorHAnsi"/>
-          <w:color w:val="000000"/>
-          <w:lang w:eastAsia="ca-ES"/>
-        </w:rPr>
-        <w:t>.</w:t>
-      </w:r>
-      <w:r>
-        <w:rPr>
-          <w:rFonts w:eastAsia="Times New Roman" w:cstheme="minorHAnsi"/>
-          <w:color w:val="000000"/>
-          <w:lang w:eastAsia="ca-ES"/>
-        </w:rPr>
-        <w:t xml:space="preserve"> </w:t>
-      </w:r>
-      <w:r>
-        <w:rPr>
-          <w:rFonts w:eastAsia="Times New Roman" w:cstheme="minorHAnsi"/>
-          <w:color w:val="000000"/>
-          <w:lang w:eastAsia="ca-ES"/>
-        </w:rPr>
-        <w:t>Pre</w:t>
-      </w:r>
-      <w:r>
-        <w:rPr>
-          <w:rFonts w:eastAsia="Times New Roman" w:cstheme="minorHAnsi"/>
-          <w:color w:val="000000"/>
-          <w:lang w:eastAsia="ca-ES"/>
-        </w:rPr>
-        <w:t>ceding</w:t>
-      </w:r>
-      <w:r>
-        <w:rPr>
-          <w:rFonts w:eastAsia="Times New Roman" w:cstheme="minorHAnsi"/>
-          <w:color w:val="000000"/>
-          <w:lang w:eastAsia="ca-ES"/>
-        </w:rPr>
-        <w:t xml:space="preserve"> </w:t>
-      </w:r>
-      <w:r>
-        <w:rPr>
-          <w:rFonts w:eastAsia="Times New Roman" w:cstheme="minorHAnsi"/>
-          <w:color w:val="000000"/>
-          <w:lang w:eastAsia="ca-ES"/>
-        </w:rPr>
-        <w:t xml:space="preserve">germination research </w:t>
-      </w:r>
-      <w:r>
-        <w:rPr>
-          <w:rFonts w:eastAsia="Times New Roman" w:cstheme="minorHAnsi"/>
-          <w:color w:val="000000"/>
-          <w:lang w:eastAsia="ca-ES"/>
-        </w:rPr>
-        <w:t xml:space="preserve">by </w:t>
-      </w:r>
-      <w:r>
-        <w:rPr>
-          <w:rFonts w:eastAsia="Times New Roman" w:cstheme="minorHAnsi"/>
-          <w:color w:val="000000"/>
-          <w:highlight w:val="yellow"/>
-          <w:lang w:eastAsia="ca-ES"/>
-        </w:rPr>
-        <w:t xml:space="preserve">Espinosa </w:t>
-      </w:r>
-      <w:proofErr w:type="gramStart"/>
-      <w:r>
-        <w:rPr>
-          <w:rFonts w:eastAsia="Times New Roman" w:cstheme="minorHAnsi"/>
-          <w:color w:val="000000"/>
-          <w:highlight w:val="yellow"/>
-          <w:lang w:eastAsia="ca-ES"/>
-        </w:rPr>
-        <w:t>del</w:t>
-      </w:r>
-      <w:proofErr w:type="gramEnd"/>
-      <w:r>
-        <w:rPr>
-          <w:rFonts w:eastAsia="Times New Roman" w:cstheme="minorHAnsi"/>
-          <w:color w:val="000000"/>
-          <w:highlight w:val="yellow"/>
-          <w:lang w:eastAsia="ca-ES"/>
-        </w:rPr>
-        <w:t xml:space="preserve"> Alba et al. 2024</w:t>
-      </w:r>
-      <w:r>
-        <w:rPr>
-          <w:rFonts w:eastAsia="Times New Roman" w:cstheme="minorHAnsi"/>
-          <w:color w:val="000000"/>
-          <w:lang w:eastAsia="ca-ES"/>
-        </w:rPr>
-        <w:t xml:space="preserve"> found </w:t>
-      </w:r>
-      <w:r>
-        <w:rPr>
-          <w:rFonts w:eastAsia="Times New Roman" w:cstheme="minorHAnsi"/>
-          <w:color w:val="000000"/>
-          <w:lang w:eastAsia="ca-ES"/>
-        </w:rPr>
-        <w:t xml:space="preserve">that </w:t>
-      </w:r>
-      <w:r>
-        <w:rPr>
-          <w:rFonts w:eastAsia="Times New Roman" w:cstheme="minorHAnsi"/>
-          <w:color w:val="000000"/>
-          <w:lang w:eastAsia="ca-ES"/>
-        </w:rPr>
-        <w:t xml:space="preserve">all </w:t>
-      </w:r>
-      <w:r>
-        <w:rPr>
-          <w:rFonts w:eastAsia="Times New Roman" w:cstheme="minorHAnsi"/>
-          <w:color w:val="000000"/>
-          <w:lang w:eastAsia="ca-ES"/>
-        </w:rPr>
-        <w:t xml:space="preserve">species could be divided </w:t>
-      </w:r>
-      <w:r>
-        <w:rPr>
-          <w:rFonts w:eastAsia="Times New Roman" w:cstheme="minorHAnsi"/>
-          <w:color w:val="000000"/>
-          <w:lang w:eastAsia="ca-ES"/>
-        </w:rPr>
-        <w:t xml:space="preserve">in two </w:t>
-      </w:r>
-      <w:r>
-        <w:rPr>
-          <w:rFonts w:eastAsia="Times New Roman" w:cstheme="minorHAnsi"/>
-          <w:color w:val="000000"/>
-          <w:lang w:eastAsia="ca-ES"/>
-        </w:rPr>
-        <w:t xml:space="preserve">optimal </w:t>
-      </w:r>
-      <w:r>
-        <w:rPr>
-          <w:rFonts w:eastAsia="Times New Roman" w:cstheme="minorHAnsi"/>
-          <w:color w:val="000000"/>
-          <w:lang w:eastAsia="ca-ES"/>
-        </w:rPr>
-        <w:t xml:space="preserve">germination </w:t>
-      </w:r>
-      <w:r>
-        <w:rPr>
-          <w:rFonts w:eastAsia="Times New Roman" w:cstheme="minorHAnsi"/>
-          <w:color w:val="000000"/>
-          <w:lang w:eastAsia="ca-ES"/>
-        </w:rPr>
-        <w:t>temperatures</w:t>
-      </w:r>
-      <w:r>
-        <w:rPr>
-          <w:rFonts w:eastAsia="Times New Roman" w:cstheme="minorHAnsi"/>
-          <w:color w:val="000000"/>
-          <w:lang w:eastAsia="ca-ES"/>
-        </w:rPr>
-        <w:t>: (1)</w:t>
-      </w:r>
-      <w:r>
-        <w:rPr>
-          <w:rFonts w:eastAsia="Times New Roman" w:cstheme="minorHAnsi"/>
-          <w:color w:val="000000"/>
-          <w:lang w:eastAsia="ca-ES"/>
-        </w:rPr>
-        <w:t xml:space="preserve"> cold</w:t>
-      </w:r>
-      <w:r>
-        <w:rPr>
-          <w:rFonts w:eastAsia="Times New Roman" w:cstheme="minorHAnsi"/>
-          <w:color w:val="000000"/>
-          <w:lang w:eastAsia="ca-ES"/>
-        </w:rPr>
-        <w:t xml:space="preserve"> (15 - 5 ºC)</w:t>
-      </w:r>
-      <w:r>
-        <w:rPr>
-          <w:rFonts w:eastAsia="Times New Roman" w:cstheme="minorHAnsi"/>
-          <w:color w:val="000000"/>
-          <w:lang w:eastAsia="ca-ES"/>
-        </w:rPr>
-        <w:t xml:space="preserve"> and </w:t>
-      </w:r>
-      <w:r>
-        <w:rPr>
-          <w:rFonts w:eastAsia="Times New Roman" w:cstheme="minorHAnsi"/>
-          <w:color w:val="000000"/>
-          <w:lang w:eastAsia="ca-ES"/>
-        </w:rPr>
-        <w:t xml:space="preserve">(2) </w:t>
-      </w:r>
-      <w:r>
-        <w:rPr>
-          <w:rFonts w:eastAsia="Times New Roman" w:cstheme="minorHAnsi"/>
-          <w:color w:val="000000"/>
-          <w:lang w:eastAsia="ca-ES"/>
-        </w:rPr>
-        <w:t>warm</w:t>
-      </w:r>
-      <w:r>
-        <w:rPr>
-          <w:rFonts w:eastAsia="Times New Roman" w:cstheme="minorHAnsi"/>
-          <w:color w:val="000000"/>
-          <w:lang w:eastAsia="ca-ES"/>
-        </w:rPr>
-        <w:t xml:space="preserve"> (22 - 12ºC)</w:t>
-      </w:r>
-      <w:r>
-        <w:rPr>
-          <w:rFonts w:eastAsia="Times New Roman" w:cstheme="minorHAnsi"/>
-          <w:color w:val="000000"/>
-          <w:lang w:eastAsia="ca-ES"/>
-        </w:rPr>
-        <w:t xml:space="preserve"> </w:t>
-      </w:r>
-      <w:r>
-        <w:rPr>
-          <w:rFonts w:eastAsia="Times New Roman" w:cstheme="minorHAnsi"/>
-          <w:color w:val="000000"/>
-          <w:lang w:eastAsia="ca-ES"/>
-        </w:rPr>
-        <w:t>temperatures</w:t>
-      </w:r>
-      <w:r>
-        <w:rPr>
-          <w:rFonts w:eastAsia="Times New Roman" w:cstheme="minorHAnsi"/>
-          <w:color w:val="000000"/>
-          <w:lang w:eastAsia="ca-ES"/>
-        </w:rPr>
-        <w:t>. The two temperature regimes</w:t>
-      </w:r>
-      <w:r>
-        <w:rPr>
-          <w:rFonts w:eastAsia="Times New Roman" w:cstheme="minorHAnsi"/>
-          <w:color w:val="000000"/>
-          <w:lang w:eastAsia="ca-ES"/>
-        </w:rPr>
-        <w:t xml:space="preserve"> </w:t>
-      </w:r>
-      <w:proofErr w:type="gramStart"/>
-      <w:r>
-        <w:rPr>
-          <w:rFonts w:eastAsia="Times New Roman" w:cstheme="minorHAnsi"/>
-          <w:color w:val="000000"/>
-          <w:lang w:eastAsia="ca-ES"/>
-        </w:rPr>
-        <w:t>were programmed</w:t>
-      </w:r>
-      <w:proofErr w:type="gramEnd"/>
-      <w:r>
-        <w:rPr>
-          <w:rFonts w:eastAsia="Times New Roman" w:cstheme="minorHAnsi"/>
-          <w:color w:val="000000"/>
-          <w:lang w:eastAsia="ca-ES"/>
-        </w:rPr>
-        <w:t xml:space="preserve"> in </w:t>
-      </w:r>
-      <w:r>
-        <w:rPr>
-          <w:rFonts w:eastAsia="Times New Roman" w:cstheme="minorHAnsi"/>
-          <w:color w:val="000000"/>
-          <w:lang w:eastAsia="ca-ES"/>
-        </w:rPr>
-        <w:t>four</w:t>
-      </w:r>
-      <w:r>
-        <w:rPr>
-          <w:rFonts w:eastAsia="Times New Roman" w:cstheme="minorHAnsi"/>
-          <w:color w:val="000000"/>
-          <w:lang w:eastAsia="ca-ES"/>
-        </w:rPr>
-        <w:t xml:space="preserve"> </w:t>
-      </w:r>
-      <w:r>
-        <w:rPr>
-          <w:rFonts w:eastAsia="Times New Roman" w:cstheme="minorHAnsi"/>
-          <w:color w:val="000000"/>
-          <w:lang w:eastAsia="ca-ES"/>
-        </w:rPr>
-        <w:t>different</w:t>
-      </w:r>
-      <w:r>
-        <w:rPr>
-          <w:rFonts w:eastAsia="Times New Roman" w:cstheme="minorHAnsi"/>
-          <w:color w:val="000000"/>
-          <w:lang w:eastAsia="ca-ES"/>
-        </w:rPr>
-        <w:t xml:space="preserve"> climatic</w:t>
-      </w:r>
-      <w:r>
-        <w:rPr>
-          <w:rFonts w:eastAsia="Times New Roman" w:cstheme="minorHAnsi"/>
-          <w:color w:val="000000"/>
-          <w:lang w:eastAsia="ca-ES"/>
-        </w:rPr>
-        <w:t xml:space="preserve"> chambers</w:t>
-      </w:r>
-      <w:r>
-        <w:rPr>
-          <w:rFonts w:eastAsia="Times New Roman" w:cstheme="minorHAnsi"/>
-          <w:color w:val="000000"/>
-          <w:lang w:eastAsia="ca-ES"/>
-        </w:rPr>
-        <w:t xml:space="preserve"> </w:t>
-      </w:r>
-      <w:r>
-        <w:rPr>
-          <w:rFonts w:eastAsia="Times New Roman" w:cstheme="minorHAnsi"/>
-          <w:color w:val="000000"/>
-          <w:lang w:eastAsia="ca-ES"/>
-        </w:rPr>
-        <w:t>i.e. there</w:t>
-      </w:r>
-      <w:r>
-        <w:rPr>
-          <w:rFonts w:eastAsia="Times New Roman" w:cstheme="minorHAnsi"/>
-          <w:color w:val="000000"/>
-          <w:lang w:eastAsia="ca-ES"/>
-        </w:rPr>
-        <w:t xml:space="preserve"> were</w:t>
-      </w:r>
-      <w:r>
-        <w:rPr>
-          <w:rFonts w:eastAsia="Times New Roman" w:cstheme="minorHAnsi"/>
-          <w:color w:val="000000"/>
-          <w:lang w:eastAsia="ca-ES"/>
-        </w:rPr>
-        <w:t xml:space="preserve"> two constant</w:t>
-      </w:r>
-      <w:r>
-        <w:rPr>
-          <w:rFonts w:eastAsia="Times New Roman" w:cstheme="minorHAnsi"/>
-          <w:color w:val="000000"/>
-          <w:lang w:eastAsia="ca-ES"/>
-        </w:rPr>
-        <w:t xml:space="preserve"> (10</w:t>
-      </w:r>
-      <w:r>
-        <w:rPr>
-          <w:rFonts w:eastAsia="Times New Roman" w:cstheme="minorHAnsi"/>
-          <w:color w:val="000000"/>
-          <w:lang w:eastAsia="ca-ES"/>
-        </w:rPr>
-        <w:t>ºC</w:t>
-      </w:r>
-      <w:r>
-        <w:rPr>
-          <w:rFonts w:eastAsia="Times New Roman" w:cstheme="minorHAnsi"/>
-          <w:color w:val="000000"/>
-          <w:lang w:eastAsia="ca-ES"/>
-        </w:rPr>
-        <w:t xml:space="preserve"> vs 17 ºC)</w:t>
-      </w:r>
-      <w:r>
-        <w:rPr>
-          <w:rFonts w:eastAsia="Times New Roman" w:cstheme="minorHAnsi"/>
-          <w:color w:val="000000"/>
-          <w:lang w:eastAsia="ca-ES"/>
-        </w:rPr>
-        <w:t xml:space="preserve"> and two alternating temperature regimes</w:t>
-      </w:r>
-      <w:r>
-        <w:rPr>
-          <w:rFonts w:eastAsia="Times New Roman" w:cstheme="minorHAnsi"/>
-          <w:color w:val="000000"/>
-          <w:lang w:eastAsia="ca-ES"/>
-        </w:rPr>
-        <w:t>.</w:t>
-      </w:r>
-      <w:r>
-        <w:rPr>
-          <w:rFonts w:eastAsia="Times New Roman" w:cstheme="minorHAnsi"/>
-          <w:color w:val="000000"/>
-          <w:lang w:eastAsia="ca-ES"/>
-        </w:rPr>
-        <w:t xml:space="preserve"> </w:t>
-      </w:r>
-      <w:r>
-        <w:rPr>
-          <w:rFonts w:eastAsia="Times New Roman" w:cstheme="minorHAnsi"/>
-          <w:color w:val="000000"/>
-          <w:lang w:eastAsia="ca-ES"/>
-        </w:rPr>
-        <w:t>Before the start of the experiment</w:t>
-      </w:r>
-      <w:r>
-        <w:rPr>
-          <w:rFonts w:eastAsia="Times New Roman" w:cstheme="minorHAnsi"/>
-          <w:color w:val="000000"/>
-          <w:lang w:eastAsia="ca-ES"/>
-        </w:rPr>
-        <w:t xml:space="preserve">, we subjected all seed lots to </w:t>
-      </w:r>
-      <w:r>
-        <w:rPr>
-          <w:rFonts w:eastAsia="Times New Roman" w:cstheme="minorHAnsi"/>
-          <w:color w:val="000000"/>
-          <w:lang w:eastAsia="ca-ES"/>
-        </w:rPr>
-        <w:t xml:space="preserve">a common </w:t>
-      </w:r>
-      <w:r>
-        <w:rPr>
-          <w:rFonts w:eastAsia="Times New Roman" w:cstheme="minorHAnsi"/>
-          <w:color w:val="000000"/>
-          <w:lang w:eastAsia="ca-ES"/>
-        </w:rPr>
-        <w:t>5-month long</w:t>
-      </w:r>
-      <w:r>
-        <w:rPr>
-          <w:rFonts w:eastAsia="Times New Roman" w:cstheme="minorHAnsi"/>
-          <w:color w:val="000000"/>
-          <w:lang w:eastAsia="ca-ES"/>
-        </w:rPr>
-        <w:t xml:space="preserve"> (November</w:t>
-      </w:r>
-      <w:r>
-        <w:rPr>
-          <w:rFonts w:eastAsia="Times New Roman" w:cstheme="minorHAnsi"/>
-          <w:color w:val="000000"/>
-          <w:lang w:eastAsia="ca-ES"/>
-        </w:rPr>
-        <w:t xml:space="preserve"> – </w:t>
-      </w:r>
-      <w:r>
-        <w:rPr>
-          <w:rFonts w:eastAsia="Times New Roman" w:cstheme="minorHAnsi"/>
-          <w:color w:val="000000"/>
-          <w:lang w:eastAsia="ca-ES"/>
-        </w:rPr>
-        <w:t>March</w:t>
-      </w:r>
-      <w:r>
-        <w:rPr>
-          <w:rFonts w:eastAsia="Times New Roman" w:cstheme="minorHAnsi"/>
-          <w:color w:val="000000"/>
-          <w:lang w:eastAsia="ca-ES"/>
-        </w:rPr>
-        <w:t>)</w:t>
-      </w:r>
-      <w:r>
-        <w:rPr>
-          <w:rFonts w:eastAsia="Times New Roman" w:cstheme="minorHAnsi"/>
-          <w:color w:val="000000"/>
-          <w:lang w:eastAsia="ca-ES"/>
-        </w:rPr>
-        <w:t xml:space="preserve"> </w:t>
-      </w:r>
-      <w:r>
-        <w:rPr>
-          <w:rFonts w:eastAsia="Times New Roman" w:cstheme="minorHAnsi"/>
-          <w:color w:val="000000"/>
-          <w:lang w:eastAsia="ca-ES"/>
-        </w:rPr>
-        <w:t xml:space="preserve">cold-stratification </w:t>
-      </w:r>
-      <w:proofErr w:type="spellStart"/>
-      <w:r>
-        <w:rPr>
-          <w:rFonts w:eastAsia="Times New Roman" w:cstheme="minorHAnsi"/>
-          <w:color w:val="000000"/>
-          <w:lang w:eastAsia="ca-ES"/>
-        </w:rPr>
-        <w:t>pretreatment</w:t>
-      </w:r>
-      <w:proofErr w:type="spellEnd"/>
-      <w:r>
-        <w:rPr>
-          <w:rFonts w:eastAsia="Times New Roman" w:cstheme="minorHAnsi"/>
-          <w:color w:val="000000"/>
-          <w:lang w:eastAsia="ca-ES"/>
-        </w:rPr>
-        <w:t xml:space="preserve"> at </w:t>
-      </w:r>
-      <w:proofErr w:type="gramStart"/>
-      <w:r>
-        <w:rPr>
-          <w:rFonts w:eastAsia="Times New Roman" w:cstheme="minorHAnsi"/>
-          <w:color w:val="000000"/>
-          <w:lang w:eastAsia="ca-ES"/>
-        </w:rPr>
-        <w:t>0º</w:t>
-      </w:r>
-      <w:proofErr w:type="gramEnd"/>
-      <w:r>
-        <w:rPr>
-          <w:rFonts w:eastAsia="Times New Roman" w:cstheme="minorHAnsi"/>
-          <w:color w:val="000000"/>
-          <w:lang w:eastAsia="ca-ES"/>
-        </w:rPr>
-        <w:t>C and darkness</w:t>
-      </w:r>
-      <w:r>
-        <w:rPr>
-          <w:rFonts w:eastAsia="Times New Roman" w:cstheme="minorHAnsi"/>
-          <w:color w:val="000000"/>
-          <w:lang w:eastAsia="ca-ES"/>
-        </w:rPr>
-        <w:t>.</w:t>
-      </w:r>
-      <w:r>
-        <w:rPr>
-          <w:rFonts w:eastAsia="Times New Roman" w:cstheme="minorHAnsi"/>
-          <w:color w:val="000000"/>
-          <w:lang w:eastAsia="ca-ES"/>
-        </w:rPr>
-        <w:t xml:space="preserve"> The </w:t>
-      </w:r>
-      <w:proofErr w:type="spellStart"/>
-      <w:r>
-        <w:rPr>
-          <w:rFonts w:eastAsia="Times New Roman" w:cstheme="minorHAnsi"/>
-          <w:color w:val="000000"/>
-          <w:lang w:eastAsia="ca-ES"/>
-        </w:rPr>
-        <w:t>pretreatment</w:t>
-      </w:r>
-      <w:proofErr w:type="spellEnd"/>
-      <w:r>
-        <w:rPr>
-          <w:rFonts w:eastAsia="Times New Roman" w:cstheme="minorHAnsi"/>
-          <w:color w:val="000000"/>
-          <w:lang w:eastAsia="ca-ES"/>
-        </w:rPr>
-        <w:t xml:space="preserve"> goal was to mimic </w:t>
-      </w:r>
-      <w:r>
-        <w:rPr>
-          <w:rFonts w:eastAsia="Times New Roman" w:cstheme="minorHAnsi"/>
-          <w:color w:val="000000"/>
-          <w:lang w:eastAsia="ca-ES"/>
-        </w:rPr>
-        <w:t xml:space="preserve">natural </w:t>
-      </w:r>
-      <w:r>
-        <w:rPr>
-          <w:rFonts w:eastAsia="Times New Roman" w:cstheme="minorHAnsi"/>
-          <w:color w:val="000000"/>
-          <w:lang w:eastAsia="ca-ES"/>
-        </w:rPr>
-        <w:t>snow conditions registered in the area</w:t>
-      </w:r>
-      <w:r>
-        <w:rPr>
-          <w:rFonts w:eastAsia="Times New Roman" w:cstheme="minorHAnsi"/>
-          <w:color w:val="000000"/>
-          <w:lang w:eastAsia="ca-ES"/>
-        </w:rPr>
-        <w:t xml:space="preserve"> (</w:t>
-      </w:r>
-      <w:r>
-        <w:rPr>
-          <w:rFonts w:eastAsia="Times New Roman" w:cstheme="minorHAnsi"/>
-          <w:color w:val="000000"/>
-          <w:highlight w:val="yellow"/>
-          <w:lang w:eastAsia="ca-ES"/>
-        </w:rPr>
-        <w:t xml:space="preserve">Espinosa </w:t>
-      </w:r>
-      <w:proofErr w:type="gramStart"/>
-      <w:r>
-        <w:rPr>
-          <w:rFonts w:eastAsia="Times New Roman" w:cstheme="minorHAnsi"/>
-          <w:color w:val="000000"/>
-          <w:highlight w:val="yellow"/>
-          <w:lang w:eastAsia="ca-ES"/>
-        </w:rPr>
-        <w:t>del</w:t>
-      </w:r>
-      <w:proofErr w:type="gramEnd"/>
-      <w:r>
-        <w:rPr>
-          <w:rFonts w:eastAsia="Times New Roman" w:cstheme="minorHAnsi"/>
-          <w:color w:val="000000"/>
-          <w:highlight w:val="yellow"/>
-          <w:lang w:eastAsia="ca-ES"/>
-        </w:rPr>
-        <w:t xml:space="preserve"> Alba et al. 2024</w:t>
-      </w:r>
-      <w:r>
-        <w:rPr>
-          <w:rFonts w:eastAsia="Times New Roman" w:cstheme="minorHAnsi"/>
-          <w:color w:val="000000"/>
-          <w:lang w:eastAsia="ca-ES"/>
-        </w:rPr>
-        <w:t xml:space="preserve">) and ensure dormancy breaking. For the </w:t>
-      </w:r>
-      <w:proofErr w:type="spellStart"/>
-      <w:r>
-        <w:rPr>
-          <w:rFonts w:eastAsia="Times New Roman" w:cstheme="minorHAnsi"/>
-          <w:color w:val="000000"/>
-          <w:lang w:eastAsia="ca-ES"/>
-        </w:rPr>
-        <w:t>pretreatment</w:t>
-      </w:r>
-      <w:proofErr w:type="spellEnd"/>
-      <w:r>
-        <w:rPr>
-          <w:rFonts w:eastAsia="Times New Roman" w:cstheme="minorHAnsi"/>
-          <w:color w:val="000000"/>
-          <w:lang w:eastAsia="ca-ES"/>
-        </w:rPr>
-        <w:t xml:space="preserve">, </w:t>
-      </w:r>
-      <w:r>
-        <w:rPr>
-          <w:rFonts w:eastAsia="Times New Roman" w:cstheme="minorHAnsi"/>
-          <w:color w:val="000000"/>
-          <w:lang w:eastAsia="ca-ES"/>
-        </w:rPr>
-        <w:t xml:space="preserve">each </w:t>
-      </w:r>
-      <w:r>
-        <w:rPr>
-          <w:rFonts w:eastAsia="Times New Roman" w:cstheme="minorHAnsi"/>
-          <w:color w:val="000000"/>
-          <w:lang w:eastAsia="ca-ES"/>
-        </w:rPr>
-        <w:t xml:space="preserve">seed lot </w:t>
-      </w:r>
-      <w:r>
-        <w:rPr>
-          <w:rFonts w:eastAsia="Times New Roman" w:cstheme="minorHAnsi"/>
-          <w:color w:val="000000"/>
-          <w:lang w:eastAsia="ca-ES"/>
-        </w:rPr>
-        <w:t>w</w:t>
-      </w:r>
-      <w:r>
-        <w:rPr>
-          <w:rFonts w:eastAsia="Times New Roman" w:cstheme="minorHAnsi"/>
-          <w:color w:val="000000"/>
-          <w:lang w:eastAsia="ca-ES"/>
-        </w:rPr>
-        <w:t>as</w:t>
-      </w:r>
-      <w:r>
-        <w:rPr>
-          <w:rFonts w:eastAsia="Times New Roman" w:cstheme="minorHAnsi"/>
-          <w:color w:val="000000"/>
-          <w:lang w:eastAsia="ca-ES"/>
-        </w:rPr>
-        <w:t xml:space="preserve"> </w:t>
-      </w:r>
-      <w:r>
-        <w:rPr>
-          <w:rFonts w:eastAsia="Times New Roman" w:cstheme="minorHAnsi"/>
-          <w:color w:val="000000"/>
-          <w:lang w:eastAsia="ca-ES"/>
-        </w:rPr>
-        <w:t xml:space="preserve">sowed </w:t>
-      </w:r>
-      <w:r>
-        <w:rPr>
-          <w:rFonts w:eastAsia="Times New Roman" w:cstheme="minorHAnsi"/>
-          <w:color w:val="000000"/>
-          <w:lang w:eastAsia="ca-ES"/>
-        </w:rPr>
-        <w:t xml:space="preserve">in 16 </w:t>
-      </w:r>
-      <w:r>
-        <w:rPr>
-          <w:rFonts w:eastAsia="Times New Roman" w:cstheme="minorHAnsi"/>
-          <w:color w:val="000000"/>
-          <w:lang w:eastAsia="ca-ES"/>
-        </w:rPr>
-        <w:t>Petri</w:t>
-      </w:r>
-      <w:r>
-        <w:rPr>
-          <w:rFonts w:eastAsia="Times New Roman" w:cstheme="minorHAnsi"/>
-          <w:color w:val="000000"/>
-          <w:lang w:eastAsia="ca-ES"/>
-        </w:rPr>
-        <w:t xml:space="preserve"> dishes </w:t>
-      </w:r>
-      <w:r>
-        <w:rPr>
-          <w:rFonts w:eastAsia="Times New Roman" w:cstheme="minorHAnsi"/>
-          <w:color w:val="000000"/>
-          <w:lang w:eastAsia="ca-ES"/>
-        </w:rPr>
-        <w:t>replicates</w:t>
-      </w:r>
-      <w:r>
-        <w:rPr>
-          <w:rFonts w:eastAsia="Times New Roman" w:cstheme="minorHAnsi"/>
-          <w:color w:val="000000"/>
-          <w:lang w:eastAsia="ca-ES"/>
-        </w:rPr>
-        <w:t xml:space="preserve"> (</w:t>
-      </w:r>
-      <w:r>
-        <w:rPr>
-          <w:rFonts w:eastAsia="Times New Roman" w:cstheme="minorHAnsi"/>
-          <w:color w:val="000000"/>
-          <w:lang w:eastAsia="ca-ES"/>
-        </w:rPr>
-        <w:t>90</w:t>
-      </w:r>
-      <w:r>
-        <w:rPr>
-          <w:rFonts w:eastAsia="Times New Roman" w:cstheme="minorHAnsi"/>
-          <w:color w:val="000000"/>
-          <w:lang w:eastAsia="ca-ES"/>
-        </w:rPr>
-        <w:t xml:space="preserve"> </w:t>
-      </w:r>
-      <w:r>
-        <w:rPr>
-          <w:rFonts w:eastAsia="Times New Roman" w:cstheme="minorHAnsi"/>
-          <w:color w:val="000000"/>
-          <w:lang w:eastAsia="ca-ES"/>
-        </w:rPr>
-        <w:t>m</w:t>
-      </w:r>
-      <w:r>
-        <w:rPr>
-          <w:rFonts w:eastAsia="Times New Roman" w:cstheme="minorHAnsi"/>
-          <w:color w:val="000000"/>
-          <w:lang w:eastAsia="ca-ES"/>
-        </w:rPr>
-        <w:t>m</w:t>
-      </w:r>
-      <w:r>
-        <w:rPr>
-          <w:rFonts w:eastAsia="Times New Roman" w:cstheme="minorHAnsi"/>
-          <w:color w:val="000000"/>
-          <w:lang w:eastAsia="ca-ES"/>
-        </w:rPr>
-        <w:t xml:space="preserve"> </w:t>
-      </w:r>
-      <w:r>
-        <w:rPr>
-          <w:rFonts w:eastAsia="Times New Roman" w:cstheme="minorHAnsi"/>
-          <w:color w:val="000000"/>
-          <w:lang w:eastAsia="ca-ES"/>
-        </w:rPr>
-        <w:t>Ø</w:t>
-      </w:r>
-      <w:r>
-        <w:rPr>
-          <w:rFonts w:eastAsia="Times New Roman" w:cstheme="minorHAnsi"/>
-          <w:color w:val="000000"/>
-          <w:lang w:eastAsia="ca-ES"/>
-        </w:rPr>
-        <w:t>)</w:t>
-      </w:r>
-      <w:r>
-        <w:rPr>
-          <w:rFonts w:eastAsia="Times New Roman" w:cstheme="minorHAnsi"/>
-          <w:color w:val="000000"/>
-          <w:lang w:eastAsia="ca-ES"/>
-        </w:rPr>
-        <w:t xml:space="preserve"> </w:t>
-      </w:r>
-      <w:r>
-        <w:rPr>
-          <w:rFonts w:eastAsia="Times New Roman" w:cstheme="minorHAnsi"/>
-          <w:color w:val="000000"/>
-          <w:lang w:eastAsia="ca-ES"/>
-        </w:rPr>
-        <w:t xml:space="preserve">with </w:t>
-      </w:r>
-      <w:r>
-        <w:rPr>
-          <w:rFonts w:eastAsia="Times New Roman" w:cstheme="minorHAnsi"/>
-          <w:color w:val="000000"/>
-          <w:lang w:eastAsia="ca-ES"/>
-        </w:rPr>
-        <w:t xml:space="preserve">25 seeds </w:t>
-      </w:r>
-      <w:r>
-        <w:rPr>
-          <w:rFonts w:eastAsia="Times New Roman" w:cstheme="minorHAnsi"/>
-          <w:color w:val="000000"/>
-          <w:lang w:eastAsia="ca-ES"/>
-        </w:rPr>
-        <w:t>each</w:t>
-      </w:r>
-      <w:r>
-        <w:rPr>
-          <w:rFonts w:eastAsia="Times New Roman" w:cstheme="minorHAnsi"/>
-          <w:color w:val="000000"/>
-          <w:lang w:eastAsia="ca-ES"/>
-        </w:rPr>
-        <w:t xml:space="preserve"> (numbers were adapted for seed lots with fewer seeds available) </w:t>
-      </w:r>
-      <w:r>
-        <w:rPr>
-          <w:rFonts w:eastAsia="Times New Roman" w:cstheme="minorHAnsi"/>
-          <w:color w:val="000000"/>
-          <w:lang w:eastAsia="ca-ES"/>
-        </w:rPr>
-        <w:t>on</w:t>
-      </w:r>
-      <w:r>
-        <w:rPr>
-          <w:rFonts w:eastAsia="Times New Roman" w:cstheme="minorHAnsi"/>
-          <w:color w:val="000000"/>
-          <w:lang w:eastAsia="ca-ES"/>
-        </w:rPr>
-        <w:t xml:space="preserve"> </w:t>
-      </w:r>
-      <w:r>
-        <w:rPr>
-          <w:rFonts w:eastAsia="Times New Roman" w:cstheme="minorHAnsi"/>
-          <w:color w:val="000000"/>
-          <w:lang w:eastAsia="ca-ES"/>
-        </w:rPr>
-        <w:t>agar 1%</w:t>
-      </w:r>
-      <w:r>
-        <w:rPr>
-          <w:rFonts w:eastAsia="Times New Roman" w:cstheme="minorHAnsi"/>
-          <w:color w:val="000000"/>
-          <w:lang w:eastAsia="ca-ES"/>
-        </w:rPr>
-        <w:t xml:space="preserve"> (1</w:t>
-      </w:r>
-      <w:r>
-        <w:rPr>
-          <w:rFonts w:eastAsia="Times New Roman" w:cstheme="minorHAnsi"/>
-          <w:color w:val="000000"/>
-          <w:lang w:eastAsia="ca-ES"/>
-        </w:rPr>
-        <w:t xml:space="preserve">0 gr agar in </w:t>
-      </w:r>
-      <w:r>
-        <w:rPr>
-          <w:rFonts w:eastAsia="Times New Roman" w:cstheme="minorHAnsi"/>
-          <w:color w:val="000000"/>
-          <w:lang w:eastAsia="ca-ES"/>
-        </w:rPr>
-        <w:t xml:space="preserve">1L </w:t>
-      </w:r>
-      <w:r>
-        <w:rPr>
-          <w:rFonts w:eastAsia="Times New Roman" w:cstheme="minorHAnsi"/>
-          <w:color w:val="000000"/>
-          <w:lang w:eastAsia="ca-ES"/>
-        </w:rPr>
-        <w:t xml:space="preserve">of </w:t>
-      </w:r>
-      <w:r>
-        <w:rPr>
-          <w:rFonts w:eastAsia="Times New Roman" w:cstheme="minorHAnsi"/>
-          <w:color w:val="000000"/>
-          <w:lang w:eastAsia="ca-ES"/>
-        </w:rPr>
-        <w:t>distilled water)</w:t>
-      </w:r>
-      <w:r>
-        <w:rPr>
-          <w:rFonts w:eastAsia="Times New Roman" w:cstheme="minorHAnsi"/>
-          <w:color w:val="000000"/>
-          <w:lang w:eastAsia="ca-ES"/>
-        </w:rPr>
-        <w:t xml:space="preserve"> and cover with two layers of aluminium foil</w:t>
+        <w:t>and cover with two layers of aluminium foil</w:t>
       </w:r>
       <w:r>
         <w:rPr>
@@ -7173,449 +7334,454 @@
         <w:t xml:space="preserve">As </w:t>
       </w:r>
       <w:r>
-        <w:t xml:space="preserve">PEG solutions depend on experimental </w:t>
-      </w:r>
-      <w:r>
+        <w:t>PEG solutions depend on experimental temperatures, t</w:t>
+      </w:r>
+      <w:r>
+        <w:t xml:space="preserve">wo </w:t>
+      </w:r>
+      <w:r>
+        <w:t xml:space="preserve">PEG solutions </w:t>
+      </w:r>
+      <w:r>
+        <w:t xml:space="preserve">were prepared </w:t>
+      </w:r>
+      <w:r>
+        <w:t xml:space="preserve">according to </w:t>
+      </w:r>
+      <w:r>
+        <w:fldChar w:fldCharType="begin" w:fldLock="1"/>
+      </w:r>
+      <w:r>
+        <w:instrText>ADDIN CSL_CITATION {"citationItems":[{"id":"ITEM-1","itemData":{"author":[{"dropping-particle":"","family":"Michel","given":"Burlyn E","non-dropping-particle":"","parse-names":false,"suffix":""},{"dropping-particle":"","family":"Kaufmann","given":"Merrill R","non-dropping-particle":"","parse-names":false,"suffix":""}],"id":"ITEM-1","issued":{"date-parts":[["1973"]]},"page":"914-916","title":"The Osmotic Potential of Polyethylene Glycol 60001","type":"article-journal"},"uris":["http://www.mendeley.com/documents/?uuid=5dcd3d1a-bbf4-4c97-b53e-728b84b2c212","http://www.mendeley.com/documents/?uuid=8bae9792-5df1-46d8-a9f4-b2080aa2e458"]}],"mendeley":{"formattedCitation":"(Michel &amp; Kaufmann 1973)","manualFormatting":"Michel &amp; Kaufmann (1973)","plainTextFormattedCitation":"(Michel &amp; Kaufmann 1973)","previouslyFormattedCitation":"(Michel &amp; Kaufmann 1973)"},"properties":{"noteIndex":0},"schema":"https://github.com/citation-style-language/schema/raw/master/csl-citation.json"}</w:instrText>
+      </w:r>
+      <w:r>
+        <w:fldChar w:fldCharType="separate"/>
+      </w:r>
+      <w:r>
+        <w:rPr>
+          <w:noProof/>
+        </w:rPr>
+        <w:t>Michel &amp; Kaufmann (1973)</w:t>
+      </w:r>
+      <w:r>
+        <w:fldChar w:fldCharType="end"/>
+      </w:r>
+      <w:r>
+        <w:t xml:space="preserve"> and </w:t>
+      </w:r>
+      <w:r>
+        <w:fldChar w:fldCharType="begin" w:fldLock="1"/>
+      </w:r>
+      <w:r>
+        <w:instrText>ADDIN CSL_CITATION {"citationItems":[{"id":"ITEM-1","itemData":{"ISBN":"1678-3921","ISSN":"1678-3921","abstract":"Um expressivo número de pesquisas vem sendo desenvolvido na área de pré-condicionamento em sementes. Na busca de contribuir com os técnicos envolvidos em pes­quisas nesta área, procurou-se através da inter-relação entre a Termodinâmica e a Tecnologia de Sementes caracterizar potenciais hídrico, osmótico, mátrico e de pressão e, a partir do tra­balho de Michel &amp; Kaufmann (1973), construir uma tabela associando potencial osmótico, concentração de polietileno glicol 6000 e temperatura.","author":[{"dropping-particle":"","family":"Villela","given":"Francisco Amaral","non-dropping-particle":"","parse-names":false,"suffix":""},{"dropping-particle":"","family":"Doni Filho","given":"Luiz","non-dropping-particle":"","parse-names":false,"suffix":""},{"dropping-particle":"","family":"Sequeira","given":"Eliseo Lecrerc","non-dropping-particle":"","parse-names":false,"suffix":""}],"container-title":"Pesquisa Agropecuária Brasileira","id":"ITEM-1","issue":"11/12","issued":{"date-parts":[["1991"]]},"page":"1957-1968","title":"Tabela de potencial osmótico em função da concentração de polietileno glicol 6.000 e da temperatura","type":"article-journal","volume":"26"},"uris":["http://www.mendeley.com/documents/?uuid=309ba047-c4bd-4f3c-8de0-e44ba85df0c4"]}],"mendeley":{"formattedCitation":"(Villela et al. 1991)","manualFormatting":"Villela et al. (1991)","plainTextFormattedCitation":"(Villela et al. 1991)","previouslyFormattedCitation":"(Villela et al. 1991)"},"properties":{"noteIndex":0},"schema":"https://github.com/citation-style-language/schema/raw/master/csl-citation.json"}</w:instrText>
+      </w:r>
+      <w:r>
+        <w:fldChar w:fldCharType="separate"/>
+      </w:r>
+      <w:r>
+        <w:rPr>
+          <w:noProof/>
+        </w:rPr>
+        <w:t xml:space="preserve">Villela et al. </w:t>
+      </w:r>
+      <w:r>
+        <w:rPr>
+          <w:noProof/>
+        </w:rPr>
+        <w:t>(</w:t>
+      </w:r>
+      <w:r>
+        <w:rPr>
+          <w:noProof/>
+        </w:rPr>
+        <w:t>1991)</w:t>
+      </w:r>
+      <w:r>
+        <w:fldChar w:fldCharType="end"/>
+      </w:r>
+      <w:r>
+        <w:t xml:space="preserve"> to reach desired osmotic potentials at </w:t>
+      </w:r>
+      <w:r>
+        <w:t xml:space="preserve">10 ºC </w:t>
+      </w:r>
+      <w:r>
+        <w:t xml:space="preserve">and </w:t>
+      </w:r>
+      <w:r>
+        <w:t>17</w:t>
+      </w:r>
+      <w:r>
+        <w:t>ºC</w:t>
+      </w:r>
+      <w:r>
+        <w:t xml:space="preserve"> </w:t>
+      </w:r>
+      <w:r>
+        <w:t xml:space="preserve">depending on species optimal germination temperature. </w:t>
+      </w:r>
+      <w:r>
+        <w:t xml:space="preserve"> </w:t>
+      </w:r>
+      <w:r>
+        <w:t xml:space="preserve">Finally, </w:t>
+      </w:r>
+      <w:r>
+        <w:t>the rest of the seed</w:t>
+      </w:r>
+      <w:r>
+        <w:t>s</w:t>
+      </w:r>
+      <w:r>
+        <w:t xml:space="preserve"> </w:t>
+      </w:r>
+      <w:proofErr w:type="gramStart"/>
+      <w:r>
+        <w:t>were divided</w:t>
+      </w:r>
+      <w:proofErr w:type="gramEnd"/>
+      <w:r>
+        <w:t xml:space="preserve"> between </w:t>
+      </w:r>
+      <w:r>
+        <w:t>control</w:t>
+      </w:r>
+      <w:r>
+        <w:t xml:space="preserve"> and constant</w:t>
+      </w:r>
+      <w:r>
+        <w:t xml:space="preserve"> temperature</w:t>
+      </w:r>
+      <w:r>
+        <w:t xml:space="preserve"> treatments</w:t>
+      </w:r>
+      <w:r>
+        <w:t xml:space="preserve">, </w:t>
+      </w:r>
+      <w:r>
+        <w:t xml:space="preserve">added 6ml of distilled water and sealed with </w:t>
+      </w:r>
+      <w:proofErr w:type="spellStart"/>
+      <w:r>
+        <w:t>parafilm</w:t>
+      </w:r>
+      <w:proofErr w:type="spellEnd"/>
+      <w:r>
+        <w:t xml:space="preserve">. </w:t>
+      </w:r>
+      <w:r>
+        <w:rPr>
+          <w:rFonts w:cstheme="minorHAnsi"/>
+        </w:rPr>
+        <w:t xml:space="preserve">We checked </w:t>
+      </w:r>
+      <w:r>
+        <w:rPr>
+          <w:rFonts w:cstheme="minorHAnsi"/>
+        </w:rPr>
+        <w:t xml:space="preserve">germination </w:t>
+      </w:r>
+      <w:r>
+        <w:rPr>
+          <w:rFonts w:cstheme="minorHAnsi"/>
+        </w:rPr>
+        <w:t xml:space="preserve">right after cold stratification </w:t>
+      </w:r>
+      <w:proofErr w:type="spellStart"/>
+      <w:r>
+        <w:rPr>
+          <w:rFonts w:cstheme="minorHAnsi"/>
+        </w:rPr>
+        <w:t>pretreatment</w:t>
+      </w:r>
+      <w:proofErr w:type="spellEnd"/>
+      <w:r>
+        <w:rPr>
+          <w:rFonts w:cstheme="minorHAnsi"/>
+        </w:rPr>
+        <w:t>, as a proxy of species ability to germinate under snow-like conditions</w:t>
+      </w:r>
+      <w:r>
+        <w:rPr>
+          <w:rFonts w:cstheme="minorHAnsi"/>
+        </w:rPr>
+        <w:t xml:space="preserve"> to have extra information</w:t>
+      </w:r>
+      <w:r>
+        <w:rPr>
+          <w:rFonts w:cstheme="minorHAnsi"/>
+        </w:rPr>
+        <w:t xml:space="preserve"> to include in niche dissimilarity analysis, </w:t>
+      </w:r>
+      <w:r>
+        <w:rPr>
+          <w:rFonts w:eastAsia="Times New Roman" w:cstheme="minorHAnsi"/>
+          <w:color w:val="000000"/>
+          <w:lang w:eastAsia="ca-ES"/>
+        </w:rPr>
+        <w:t>one species (</w:t>
+      </w:r>
+      <w:proofErr w:type="spellStart"/>
+      <w:r>
+        <w:rPr>
+          <w:rFonts w:eastAsia="Times New Roman" w:cstheme="minorHAnsi"/>
+          <w:i/>
+          <w:color w:val="000000"/>
+          <w:lang w:eastAsia="ca-ES"/>
+        </w:rPr>
+        <w:t>Teesdalia</w:t>
+      </w:r>
+      <w:proofErr w:type="spellEnd"/>
+      <w:r>
+        <w:rPr>
+          <w:rFonts w:eastAsia="Times New Roman" w:cstheme="minorHAnsi"/>
+          <w:i/>
+          <w:color w:val="000000"/>
+          <w:lang w:eastAsia="ca-ES"/>
+        </w:rPr>
+        <w:t xml:space="preserve"> </w:t>
+      </w:r>
+      <w:proofErr w:type="spellStart"/>
+      <w:r>
+        <w:rPr>
+          <w:rFonts w:eastAsia="Times New Roman" w:cstheme="minorHAnsi"/>
+          <w:i/>
+          <w:color w:val="000000"/>
+          <w:lang w:eastAsia="ca-ES"/>
+        </w:rPr>
+        <w:t>conferta</w:t>
+      </w:r>
+      <w:proofErr w:type="spellEnd"/>
+      <w:r>
+        <w:rPr>
+          <w:rFonts w:eastAsia="Times New Roman" w:cstheme="minorHAnsi"/>
+          <w:color w:val="000000"/>
+          <w:lang w:eastAsia="ca-ES"/>
+        </w:rPr>
+        <w:t xml:space="preserve">) germinated to 100% thus </w:t>
+      </w:r>
+      <w:proofErr w:type="gramStart"/>
+      <w:r>
+        <w:rPr>
+          <w:rFonts w:eastAsia="Times New Roman" w:cstheme="minorHAnsi"/>
+          <w:color w:val="000000"/>
+          <w:lang w:eastAsia="ca-ES"/>
+        </w:rPr>
+        <w:t>was removed</w:t>
+      </w:r>
+      <w:proofErr w:type="gramEnd"/>
+      <w:r>
+        <w:rPr>
+          <w:rFonts w:eastAsia="Times New Roman" w:cstheme="minorHAnsi"/>
+          <w:color w:val="000000"/>
+          <w:lang w:eastAsia="ca-ES"/>
+        </w:rPr>
+        <w:t xml:space="preserve"> from germination treatments analysis</w:t>
+      </w:r>
+      <w:r>
+        <w:rPr>
+          <w:rFonts w:cstheme="minorHAnsi"/>
+        </w:rPr>
+        <w:t>. Fr</w:t>
+      </w:r>
+      <w:r>
+        <w:rPr>
+          <w:rFonts w:cstheme="minorHAnsi"/>
+        </w:rPr>
+        <w:t>o</w:t>
+      </w:r>
+      <w:r>
+        <w:rPr>
+          <w:rFonts w:cstheme="minorHAnsi"/>
+        </w:rPr>
+        <w:t>m there</w:t>
+      </w:r>
+      <w:r>
+        <w:rPr>
+          <w:rFonts w:cstheme="minorHAnsi"/>
+        </w:rPr>
+        <w:t xml:space="preserve"> on,</w:t>
+      </w:r>
+      <w:r>
+        <w:rPr>
+          <w:rFonts w:cstheme="minorHAnsi"/>
+        </w:rPr>
+        <w:t xml:space="preserve"> we checked</w:t>
+      </w:r>
+      <w:r>
+        <w:rPr>
+          <w:rFonts w:cstheme="minorHAnsi"/>
+        </w:rPr>
+        <w:t xml:space="preserve"> </w:t>
+      </w:r>
+      <w:r>
+        <w:rPr>
+          <w:rFonts w:cstheme="minorHAnsi"/>
+        </w:rPr>
+        <w:t>germination</w:t>
+      </w:r>
+      <w:r>
+        <w:rPr>
+          <w:rFonts w:eastAsia="Times New Roman" w:cstheme="minorHAnsi"/>
+          <w:color w:val="000000"/>
+          <w:lang w:eastAsia="ca-ES"/>
+        </w:rPr>
+        <w:t xml:space="preserve"> </w:t>
+      </w:r>
+      <w:r>
+        <w:rPr>
+          <w:rFonts w:cstheme="minorHAnsi"/>
+        </w:rPr>
+        <w:t xml:space="preserve">every </w:t>
+      </w:r>
+      <w:r>
+        <w:rPr>
+          <w:rFonts w:cstheme="minorHAnsi"/>
+        </w:rPr>
+        <w:t xml:space="preserve">week </w:t>
+      </w:r>
+      <w:r>
+        <w:rPr>
+          <w:rFonts w:cstheme="minorHAnsi"/>
+        </w:rPr>
+        <w:t>until the end of the experiment</w:t>
+      </w:r>
+      <w:r>
+        <w:rPr>
+          <w:rFonts w:cstheme="minorHAnsi"/>
+        </w:rPr>
+        <w:t xml:space="preserve"> (6 weeks)</w:t>
+      </w:r>
+      <w:r>
+        <w:rPr>
+          <w:rFonts w:cstheme="minorHAnsi"/>
+        </w:rPr>
+        <w:t xml:space="preserve">. We removed seeds from the petri dishes once </w:t>
+      </w:r>
+      <w:r>
+        <w:rPr>
+          <w:rFonts w:eastAsia="Times New Roman" w:cstheme="minorHAnsi"/>
+          <w:color w:val="000000"/>
+          <w:lang w:eastAsia="ca-ES"/>
+        </w:rPr>
+        <w:t xml:space="preserve">germination occurred (radicle &gt; 1.5 mm long). At the end of the experiment, we cut open non-germinated seeds under the binocular loupe </w:t>
+      </w:r>
+      <w:proofErr w:type="gramStart"/>
+      <w:r>
+        <w:rPr>
+          <w:rFonts w:eastAsia="Times New Roman" w:cstheme="minorHAnsi"/>
+          <w:color w:val="000000"/>
+          <w:lang w:eastAsia="ca-ES"/>
+        </w:rPr>
+        <w:t>to visually assess</w:t>
+      </w:r>
+      <w:proofErr w:type="gramEnd"/>
+      <w:r>
+        <w:rPr>
+          <w:rFonts w:eastAsia="Times New Roman" w:cstheme="minorHAnsi"/>
+          <w:color w:val="000000"/>
+          <w:lang w:eastAsia="ca-ES"/>
+        </w:rPr>
+        <w:t xml:space="preserve"> if they were empty, infected, or seemed normal. We considered seeds</w:t>
+      </w:r>
+      <w:r>
+        <w:rPr>
+          <w:rFonts w:cstheme="minorHAnsi"/>
+          <w:color w:val="000000"/>
+        </w:rPr>
+        <w:t xml:space="preserve"> with white and firm embryos viable, i.e. potentially </w:t>
+      </w:r>
+      <w:proofErr w:type="spellStart"/>
+      <w:r>
+        <w:rPr>
+          <w:rFonts w:cstheme="minorHAnsi"/>
+          <w:color w:val="000000"/>
+        </w:rPr>
+        <w:t>germinable</w:t>
+      </w:r>
+      <w:proofErr w:type="spellEnd"/>
+      <w:r>
+        <w:rPr>
+          <w:rFonts w:cstheme="minorHAnsi"/>
+          <w:color w:val="000000"/>
+        </w:rPr>
+        <w:t xml:space="preserve"> </w:t>
+      </w:r>
+      <w:r>
+        <w:rPr>
+          <w:rFonts w:cstheme="minorHAnsi"/>
+          <w:color w:val="000000"/>
+        </w:rPr>
+        <w:fldChar w:fldCharType="begin" w:fldLock="1"/>
+      </w:r>
+      <w:r>
+        <w:rPr>
+          <w:rFonts w:cstheme="minorHAnsi"/>
+          <w:color w:val="000000"/>
+        </w:rPr>
+        <w:instrText>ADDIN CSL_CITATION {"citationItems":[{"id":"ITEM-1","itemData":{"DOI":"10.1016/B978-0-12-416677-6.00001-9","ISBN":"978-0-12-416677-6","abstract":"This book covers the present state of knowledge of the ecology, biogeography and evolution of whole-seed dormancy and germination, and it synthesizes available information on these topics for more than 14,000 species. The first chapter explains the meaning of seed germination ecology, provides an overview of the general kinds of information needed to understand the seed germination ecology of a species and comments on the values of such studies. Also, attention is given to reasons why this book on seed germination is needed, and how it differs from previous ones written on various aspects of seeds.","author":[{"dropping-particle":"","family":"Baskin","given":"Carol C.","non-dropping-particle":"","parse-names":false,"suffix":""},{"dropping-particle":"","family":"Baskin","given":"Jerry M.","non-dropping-particle":"","parse-names":false,"suffix":""}],"container-title":"Seeds","edition":"2nd Editio","id":"ITEM-1","issued":{"date-parts":[["2014","1","1"]]},"publisher":"Academic Press","publisher-place":"San Diego, CA, USA","title":"Seeds. Ecology, Biogeography and Evolution of Dormancy and Germination","type":"book"},"uris":["http://www.mendeley.com/documents/?uuid=a147d983-47ad-3113-ac22-f9e2c3bbcc32"]}],"mendeley":{"formattedCitation":"(Baskin and Baskin, 2014)","plainTextFormattedCitation":"(Baskin and Baskin, 2014)","previouslyFormattedCitation":"(Baskin and Baskin, 2014)"},"properties":{"noteIndex":0},"schema":"https://github.com/citation-style-language/schema/raw/master/csl-citation.json"}</w:instrText>
+      </w:r>
+      <w:r>
+        <w:rPr>
+          <w:rFonts w:cstheme="minorHAnsi"/>
+          <w:color w:val="000000"/>
+        </w:rPr>
+        <w:fldChar w:fldCharType="separate"/>
+      </w:r>
+      <w:r>
+        <w:rPr>
+          <w:rFonts w:cstheme="minorHAnsi"/>
+          <w:noProof/>
+          <w:color w:val="000000"/>
+        </w:rPr>
+        <w:t>(Baskin and Baskin, 2014)</w:t>
+      </w:r>
+      <w:r>
+        <w:rPr>
+          <w:rFonts w:cstheme="minorHAnsi"/>
+          <w:color w:val="000000"/>
+        </w:rPr>
+        <w:fldChar w:fldCharType="end"/>
+      </w:r>
+      <w:r>
+        <w:rPr>
+          <w:rFonts w:cstheme="minorHAnsi"/>
+          <w:color w:val="000000"/>
+        </w:rPr>
+        <w:t xml:space="preserve">. We removed </w:t>
+      </w:r>
+      <w:r>
+        <w:rPr>
+          <w:rFonts w:eastAsia="Times New Roman" w:cstheme="minorHAnsi"/>
+          <w:color w:val="000000"/>
+          <w:lang w:eastAsia="ca-ES"/>
+        </w:rPr>
+        <w:t xml:space="preserve">empty or infected seeds </w:t>
+      </w:r>
+      <w:r>
+        <w:rPr>
+          <w:rFonts w:eastAsia="Times New Roman" w:cstheme="minorHAnsi"/>
+          <w:color w:val="000000"/>
+          <w:lang w:eastAsia="ca-ES"/>
+        </w:rPr>
+        <w:t>as well as</w:t>
+      </w:r>
+      <w:r>
+        <w:rPr>
+          <w:rFonts w:eastAsia="Times New Roman" w:cstheme="minorHAnsi"/>
+          <w:color w:val="000000"/>
+          <w:lang w:eastAsia="ca-ES"/>
+        </w:rPr>
+        <w:t xml:space="preserve"> populations with zero </w:t>
+      </w:r>
+      <w:r>
+        <w:rPr>
+          <w:rFonts w:eastAsia="Times New Roman" w:cstheme="minorHAnsi"/>
+          <w:color w:val="000000"/>
+          <w:lang w:eastAsia="ca-ES"/>
+        </w:rPr>
         <w:lastRenderedPageBreak/>
-        <w:t>temperatures, t</w:t>
-      </w:r>
-      <w:r>
-        <w:t xml:space="preserve">wo </w:t>
-      </w:r>
-      <w:r>
-        <w:t xml:space="preserve">PEG solutions </w:t>
-      </w:r>
-      <w:r>
-        <w:t xml:space="preserve">were prepared </w:t>
-      </w:r>
-      <w:r>
-        <w:t xml:space="preserve">according to </w:t>
-      </w:r>
-      <w:r>
-        <w:fldChar w:fldCharType="begin" w:fldLock="1"/>
-      </w:r>
-      <w:r>
-        <w:instrText>ADDIN CSL_CITATION {"citationItems":[{"id":"ITEM-1","itemData":{"author":[{"dropping-particle":"","family":"Michel","given":"Burlyn E","non-dropping-particle":"","parse-names":false,"suffix":""},{"dropping-particle":"","family":"Kaufmann","given":"Merrill R","non-dropping-particle":"","parse-names":false,"suffix":""}],"id":"ITEM-1","issued":{"date-parts":[["1973"]]},"page":"914-916","title":"The Osmotic Potential of Polyethylene Glycol 60001","type":"article-journal"},"uris":["http://www.mendeley.com/documents/?uuid=5dcd3d1a-bbf4-4c97-b53e-728b84b2c212","http://www.mendeley.com/documents/?uuid=8bae9792-5df1-46d8-a9f4-b2080aa2e458"]}],"mendeley":{"formattedCitation":"(Michel &amp; Kaufmann 1973)","manualFormatting":"Michel &amp; Kaufmann (1973)","plainTextFormattedCitation":"(Michel &amp; Kaufmann 1973)","previouslyFormattedCitation":"(Michel &amp; Kaufmann 1973)"},"properties":{"noteIndex":0},"schema":"https://github.com/citation-style-language/schema/raw/master/csl-citation.json"}</w:instrText>
-      </w:r>
-      <w:r>
-        <w:fldChar w:fldCharType="separate"/>
-      </w:r>
-      <w:r>
-        <w:rPr>
-          <w:noProof/>
-        </w:rPr>
-        <w:t>Michel &amp; Kaufmann (1973)</w:t>
-      </w:r>
-      <w:r>
-        <w:fldChar w:fldCharType="end"/>
-      </w:r>
-      <w:r>
-        <w:t xml:space="preserve"> and </w:t>
-      </w:r>
-      <w:r>
-        <w:fldChar w:fldCharType="begin" w:fldLock="1"/>
-      </w:r>
-      <w:r>
-        <w:instrText>ADDIN CSL_CITATION {"citationItems":[{"id":"ITEM-1","itemData":{"ISBN":"1678-3921","ISSN":"1678-3921","abstract":"Um expressivo número de pesquisas vem sendo desenvolvido na área de pré-condicionamento em sementes. Na busca de contribuir com os técnicos envolvidos em pes­quisas nesta área, procurou-se através da inter-relação entre a Termodinâmica e a Tecnologia de Sementes caracterizar potenciais hídrico, osmótico, mátrico e de pressão e, a partir do tra­balho de Michel &amp; Kaufmann (1973), construir uma tabela associando potencial osmótico, concentração de polietileno glicol 6000 e temperatura.","author":[{"dropping-particle":"","family":"Villela","given":"Francisco Amaral","non-dropping-particle":"","parse-names":false,"suffix":""},{"dropping-particle":"","family":"Doni Filho","given":"Luiz","non-dropping-particle":"","parse-names":false,"suffix":""},{"dropping-particle":"","family":"Sequeira","given":"Eliseo Lecrerc","non-dropping-particle":"","parse-names":false,"suffix":""}],"container-title":"Pesquisa Agropecuária Brasileira","id":"ITEM-1","issue":"11/12","issued":{"date-parts":[["1991"]]},"page":"1957-1968","title":"Tabela de potencial osmótico em função da concentração de polietileno glicol 6.000 e da temperatura","type":"article-journal","volume":"26"},"uris":["http://www.mendeley.com/documents/?uuid=309ba047-c4bd-4f3c-8de0-e44ba85df0c4"]}],"mendeley":{"formattedCitation":"(Villela et al. 1991)","manualFormatting":"Villela et al. (1991)","plainTextFormattedCitation":"(Villela et al. 1991)","previouslyFormattedCitation":"(Villela et al. 1991)"},"properties":{"noteIndex":0},"schema":"https://github.com/citation-style-language/schema/raw/master/csl-citation.json"}</w:instrText>
-      </w:r>
-      <w:r>
-        <w:fldChar w:fldCharType="separate"/>
-      </w:r>
-      <w:r>
-        <w:rPr>
-          <w:noProof/>
-        </w:rPr>
-        <w:t xml:space="preserve">Villela et al. </w:t>
-      </w:r>
-      <w:r>
-        <w:rPr>
-          <w:noProof/>
-        </w:rPr>
-        <w:t>(</w:t>
-      </w:r>
-      <w:r>
-        <w:rPr>
-          <w:noProof/>
-        </w:rPr>
-        <w:t>1991)</w:t>
-      </w:r>
-      <w:r>
-        <w:fldChar w:fldCharType="end"/>
-      </w:r>
-      <w:r>
-        <w:t xml:space="preserve"> to reach desired osmotic potentials at </w:t>
-      </w:r>
-      <w:r>
-        <w:t xml:space="preserve">10 ºC </w:t>
-      </w:r>
-      <w:r>
-        <w:t xml:space="preserve">and </w:t>
-      </w:r>
-      <w:r>
-        <w:t>17</w:t>
-      </w:r>
-      <w:r>
-        <w:t>ºC</w:t>
-      </w:r>
-      <w:r>
-        <w:t xml:space="preserve"> </w:t>
-      </w:r>
-      <w:r>
-        <w:t xml:space="preserve">depending on species optimal germination temperature. </w:t>
-      </w:r>
-      <w:r>
-        <w:t xml:space="preserve"> </w:t>
-      </w:r>
-      <w:r>
-        <w:t xml:space="preserve">Finally, </w:t>
-      </w:r>
-      <w:r>
-        <w:t>the rest of the seed</w:t>
-      </w:r>
-      <w:r>
-        <w:t>s</w:t>
-      </w:r>
-      <w:r>
-        <w:t xml:space="preserve"> </w:t>
-      </w:r>
-      <w:proofErr w:type="gramStart"/>
-      <w:r>
-        <w:t>were divided</w:t>
-      </w:r>
-      <w:proofErr w:type="gramEnd"/>
-      <w:r>
-        <w:t xml:space="preserve"> between </w:t>
-      </w:r>
-      <w:r>
-        <w:t>control</w:t>
-      </w:r>
-      <w:r>
-        <w:t xml:space="preserve"> and constant</w:t>
-      </w:r>
-      <w:r>
-        <w:t xml:space="preserve"> temperature</w:t>
-      </w:r>
-      <w:r>
-        <w:t xml:space="preserve"> treatments</w:t>
-      </w:r>
-      <w:r>
-        <w:t xml:space="preserve">, </w:t>
-      </w:r>
-      <w:r>
-        <w:t xml:space="preserve">added 6ml of distilled water and sealed with </w:t>
-      </w:r>
-      <w:proofErr w:type="spellStart"/>
-      <w:r>
-        <w:t>parafilm</w:t>
-      </w:r>
-      <w:proofErr w:type="spellEnd"/>
-      <w:r>
-        <w:t xml:space="preserve">. </w:t>
-      </w:r>
-      <w:r>
-        <w:rPr>
-          <w:rFonts w:cstheme="minorHAnsi"/>
-        </w:rPr>
-        <w:t xml:space="preserve">We checked </w:t>
-      </w:r>
-      <w:r>
-        <w:rPr>
-          <w:rFonts w:cstheme="minorHAnsi"/>
-        </w:rPr>
-        <w:t xml:space="preserve">germination </w:t>
-      </w:r>
-      <w:r>
-        <w:rPr>
-          <w:rFonts w:cstheme="minorHAnsi"/>
-        </w:rPr>
-        <w:t xml:space="preserve">right after cold stratification </w:t>
-      </w:r>
-      <w:proofErr w:type="spellStart"/>
-      <w:r>
-        <w:rPr>
-          <w:rFonts w:cstheme="minorHAnsi"/>
-        </w:rPr>
-        <w:t>pretreatment</w:t>
-      </w:r>
-      <w:proofErr w:type="spellEnd"/>
-      <w:r>
-        <w:rPr>
-          <w:rFonts w:cstheme="minorHAnsi"/>
-        </w:rPr>
-        <w:t>, as a proxy of species ability to germinate under snow-like conditions</w:t>
-      </w:r>
-      <w:r>
-        <w:rPr>
-          <w:rFonts w:cstheme="minorHAnsi"/>
-        </w:rPr>
-        <w:t xml:space="preserve"> to have extra information</w:t>
-      </w:r>
-      <w:r>
-        <w:rPr>
-          <w:rFonts w:cstheme="minorHAnsi"/>
-        </w:rPr>
-        <w:t xml:space="preserve"> to include in niche dissimilarity analysis, </w:t>
-      </w:r>
-      <w:r>
-        <w:rPr>
-          <w:rFonts w:eastAsia="Times New Roman" w:cstheme="minorHAnsi"/>
-          <w:color w:val="000000"/>
-          <w:lang w:eastAsia="ca-ES"/>
-        </w:rPr>
-        <w:t>one species (</w:t>
-      </w:r>
-      <w:proofErr w:type="spellStart"/>
-      <w:r>
-        <w:rPr>
-          <w:rFonts w:eastAsia="Times New Roman" w:cstheme="minorHAnsi"/>
-          <w:i/>
-          <w:color w:val="000000"/>
-          <w:lang w:eastAsia="ca-ES"/>
-        </w:rPr>
-        <w:t>Teesdalia</w:t>
-      </w:r>
-      <w:proofErr w:type="spellEnd"/>
-      <w:r>
-        <w:rPr>
-          <w:rFonts w:eastAsia="Times New Roman" w:cstheme="minorHAnsi"/>
-          <w:i/>
-          <w:color w:val="000000"/>
-          <w:lang w:eastAsia="ca-ES"/>
-        </w:rPr>
-        <w:t xml:space="preserve"> </w:t>
-      </w:r>
-      <w:proofErr w:type="spellStart"/>
-      <w:r>
-        <w:rPr>
-          <w:rFonts w:eastAsia="Times New Roman" w:cstheme="minorHAnsi"/>
-          <w:i/>
-          <w:color w:val="000000"/>
-          <w:lang w:eastAsia="ca-ES"/>
-        </w:rPr>
-        <w:t>conferta</w:t>
-      </w:r>
-      <w:proofErr w:type="spellEnd"/>
-      <w:r>
-        <w:rPr>
-          <w:rFonts w:eastAsia="Times New Roman" w:cstheme="minorHAnsi"/>
-          <w:color w:val="000000"/>
-          <w:lang w:eastAsia="ca-ES"/>
-        </w:rPr>
-        <w:t xml:space="preserve">) germinated to 100% thus </w:t>
-      </w:r>
-      <w:proofErr w:type="gramStart"/>
-      <w:r>
-        <w:rPr>
-          <w:rFonts w:eastAsia="Times New Roman" w:cstheme="minorHAnsi"/>
-          <w:color w:val="000000"/>
-          <w:lang w:eastAsia="ca-ES"/>
-        </w:rPr>
-        <w:t>was removed</w:t>
-      </w:r>
-      <w:proofErr w:type="gramEnd"/>
-      <w:r>
-        <w:rPr>
-          <w:rFonts w:eastAsia="Times New Roman" w:cstheme="minorHAnsi"/>
-          <w:color w:val="000000"/>
-          <w:lang w:eastAsia="ca-ES"/>
-        </w:rPr>
-        <w:t xml:space="preserve"> from germination treatments analysis</w:t>
-      </w:r>
-      <w:r>
-        <w:rPr>
-          <w:rFonts w:cstheme="minorHAnsi"/>
-        </w:rPr>
-        <w:t>. Fr</w:t>
-      </w:r>
-      <w:r>
-        <w:rPr>
-          <w:rFonts w:cstheme="minorHAnsi"/>
-        </w:rPr>
-        <w:t>o</w:t>
-      </w:r>
-      <w:r>
-        <w:rPr>
-          <w:rFonts w:cstheme="minorHAnsi"/>
-        </w:rPr>
-        <w:t>m there</w:t>
-      </w:r>
-      <w:r>
-        <w:rPr>
-          <w:rFonts w:cstheme="minorHAnsi"/>
-        </w:rPr>
-        <w:t xml:space="preserve"> on,</w:t>
-      </w:r>
-      <w:r>
-        <w:rPr>
-          <w:rFonts w:cstheme="minorHAnsi"/>
-        </w:rPr>
-        <w:t xml:space="preserve"> we checked</w:t>
-      </w:r>
-      <w:r>
-        <w:rPr>
-          <w:rFonts w:cstheme="minorHAnsi"/>
-        </w:rPr>
-        <w:t xml:space="preserve"> </w:t>
-      </w:r>
-      <w:r>
-        <w:rPr>
-          <w:rFonts w:cstheme="minorHAnsi"/>
-        </w:rPr>
         <w:t>germination</w:t>
-      </w:r>
-      <w:r>
-        <w:rPr>
-          <w:rFonts w:eastAsia="Times New Roman" w:cstheme="minorHAnsi"/>
-          <w:color w:val="000000"/>
-          <w:lang w:eastAsia="ca-ES"/>
-        </w:rPr>
-        <w:t xml:space="preserve"> </w:t>
-      </w:r>
-      <w:r>
-        <w:rPr>
-          <w:rFonts w:cstheme="minorHAnsi"/>
-        </w:rPr>
-        <w:t xml:space="preserve">every </w:t>
-      </w:r>
-      <w:r>
-        <w:rPr>
-          <w:rFonts w:cstheme="minorHAnsi"/>
-        </w:rPr>
-        <w:t xml:space="preserve">week </w:t>
-      </w:r>
-      <w:r>
-        <w:rPr>
-          <w:rFonts w:cstheme="minorHAnsi"/>
-        </w:rPr>
-        <w:t>until the end of the experiment</w:t>
-      </w:r>
-      <w:r>
-        <w:rPr>
-          <w:rFonts w:cstheme="minorHAnsi"/>
-        </w:rPr>
-        <w:t xml:space="preserve"> (6 weeks)</w:t>
-      </w:r>
-      <w:r>
-        <w:rPr>
-          <w:rFonts w:cstheme="minorHAnsi"/>
-        </w:rPr>
-        <w:t xml:space="preserve">. We removed seeds from the petri dishes once </w:t>
-      </w:r>
-      <w:r>
-        <w:rPr>
-          <w:rFonts w:eastAsia="Times New Roman" w:cstheme="minorHAnsi"/>
-          <w:color w:val="000000"/>
-          <w:lang w:eastAsia="ca-ES"/>
-        </w:rPr>
-        <w:t xml:space="preserve">germination occurred (radicle &gt; 1.5 mm long). At the end of the experiment, we cut open non-germinated seeds under the binocular loupe </w:t>
-      </w:r>
-      <w:proofErr w:type="gramStart"/>
-      <w:r>
-        <w:rPr>
-          <w:rFonts w:eastAsia="Times New Roman" w:cstheme="minorHAnsi"/>
-          <w:color w:val="000000"/>
-          <w:lang w:eastAsia="ca-ES"/>
-        </w:rPr>
-        <w:t>to visually assess</w:t>
-      </w:r>
-      <w:proofErr w:type="gramEnd"/>
-      <w:r>
-        <w:rPr>
-          <w:rFonts w:eastAsia="Times New Roman" w:cstheme="minorHAnsi"/>
-          <w:color w:val="000000"/>
-          <w:lang w:eastAsia="ca-ES"/>
-        </w:rPr>
-        <w:t xml:space="preserve"> if they were empty, infected, or seemed normal. We considered seeds</w:t>
-      </w:r>
-      <w:r>
-        <w:rPr>
-          <w:rFonts w:cstheme="minorHAnsi"/>
-          <w:color w:val="000000"/>
-        </w:rPr>
-        <w:t xml:space="preserve"> with white and firm embryos viable, i.e. potentially </w:t>
-      </w:r>
-      <w:proofErr w:type="spellStart"/>
-      <w:r>
-        <w:rPr>
-          <w:rFonts w:cstheme="minorHAnsi"/>
-          <w:color w:val="000000"/>
-        </w:rPr>
-        <w:t>germinable</w:t>
-      </w:r>
-      <w:proofErr w:type="spellEnd"/>
-      <w:r>
-        <w:rPr>
-          <w:rFonts w:cstheme="minorHAnsi"/>
-          <w:color w:val="000000"/>
-        </w:rPr>
-        <w:t xml:space="preserve"> </w:t>
-      </w:r>
-      <w:r>
-        <w:rPr>
-          <w:rFonts w:cstheme="minorHAnsi"/>
-          <w:color w:val="000000"/>
-        </w:rPr>
-        <w:fldChar w:fldCharType="begin" w:fldLock="1"/>
-      </w:r>
-      <w:r>
-        <w:rPr>
-          <w:rFonts w:cstheme="minorHAnsi"/>
-          <w:color w:val="000000"/>
-        </w:rPr>
-        <w:instrText>ADDIN CSL_CITATION {"citationItems":[{"id":"ITEM-1","itemData":{"DOI":"10.1016/B978-0-12-416677-6.00001-9","ISBN":"978-0-12-416677-6","abstract":"This book covers the present state of knowledge of the ecology, biogeography and evolution of whole-seed dormancy and germination, and it synthesizes available information on these topics for more than 14,000 species. The first chapter explains the meaning of seed germination ecology, provides an overview of the general kinds of information needed to understand the seed germination ecology of a species and comments on the values of such studies. Also, attention is given to reasons why this book on seed germination is needed, and how it differs from previous ones written on various aspects of seeds.","author":[{"dropping-particle":"","family":"Baskin","given":"Carol C.","non-dropping-particle":"","parse-names":false,"suffix":""},{"dropping-particle":"","family":"Baskin","given":"Jerry M.","non-dropping-particle":"","parse-names":false,"suffix":""}],"container-title":"Seeds","edition":"2nd Editio","id":"ITEM-1","issued":{"date-parts":[["2014","1","1"]]},"publisher":"Academic Press","publisher-place":"San Diego, CA, USA","title":"Seeds. Ecology, Biogeography and Evolution of Dormancy and Germination","type":"book"},"uris":["http://www.mendeley.com/documents/?uuid=a147d983-47ad-3113-ac22-f9e2c3bbcc32"]}],"mendeley":{"formattedCitation":"(Baskin and Baskin, 2014)","plainTextFormattedCitation":"(Baskin and Baskin, 2014)","previouslyFormattedCitation":"(Baskin and Baskin, 2014)"},"properties":{"noteIndex":0},"schema":"https://github.com/citation-style-language/schema/raw/master/csl-citation.json"}</w:instrText>
-      </w:r>
-      <w:r>
-        <w:rPr>
-          <w:rFonts w:cstheme="minorHAnsi"/>
-          <w:color w:val="000000"/>
-        </w:rPr>
-        <w:fldChar w:fldCharType="separate"/>
-      </w:r>
-      <w:r>
-        <w:rPr>
-          <w:rFonts w:cstheme="minorHAnsi"/>
-          <w:noProof/>
-          <w:color w:val="000000"/>
-        </w:rPr>
-        <w:t>(Baskin and Baskin, 2014)</w:t>
-      </w:r>
-      <w:r>
-        <w:rPr>
-          <w:rFonts w:cstheme="minorHAnsi"/>
-          <w:color w:val="000000"/>
-        </w:rPr>
-        <w:fldChar w:fldCharType="end"/>
-      </w:r>
-      <w:r>
-        <w:rPr>
-          <w:rFonts w:cstheme="minorHAnsi"/>
-          <w:color w:val="000000"/>
-        </w:rPr>
-        <w:t xml:space="preserve">. We removed </w:t>
-      </w:r>
-      <w:r>
-        <w:rPr>
-          <w:rFonts w:eastAsia="Times New Roman" w:cstheme="minorHAnsi"/>
-          <w:color w:val="000000"/>
-          <w:lang w:eastAsia="ca-ES"/>
-        </w:rPr>
-        <w:t xml:space="preserve">empty or infected seeds </w:t>
-      </w:r>
-      <w:r>
-        <w:rPr>
-          <w:rFonts w:eastAsia="Times New Roman" w:cstheme="minorHAnsi"/>
-          <w:color w:val="000000"/>
-          <w:lang w:eastAsia="ca-ES"/>
-        </w:rPr>
-        <w:t>as well as</w:t>
-      </w:r>
-      <w:r>
-        <w:rPr>
-          <w:rFonts w:eastAsia="Times New Roman" w:cstheme="minorHAnsi"/>
-          <w:color w:val="000000"/>
-          <w:lang w:eastAsia="ca-ES"/>
-        </w:rPr>
-        <w:t xml:space="preserve"> populations with zero germination</w:t>
       </w:r>
       <w:r>
         <w:rPr>
@@ -7873,11 +8039,7 @@
         <w:t>) at 600 dpi</w:t>
       </w:r>
       <w:r>
-        <w:t xml:space="preserve"> and finally leaves were put in the oven at </w:t>
-      </w:r>
-      <w:r>
-        <w:lastRenderedPageBreak/>
-        <w:t>70ºCfor 72h to calculate dry weight. Leaves images where analysed using WINDDIAS version 3 software (</w:t>
+        <w:t xml:space="preserve"> and finally leaves were put in the oven at 70ºCfor 72h to calculate dry weight. Leaves images where analysed using WINDDIAS version 3 software (</w:t>
       </w:r>
       <w:r>
         <w:rPr>
@@ -8368,6 +8530,7 @@
           <w:highlight w:val="yellow"/>
           <w:lang w:eastAsia="ca-ES"/>
         </w:rPr>
+        <w:lastRenderedPageBreak/>
         <w:t xml:space="preserve">To calculate niche dissimilarity we followed the procedure detailed in (book Lars) with coverage data using </w:t>
       </w:r>
       <w:proofErr w:type="spellStart"/>
@@ -8471,7 +8634,6 @@
         <w:t xml:space="preserve">&lt;0.001) decrease of germination under </w:t>
       </w:r>
       <w:r>
-        <w:lastRenderedPageBreak/>
         <w:t>water stress (MPa -0.6) as well as i</w:t>
       </w:r>
       <w:r>
@@ -8508,8 +8670,6 @@
       <w:r>
         <w:t xml:space="preserve"> &lt;0.05)</w:t>
       </w:r>
-      <w:bookmarkStart w:id="5" w:name="_GoBack"/>
-      <w:bookmarkEnd w:id="5"/>
       <w:r>
         <w:t xml:space="preserve"> see Figure 2</w:t>
       </w:r>
@@ -8527,8 +8687,8 @@
       </w:pPr>
       <w:r>
         <w:pict w14:anchorId="36479C7F">
-          <v:shape id="_x0000_i1026" type="#_x0000_t75" style="width:425pt;height:241.8pt">
-            <v:imagedata r:id="rId17" o:title="fig2"/>
+          <v:shape id="_x0000_i1025" type="#_x0000_t75" style="width:425pt;height:241.8pt">
+            <v:imagedata r:id="rId16" o:title="fig2"/>
           </v:shape>
         </w:pict>
       </w:r>
@@ -8568,7 +8728,11 @@
         <w:t xml:space="preserve">germination </w:t>
       </w:r>
       <w:r>
-        <w:t xml:space="preserve">treatments studied. Bars represent the mean germination observed and each treatment (in different </w:t>
+        <w:t xml:space="preserve">treatments studied. Bars represent the mean germination </w:t>
+      </w:r>
+      <w:r>
+        <w:lastRenderedPageBreak/>
+        <w:t xml:space="preserve">observed and each treatment (in different </w:t>
       </w:r>
       <w:proofErr w:type="spellStart"/>
       <w:r>
@@ -8679,7 +8843,7 @@
       </w:r>
     </w:p>
     <w:sectPr>
-      <w:footerReference w:type="default" r:id="rId18"/>
+      <w:footerReference w:type="default" r:id="rId17"/>
       <w:pgSz w:w="11906" w:h="16838"/>
       <w:pgMar w:top="1417" w:right="1701" w:bottom="1417" w:left="1701" w:header="708" w:footer="708" w:gutter="0"/>
       <w:lnNumType w:countBy="1" w:restart="continuous"/>
@@ -8740,7 +8904,7 @@
       </w:r>
     </w:p>
   </w:comment>
-  <w:comment w:id="2" w:author="CLARA ESPINOSA DEL ALBA" w:date="2024-01-30T08:39:00Z" w:initials="CE">
+  <w:comment w:id="2" w:author="Cuenta Microsoft" w:date="2024-10-04T16:23:00Z" w:initials="CM">
     <w:p>
       <w:pPr>
         <w:pStyle w:val="Textocomentario"/>
@@ -8752,23 +8916,7 @@
         <w:annotationRef/>
       </w:r>
       <w:r>
-        <w:t>Rewrite all paragraph from Move-along paper</w:t>
-      </w:r>
-    </w:p>
-  </w:comment>
-  <w:comment w:id="3" w:author="CLARA ESPINOSA DEL ALBA" w:date="2024-01-30T09:34:00Z" w:initials="CE">
-    <w:p>
-      <w:pPr>
-        <w:pStyle w:val="Textocomentario"/>
-      </w:pPr>
-      <w:r>
-        <w:rPr>
-          <w:rStyle w:val="Refdecomentario"/>
-        </w:rPr>
-        <w:annotationRef/>
-      </w:r>
-      <w:r>
-        <w:t xml:space="preserve">From JVA 2024 </w:t>
+        <w:t xml:space="preserve">From </w:t>
       </w:r>
       <w:proofErr w:type="spellStart"/>
       <w:r>
@@ -8776,7 +8924,7 @@
       </w:r>
       <w:proofErr w:type="spellEnd"/>
       <w:r>
-        <w:t xml:space="preserve"> paper</w:t>
+        <w:t xml:space="preserve"> paper, rewrite!</w:t>
       </w:r>
     </w:p>
   </w:comment>
@@ -8803,8 +8951,7 @@
 <w15:commentsEx xmlns:wpc="http://schemas.microsoft.com/office/word/2010/wordprocessingCanvas" xmlns:mc="http://schemas.openxmlformats.org/markup-compatibility/2006" xmlns:o="urn:schemas-microsoft-com:office:office" xmlns:r="http://schemas.openxmlformats.org/officeDocument/2006/relationships" xmlns:m="http://schemas.openxmlformats.org/officeDocument/2006/math" xmlns:v="urn:schemas-microsoft-com:vml" xmlns:wp14="http://schemas.microsoft.com/office/word/2010/wordprocessingDrawing" xmlns:wp="http://schemas.openxmlformats.org/drawingml/2006/wordprocessingDrawing" xmlns:w10="urn:schemas-microsoft-com:office:word" xmlns:w="http://schemas.openxmlformats.org/wordprocessingml/2006/main" xmlns:w14="http://schemas.microsoft.com/office/word/2010/wordml" xmlns:w15="http://schemas.microsoft.com/office/word/2012/wordml" xmlns:wpg="http://schemas.microsoft.com/office/word/2010/wordprocessingGroup" xmlns:wpi="http://schemas.microsoft.com/office/word/2010/wordprocessingInk" xmlns:wne="http://schemas.microsoft.com/office/word/2006/wordml" xmlns:wps="http://schemas.microsoft.com/office/word/2010/wordprocessingShape" mc:Ignorable="w14 w15 wp14">
   <w15:commentEx w15:paraId="7129F811" w15:done="0"/>
   <w15:commentEx w15:paraId="18501729" w15:done="0"/>
-  <w15:commentEx w15:paraId="45405D54" w15:done="0"/>
-  <w15:commentEx w15:paraId="062E70A4" w15:done="0"/>
+  <w15:commentEx w15:paraId="471925E9" w15:done="0"/>
   <w15:commentEx w15:paraId="15B37E00" w15:done="0"/>
 </w15:commentsEx>
 </file>
@@ -13133,6 +13280,9 @@
 <w15:people xmlns:wpc="http://schemas.microsoft.com/office/word/2010/wordprocessingCanvas" xmlns:mc="http://schemas.openxmlformats.org/markup-compatibility/2006" xmlns:o="urn:schemas-microsoft-com:office:office" xmlns:r="http://schemas.openxmlformats.org/officeDocument/2006/relationships" xmlns:m="http://schemas.openxmlformats.org/officeDocument/2006/math" xmlns:v="urn:schemas-microsoft-com:vml" xmlns:wp14="http://schemas.microsoft.com/office/word/2010/wordprocessingDrawing" xmlns:wp="http://schemas.openxmlformats.org/drawingml/2006/wordprocessingDrawing" xmlns:w10="urn:schemas-microsoft-com:office:word" xmlns:w="http://schemas.openxmlformats.org/wordprocessingml/2006/main" xmlns:w14="http://schemas.microsoft.com/office/word/2010/wordml" xmlns:w15="http://schemas.microsoft.com/office/word/2012/wordml" xmlns:wpg="http://schemas.microsoft.com/office/word/2010/wordprocessingGroup" xmlns:wpi="http://schemas.microsoft.com/office/word/2010/wordprocessingInk" xmlns:wne="http://schemas.microsoft.com/office/word/2006/wordml" xmlns:wps="http://schemas.microsoft.com/office/word/2010/wordprocessingShape" mc:Ignorable="w14 w15 wp14">
   <w15:person w15:author="CLARA ESPINOSA DEL ALBA">
     <w15:presenceInfo w15:providerId="AD" w15:userId="S::espinosaclara@uniovi.es::56b0cbcd-66e9-4a2a-97b1-2aadcbcf6318"/>
+  </w15:person>
+  <w15:person w15:author="Cuenta Microsoft">
+    <w15:presenceInfo w15:providerId="Windows Live" w15:userId="e18eea43b52b8463"/>
   </w15:person>
 </w15:people>
 </file>

</xml_diff>

<commit_message>
FD correlation with richness exploration FD differences between germ and adult plant traits Ms 0 updated with description of preliminar results
</commit_message>
<xml_diff>
--- a/doc/Ms_0.docx
+++ b/doc/Ms_0.docx
@@ -538,7 +538,7 @@
         </w:rPr>
         <w:t xml:space="preserve"> Email: </w:t>
       </w:r>
-      <w:hyperlink r:id="rId7" w:history="1">
+      <w:hyperlink r:id="rId8" w:history="1">
         <w:r>
           <w:rPr>
             <w:rStyle w:val="Hipervnculo"/>
@@ -650,7 +650,7 @@
         </w:rPr>
         <w:t xml:space="preserve"> </w:t>
       </w:r>
-      <w:hyperlink r:id="rId8" w:history="1">
+      <w:hyperlink r:id="rId9" w:history="1">
         <w:r>
           <w:rPr>
             <w:rStyle w:val="Hipervnculo"/>
@@ -702,7 +702,7 @@
         </w:rPr>
         <w:t xml:space="preserve"> </w:t>
       </w:r>
-      <w:hyperlink r:id="rId9" w:history="1">
+      <w:hyperlink r:id="rId10" w:history="1">
         <w:r>
           <w:rPr>
             <w:rStyle w:val="Hipervnculo"/>
@@ -735,7 +735,7 @@
         </w:rPr>
         <w:t xml:space="preserve"> </w:t>
       </w:r>
-      <w:hyperlink r:id="rId10" w:history="1">
+      <w:hyperlink r:id="rId11" w:history="1">
         <w:r>
           <w:rPr>
             <w:rStyle w:val="Hipervnculo"/>
@@ -865,21 +865,7 @@
         <w:rPr>
           <w:rFonts w:eastAsia="Arial" w:cstheme="minorHAnsi"/>
         </w:rPr>
-        <w:t xml:space="preserve">). Recently, it </w:t>
-      </w:r>
-      <w:proofErr w:type="gramStart"/>
-      <w:r>
-        <w:rPr>
-          <w:rFonts w:eastAsia="Arial" w:cstheme="minorHAnsi"/>
-        </w:rPr>
-        <w:t>has been noted</w:t>
-      </w:r>
-      <w:proofErr w:type="gramEnd"/>
-      <w:r>
-        <w:rPr>
-          <w:rFonts w:eastAsia="Arial" w:cstheme="minorHAnsi"/>
-        </w:rPr>
-        <w:t xml:space="preserve"> that the abundance and distribution of alpine plants strongly depends on micro-topographic variation, which accounts for drastic changes in temperature and related factors (</w:t>
+        <w:t>). Recently, it has been noted that the abundance and distribution of alpine plants strongly depends on micro-topographic variation, which accounts for drastic changes in temperature and related factors (</w:t>
       </w:r>
       <w:proofErr w:type="spellStart"/>
       <w:r>
@@ -1027,6 +1013,7 @@
           <w:tag w:val="goog_rdk_8"/>
           <w:id w:val="30777417"/>
         </w:sdtPr>
+        <w:sdtEndPr/>
         <w:sdtContent/>
       </w:sdt>
       <w:r>
@@ -1153,6 +1140,7 @@
           <w:tag w:val="goog_rdk_10"/>
           <w:id w:val="-750579298"/>
         </w:sdtPr>
+        <w:sdtEndPr/>
         <w:sdtContent>
           <w:r>
             <w:rPr>
@@ -1223,6 +1211,7 @@
           <w:tag w:val="goog_rdk_16"/>
           <w:id w:val="-403298020"/>
         </w:sdtPr>
+        <w:sdtEndPr/>
         <w:sdtContent>
           <w:r>
             <w:rPr>
@@ -1735,7 +1724,79 @@
           <w:szCs w:val="22"/>
           <w:lang w:val="en-US" w:eastAsia="ca-ES"/>
         </w:rPr>
-        <w:t xml:space="preserve"> germination in conditions of low temperature, constant temperatures and darkness. Exposed sites will </w:t>
+        <w:t xml:space="preserve"> germination in conditions of low temperature, constant temperatures and darkness</w:t>
+      </w:r>
+      <w:r>
+        <w:rPr>
+          <w:rFonts w:asciiTheme="minorHAnsi" w:eastAsiaTheme="minorHAnsi" w:hAnsiTheme="minorHAnsi" w:cstheme="minorBidi"/>
+          <w:color w:val="auto"/>
+          <w:sz w:val="22"/>
+          <w:szCs w:val="22"/>
+          <w:lang w:val="en-US" w:eastAsia="ca-ES"/>
+        </w:rPr>
+        <w:t xml:space="preserve"> </w:t>
+      </w:r>
+      <w:r>
+        <w:rPr>
+          <w:rFonts w:asciiTheme="minorHAnsi" w:eastAsiaTheme="minorHAnsi" w:hAnsiTheme="minorHAnsi" w:cstheme="minorBidi"/>
+          <w:color w:val="FF0000"/>
+          <w:sz w:val="22"/>
+          <w:szCs w:val="22"/>
+          <w:lang w:val="en-US" w:eastAsia="ca-ES"/>
+        </w:rPr>
+        <w:t xml:space="preserve">(we actually see the opposite </w:t>
+      </w:r>
+      <w:proofErr w:type="gramStart"/>
+      <w:r>
+        <w:rPr>
+          <w:rFonts w:asciiTheme="minorHAnsi" w:eastAsiaTheme="minorHAnsi" w:hAnsiTheme="minorHAnsi" w:cstheme="minorBidi"/>
+          <w:color w:val="FF0000"/>
+          <w:sz w:val="22"/>
+          <w:szCs w:val="22"/>
+          <w:lang w:val="en-US" w:eastAsia="ca-ES"/>
+        </w:rPr>
+        <w:t>trend</w:t>
+      </w:r>
+      <w:r>
+        <w:rPr>
+          <w:rFonts w:asciiTheme="minorHAnsi" w:eastAsiaTheme="minorHAnsi" w:hAnsiTheme="minorHAnsi" w:cstheme="minorBidi"/>
+          <w:color w:val="FF0000"/>
+          <w:sz w:val="22"/>
+          <w:szCs w:val="22"/>
+          <w:lang w:val="en-US" w:eastAsia="ca-ES"/>
+        </w:rPr>
+        <w:t>,</w:t>
+      </w:r>
+      <w:proofErr w:type="gramEnd"/>
+      <w:r>
+        <w:rPr>
+          <w:rFonts w:asciiTheme="minorHAnsi" w:eastAsiaTheme="minorHAnsi" w:hAnsiTheme="minorHAnsi" w:cstheme="minorBidi"/>
+          <w:color w:val="FF0000"/>
+          <w:sz w:val="22"/>
+          <w:szCs w:val="22"/>
+          <w:lang w:val="en-US" w:eastAsia="ca-ES"/>
+        </w:rPr>
+        <w:t xml:space="preserve"> sites with prolonged snow cover have worse germination in darkness, water stress and constant temperatures</w:t>
+      </w:r>
+      <w:r>
+        <w:rPr>
+          <w:rFonts w:asciiTheme="minorHAnsi" w:eastAsiaTheme="minorHAnsi" w:hAnsiTheme="minorHAnsi" w:cstheme="minorBidi"/>
+          <w:color w:val="FF0000"/>
+          <w:sz w:val="22"/>
+          <w:szCs w:val="22"/>
+          <w:lang w:val="en-US" w:eastAsia="ca-ES"/>
+        </w:rPr>
+        <w:t>)</w:t>
+      </w:r>
+      <w:r>
+        <w:rPr>
+          <w:rFonts w:asciiTheme="minorHAnsi" w:eastAsiaTheme="minorHAnsi" w:hAnsiTheme="minorHAnsi" w:cstheme="minorBidi"/>
+          <w:color w:val="auto"/>
+          <w:sz w:val="22"/>
+          <w:szCs w:val="22"/>
+          <w:lang w:val="en-US" w:eastAsia="ca-ES"/>
+        </w:rPr>
+        <w:t xml:space="preserve">. Exposed sites will </w:t>
       </w:r>
       <w:proofErr w:type="spellStart"/>
       <w:r>
@@ -2085,12 +2146,19 @@
         <w:rPr>
           <w:rFonts w:cstheme="minorHAnsi"/>
         </w:rPr>
-        <w:t>study communities one from each macroclimatic region</w:t>
+        <w:t xml:space="preserve">study communities one </w:t>
       </w:r>
       <w:r>
         <w:rPr>
           <w:rFonts w:cstheme="minorHAnsi"/>
         </w:rPr>
+        <w:lastRenderedPageBreak/>
+        <w:t>from each macroclimatic region</w:t>
+      </w:r>
+      <w:r>
+        <w:rPr>
+          <w:rFonts w:cstheme="minorHAnsi"/>
+        </w:rPr>
         <w:t xml:space="preserve"> to act as replicates</w:t>
       </w:r>
       <w:r>
@@ -2159,7 +2227,6 @@
         <w:rPr>
           <w:rFonts w:cstheme="minorHAnsi"/>
         </w:rPr>
-        <w:lastRenderedPageBreak/>
         <w:t>and (2) calcareous grasslands in</w:t>
       </w:r>
       <w:r>
@@ -3808,6 +3875,7 @@
                 <w:szCs w:val="18"/>
                 <w:lang w:val="en-US" w:eastAsia="es-ES"/>
               </w:rPr>
+              <w:lastRenderedPageBreak/>
               <w:t xml:space="preserve">Dominant species </w:t>
             </w:r>
           </w:p>
@@ -4708,7 +4776,7 @@
                     </pic:cNvPicPr>
                   </pic:nvPicPr>
                   <pic:blipFill rotWithShape="1">
-                    <a:blip r:embed="rId13" cstate="print">
+                    <a:blip r:embed="rId14" cstate="print">
                       <a:extLst>
                         <a:ext uri="{28A0092B-C50C-407E-A947-70E740481C1C}">
                           <a14:useLocalDpi xmlns:a14="http://schemas.microsoft.com/office/drawing/2010/main" val="0"/>
@@ -4765,7 +4833,7 @@
                     </pic:cNvPicPr>
                   </pic:nvPicPr>
                   <pic:blipFill>
-                    <a:blip r:embed="rId14" cstate="print">
+                    <a:blip r:embed="rId15" cstate="print">
                       <a:extLst>
                         <a:ext uri="{28A0092B-C50C-407E-A947-70E740481C1C}">
                           <a14:useLocalDpi xmlns:a14="http://schemas.microsoft.com/office/drawing/2010/main" val="0"/>
@@ -4898,11 +4966,11 @@
       </w:r>
       <w:proofErr w:type="spellEnd"/>
       <w:r>
-        <w:t xml:space="preserve">, 2017) and four variables with a relevant function in alpine topographic gradients, including also elevation as another potentially important variable, that might captures other gradient no directly explained by our other bioclimatic indices. We focused </w:t>
+        <w:t xml:space="preserve">, 2017) and four variables with a relevant function in alpine </w:t>
       </w:r>
       <w:r>
         <w:lastRenderedPageBreak/>
-        <w:t xml:space="preserve">on annual mean temperature (bio1), mean diurnal range (bio2), temperature annual range (bio7), number of days with snow cover (Snow), freezing </w:t>
+        <w:t xml:space="preserve">topographic gradients, including also elevation as another potentially important variable, that might captures other gradient no directly explained by our other bioclimatic indices. We focused on annual mean temperature (bio1), mean diurnal range (bio2), temperature annual range (bio7), number of days with snow cover (Snow), freezing </w:t>
       </w:r>
       <w:proofErr w:type="gramStart"/>
       <w:r>
@@ -5297,8 +5365,8 @@
             <v:path o:extrusionok="f" gradientshapeok="t" o:connecttype="rect"/>
             <o:lock v:ext="edit" aspectratio="t"/>
           </v:shapetype>
-          <v:shape id="_x0000_i1026" type="#_x0000_t75" style="width:425pt;height:186.45pt">
-            <v:imagedata r:id="rId15" o:title="Bioclimatic indices PCA"/>
+          <v:shape id="_x0000_i1025" type="#_x0000_t75" style="width:425pt;height:185.9pt">
+            <v:imagedata r:id="rId16" o:title="Bioclimatic indices PCA"/>
           </v:shape>
         </w:pict>
       </w:r>
@@ -5316,6 +5384,7 @@
           <w:rFonts w:eastAsia="Times New Roman"/>
           <w:lang w:eastAsia="ca-ES"/>
         </w:rPr>
+        <w:lastRenderedPageBreak/>
         <w:t>2.</w:t>
       </w:r>
       <w:r>
@@ -5480,16 +5549,7 @@
           <w:color w:val="000000"/>
           <w:lang w:eastAsia="ca-ES"/>
         </w:rPr>
-        <w:t xml:space="preserve"> </w:t>
-      </w:r>
-      <w:r>
-        <w:rPr>
-          <w:rFonts w:eastAsia="Times New Roman" w:cstheme="minorHAnsi"/>
-          <w:color w:val="000000"/>
-          <w:lang w:eastAsia="ca-ES"/>
-        </w:rPr>
-        <w:lastRenderedPageBreak/>
-        <w:t xml:space="preserve">species in the Mediterranean </w:t>
+        <w:t xml:space="preserve"> species in the Mediterranean </w:t>
       </w:r>
       <w:r>
         <w:rPr>
@@ -6710,6 +6770,7 @@
           <w:color w:val="000000"/>
           <w:lang w:eastAsia="ca-ES"/>
         </w:rPr>
+        <w:lastRenderedPageBreak/>
         <w:t>(referred to as “</w:t>
       </w:r>
       <w:r>
@@ -6750,7 +6811,1082 @@
           <w:color w:val="000000"/>
           <w:lang w:eastAsia="ca-ES"/>
         </w:rPr>
-        <w:t xml:space="preserve">alternating temperatures and constant darkness (referred to as “Darkness”), (3) alternating temperature, water stress and 12h photoperiod (referred to as </w:t>
+        <w:t xml:space="preserve">alternating temperatures and constant darkness (referred to as “Darkness”), (3) alternating temperature, water stress and 12h photoperiod (referred to as “Water stress”) and (4) </w:t>
+      </w:r>
+      <w:r>
+        <w:rPr>
+          <w:rFonts w:eastAsia="Times New Roman" w:cstheme="minorHAnsi"/>
+          <w:color w:val="000000"/>
+          <w:lang w:eastAsia="ca-ES"/>
+        </w:rPr>
+        <w:t xml:space="preserve">constant temperatures and </w:t>
+      </w:r>
+      <w:r>
+        <w:rPr>
+          <w:rFonts w:eastAsia="Times New Roman" w:cstheme="minorHAnsi"/>
+          <w:color w:val="000000"/>
+          <w:lang w:eastAsia="ca-ES"/>
+        </w:rPr>
+        <w:t xml:space="preserve">12h photoperiod </w:t>
+      </w:r>
+      <w:r>
+        <w:rPr>
+          <w:rFonts w:eastAsia="Times New Roman" w:cstheme="minorHAnsi"/>
+          <w:color w:val="000000"/>
+          <w:lang w:eastAsia="ca-ES"/>
+        </w:rPr>
+        <w:t>(referred to as “</w:t>
+      </w:r>
+      <w:r>
+        <w:rPr>
+          <w:rFonts w:eastAsia="Times New Roman" w:cstheme="minorHAnsi"/>
+          <w:color w:val="000000"/>
+          <w:lang w:eastAsia="ca-ES"/>
+        </w:rPr>
+        <w:t>Constant Temperature</w:t>
+      </w:r>
+      <w:r>
+        <w:rPr>
+          <w:rFonts w:eastAsia="Times New Roman" w:cstheme="minorHAnsi"/>
+          <w:color w:val="000000"/>
+          <w:lang w:eastAsia="ca-ES"/>
+        </w:rPr>
+        <w:t>”</w:t>
+      </w:r>
+      <w:r>
+        <w:rPr>
+          <w:rFonts w:eastAsia="Times New Roman" w:cstheme="minorHAnsi"/>
+          <w:color w:val="000000"/>
+          <w:lang w:eastAsia="ca-ES"/>
+        </w:rPr>
+        <w:t>)</w:t>
+      </w:r>
+      <w:r>
+        <w:rPr>
+          <w:rFonts w:eastAsia="Times New Roman" w:cstheme="minorHAnsi"/>
+          <w:color w:val="000000"/>
+          <w:lang w:eastAsia="ca-ES"/>
+        </w:rPr>
+        <w:t>.</w:t>
+      </w:r>
+      <w:r>
+        <w:rPr>
+          <w:rFonts w:eastAsia="Times New Roman" w:cstheme="minorHAnsi"/>
+          <w:color w:val="000000"/>
+          <w:lang w:eastAsia="ca-ES"/>
+        </w:rPr>
+        <w:t xml:space="preserve"> </w:t>
+      </w:r>
+      <w:r>
+        <w:rPr>
+          <w:rFonts w:eastAsia="Times New Roman" w:cstheme="minorHAnsi"/>
+          <w:color w:val="000000"/>
+          <w:lang w:eastAsia="ca-ES"/>
+        </w:rPr>
+        <w:t>Pre</w:t>
+      </w:r>
+      <w:r>
+        <w:rPr>
+          <w:rFonts w:eastAsia="Times New Roman" w:cstheme="minorHAnsi"/>
+          <w:color w:val="000000"/>
+          <w:lang w:eastAsia="ca-ES"/>
+        </w:rPr>
+        <w:t>ceding</w:t>
+      </w:r>
+      <w:r>
+        <w:rPr>
+          <w:rFonts w:eastAsia="Times New Roman" w:cstheme="minorHAnsi"/>
+          <w:color w:val="000000"/>
+          <w:lang w:eastAsia="ca-ES"/>
+        </w:rPr>
+        <w:t xml:space="preserve"> </w:t>
+      </w:r>
+      <w:r>
+        <w:rPr>
+          <w:rFonts w:eastAsia="Times New Roman" w:cstheme="minorHAnsi"/>
+          <w:color w:val="000000"/>
+          <w:lang w:eastAsia="ca-ES"/>
+        </w:rPr>
+        <w:t xml:space="preserve">germination research </w:t>
+      </w:r>
+      <w:r>
+        <w:rPr>
+          <w:rFonts w:eastAsia="Times New Roman" w:cstheme="minorHAnsi"/>
+          <w:color w:val="000000"/>
+          <w:lang w:eastAsia="ca-ES"/>
+        </w:rPr>
+        <w:t xml:space="preserve">by </w:t>
+      </w:r>
+      <w:r>
+        <w:rPr>
+          <w:rFonts w:eastAsia="Times New Roman" w:cstheme="minorHAnsi"/>
+          <w:color w:val="000000"/>
+          <w:highlight w:val="yellow"/>
+          <w:lang w:eastAsia="ca-ES"/>
+        </w:rPr>
+        <w:t xml:space="preserve">Espinosa </w:t>
+      </w:r>
+      <w:proofErr w:type="gramStart"/>
+      <w:r>
+        <w:rPr>
+          <w:rFonts w:eastAsia="Times New Roman" w:cstheme="minorHAnsi"/>
+          <w:color w:val="000000"/>
+          <w:highlight w:val="yellow"/>
+          <w:lang w:eastAsia="ca-ES"/>
+        </w:rPr>
+        <w:t>del</w:t>
+      </w:r>
+      <w:proofErr w:type="gramEnd"/>
+      <w:r>
+        <w:rPr>
+          <w:rFonts w:eastAsia="Times New Roman" w:cstheme="minorHAnsi"/>
+          <w:color w:val="000000"/>
+          <w:highlight w:val="yellow"/>
+          <w:lang w:eastAsia="ca-ES"/>
+        </w:rPr>
+        <w:t xml:space="preserve"> Alba et al. 2025</w:t>
+      </w:r>
+      <w:r>
+        <w:rPr>
+          <w:rFonts w:eastAsia="Times New Roman" w:cstheme="minorHAnsi"/>
+          <w:color w:val="000000"/>
+          <w:lang w:eastAsia="ca-ES"/>
+        </w:rPr>
+        <w:t xml:space="preserve"> found </w:t>
+      </w:r>
+      <w:r>
+        <w:rPr>
+          <w:rFonts w:eastAsia="Times New Roman" w:cstheme="minorHAnsi"/>
+          <w:color w:val="000000"/>
+          <w:lang w:eastAsia="ca-ES"/>
+        </w:rPr>
+        <w:t xml:space="preserve">that </w:t>
+      </w:r>
+      <w:r>
+        <w:rPr>
+          <w:rFonts w:eastAsia="Times New Roman" w:cstheme="minorHAnsi"/>
+          <w:color w:val="000000"/>
+          <w:lang w:eastAsia="ca-ES"/>
+        </w:rPr>
+        <w:t>a similar set of</w:t>
+      </w:r>
+      <w:r>
+        <w:rPr>
+          <w:rFonts w:eastAsia="Times New Roman" w:cstheme="minorHAnsi"/>
+          <w:color w:val="000000"/>
+          <w:lang w:eastAsia="ca-ES"/>
+        </w:rPr>
+        <w:t xml:space="preserve"> </w:t>
+      </w:r>
+      <w:r>
+        <w:rPr>
+          <w:rFonts w:eastAsia="Times New Roman" w:cstheme="minorHAnsi"/>
+          <w:color w:val="000000"/>
+          <w:lang w:eastAsia="ca-ES"/>
+        </w:rPr>
+        <w:t xml:space="preserve">species </w:t>
+      </w:r>
+      <w:r>
+        <w:rPr>
+          <w:rFonts w:eastAsia="Times New Roman" w:cstheme="minorHAnsi"/>
+          <w:color w:val="000000"/>
+          <w:lang w:eastAsia="ca-ES"/>
+        </w:rPr>
+        <w:t>had</w:t>
+      </w:r>
+      <w:r>
+        <w:rPr>
+          <w:rFonts w:eastAsia="Times New Roman" w:cstheme="minorHAnsi"/>
+          <w:color w:val="000000"/>
+          <w:lang w:eastAsia="ca-ES"/>
+        </w:rPr>
+        <w:t xml:space="preserve"> two </w:t>
+      </w:r>
+      <w:r>
+        <w:rPr>
+          <w:rFonts w:eastAsia="Times New Roman" w:cstheme="minorHAnsi"/>
+          <w:color w:val="000000"/>
+          <w:lang w:eastAsia="ca-ES"/>
+        </w:rPr>
+        <w:t xml:space="preserve">differential </w:t>
+      </w:r>
+      <w:r>
+        <w:rPr>
+          <w:rFonts w:eastAsia="Times New Roman" w:cstheme="minorHAnsi"/>
+          <w:color w:val="000000"/>
+          <w:lang w:eastAsia="ca-ES"/>
+        </w:rPr>
+        <w:t xml:space="preserve">optimal </w:t>
+      </w:r>
+      <w:r>
+        <w:rPr>
+          <w:rFonts w:eastAsia="Times New Roman" w:cstheme="minorHAnsi"/>
+          <w:color w:val="000000"/>
+          <w:lang w:eastAsia="ca-ES"/>
+        </w:rPr>
+        <w:t xml:space="preserve">germination </w:t>
+      </w:r>
+      <w:r>
+        <w:rPr>
+          <w:rFonts w:eastAsia="Times New Roman" w:cstheme="minorHAnsi"/>
+          <w:color w:val="000000"/>
+          <w:lang w:eastAsia="ca-ES"/>
+        </w:rPr>
+        <w:t>temperatures</w:t>
+      </w:r>
+      <w:r>
+        <w:rPr>
+          <w:rFonts w:eastAsia="Times New Roman" w:cstheme="minorHAnsi"/>
+          <w:color w:val="000000"/>
+          <w:lang w:eastAsia="ca-ES"/>
+        </w:rPr>
+        <w:t xml:space="preserve">: </w:t>
+      </w:r>
+      <w:r>
+        <w:rPr>
+          <w:rFonts w:eastAsia="Times New Roman" w:cstheme="minorHAnsi"/>
+          <w:color w:val="000000"/>
+          <w:lang w:eastAsia="ca-ES"/>
+        </w:rPr>
+        <w:t xml:space="preserve">some with </w:t>
+      </w:r>
+      <w:r>
+        <w:rPr>
+          <w:rFonts w:eastAsia="Times New Roman" w:cstheme="minorHAnsi"/>
+          <w:color w:val="000000"/>
+          <w:lang w:eastAsia="ca-ES"/>
+        </w:rPr>
+        <w:t>cold</w:t>
+      </w:r>
+      <w:r>
+        <w:rPr>
+          <w:rFonts w:eastAsia="Times New Roman" w:cstheme="minorHAnsi"/>
+          <w:color w:val="000000"/>
+          <w:lang w:eastAsia="ca-ES"/>
+        </w:rPr>
+        <w:t xml:space="preserve"> </w:t>
+      </w:r>
+      <w:r>
+        <w:rPr>
+          <w:rFonts w:eastAsia="Times New Roman" w:cstheme="minorHAnsi"/>
+          <w:color w:val="000000"/>
+          <w:lang w:eastAsia="ca-ES"/>
+        </w:rPr>
+        <w:t>preference while other preferred</w:t>
+      </w:r>
+      <w:r>
+        <w:rPr>
+          <w:rFonts w:eastAsia="Times New Roman" w:cstheme="minorHAnsi"/>
+          <w:color w:val="000000"/>
+          <w:lang w:eastAsia="ca-ES"/>
+        </w:rPr>
+        <w:t xml:space="preserve"> warm</w:t>
+      </w:r>
+      <w:r>
+        <w:rPr>
+          <w:rFonts w:eastAsia="Times New Roman" w:cstheme="minorHAnsi"/>
+          <w:color w:val="000000"/>
+          <w:lang w:eastAsia="ca-ES"/>
+        </w:rPr>
+        <w:t xml:space="preserve"> </w:t>
+      </w:r>
+      <w:r>
+        <w:rPr>
+          <w:rFonts w:eastAsia="Times New Roman" w:cstheme="minorHAnsi"/>
+          <w:color w:val="000000"/>
+          <w:lang w:eastAsia="ca-ES"/>
+        </w:rPr>
+        <w:t>temperatures</w:t>
+      </w:r>
+      <w:r>
+        <w:rPr>
+          <w:rFonts w:eastAsia="Times New Roman" w:cstheme="minorHAnsi"/>
+          <w:color w:val="000000"/>
+          <w:lang w:eastAsia="ca-ES"/>
+        </w:rPr>
+        <w:t xml:space="preserve">. </w:t>
+      </w:r>
+      <w:r>
+        <w:rPr>
+          <w:rFonts w:eastAsia="Times New Roman" w:cstheme="minorHAnsi"/>
+          <w:color w:val="000000"/>
+          <w:lang w:eastAsia="ca-ES"/>
+        </w:rPr>
+        <w:t>Consequently, we subdivided the species into</w:t>
+      </w:r>
+      <w:r>
+        <w:rPr>
+          <w:rFonts w:eastAsia="Times New Roman" w:cstheme="minorHAnsi"/>
+          <w:color w:val="000000"/>
+          <w:lang w:eastAsia="ca-ES"/>
+        </w:rPr>
+        <w:t xml:space="preserve"> two temperature regimes</w:t>
+      </w:r>
+      <w:r>
+        <w:rPr>
+          <w:rFonts w:eastAsia="Times New Roman" w:cstheme="minorHAnsi"/>
+          <w:color w:val="000000"/>
+          <w:lang w:eastAsia="ca-ES"/>
+        </w:rPr>
+        <w:t xml:space="preserve"> </w:t>
+      </w:r>
+      <w:r>
+        <w:rPr>
+          <w:rFonts w:eastAsia="Times New Roman" w:cstheme="minorHAnsi"/>
+          <w:color w:val="000000"/>
+          <w:lang w:eastAsia="ca-ES"/>
+        </w:rPr>
+        <w:t xml:space="preserve">and </w:t>
+      </w:r>
+      <w:r>
+        <w:rPr>
+          <w:rFonts w:eastAsia="Times New Roman" w:cstheme="minorHAnsi"/>
+          <w:color w:val="000000"/>
+          <w:lang w:eastAsia="ca-ES"/>
+        </w:rPr>
+        <w:t>programmed</w:t>
+      </w:r>
+      <w:r>
+        <w:rPr>
+          <w:rFonts w:eastAsia="Times New Roman" w:cstheme="minorHAnsi"/>
+          <w:color w:val="000000"/>
+          <w:lang w:eastAsia="ca-ES"/>
+        </w:rPr>
+        <w:t xml:space="preserve"> in </w:t>
+      </w:r>
+      <w:r>
+        <w:rPr>
+          <w:rFonts w:eastAsia="Times New Roman" w:cstheme="minorHAnsi"/>
+          <w:color w:val="000000"/>
+          <w:lang w:eastAsia="ca-ES"/>
+        </w:rPr>
+        <w:t>four</w:t>
+      </w:r>
+      <w:r>
+        <w:rPr>
+          <w:rFonts w:eastAsia="Times New Roman" w:cstheme="minorHAnsi"/>
+          <w:color w:val="000000"/>
+          <w:lang w:eastAsia="ca-ES"/>
+        </w:rPr>
+        <w:t xml:space="preserve"> </w:t>
+      </w:r>
+      <w:r>
+        <w:rPr>
+          <w:rFonts w:eastAsia="Times New Roman" w:cstheme="minorHAnsi"/>
+          <w:color w:val="000000"/>
+          <w:lang w:eastAsia="ca-ES"/>
+        </w:rPr>
+        <w:t>different</w:t>
+      </w:r>
+      <w:r>
+        <w:rPr>
+          <w:rFonts w:eastAsia="Times New Roman" w:cstheme="minorHAnsi"/>
+          <w:color w:val="000000"/>
+          <w:lang w:eastAsia="ca-ES"/>
+        </w:rPr>
+        <w:t xml:space="preserve"> climatic</w:t>
+      </w:r>
+      <w:r>
+        <w:rPr>
+          <w:rFonts w:eastAsia="Times New Roman" w:cstheme="minorHAnsi"/>
+          <w:color w:val="000000"/>
+          <w:lang w:eastAsia="ca-ES"/>
+        </w:rPr>
+        <w:t xml:space="preserve"> chambers</w:t>
+      </w:r>
+      <w:r>
+        <w:rPr>
+          <w:rFonts w:eastAsia="Times New Roman" w:cstheme="minorHAnsi"/>
+          <w:color w:val="000000"/>
+          <w:lang w:eastAsia="ca-ES"/>
+        </w:rPr>
+        <w:t xml:space="preserve"> </w:t>
+      </w:r>
+      <w:r>
+        <w:rPr>
+          <w:rFonts w:eastAsia="Times New Roman" w:cstheme="minorHAnsi"/>
+          <w:color w:val="000000"/>
+          <w:lang w:eastAsia="ca-ES"/>
+        </w:rPr>
+        <w:t>i.e. there</w:t>
+      </w:r>
+      <w:r>
+        <w:rPr>
+          <w:rFonts w:eastAsia="Times New Roman" w:cstheme="minorHAnsi"/>
+          <w:color w:val="000000"/>
+          <w:lang w:eastAsia="ca-ES"/>
+        </w:rPr>
+        <w:t xml:space="preserve"> were</w:t>
+      </w:r>
+      <w:r>
+        <w:rPr>
+          <w:rFonts w:eastAsia="Times New Roman" w:cstheme="minorHAnsi"/>
+          <w:color w:val="000000"/>
+          <w:lang w:eastAsia="ca-ES"/>
+        </w:rPr>
+        <w:t xml:space="preserve"> two constant</w:t>
+      </w:r>
+      <w:r>
+        <w:rPr>
+          <w:rFonts w:eastAsia="Times New Roman" w:cstheme="minorHAnsi"/>
+          <w:color w:val="000000"/>
+          <w:lang w:eastAsia="ca-ES"/>
+        </w:rPr>
+        <w:t xml:space="preserve"> (10</w:t>
+      </w:r>
+      <w:r>
+        <w:rPr>
+          <w:rFonts w:eastAsia="Times New Roman" w:cstheme="minorHAnsi"/>
+          <w:color w:val="000000"/>
+          <w:lang w:eastAsia="ca-ES"/>
+        </w:rPr>
+        <w:t>ºC</w:t>
+      </w:r>
+      <w:r>
+        <w:rPr>
+          <w:rFonts w:eastAsia="Times New Roman" w:cstheme="minorHAnsi"/>
+          <w:color w:val="000000"/>
+          <w:lang w:eastAsia="ca-ES"/>
+        </w:rPr>
+        <w:t xml:space="preserve"> vs 17 ºC)</w:t>
+      </w:r>
+      <w:r>
+        <w:rPr>
+          <w:rFonts w:eastAsia="Times New Roman" w:cstheme="minorHAnsi"/>
+          <w:color w:val="000000"/>
+          <w:lang w:eastAsia="ca-ES"/>
+        </w:rPr>
+        <w:t xml:space="preserve"> and two alternating temperature regimes</w:t>
+      </w:r>
+      <w:r>
+        <w:rPr>
+          <w:rFonts w:eastAsia="Times New Roman" w:cstheme="minorHAnsi"/>
+          <w:color w:val="000000"/>
+          <w:lang w:eastAsia="ca-ES"/>
+        </w:rPr>
+        <w:t>(15 - 5 ºC vs (22 - 12ºC)</w:t>
+      </w:r>
+      <w:r>
+        <w:rPr>
+          <w:rFonts w:eastAsia="Times New Roman" w:cstheme="minorHAnsi"/>
+          <w:color w:val="000000"/>
+          <w:lang w:eastAsia="ca-ES"/>
+        </w:rPr>
+        <w:t>.</w:t>
+      </w:r>
+      <w:r>
+        <w:rPr>
+          <w:rFonts w:eastAsia="Times New Roman" w:cstheme="minorHAnsi"/>
+          <w:color w:val="000000"/>
+          <w:lang w:eastAsia="ca-ES"/>
+        </w:rPr>
+        <w:t xml:space="preserve"> </w:t>
+      </w:r>
+      <w:r>
+        <w:rPr>
+          <w:rFonts w:eastAsia="Times New Roman" w:cstheme="minorHAnsi"/>
+          <w:color w:val="000000"/>
+          <w:lang w:eastAsia="ca-ES"/>
+        </w:rPr>
+        <w:t xml:space="preserve">Once the </w:t>
+      </w:r>
+      <w:proofErr w:type="spellStart"/>
+      <w:r>
+        <w:rPr>
+          <w:rFonts w:eastAsia="Times New Roman" w:cstheme="minorHAnsi"/>
+          <w:color w:val="000000"/>
+          <w:lang w:eastAsia="ca-ES"/>
+        </w:rPr>
+        <w:t>pretreatment</w:t>
+      </w:r>
+      <w:proofErr w:type="spellEnd"/>
+      <w:r>
+        <w:rPr>
+          <w:rFonts w:eastAsia="Times New Roman" w:cstheme="minorHAnsi"/>
+          <w:color w:val="000000"/>
+          <w:lang w:eastAsia="ca-ES"/>
+        </w:rPr>
+        <w:t xml:space="preserve"> ended</w:t>
+      </w:r>
+      <w:r>
+        <w:rPr>
+          <w:rFonts w:eastAsia="Times New Roman" w:cstheme="minorHAnsi"/>
+          <w:color w:val="000000"/>
+          <w:lang w:eastAsia="ca-ES"/>
+        </w:rPr>
+        <w:t xml:space="preserve">, </w:t>
+      </w:r>
+      <w:r>
+        <w:rPr>
+          <w:rFonts w:eastAsia="Times New Roman" w:cstheme="minorHAnsi"/>
+          <w:color w:val="000000"/>
+          <w:lang w:eastAsia="ca-ES"/>
+        </w:rPr>
+        <w:t>n</w:t>
+      </w:r>
+      <w:r>
+        <w:rPr>
+          <w:rFonts w:eastAsia="Times New Roman" w:cstheme="minorHAnsi"/>
+          <w:color w:val="000000"/>
+          <w:lang w:eastAsia="ca-ES"/>
+        </w:rPr>
+        <w:t xml:space="preserve">on-germinated </w:t>
+      </w:r>
+      <w:r>
+        <w:rPr>
+          <w:rFonts w:eastAsia="Times New Roman" w:cstheme="minorHAnsi"/>
+          <w:color w:val="000000"/>
+          <w:lang w:eastAsia="ca-ES"/>
+        </w:rPr>
+        <w:t>seed</w:t>
+      </w:r>
+      <w:r>
+        <w:rPr>
+          <w:rFonts w:eastAsia="Times New Roman" w:cstheme="minorHAnsi"/>
+          <w:color w:val="000000"/>
+          <w:lang w:eastAsia="ca-ES"/>
+        </w:rPr>
+        <w:t>s</w:t>
+      </w:r>
+      <w:r>
+        <w:rPr>
+          <w:rFonts w:eastAsia="Times New Roman" w:cstheme="minorHAnsi"/>
+          <w:color w:val="000000"/>
+          <w:lang w:eastAsia="ca-ES"/>
+        </w:rPr>
+        <w:t xml:space="preserve"> </w:t>
+      </w:r>
+      <w:proofErr w:type="gramStart"/>
+      <w:r>
+        <w:rPr>
+          <w:rFonts w:eastAsia="Times New Roman" w:cstheme="minorHAnsi"/>
+          <w:color w:val="000000"/>
+          <w:lang w:eastAsia="ca-ES"/>
+        </w:rPr>
+        <w:t>were</w:t>
+      </w:r>
+      <w:r>
+        <w:rPr>
+          <w:rFonts w:eastAsia="Times New Roman" w:cstheme="minorHAnsi"/>
+          <w:color w:val="000000"/>
+          <w:lang w:eastAsia="ca-ES"/>
+        </w:rPr>
+        <w:t xml:space="preserve"> transferred to </w:t>
+      </w:r>
+      <w:r>
+        <w:rPr>
+          <w:rFonts w:eastAsia="Times New Roman" w:cstheme="minorHAnsi"/>
+          <w:color w:val="000000"/>
+          <w:lang w:eastAsia="ca-ES"/>
+        </w:rPr>
+        <w:t xml:space="preserve">new </w:t>
+      </w:r>
+      <w:r>
+        <w:t>90 mm Ø Petri dishes with two layers of filter paper (</w:t>
+      </w:r>
+      <w:proofErr w:type="spellStart"/>
+      <w:r>
+        <w:rPr>
+          <w:rFonts w:eastAsia="Times New Roman" w:cstheme="minorHAnsi"/>
+          <w:color w:val="000000"/>
+          <w:lang w:eastAsia="ca-ES"/>
+        </w:rPr>
+        <w:t>Filtros</w:t>
+      </w:r>
+      <w:proofErr w:type="spellEnd"/>
+      <w:r>
+        <w:rPr>
+          <w:rFonts w:eastAsia="Times New Roman" w:cstheme="minorHAnsi"/>
+          <w:color w:val="000000"/>
+          <w:lang w:eastAsia="ca-ES"/>
+        </w:rPr>
+        <w:t xml:space="preserve"> </w:t>
+      </w:r>
+      <w:proofErr w:type="spellStart"/>
+      <w:r>
+        <w:rPr>
+          <w:rFonts w:eastAsia="Times New Roman" w:cstheme="minorHAnsi"/>
+          <w:color w:val="000000"/>
+          <w:lang w:eastAsia="ca-ES"/>
+        </w:rPr>
+        <w:t>Anoia</w:t>
+      </w:r>
+      <w:proofErr w:type="spellEnd"/>
+      <w:r>
+        <w:rPr>
+          <w:rFonts w:eastAsia="Times New Roman" w:cstheme="minorHAnsi"/>
+          <w:color w:val="000000"/>
+          <w:lang w:eastAsia="ca-ES"/>
+        </w:rPr>
+        <w:t xml:space="preserve"> S.A. paper for germination assays, Ref.518G085</w:t>
+      </w:r>
+      <w:r>
+        <w:t>)</w:t>
+      </w:r>
+      <w:r>
+        <w:t xml:space="preserve"> and sealed with </w:t>
+      </w:r>
+      <w:proofErr w:type="spellStart"/>
+      <w:r>
+        <w:t>parafilm</w:t>
+      </w:r>
+      <w:proofErr w:type="spellEnd"/>
+      <w:proofErr w:type="gramEnd"/>
+      <w:r>
+        <w:t>.</w:t>
+      </w:r>
+      <w:r>
+        <w:t xml:space="preserve"> </w:t>
+      </w:r>
+      <w:r>
+        <w:t xml:space="preserve">Firstly, </w:t>
+      </w:r>
+      <w:r>
+        <w:t xml:space="preserve">we transferred </w:t>
+      </w:r>
+      <w:r>
+        <w:t xml:space="preserve">the </w:t>
+      </w:r>
+      <w:r>
+        <w:t>seed</w:t>
+      </w:r>
+      <w:r>
+        <w:t>s</w:t>
+      </w:r>
+      <w:r>
+        <w:t xml:space="preserve"> for </w:t>
+      </w:r>
+      <w:r>
+        <w:t>Darkness</w:t>
+      </w:r>
+      <w:r>
+        <w:t xml:space="preserve"> treatment, </w:t>
+      </w:r>
+      <w:r>
+        <w:t xml:space="preserve">added 6ml of distilled water, sealed with </w:t>
+      </w:r>
+      <w:proofErr w:type="spellStart"/>
+      <w:r>
+        <w:t>parafilm</w:t>
+      </w:r>
+      <w:proofErr w:type="spellEnd"/>
+      <w:r>
+        <w:t xml:space="preserve"> </w:t>
+      </w:r>
+      <w:r>
+        <w:t xml:space="preserve">and </w:t>
+      </w:r>
+      <w:r>
+        <w:t>immediately</w:t>
+      </w:r>
+      <w:r>
+        <w:t xml:space="preserve"> cover them with two layers aluminium foil</w:t>
+      </w:r>
+      <w:r>
+        <w:t xml:space="preserve">. </w:t>
+      </w:r>
+      <w:r>
+        <w:t xml:space="preserve">Next, we transfer the seeds for the </w:t>
+      </w:r>
+      <w:r>
+        <w:t>Water stress</w:t>
+      </w:r>
+      <w:r>
+        <w:t xml:space="preserve"> </w:t>
+      </w:r>
+      <w:r>
+        <w:t>treatme</w:t>
+      </w:r>
+      <w:r>
+        <w:t>nt</w:t>
+      </w:r>
+      <w:r>
+        <w:t xml:space="preserve">, where instead of distilled water we added 6ml of </w:t>
+      </w:r>
+      <w:r>
+        <w:t>a polyethylene solution (PEG</w:t>
+      </w:r>
+      <w:r>
+        <w:t xml:space="preserve"> 6000</w:t>
+      </w:r>
+      <w:r>
+        <w:t xml:space="preserve">) </w:t>
+      </w:r>
+      <w:r>
+        <w:t xml:space="preserve">to simulate a -0.6 </w:t>
+      </w:r>
+      <w:proofErr w:type="spellStart"/>
+      <w:r>
+        <w:t>Mpa</w:t>
+      </w:r>
+      <w:proofErr w:type="spellEnd"/>
+      <w:r>
+        <w:t xml:space="preserve"> of water potential</w:t>
+      </w:r>
+      <w:r>
+        <w:t xml:space="preserve"> and sealed with </w:t>
+      </w:r>
+      <w:proofErr w:type="spellStart"/>
+      <w:r>
+        <w:t>parafilm</w:t>
+      </w:r>
+      <w:proofErr w:type="spellEnd"/>
+      <w:r>
+        <w:t xml:space="preserve">. </w:t>
+      </w:r>
+      <w:r>
+        <w:t xml:space="preserve">As </w:t>
+      </w:r>
+      <w:r>
+        <w:t>PEG solutions depend on experimental temperatures, t</w:t>
+      </w:r>
+      <w:r>
+        <w:t xml:space="preserve">wo </w:t>
+      </w:r>
+      <w:r>
+        <w:t xml:space="preserve">PEG solutions </w:t>
+      </w:r>
+      <w:r>
+        <w:t xml:space="preserve">were prepared </w:t>
+      </w:r>
+      <w:r>
+        <w:t xml:space="preserve">according to </w:t>
+      </w:r>
+      <w:r>
+        <w:fldChar w:fldCharType="begin" w:fldLock="1"/>
+      </w:r>
+      <w:r>
+        <w:instrText>ADDIN CSL_CITATION {"citationItems":[{"id":"ITEM-1","itemData":{"author":[{"dropping-particle":"","family":"Michel","given":"Burlyn E","non-dropping-particle":"","parse-names":false,"suffix":""},{"dropping-particle":"","family":"Kaufmann","given":"Merrill R","non-dropping-particle":"","parse-names":false,"suffix":""}],"id":"ITEM-1","issued":{"date-parts":[["1973"]]},"page":"914-916","title":"The Osmotic Potential of Polyethylene Glycol 60001","type":"article-journal"},"uris":["http://www.mendeley.com/documents/?uuid=5dcd3d1a-bbf4-4c97-b53e-728b84b2c212","http://www.mendeley.com/documents/?uuid=8bae9792-5df1-46d8-a9f4-b2080aa2e458"]}],"mendeley":{"formattedCitation":"(Michel &amp; Kaufmann 1973)","manualFormatting":"Michel &amp; Kaufmann (1973)","plainTextFormattedCitation":"(Michel &amp; Kaufmann 1973)","previouslyFormattedCitation":"(Michel &amp; Kaufmann 1973)"},"properties":{"noteIndex":0},"schema":"https://github.com/citation-style-language/schema/raw/master/csl-citation.json"}</w:instrText>
+      </w:r>
+      <w:r>
+        <w:fldChar w:fldCharType="separate"/>
+      </w:r>
+      <w:r>
+        <w:rPr>
+          <w:noProof/>
+        </w:rPr>
+        <w:t>Michel &amp; Kaufmann (1973)</w:t>
+      </w:r>
+      <w:r>
+        <w:fldChar w:fldCharType="end"/>
+      </w:r>
+      <w:r>
+        <w:t xml:space="preserve"> and </w:t>
+      </w:r>
+      <w:r>
+        <w:fldChar w:fldCharType="begin" w:fldLock="1"/>
+      </w:r>
+      <w:r>
+        <w:instrText>ADDIN CSL_CITATION {"citationItems":[{"id":"ITEM-1","itemData":{"ISBN":"1678-3921","ISSN":"1678-3921","abstract":"Um expressivo número de pesquisas vem sendo desenvolvido na área de pré-condicionamento em sementes. Na busca de contribuir com os técnicos envolvidos em pes­quisas nesta área, procurou-se através da inter-relação entre a Termodinâmica e a Tecnologia de Sementes caracterizar potenciais hídrico, osmótico, mátrico e de pressão e, a partir do tra­balho de Michel &amp; Kaufmann (1973), construir uma tabela associando potencial osmótico, concentração de polietileno glicol 6000 e temperatura.","author":[{"dropping-particle":"","family":"Villela","given":"Francisco Amaral","non-dropping-particle":"","parse-names":false,"suffix":""},{"dropping-particle":"","family":"Doni Filho","given":"Luiz","non-dropping-particle":"","parse-names":false,"suffix":""},{"dropping-particle":"","family":"Sequeira","given":"Eliseo Lecrerc","non-dropping-particle":"","parse-names":false,"suffix":""}],"container-title":"Pesquisa Agropecuária Brasileira","id":"ITEM-1","issue":"11/12","issued":{"date-parts":[["1991"]]},"page":"1957-1968","title":"Tabela de potencial osmótico em função da concentração de polietileno glicol 6.000 e da temperatura","type":"article-journal","volume":"26"},"uris":["http://www.mendeley.com/documents/?uuid=309ba047-c4bd-4f3c-8de0-e44ba85df0c4"]}],"mendeley":{"formattedCitation":"(Villela et al. 1991)","manualFormatting":"Villela et al. (1991)","plainTextFormattedCitation":"(Villela et al. 1991)","previouslyFormattedCitation":"(Villela et al. 1991)"},"properties":{"noteIndex":0},"schema":"https://github.com/citation-style-language/schema/raw/master/csl-citation.json"}</w:instrText>
+      </w:r>
+      <w:r>
+        <w:fldChar w:fldCharType="separate"/>
+      </w:r>
+      <w:r>
+        <w:rPr>
+          <w:noProof/>
+        </w:rPr>
+        <w:t xml:space="preserve">Villela et al. </w:t>
+      </w:r>
+      <w:r>
+        <w:rPr>
+          <w:noProof/>
+        </w:rPr>
+        <w:t>(</w:t>
+      </w:r>
+      <w:r>
+        <w:rPr>
+          <w:noProof/>
+        </w:rPr>
+        <w:t>1991)</w:t>
+      </w:r>
+      <w:r>
+        <w:fldChar w:fldCharType="end"/>
+      </w:r>
+      <w:r>
+        <w:t xml:space="preserve"> to reach desired osmotic potentials at </w:t>
+      </w:r>
+      <w:r>
+        <w:t xml:space="preserve">10 ºC </w:t>
+      </w:r>
+      <w:r>
+        <w:t xml:space="preserve">and </w:t>
+      </w:r>
+      <w:r>
+        <w:t>17</w:t>
+      </w:r>
+      <w:r>
+        <w:t>ºC</w:t>
+      </w:r>
+      <w:r>
+        <w:t xml:space="preserve"> </w:t>
+      </w:r>
+      <w:r>
+        <w:t xml:space="preserve">depending on species optimal germination temperature. </w:t>
+      </w:r>
+      <w:r>
+        <w:t xml:space="preserve"> </w:t>
+      </w:r>
+      <w:r>
+        <w:t xml:space="preserve">Finally, </w:t>
+      </w:r>
+      <w:r>
+        <w:t>the rest of the seed</w:t>
+      </w:r>
+      <w:r>
+        <w:t>s</w:t>
+      </w:r>
+      <w:r>
+        <w:t xml:space="preserve"> </w:t>
+      </w:r>
+      <w:proofErr w:type="gramStart"/>
+      <w:r>
+        <w:t>were divided</w:t>
+      </w:r>
+      <w:proofErr w:type="gramEnd"/>
+      <w:r>
+        <w:t xml:space="preserve"> between </w:t>
+      </w:r>
+      <w:r>
+        <w:t>control</w:t>
+      </w:r>
+      <w:r>
+        <w:t xml:space="preserve"> and constant</w:t>
+      </w:r>
+      <w:r>
+        <w:t xml:space="preserve"> temperature</w:t>
+      </w:r>
+      <w:r>
+        <w:t xml:space="preserve"> treatments</w:t>
+      </w:r>
+      <w:r>
+        <w:t xml:space="preserve">, </w:t>
+      </w:r>
+      <w:r>
+        <w:t xml:space="preserve">added 6ml of distilled water and sealed with </w:t>
+      </w:r>
+      <w:proofErr w:type="spellStart"/>
+      <w:r>
+        <w:t>parafilm</w:t>
+      </w:r>
+      <w:proofErr w:type="spellEnd"/>
+      <w:r>
+        <w:t xml:space="preserve">. </w:t>
+      </w:r>
+      <w:r>
+        <w:rPr>
+          <w:rFonts w:cstheme="minorHAnsi"/>
+        </w:rPr>
+        <w:t xml:space="preserve">We checked </w:t>
+      </w:r>
+      <w:r>
+        <w:rPr>
+          <w:rFonts w:cstheme="minorHAnsi"/>
+        </w:rPr>
+        <w:t xml:space="preserve">germination </w:t>
+      </w:r>
+      <w:r>
+        <w:rPr>
+          <w:rFonts w:cstheme="minorHAnsi"/>
+        </w:rPr>
+        <w:t xml:space="preserve">right after cold stratification </w:t>
+      </w:r>
+      <w:proofErr w:type="spellStart"/>
+      <w:r>
+        <w:rPr>
+          <w:rFonts w:cstheme="minorHAnsi"/>
+        </w:rPr>
+        <w:t>pretreatment</w:t>
+      </w:r>
+      <w:proofErr w:type="spellEnd"/>
+      <w:r>
+        <w:rPr>
+          <w:rFonts w:cstheme="minorHAnsi"/>
+        </w:rPr>
+        <w:t>, as a proxy of species ability to germinate under snow-like conditions</w:t>
+      </w:r>
+      <w:r>
+        <w:rPr>
+          <w:rFonts w:cstheme="minorHAnsi"/>
+        </w:rPr>
+        <w:t xml:space="preserve"> to have extra information</w:t>
+      </w:r>
+      <w:r>
+        <w:rPr>
+          <w:rFonts w:cstheme="minorHAnsi"/>
+        </w:rPr>
+        <w:t xml:space="preserve"> to include in niche dissimilarity analysis, </w:t>
+      </w:r>
+      <w:r>
+        <w:rPr>
+          <w:rFonts w:eastAsia="Times New Roman" w:cstheme="minorHAnsi"/>
+          <w:color w:val="000000"/>
+          <w:lang w:eastAsia="ca-ES"/>
+        </w:rPr>
+        <w:t>one species (</w:t>
+      </w:r>
+      <w:proofErr w:type="spellStart"/>
+      <w:r>
+        <w:rPr>
+          <w:rFonts w:eastAsia="Times New Roman" w:cstheme="minorHAnsi"/>
+          <w:i/>
+          <w:color w:val="000000"/>
+          <w:lang w:eastAsia="ca-ES"/>
+        </w:rPr>
+        <w:t>Teesdalia</w:t>
+      </w:r>
+      <w:proofErr w:type="spellEnd"/>
+      <w:r>
+        <w:rPr>
+          <w:rFonts w:eastAsia="Times New Roman" w:cstheme="minorHAnsi"/>
+          <w:i/>
+          <w:color w:val="000000"/>
+          <w:lang w:eastAsia="ca-ES"/>
+        </w:rPr>
+        <w:t xml:space="preserve"> </w:t>
+      </w:r>
+      <w:proofErr w:type="spellStart"/>
+      <w:r>
+        <w:rPr>
+          <w:rFonts w:eastAsia="Times New Roman" w:cstheme="minorHAnsi"/>
+          <w:i/>
+          <w:color w:val="000000"/>
+          <w:lang w:eastAsia="ca-ES"/>
+        </w:rPr>
+        <w:t>conferta</w:t>
+      </w:r>
+      <w:proofErr w:type="spellEnd"/>
+      <w:r>
+        <w:rPr>
+          <w:rFonts w:eastAsia="Times New Roman" w:cstheme="minorHAnsi"/>
+          <w:color w:val="000000"/>
+          <w:lang w:eastAsia="ca-ES"/>
+        </w:rPr>
+        <w:t xml:space="preserve">) germinated to 100% thus </w:t>
+      </w:r>
+      <w:proofErr w:type="gramStart"/>
+      <w:r>
+        <w:rPr>
+          <w:rFonts w:eastAsia="Times New Roman" w:cstheme="minorHAnsi"/>
+          <w:color w:val="000000"/>
+          <w:lang w:eastAsia="ca-ES"/>
+        </w:rPr>
+        <w:t>was removed</w:t>
+      </w:r>
+      <w:proofErr w:type="gramEnd"/>
+      <w:r>
+        <w:rPr>
+          <w:rFonts w:eastAsia="Times New Roman" w:cstheme="minorHAnsi"/>
+          <w:color w:val="000000"/>
+          <w:lang w:eastAsia="ca-ES"/>
+        </w:rPr>
+        <w:t xml:space="preserve"> from germination treatments analysis</w:t>
+      </w:r>
+      <w:r>
+        <w:rPr>
+          <w:rFonts w:cstheme="minorHAnsi"/>
+        </w:rPr>
+        <w:t>. Fr</w:t>
+      </w:r>
+      <w:r>
+        <w:rPr>
+          <w:rFonts w:cstheme="minorHAnsi"/>
+        </w:rPr>
+        <w:t>o</w:t>
+      </w:r>
+      <w:r>
+        <w:rPr>
+          <w:rFonts w:cstheme="minorHAnsi"/>
+        </w:rPr>
+        <w:t>m there</w:t>
+      </w:r>
+      <w:r>
+        <w:rPr>
+          <w:rFonts w:cstheme="minorHAnsi"/>
+        </w:rPr>
+        <w:t xml:space="preserve"> on,</w:t>
+      </w:r>
+      <w:r>
+        <w:rPr>
+          <w:rFonts w:cstheme="minorHAnsi"/>
+        </w:rPr>
+        <w:t xml:space="preserve"> we checked</w:t>
+      </w:r>
+      <w:r>
+        <w:rPr>
+          <w:rFonts w:cstheme="minorHAnsi"/>
+        </w:rPr>
+        <w:t xml:space="preserve"> </w:t>
+      </w:r>
+      <w:r>
+        <w:rPr>
+          <w:rFonts w:cstheme="minorHAnsi"/>
+        </w:rPr>
+        <w:t>germination</w:t>
+      </w:r>
+      <w:r>
+        <w:rPr>
+          <w:rFonts w:eastAsia="Times New Roman" w:cstheme="minorHAnsi"/>
+          <w:color w:val="000000"/>
+          <w:lang w:eastAsia="ca-ES"/>
+        </w:rPr>
+        <w:t xml:space="preserve"> </w:t>
+      </w:r>
+      <w:r>
+        <w:rPr>
+          <w:rFonts w:cstheme="minorHAnsi"/>
+        </w:rPr>
+        <w:t xml:space="preserve">every </w:t>
+      </w:r>
+      <w:r>
+        <w:rPr>
+          <w:rFonts w:cstheme="minorHAnsi"/>
+        </w:rPr>
+        <w:t xml:space="preserve">week </w:t>
+      </w:r>
+      <w:r>
+        <w:rPr>
+          <w:rFonts w:cstheme="minorHAnsi"/>
+        </w:rPr>
+        <w:t>until the end of the experiment</w:t>
+      </w:r>
+      <w:r>
+        <w:rPr>
+          <w:rFonts w:cstheme="minorHAnsi"/>
+        </w:rPr>
+        <w:t xml:space="preserve"> (6 weeks)</w:t>
+      </w:r>
+      <w:r>
+        <w:rPr>
+          <w:rFonts w:cstheme="minorHAnsi"/>
+        </w:rPr>
+        <w:t xml:space="preserve">. We removed seeds from the petri dishes once </w:t>
+      </w:r>
+      <w:r>
+        <w:rPr>
+          <w:rFonts w:eastAsia="Times New Roman" w:cstheme="minorHAnsi"/>
+          <w:color w:val="000000"/>
+          <w:lang w:eastAsia="ca-ES"/>
+        </w:rPr>
+        <w:t xml:space="preserve">germination occurred (radicle &gt; 1.5 mm long). At the end of the experiment, we cut open non-germinated seeds under the binocular loupe </w:t>
+      </w:r>
+      <w:proofErr w:type="gramStart"/>
+      <w:r>
+        <w:rPr>
+          <w:rFonts w:eastAsia="Times New Roman" w:cstheme="minorHAnsi"/>
+          <w:color w:val="000000"/>
+          <w:lang w:eastAsia="ca-ES"/>
+        </w:rPr>
+        <w:t>to visually assess</w:t>
+      </w:r>
+      <w:proofErr w:type="gramEnd"/>
+      <w:r>
+        <w:rPr>
+          <w:rFonts w:eastAsia="Times New Roman" w:cstheme="minorHAnsi"/>
+          <w:color w:val="000000"/>
+          <w:lang w:eastAsia="ca-ES"/>
+        </w:rPr>
+        <w:t xml:space="preserve"> if they were empty, infected, or seemed </w:t>
       </w:r>
       <w:r>
         <w:rPr>
@@ -6759,1082 +7895,7 @@
           <w:lang w:eastAsia="ca-ES"/>
         </w:rPr>
         <w:lastRenderedPageBreak/>
-        <w:t xml:space="preserve">“Water stress”) and (4) </w:t>
-      </w:r>
-      <w:r>
-        <w:rPr>
-          <w:rFonts w:eastAsia="Times New Roman" w:cstheme="minorHAnsi"/>
-          <w:color w:val="000000"/>
-          <w:lang w:eastAsia="ca-ES"/>
-        </w:rPr>
-        <w:t xml:space="preserve">constant temperatures and </w:t>
-      </w:r>
-      <w:r>
-        <w:rPr>
-          <w:rFonts w:eastAsia="Times New Roman" w:cstheme="minorHAnsi"/>
-          <w:color w:val="000000"/>
-          <w:lang w:eastAsia="ca-ES"/>
-        </w:rPr>
-        <w:t xml:space="preserve">12h photoperiod </w:t>
-      </w:r>
-      <w:r>
-        <w:rPr>
-          <w:rFonts w:eastAsia="Times New Roman" w:cstheme="minorHAnsi"/>
-          <w:color w:val="000000"/>
-          <w:lang w:eastAsia="ca-ES"/>
-        </w:rPr>
-        <w:t>(referred to as “</w:t>
-      </w:r>
-      <w:r>
-        <w:rPr>
-          <w:rFonts w:eastAsia="Times New Roman" w:cstheme="minorHAnsi"/>
-          <w:color w:val="000000"/>
-          <w:lang w:eastAsia="ca-ES"/>
-        </w:rPr>
-        <w:t>Constant Temperature</w:t>
-      </w:r>
-      <w:r>
-        <w:rPr>
-          <w:rFonts w:eastAsia="Times New Roman" w:cstheme="minorHAnsi"/>
-          <w:color w:val="000000"/>
-          <w:lang w:eastAsia="ca-ES"/>
-        </w:rPr>
-        <w:t>”</w:t>
-      </w:r>
-      <w:r>
-        <w:rPr>
-          <w:rFonts w:eastAsia="Times New Roman" w:cstheme="minorHAnsi"/>
-          <w:color w:val="000000"/>
-          <w:lang w:eastAsia="ca-ES"/>
-        </w:rPr>
-        <w:t>)</w:t>
-      </w:r>
-      <w:r>
-        <w:rPr>
-          <w:rFonts w:eastAsia="Times New Roman" w:cstheme="minorHAnsi"/>
-          <w:color w:val="000000"/>
-          <w:lang w:eastAsia="ca-ES"/>
-        </w:rPr>
-        <w:t>.</w:t>
-      </w:r>
-      <w:r>
-        <w:rPr>
-          <w:rFonts w:eastAsia="Times New Roman" w:cstheme="minorHAnsi"/>
-          <w:color w:val="000000"/>
-          <w:lang w:eastAsia="ca-ES"/>
-        </w:rPr>
-        <w:t xml:space="preserve"> </w:t>
-      </w:r>
-      <w:r>
-        <w:rPr>
-          <w:rFonts w:eastAsia="Times New Roman" w:cstheme="minorHAnsi"/>
-          <w:color w:val="000000"/>
-          <w:lang w:eastAsia="ca-ES"/>
-        </w:rPr>
-        <w:t>Pre</w:t>
-      </w:r>
-      <w:r>
-        <w:rPr>
-          <w:rFonts w:eastAsia="Times New Roman" w:cstheme="minorHAnsi"/>
-          <w:color w:val="000000"/>
-          <w:lang w:eastAsia="ca-ES"/>
-        </w:rPr>
-        <w:t>ceding</w:t>
-      </w:r>
-      <w:r>
-        <w:rPr>
-          <w:rFonts w:eastAsia="Times New Roman" w:cstheme="minorHAnsi"/>
-          <w:color w:val="000000"/>
-          <w:lang w:eastAsia="ca-ES"/>
-        </w:rPr>
-        <w:t xml:space="preserve"> </w:t>
-      </w:r>
-      <w:r>
-        <w:rPr>
-          <w:rFonts w:eastAsia="Times New Roman" w:cstheme="minorHAnsi"/>
-          <w:color w:val="000000"/>
-          <w:lang w:eastAsia="ca-ES"/>
-        </w:rPr>
-        <w:t xml:space="preserve">germination research </w:t>
-      </w:r>
-      <w:r>
-        <w:rPr>
-          <w:rFonts w:eastAsia="Times New Roman" w:cstheme="minorHAnsi"/>
-          <w:color w:val="000000"/>
-          <w:lang w:eastAsia="ca-ES"/>
-        </w:rPr>
-        <w:t xml:space="preserve">by </w:t>
-      </w:r>
-      <w:r>
-        <w:rPr>
-          <w:rFonts w:eastAsia="Times New Roman" w:cstheme="minorHAnsi"/>
-          <w:color w:val="000000"/>
-          <w:highlight w:val="yellow"/>
-          <w:lang w:eastAsia="ca-ES"/>
-        </w:rPr>
-        <w:t xml:space="preserve">Espinosa </w:t>
-      </w:r>
-      <w:proofErr w:type="gramStart"/>
-      <w:r>
-        <w:rPr>
-          <w:rFonts w:eastAsia="Times New Roman" w:cstheme="minorHAnsi"/>
-          <w:color w:val="000000"/>
-          <w:highlight w:val="yellow"/>
-          <w:lang w:eastAsia="ca-ES"/>
-        </w:rPr>
-        <w:t>del</w:t>
-      </w:r>
-      <w:proofErr w:type="gramEnd"/>
-      <w:r>
-        <w:rPr>
-          <w:rFonts w:eastAsia="Times New Roman" w:cstheme="minorHAnsi"/>
-          <w:color w:val="000000"/>
-          <w:highlight w:val="yellow"/>
-          <w:lang w:eastAsia="ca-ES"/>
-        </w:rPr>
-        <w:t xml:space="preserve"> Alba et al. 2025</w:t>
-      </w:r>
-      <w:r>
-        <w:rPr>
-          <w:rFonts w:eastAsia="Times New Roman" w:cstheme="minorHAnsi"/>
-          <w:color w:val="000000"/>
-          <w:lang w:eastAsia="ca-ES"/>
-        </w:rPr>
-        <w:t xml:space="preserve"> found </w:t>
-      </w:r>
-      <w:r>
-        <w:rPr>
-          <w:rFonts w:eastAsia="Times New Roman" w:cstheme="minorHAnsi"/>
-          <w:color w:val="000000"/>
-          <w:lang w:eastAsia="ca-ES"/>
-        </w:rPr>
-        <w:t xml:space="preserve">that </w:t>
-      </w:r>
-      <w:r>
-        <w:rPr>
-          <w:rFonts w:eastAsia="Times New Roman" w:cstheme="minorHAnsi"/>
-          <w:color w:val="000000"/>
-          <w:lang w:eastAsia="ca-ES"/>
-        </w:rPr>
-        <w:t>a similar set of</w:t>
-      </w:r>
-      <w:r>
-        <w:rPr>
-          <w:rFonts w:eastAsia="Times New Roman" w:cstheme="minorHAnsi"/>
-          <w:color w:val="000000"/>
-          <w:lang w:eastAsia="ca-ES"/>
-        </w:rPr>
-        <w:t xml:space="preserve"> </w:t>
-      </w:r>
-      <w:r>
-        <w:rPr>
-          <w:rFonts w:eastAsia="Times New Roman" w:cstheme="minorHAnsi"/>
-          <w:color w:val="000000"/>
-          <w:lang w:eastAsia="ca-ES"/>
-        </w:rPr>
-        <w:t xml:space="preserve">species </w:t>
-      </w:r>
-      <w:r>
-        <w:rPr>
-          <w:rFonts w:eastAsia="Times New Roman" w:cstheme="minorHAnsi"/>
-          <w:color w:val="000000"/>
-          <w:lang w:eastAsia="ca-ES"/>
-        </w:rPr>
-        <w:t>had</w:t>
-      </w:r>
-      <w:r>
-        <w:rPr>
-          <w:rFonts w:eastAsia="Times New Roman" w:cstheme="minorHAnsi"/>
-          <w:color w:val="000000"/>
-          <w:lang w:eastAsia="ca-ES"/>
-        </w:rPr>
-        <w:t xml:space="preserve"> two </w:t>
-      </w:r>
-      <w:r>
-        <w:rPr>
-          <w:rFonts w:eastAsia="Times New Roman" w:cstheme="minorHAnsi"/>
-          <w:color w:val="000000"/>
-          <w:lang w:eastAsia="ca-ES"/>
-        </w:rPr>
-        <w:t xml:space="preserve">differential </w:t>
-      </w:r>
-      <w:r>
-        <w:rPr>
-          <w:rFonts w:eastAsia="Times New Roman" w:cstheme="minorHAnsi"/>
-          <w:color w:val="000000"/>
-          <w:lang w:eastAsia="ca-ES"/>
-        </w:rPr>
-        <w:t xml:space="preserve">optimal </w:t>
-      </w:r>
-      <w:r>
-        <w:rPr>
-          <w:rFonts w:eastAsia="Times New Roman" w:cstheme="minorHAnsi"/>
-          <w:color w:val="000000"/>
-          <w:lang w:eastAsia="ca-ES"/>
-        </w:rPr>
-        <w:t xml:space="preserve">germination </w:t>
-      </w:r>
-      <w:r>
-        <w:rPr>
-          <w:rFonts w:eastAsia="Times New Roman" w:cstheme="minorHAnsi"/>
-          <w:color w:val="000000"/>
-          <w:lang w:eastAsia="ca-ES"/>
-        </w:rPr>
-        <w:t>temperatures</w:t>
-      </w:r>
-      <w:r>
-        <w:rPr>
-          <w:rFonts w:eastAsia="Times New Roman" w:cstheme="minorHAnsi"/>
-          <w:color w:val="000000"/>
-          <w:lang w:eastAsia="ca-ES"/>
-        </w:rPr>
-        <w:t xml:space="preserve">: </w:t>
-      </w:r>
-      <w:r>
-        <w:rPr>
-          <w:rFonts w:eastAsia="Times New Roman" w:cstheme="minorHAnsi"/>
-          <w:color w:val="000000"/>
-          <w:lang w:eastAsia="ca-ES"/>
-        </w:rPr>
-        <w:t xml:space="preserve">some with </w:t>
-      </w:r>
-      <w:r>
-        <w:rPr>
-          <w:rFonts w:eastAsia="Times New Roman" w:cstheme="minorHAnsi"/>
-          <w:color w:val="000000"/>
-          <w:lang w:eastAsia="ca-ES"/>
-        </w:rPr>
-        <w:t>cold</w:t>
-      </w:r>
-      <w:r>
-        <w:rPr>
-          <w:rFonts w:eastAsia="Times New Roman" w:cstheme="minorHAnsi"/>
-          <w:color w:val="000000"/>
-          <w:lang w:eastAsia="ca-ES"/>
-        </w:rPr>
-        <w:t xml:space="preserve"> </w:t>
-      </w:r>
-      <w:r>
-        <w:rPr>
-          <w:rFonts w:eastAsia="Times New Roman" w:cstheme="minorHAnsi"/>
-          <w:color w:val="000000"/>
-          <w:lang w:eastAsia="ca-ES"/>
-        </w:rPr>
-        <w:t>preference while other preferred</w:t>
-      </w:r>
-      <w:r>
-        <w:rPr>
-          <w:rFonts w:eastAsia="Times New Roman" w:cstheme="minorHAnsi"/>
-          <w:color w:val="000000"/>
-          <w:lang w:eastAsia="ca-ES"/>
-        </w:rPr>
-        <w:t xml:space="preserve"> warm</w:t>
-      </w:r>
-      <w:r>
-        <w:rPr>
-          <w:rFonts w:eastAsia="Times New Roman" w:cstheme="minorHAnsi"/>
-          <w:color w:val="000000"/>
-          <w:lang w:eastAsia="ca-ES"/>
-        </w:rPr>
-        <w:t xml:space="preserve"> </w:t>
-      </w:r>
-      <w:r>
-        <w:rPr>
-          <w:rFonts w:eastAsia="Times New Roman" w:cstheme="minorHAnsi"/>
-          <w:color w:val="000000"/>
-          <w:lang w:eastAsia="ca-ES"/>
-        </w:rPr>
-        <w:t>temperatures</w:t>
-      </w:r>
-      <w:r>
-        <w:rPr>
-          <w:rFonts w:eastAsia="Times New Roman" w:cstheme="minorHAnsi"/>
-          <w:color w:val="000000"/>
-          <w:lang w:eastAsia="ca-ES"/>
-        </w:rPr>
-        <w:t xml:space="preserve">. </w:t>
-      </w:r>
-      <w:r>
-        <w:rPr>
-          <w:rFonts w:eastAsia="Times New Roman" w:cstheme="minorHAnsi"/>
-          <w:color w:val="000000"/>
-          <w:lang w:eastAsia="ca-ES"/>
-        </w:rPr>
-        <w:t>Consequently, we subdivided the species into</w:t>
-      </w:r>
-      <w:r>
-        <w:rPr>
-          <w:rFonts w:eastAsia="Times New Roman" w:cstheme="minorHAnsi"/>
-          <w:color w:val="000000"/>
-          <w:lang w:eastAsia="ca-ES"/>
-        </w:rPr>
-        <w:t xml:space="preserve"> two temperature regimes</w:t>
-      </w:r>
-      <w:r>
-        <w:rPr>
-          <w:rFonts w:eastAsia="Times New Roman" w:cstheme="minorHAnsi"/>
-          <w:color w:val="000000"/>
-          <w:lang w:eastAsia="ca-ES"/>
-        </w:rPr>
-        <w:t xml:space="preserve"> </w:t>
-      </w:r>
-      <w:r>
-        <w:rPr>
-          <w:rFonts w:eastAsia="Times New Roman" w:cstheme="minorHAnsi"/>
-          <w:color w:val="000000"/>
-          <w:lang w:eastAsia="ca-ES"/>
-        </w:rPr>
-        <w:t xml:space="preserve">and </w:t>
-      </w:r>
-      <w:r>
-        <w:rPr>
-          <w:rFonts w:eastAsia="Times New Roman" w:cstheme="minorHAnsi"/>
-          <w:color w:val="000000"/>
-          <w:lang w:eastAsia="ca-ES"/>
-        </w:rPr>
-        <w:t>programmed</w:t>
-      </w:r>
-      <w:r>
-        <w:rPr>
-          <w:rFonts w:eastAsia="Times New Roman" w:cstheme="minorHAnsi"/>
-          <w:color w:val="000000"/>
-          <w:lang w:eastAsia="ca-ES"/>
-        </w:rPr>
-        <w:t xml:space="preserve"> in </w:t>
-      </w:r>
-      <w:r>
-        <w:rPr>
-          <w:rFonts w:eastAsia="Times New Roman" w:cstheme="minorHAnsi"/>
-          <w:color w:val="000000"/>
-          <w:lang w:eastAsia="ca-ES"/>
-        </w:rPr>
-        <w:t>four</w:t>
-      </w:r>
-      <w:r>
-        <w:rPr>
-          <w:rFonts w:eastAsia="Times New Roman" w:cstheme="minorHAnsi"/>
-          <w:color w:val="000000"/>
-          <w:lang w:eastAsia="ca-ES"/>
-        </w:rPr>
-        <w:t xml:space="preserve"> </w:t>
-      </w:r>
-      <w:r>
-        <w:rPr>
-          <w:rFonts w:eastAsia="Times New Roman" w:cstheme="minorHAnsi"/>
-          <w:color w:val="000000"/>
-          <w:lang w:eastAsia="ca-ES"/>
-        </w:rPr>
-        <w:t>different</w:t>
-      </w:r>
-      <w:r>
-        <w:rPr>
-          <w:rFonts w:eastAsia="Times New Roman" w:cstheme="minorHAnsi"/>
-          <w:color w:val="000000"/>
-          <w:lang w:eastAsia="ca-ES"/>
-        </w:rPr>
-        <w:t xml:space="preserve"> climatic</w:t>
-      </w:r>
-      <w:r>
-        <w:rPr>
-          <w:rFonts w:eastAsia="Times New Roman" w:cstheme="minorHAnsi"/>
-          <w:color w:val="000000"/>
-          <w:lang w:eastAsia="ca-ES"/>
-        </w:rPr>
-        <w:t xml:space="preserve"> chambers</w:t>
-      </w:r>
-      <w:r>
-        <w:rPr>
-          <w:rFonts w:eastAsia="Times New Roman" w:cstheme="minorHAnsi"/>
-          <w:color w:val="000000"/>
-          <w:lang w:eastAsia="ca-ES"/>
-        </w:rPr>
-        <w:t xml:space="preserve"> </w:t>
-      </w:r>
-      <w:r>
-        <w:rPr>
-          <w:rFonts w:eastAsia="Times New Roman" w:cstheme="minorHAnsi"/>
-          <w:color w:val="000000"/>
-          <w:lang w:eastAsia="ca-ES"/>
-        </w:rPr>
-        <w:t>i.e. there</w:t>
-      </w:r>
-      <w:r>
-        <w:rPr>
-          <w:rFonts w:eastAsia="Times New Roman" w:cstheme="minorHAnsi"/>
-          <w:color w:val="000000"/>
-          <w:lang w:eastAsia="ca-ES"/>
-        </w:rPr>
-        <w:t xml:space="preserve"> were</w:t>
-      </w:r>
-      <w:r>
-        <w:rPr>
-          <w:rFonts w:eastAsia="Times New Roman" w:cstheme="minorHAnsi"/>
-          <w:color w:val="000000"/>
-          <w:lang w:eastAsia="ca-ES"/>
-        </w:rPr>
-        <w:t xml:space="preserve"> two constant</w:t>
-      </w:r>
-      <w:r>
-        <w:rPr>
-          <w:rFonts w:eastAsia="Times New Roman" w:cstheme="minorHAnsi"/>
-          <w:color w:val="000000"/>
-          <w:lang w:eastAsia="ca-ES"/>
-        </w:rPr>
-        <w:t xml:space="preserve"> (10</w:t>
-      </w:r>
-      <w:r>
-        <w:rPr>
-          <w:rFonts w:eastAsia="Times New Roman" w:cstheme="minorHAnsi"/>
-          <w:color w:val="000000"/>
-          <w:lang w:eastAsia="ca-ES"/>
-        </w:rPr>
-        <w:t>ºC</w:t>
-      </w:r>
-      <w:r>
-        <w:rPr>
-          <w:rFonts w:eastAsia="Times New Roman" w:cstheme="minorHAnsi"/>
-          <w:color w:val="000000"/>
-          <w:lang w:eastAsia="ca-ES"/>
-        </w:rPr>
-        <w:t xml:space="preserve"> vs 17 ºC)</w:t>
-      </w:r>
-      <w:r>
-        <w:rPr>
-          <w:rFonts w:eastAsia="Times New Roman" w:cstheme="minorHAnsi"/>
-          <w:color w:val="000000"/>
-          <w:lang w:eastAsia="ca-ES"/>
-        </w:rPr>
-        <w:t xml:space="preserve"> and two alternating temperature regimes</w:t>
-      </w:r>
-      <w:r>
-        <w:rPr>
-          <w:rFonts w:eastAsia="Times New Roman" w:cstheme="minorHAnsi"/>
-          <w:color w:val="000000"/>
-          <w:lang w:eastAsia="ca-ES"/>
-        </w:rPr>
-        <w:t>(15 - 5 ºC vs (22 - 12ºC)</w:t>
-      </w:r>
-      <w:r>
-        <w:rPr>
-          <w:rFonts w:eastAsia="Times New Roman" w:cstheme="minorHAnsi"/>
-          <w:color w:val="000000"/>
-          <w:lang w:eastAsia="ca-ES"/>
-        </w:rPr>
-        <w:t>.</w:t>
-      </w:r>
-      <w:r>
-        <w:rPr>
-          <w:rFonts w:eastAsia="Times New Roman" w:cstheme="minorHAnsi"/>
-          <w:color w:val="000000"/>
-          <w:lang w:eastAsia="ca-ES"/>
-        </w:rPr>
-        <w:t xml:space="preserve"> </w:t>
-      </w:r>
-      <w:r>
-        <w:rPr>
-          <w:rFonts w:eastAsia="Times New Roman" w:cstheme="minorHAnsi"/>
-          <w:color w:val="000000"/>
-          <w:lang w:eastAsia="ca-ES"/>
-        </w:rPr>
-        <w:t xml:space="preserve">Once the </w:t>
-      </w:r>
-      <w:proofErr w:type="spellStart"/>
-      <w:r>
-        <w:rPr>
-          <w:rFonts w:eastAsia="Times New Roman" w:cstheme="minorHAnsi"/>
-          <w:color w:val="000000"/>
-          <w:lang w:eastAsia="ca-ES"/>
-        </w:rPr>
-        <w:t>pretreatment</w:t>
-      </w:r>
-      <w:proofErr w:type="spellEnd"/>
-      <w:r>
-        <w:rPr>
-          <w:rFonts w:eastAsia="Times New Roman" w:cstheme="minorHAnsi"/>
-          <w:color w:val="000000"/>
-          <w:lang w:eastAsia="ca-ES"/>
-        </w:rPr>
-        <w:t xml:space="preserve"> ended</w:t>
-      </w:r>
-      <w:r>
-        <w:rPr>
-          <w:rFonts w:eastAsia="Times New Roman" w:cstheme="minorHAnsi"/>
-          <w:color w:val="000000"/>
-          <w:lang w:eastAsia="ca-ES"/>
-        </w:rPr>
-        <w:t xml:space="preserve">, </w:t>
-      </w:r>
-      <w:r>
-        <w:rPr>
-          <w:rFonts w:eastAsia="Times New Roman" w:cstheme="minorHAnsi"/>
-          <w:color w:val="000000"/>
-          <w:lang w:eastAsia="ca-ES"/>
-        </w:rPr>
-        <w:t>n</w:t>
-      </w:r>
-      <w:r>
-        <w:rPr>
-          <w:rFonts w:eastAsia="Times New Roman" w:cstheme="minorHAnsi"/>
-          <w:color w:val="000000"/>
-          <w:lang w:eastAsia="ca-ES"/>
-        </w:rPr>
-        <w:t xml:space="preserve">on-germinated </w:t>
-      </w:r>
-      <w:r>
-        <w:rPr>
-          <w:rFonts w:eastAsia="Times New Roman" w:cstheme="minorHAnsi"/>
-          <w:color w:val="000000"/>
-          <w:lang w:eastAsia="ca-ES"/>
-        </w:rPr>
-        <w:t>seed</w:t>
-      </w:r>
-      <w:r>
-        <w:rPr>
-          <w:rFonts w:eastAsia="Times New Roman" w:cstheme="minorHAnsi"/>
-          <w:color w:val="000000"/>
-          <w:lang w:eastAsia="ca-ES"/>
-        </w:rPr>
-        <w:t>s</w:t>
-      </w:r>
-      <w:r>
-        <w:rPr>
-          <w:rFonts w:eastAsia="Times New Roman" w:cstheme="minorHAnsi"/>
-          <w:color w:val="000000"/>
-          <w:lang w:eastAsia="ca-ES"/>
-        </w:rPr>
-        <w:t xml:space="preserve"> </w:t>
-      </w:r>
-      <w:proofErr w:type="gramStart"/>
-      <w:r>
-        <w:rPr>
-          <w:rFonts w:eastAsia="Times New Roman" w:cstheme="minorHAnsi"/>
-          <w:color w:val="000000"/>
-          <w:lang w:eastAsia="ca-ES"/>
-        </w:rPr>
-        <w:t>were</w:t>
-      </w:r>
-      <w:r>
-        <w:rPr>
-          <w:rFonts w:eastAsia="Times New Roman" w:cstheme="minorHAnsi"/>
-          <w:color w:val="000000"/>
-          <w:lang w:eastAsia="ca-ES"/>
-        </w:rPr>
-        <w:t xml:space="preserve"> transferred to </w:t>
-      </w:r>
-      <w:r>
-        <w:rPr>
-          <w:rFonts w:eastAsia="Times New Roman" w:cstheme="minorHAnsi"/>
-          <w:color w:val="000000"/>
-          <w:lang w:eastAsia="ca-ES"/>
-        </w:rPr>
-        <w:t xml:space="preserve">new </w:t>
-      </w:r>
-      <w:r>
-        <w:t>90 mm Ø Petri dishes with two layers of filter paper (</w:t>
-      </w:r>
-      <w:proofErr w:type="spellStart"/>
-      <w:r>
-        <w:rPr>
-          <w:rFonts w:eastAsia="Times New Roman" w:cstheme="minorHAnsi"/>
-          <w:color w:val="000000"/>
-          <w:lang w:eastAsia="ca-ES"/>
-        </w:rPr>
-        <w:t>Filtros</w:t>
-      </w:r>
-      <w:proofErr w:type="spellEnd"/>
-      <w:r>
-        <w:rPr>
-          <w:rFonts w:eastAsia="Times New Roman" w:cstheme="minorHAnsi"/>
-          <w:color w:val="000000"/>
-          <w:lang w:eastAsia="ca-ES"/>
-        </w:rPr>
-        <w:t xml:space="preserve"> </w:t>
-      </w:r>
-      <w:proofErr w:type="spellStart"/>
-      <w:r>
-        <w:rPr>
-          <w:rFonts w:eastAsia="Times New Roman" w:cstheme="minorHAnsi"/>
-          <w:color w:val="000000"/>
-          <w:lang w:eastAsia="ca-ES"/>
-        </w:rPr>
-        <w:t>Anoia</w:t>
-      </w:r>
-      <w:proofErr w:type="spellEnd"/>
-      <w:r>
-        <w:rPr>
-          <w:rFonts w:eastAsia="Times New Roman" w:cstheme="minorHAnsi"/>
-          <w:color w:val="000000"/>
-          <w:lang w:eastAsia="ca-ES"/>
-        </w:rPr>
-        <w:t xml:space="preserve"> S.A. paper for germination assays, Ref.518G085</w:t>
-      </w:r>
-      <w:r>
-        <w:t>)</w:t>
-      </w:r>
-      <w:r>
-        <w:t xml:space="preserve"> and sealed with </w:t>
-      </w:r>
-      <w:proofErr w:type="spellStart"/>
-      <w:r>
-        <w:t>parafilm</w:t>
-      </w:r>
-      <w:proofErr w:type="spellEnd"/>
-      <w:proofErr w:type="gramEnd"/>
-      <w:r>
-        <w:t>.</w:t>
-      </w:r>
-      <w:r>
-        <w:t xml:space="preserve"> </w:t>
-      </w:r>
-      <w:r>
-        <w:t xml:space="preserve">Firstly, </w:t>
-      </w:r>
-      <w:r>
-        <w:t xml:space="preserve">we transferred </w:t>
-      </w:r>
-      <w:r>
-        <w:t xml:space="preserve">the </w:t>
-      </w:r>
-      <w:r>
-        <w:t>seed</w:t>
-      </w:r>
-      <w:r>
-        <w:t>s</w:t>
-      </w:r>
-      <w:r>
-        <w:t xml:space="preserve"> for </w:t>
-      </w:r>
-      <w:r>
-        <w:t>Darkness</w:t>
-      </w:r>
-      <w:r>
-        <w:t xml:space="preserve"> treatment, </w:t>
-      </w:r>
-      <w:r>
-        <w:t xml:space="preserve">added 6ml of distilled water, sealed with </w:t>
-      </w:r>
-      <w:proofErr w:type="spellStart"/>
-      <w:r>
-        <w:t>parafilm</w:t>
-      </w:r>
-      <w:proofErr w:type="spellEnd"/>
-      <w:r>
-        <w:t xml:space="preserve"> </w:t>
-      </w:r>
-      <w:r>
-        <w:t xml:space="preserve">and </w:t>
-      </w:r>
-      <w:r>
-        <w:t>immediately</w:t>
-      </w:r>
-      <w:r>
-        <w:t xml:space="preserve"> cover them with two layers aluminium foil</w:t>
-      </w:r>
-      <w:r>
-        <w:t xml:space="preserve">. </w:t>
-      </w:r>
-      <w:r>
-        <w:t xml:space="preserve">Next, we transfer the seeds for the </w:t>
-      </w:r>
-      <w:r>
-        <w:t>Water stress</w:t>
-      </w:r>
-      <w:r>
-        <w:t xml:space="preserve"> </w:t>
-      </w:r>
-      <w:r>
-        <w:t>treatme</w:t>
-      </w:r>
-      <w:r>
-        <w:t>nt</w:t>
-      </w:r>
-      <w:r>
-        <w:t xml:space="preserve">, where instead of distilled water we added 6ml of </w:t>
-      </w:r>
-      <w:r>
-        <w:t>a polyethylene solution (PEG</w:t>
-      </w:r>
-      <w:r>
-        <w:t xml:space="preserve"> 6000</w:t>
-      </w:r>
-      <w:r>
-        <w:t xml:space="preserve">) </w:t>
-      </w:r>
-      <w:r>
-        <w:t xml:space="preserve">to simulate a -0.6 </w:t>
-      </w:r>
-      <w:proofErr w:type="spellStart"/>
-      <w:r>
-        <w:t>Mpa</w:t>
-      </w:r>
-      <w:proofErr w:type="spellEnd"/>
-      <w:r>
-        <w:t xml:space="preserve"> of water potential</w:t>
-      </w:r>
-      <w:r>
-        <w:t xml:space="preserve"> and sealed with </w:t>
-      </w:r>
-      <w:proofErr w:type="spellStart"/>
-      <w:r>
-        <w:t>parafilm</w:t>
-      </w:r>
-      <w:proofErr w:type="spellEnd"/>
-      <w:r>
-        <w:t xml:space="preserve">. </w:t>
-      </w:r>
-      <w:r>
-        <w:t xml:space="preserve">As </w:t>
-      </w:r>
-      <w:r>
-        <w:t>PEG solutions depend on experimental temperatures, t</w:t>
-      </w:r>
-      <w:r>
-        <w:t xml:space="preserve">wo </w:t>
-      </w:r>
-      <w:r>
-        <w:t xml:space="preserve">PEG solutions </w:t>
-      </w:r>
-      <w:r>
-        <w:t xml:space="preserve">were prepared </w:t>
-      </w:r>
-      <w:r>
-        <w:t xml:space="preserve">according to </w:t>
-      </w:r>
-      <w:r>
-        <w:fldChar w:fldCharType="begin" w:fldLock="1"/>
-      </w:r>
-      <w:r>
-        <w:instrText>ADDIN CSL_CITATION {"citationItems":[{"id":"ITEM-1","itemData":{"author":[{"dropping-particle":"","family":"Michel","given":"Burlyn E","non-dropping-particle":"","parse-names":false,"suffix":""},{"dropping-particle":"","family":"Kaufmann","given":"Merrill R","non-dropping-particle":"","parse-names":false,"suffix":""}],"id":"ITEM-1","issued":{"date-parts":[["1973"]]},"page":"914-916","title":"The Osmotic Potential of Polyethylene Glycol 60001","type":"article-journal"},"uris":["http://www.mendeley.com/documents/?uuid=5dcd3d1a-bbf4-4c97-b53e-728b84b2c212","http://www.mendeley.com/documents/?uuid=8bae9792-5df1-46d8-a9f4-b2080aa2e458"]}],"mendeley":{"formattedCitation":"(Michel &amp; Kaufmann 1973)","manualFormatting":"Michel &amp; Kaufmann (1973)","plainTextFormattedCitation":"(Michel &amp; Kaufmann 1973)","previouslyFormattedCitation":"(Michel &amp; Kaufmann 1973)"},"properties":{"noteIndex":0},"schema":"https://github.com/citation-style-language/schema/raw/master/csl-citation.json"}</w:instrText>
-      </w:r>
-      <w:r>
-        <w:fldChar w:fldCharType="separate"/>
-      </w:r>
-      <w:r>
-        <w:rPr>
-          <w:noProof/>
-        </w:rPr>
-        <w:t>Michel &amp; Kaufmann (1973)</w:t>
-      </w:r>
-      <w:r>
-        <w:fldChar w:fldCharType="end"/>
-      </w:r>
-      <w:r>
-        <w:t xml:space="preserve"> and </w:t>
-      </w:r>
-      <w:r>
-        <w:fldChar w:fldCharType="begin" w:fldLock="1"/>
-      </w:r>
-      <w:r>
-        <w:instrText>ADDIN CSL_CITATION {"citationItems":[{"id":"ITEM-1","itemData":{"ISBN":"1678-3921","ISSN":"1678-3921","abstract":"Um expressivo número de pesquisas vem sendo desenvolvido na área de pré-condicionamento em sementes. Na busca de contribuir com os técnicos envolvidos em pes­quisas nesta área, procurou-se através da inter-relação entre a Termodinâmica e a Tecnologia de Sementes caracterizar potenciais hídrico, osmótico, mátrico e de pressão e, a partir do tra­balho de Michel &amp; Kaufmann (1973), construir uma tabela associando potencial osmótico, concentração de polietileno glicol 6000 e temperatura.","author":[{"dropping-particle":"","family":"Villela","given":"Francisco Amaral","non-dropping-particle":"","parse-names":false,"suffix":""},{"dropping-particle":"","family":"Doni Filho","given":"Luiz","non-dropping-particle":"","parse-names":false,"suffix":""},{"dropping-particle":"","family":"Sequeira","given":"Eliseo Lecrerc","non-dropping-particle":"","parse-names":false,"suffix":""}],"container-title":"Pesquisa Agropecuária Brasileira","id":"ITEM-1","issue":"11/12","issued":{"date-parts":[["1991"]]},"page":"1957-1968","title":"Tabela de potencial osmótico em função da concentração de polietileno glicol 6.000 e da temperatura","type":"article-journal","volume":"26"},"uris":["http://www.mendeley.com/documents/?uuid=309ba047-c4bd-4f3c-8de0-e44ba85df0c4"]}],"mendeley":{"formattedCitation":"(Villela et al. 1991)","manualFormatting":"Villela et al. (1991)","plainTextFormattedCitation":"(Villela et al. 1991)","previouslyFormattedCitation":"(Villela et al. 1991)"},"properties":{"noteIndex":0},"schema":"https://github.com/citation-style-language/schema/raw/master/csl-citation.json"}</w:instrText>
-      </w:r>
-      <w:r>
-        <w:fldChar w:fldCharType="separate"/>
-      </w:r>
-      <w:r>
-        <w:rPr>
-          <w:noProof/>
-        </w:rPr>
-        <w:t xml:space="preserve">Villela et al. </w:t>
-      </w:r>
-      <w:r>
-        <w:rPr>
-          <w:noProof/>
-        </w:rPr>
-        <w:t>(</w:t>
-      </w:r>
-      <w:r>
-        <w:rPr>
-          <w:noProof/>
-        </w:rPr>
-        <w:t>1991)</w:t>
-      </w:r>
-      <w:r>
-        <w:fldChar w:fldCharType="end"/>
-      </w:r>
-      <w:r>
-        <w:t xml:space="preserve"> to reach desired osmotic potentials at </w:t>
-      </w:r>
-      <w:r>
-        <w:t xml:space="preserve">10 ºC </w:t>
-      </w:r>
-      <w:r>
-        <w:t xml:space="preserve">and </w:t>
-      </w:r>
-      <w:r>
-        <w:t>17</w:t>
-      </w:r>
-      <w:r>
-        <w:t>ºC</w:t>
-      </w:r>
-      <w:r>
-        <w:t xml:space="preserve"> </w:t>
-      </w:r>
-      <w:r>
-        <w:t xml:space="preserve">depending on species optimal germination temperature. </w:t>
-      </w:r>
-      <w:r>
-        <w:t xml:space="preserve"> </w:t>
-      </w:r>
-      <w:r>
-        <w:t xml:space="preserve">Finally, </w:t>
-      </w:r>
-      <w:r>
-        <w:t>the rest of the seed</w:t>
-      </w:r>
-      <w:r>
-        <w:t>s</w:t>
-      </w:r>
-      <w:r>
-        <w:t xml:space="preserve"> </w:t>
-      </w:r>
-      <w:proofErr w:type="gramStart"/>
-      <w:r>
-        <w:t>were divided</w:t>
-      </w:r>
-      <w:proofErr w:type="gramEnd"/>
-      <w:r>
-        <w:t xml:space="preserve"> between </w:t>
-      </w:r>
-      <w:r>
-        <w:t>control</w:t>
-      </w:r>
-      <w:r>
-        <w:t xml:space="preserve"> and constant</w:t>
-      </w:r>
-      <w:r>
-        <w:t xml:space="preserve"> temperature</w:t>
-      </w:r>
-      <w:r>
-        <w:t xml:space="preserve"> treatments</w:t>
-      </w:r>
-      <w:r>
-        <w:t xml:space="preserve">, </w:t>
-      </w:r>
-      <w:r>
-        <w:t xml:space="preserve">added 6ml of distilled water and sealed with </w:t>
-      </w:r>
-      <w:proofErr w:type="spellStart"/>
-      <w:r>
-        <w:t>parafilm</w:t>
-      </w:r>
-      <w:proofErr w:type="spellEnd"/>
-      <w:r>
-        <w:t xml:space="preserve">. </w:t>
-      </w:r>
-      <w:r>
-        <w:rPr>
-          <w:rFonts w:cstheme="minorHAnsi"/>
-        </w:rPr>
-        <w:t xml:space="preserve">We checked </w:t>
-      </w:r>
-      <w:r>
-        <w:rPr>
-          <w:rFonts w:cstheme="minorHAnsi"/>
-        </w:rPr>
-        <w:t xml:space="preserve">germination </w:t>
-      </w:r>
-      <w:r>
-        <w:rPr>
-          <w:rFonts w:cstheme="minorHAnsi"/>
-        </w:rPr>
-        <w:t xml:space="preserve">right after cold stratification </w:t>
-      </w:r>
-      <w:proofErr w:type="spellStart"/>
-      <w:r>
-        <w:rPr>
-          <w:rFonts w:cstheme="minorHAnsi"/>
-        </w:rPr>
-        <w:t>pretreatment</w:t>
-      </w:r>
-      <w:proofErr w:type="spellEnd"/>
-      <w:r>
-        <w:rPr>
-          <w:rFonts w:cstheme="minorHAnsi"/>
-        </w:rPr>
-        <w:t>, as a proxy of species ability to germinate under snow-like conditions</w:t>
-      </w:r>
-      <w:r>
-        <w:rPr>
-          <w:rFonts w:cstheme="minorHAnsi"/>
-        </w:rPr>
-        <w:t xml:space="preserve"> to have extra information</w:t>
-      </w:r>
-      <w:r>
-        <w:rPr>
-          <w:rFonts w:cstheme="minorHAnsi"/>
-        </w:rPr>
-        <w:t xml:space="preserve"> to include in niche dissimilarity analysis, </w:t>
-      </w:r>
-      <w:r>
-        <w:rPr>
-          <w:rFonts w:eastAsia="Times New Roman" w:cstheme="minorHAnsi"/>
-          <w:color w:val="000000"/>
-          <w:lang w:eastAsia="ca-ES"/>
-        </w:rPr>
-        <w:t>one species (</w:t>
-      </w:r>
-      <w:proofErr w:type="spellStart"/>
-      <w:r>
-        <w:rPr>
-          <w:rFonts w:eastAsia="Times New Roman" w:cstheme="minorHAnsi"/>
-          <w:i/>
-          <w:color w:val="000000"/>
-          <w:lang w:eastAsia="ca-ES"/>
-        </w:rPr>
-        <w:t>Teesdalia</w:t>
-      </w:r>
-      <w:proofErr w:type="spellEnd"/>
-      <w:r>
-        <w:rPr>
-          <w:rFonts w:eastAsia="Times New Roman" w:cstheme="minorHAnsi"/>
-          <w:i/>
-          <w:color w:val="000000"/>
-          <w:lang w:eastAsia="ca-ES"/>
-        </w:rPr>
-        <w:t xml:space="preserve"> </w:t>
-      </w:r>
-      <w:proofErr w:type="spellStart"/>
-      <w:r>
-        <w:rPr>
-          <w:rFonts w:eastAsia="Times New Roman" w:cstheme="minorHAnsi"/>
-          <w:i/>
-          <w:color w:val="000000"/>
-          <w:lang w:eastAsia="ca-ES"/>
-        </w:rPr>
-        <w:t>conferta</w:t>
-      </w:r>
-      <w:proofErr w:type="spellEnd"/>
-      <w:r>
-        <w:rPr>
-          <w:rFonts w:eastAsia="Times New Roman" w:cstheme="minorHAnsi"/>
-          <w:color w:val="000000"/>
-          <w:lang w:eastAsia="ca-ES"/>
-        </w:rPr>
-        <w:t xml:space="preserve">) germinated to 100% thus </w:t>
-      </w:r>
-      <w:proofErr w:type="gramStart"/>
-      <w:r>
-        <w:rPr>
-          <w:rFonts w:eastAsia="Times New Roman" w:cstheme="minorHAnsi"/>
-          <w:color w:val="000000"/>
-          <w:lang w:eastAsia="ca-ES"/>
-        </w:rPr>
-        <w:t>was removed</w:t>
-      </w:r>
-      <w:proofErr w:type="gramEnd"/>
-      <w:r>
-        <w:rPr>
-          <w:rFonts w:eastAsia="Times New Roman" w:cstheme="minorHAnsi"/>
-          <w:color w:val="000000"/>
-          <w:lang w:eastAsia="ca-ES"/>
-        </w:rPr>
-        <w:t xml:space="preserve"> from germination treatments analysis</w:t>
-      </w:r>
-      <w:r>
-        <w:rPr>
-          <w:rFonts w:cstheme="minorHAnsi"/>
-        </w:rPr>
-        <w:t>. Fr</w:t>
-      </w:r>
-      <w:r>
-        <w:rPr>
-          <w:rFonts w:cstheme="minorHAnsi"/>
-        </w:rPr>
-        <w:t>o</w:t>
-      </w:r>
-      <w:r>
-        <w:rPr>
-          <w:rFonts w:cstheme="minorHAnsi"/>
-        </w:rPr>
-        <w:t>m there</w:t>
-      </w:r>
-      <w:r>
-        <w:rPr>
-          <w:rFonts w:cstheme="minorHAnsi"/>
-        </w:rPr>
-        <w:t xml:space="preserve"> on,</w:t>
-      </w:r>
-      <w:r>
-        <w:rPr>
-          <w:rFonts w:cstheme="minorHAnsi"/>
-        </w:rPr>
-        <w:t xml:space="preserve"> we checked</w:t>
-      </w:r>
-      <w:r>
-        <w:rPr>
-          <w:rFonts w:cstheme="minorHAnsi"/>
-        </w:rPr>
-        <w:t xml:space="preserve"> </w:t>
-      </w:r>
-      <w:r>
-        <w:rPr>
-          <w:rFonts w:cstheme="minorHAnsi"/>
-        </w:rPr>
-        <w:t>germination</w:t>
-      </w:r>
-      <w:r>
-        <w:rPr>
-          <w:rFonts w:eastAsia="Times New Roman" w:cstheme="minorHAnsi"/>
-          <w:color w:val="000000"/>
-          <w:lang w:eastAsia="ca-ES"/>
-        </w:rPr>
-        <w:t xml:space="preserve"> </w:t>
-      </w:r>
-      <w:r>
-        <w:rPr>
-          <w:rFonts w:cstheme="minorHAnsi"/>
-        </w:rPr>
-        <w:t xml:space="preserve">every </w:t>
-      </w:r>
-      <w:r>
-        <w:rPr>
-          <w:rFonts w:cstheme="minorHAnsi"/>
-        </w:rPr>
-        <w:t xml:space="preserve">week </w:t>
-      </w:r>
-      <w:r>
-        <w:rPr>
-          <w:rFonts w:cstheme="minorHAnsi"/>
-        </w:rPr>
-        <w:t>until the end of the experiment</w:t>
-      </w:r>
-      <w:r>
-        <w:rPr>
-          <w:rFonts w:cstheme="minorHAnsi"/>
-        </w:rPr>
-        <w:t xml:space="preserve"> (6 weeks)</w:t>
-      </w:r>
-      <w:r>
-        <w:rPr>
-          <w:rFonts w:cstheme="minorHAnsi"/>
-        </w:rPr>
-        <w:t xml:space="preserve">. We removed seeds from the petri dishes once </w:t>
-      </w:r>
-      <w:r>
-        <w:rPr>
-          <w:rFonts w:eastAsia="Times New Roman" w:cstheme="minorHAnsi"/>
-          <w:color w:val="000000"/>
-          <w:lang w:eastAsia="ca-ES"/>
-        </w:rPr>
-        <w:t xml:space="preserve">germination occurred (radicle &gt; 1.5 mm long). At the end of the experiment, we cut open non-germinated seeds under the binocular loupe </w:t>
-      </w:r>
-      <w:proofErr w:type="gramStart"/>
-      <w:r>
-        <w:rPr>
-          <w:rFonts w:eastAsia="Times New Roman" w:cstheme="minorHAnsi"/>
-          <w:color w:val="000000"/>
-          <w:lang w:eastAsia="ca-ES"/>
-        </w:rPr>
-        <w:t>to visually assess</w:t>
-      </w:r>
-      <w:proofErr w:type="gramEnd"/>
-      <w:r>
-        <w:rPr>
-          <w:rFonts w:eastAsia="Times New Roman" w:cstheme="minorHAnsi"/>
-          <w:color w:val="000000"/>
-          <w:lang w:eastAsia="ca-ES"/>
-        </w:rPr>
-        <w:t xml:space="preserve"> if they were empty, infected, or seemed normal. We considered seeds</w:t>
+        <w:t>normal. We considered seeds</w:t>
       </w:r>
       <w:r>
         <w:rPr>
@@ -7915,7 +7976,6 @@
           <w:color w:val="000000"/>
           <w:lang w:eastAsia="ca-ES"/>
         </w:rPr>
-        <w:lastRenderedPageBreak/>
         <w:t>The</w:t>
       </w:r>
       <w:r>
@@ -9201,7 +9261,47 @@
         <w:rPr>
           <w:lang w:eastAsia="ca-ES"/>
         </w:rPr>
-        <w:t xml:space="preserve"> with binomial family. For the other  plant traits (</w:t>
+        <w:t xml:space="preserve"> with binomial family</w:t>
+      </w:r>
+      <w:r>
+        <w:rPr>
+          <w:lang w:eastAsia="ca-ES"/>
+        </w:rPr>
+        <w:t xml:space="preserve">. The log odd ratios gives as information about how much percent is more or less likely for germination to happen in each treatment. In our case, the log odd ratios are mainly negative </w:t>
+      </w:r>
+      <w:proofErr w:type="gramStart"/>
+      <w:r>
+        <w:rPr>
+          <w:lang w:eastAsia="ca-ES"/>
+        </w:rPr>
+        <w:t>due to the fact that</w:t>
+      </w:r>
+      <w:proofErr w:type="gramEnd"/>
+      <w:r>
+        <w:rPr>
+          <w:lang w:eastAsia="ca-ES"/>
+        </w:rPr>
+        <w:t xml:space="preserve"> germination was mainly higher in control treatment. The more negative the log odd ratio the worse the germination in </w:t>
+      </w:r>
+      <w:proofErr w:type="gramStart"/>
+      <w:r>
+        <w:rPr>
+          <w:lang w:eastAsia="ca-ES"/>
+        </w:rPr>
+        <w:t>an</w:t>
+      </w:r>
+      <w:proofErr w:type="gramEnd"/>
+      <w:r>
+        <w:rPr>
+          <w:lang w:eastAsia="ca-ES"/>
+        </w:rPr>
+        <w:t xml:space="preserve"> specific treatment is compared to control</w:t>
+      </w:r>
+      <w:r>
+        <w:rPr>
+          <w:lang w:eastAsia="ca-ES"/>
+        </w:rPr>
+        <w:t>. For the other  plant traits (</w:t>
       </w:r>
       <w:r>
         <w:rPr>
@@ -9213,7 +9313,14 @@
         <w:rPr>
           <w:lang w:eastAsia="ca-ES"/>
         </w:rPr>
-        <w:t>5): seed mass (mg), plant height (cm) and leaf area (mm2) were log transform to maintain normal distribution of the data while LDMC and SLA remained with original scales. For the Mediterranean community one species (</w:t>
+        <w:t xml:space="preserve">5): seed mass (mg), plant height (cm) and leaf area (mm2) were log transform to maintain normal distribution of the data while LDMC and SLA </w:t>
+      </w:r>
+      <w:r>
+        <w:rPr>
+          <w:lang w:eastAsia="ca-ES"/>
+        </w:rPr>
+        <w:lastRenderedPageBreak/>
+        <w:t>remained with original scales. For the Mediterranean community one species (</w:t>
       </w:r>
       <w:proofErr w:type="spellStart"/>
       <w:r>
@@ -9262,14 +9369,7 @@
         <w:rPr>
           <w:lang w:eastAsia="ca-ES"/>
         </w:rPr>
-        <w:t xml:space="preserve"> according to the maximum </w:t>
-      </w:r>
-      <w:r>
-        <w:rPr>
-          <w:lang w:eastAsia="ca-ES"/>
-        </w:rPr>
-        <w:lastRenderedPageBreak/>
-        <w:t>vegetation cover recorded (sum of all species cover)</w:t>
+        <w:t xml:space="preserve"> according to the maximum vegetation cover recorded (sum of all species cover)</w:t>
       </w:r>
       <w:r>
         <w:rPr>
@@ -9629,21 +9729,7 @@
         <w:rPr>
           <w:lang w:eastAsia="ca-ES"/>
         </w:rPr>
-        <w:t xml:space="preserve"> From distance </w:t>
-      </w:r>
-      <w:proofErr w:type="gramStart"/>
-      <w:r>
-        <w:rPr>
-          <w:lang w:eastAsia="ca-ES"/>
-        </w:rPr>
-        <w:t>matrices</w:t>
-      </w:r>
-      <w:proofErr w:type="gramEnd"/>
-      <w:r>
-        <w:rPr>
-          <w:lang w:eastAsia="ca-ES"/>
-        </w:rPr>
-        <w:t xml:space="preserve"> we used the function melodic (</w:t>
+        <w:t xml:space="preserve"> From distance matrices we used the function melodic (</w:t>
       </w:r>
       <w:commentRangeStart w:id="9"/>
       <w:proofErr w:type="spellStart"/>
@@ -9686,16 +9772,68 @@
         <w:rPr>
           <w:lang w:eastAsia="ca-ES"/>
         </w:rPr>
-        <w:t xml:space="preserve"> Dissimilarity (MPD) and </w:t>
-      </w:r>
-      <w:proofErr w:type="spellStart"/>
-      <w:r>
-        <w:rPr>
-          <w:lang w:eastAsia="ca-ES"/>
-        </w:rPr>
-        <w:t>RaoQ</w:t>
-      </w:r>
-      <w:proofErr w:type="spellEnd"/>
+        <w:t xml:space="preserve"> Dissimilarity (MPD</w:t>
+      </w:r>
+      <w:r>
+        <w:rPr>
+          <w:lang w:eastAsia="ca-ES"/>
+        </w:rPr>
+        <w:t xml:space="preserve">, </w:t>
+      </w:r>
+      <w:proofErr w:type="spellStart"/>
+      <w:r>
+        <w:rPr>
+          <w:lang w:eastAsia="ca-ES"/>
+        </w:rPr>
+        <w:t>Wieher</w:t>
+      </w:r>
+      <w:proofErr w:type="spellEnd"/>
+      <w:r>
+        <w:rPr>
+          <w:lang w:eastAsia="ca-ES"/>
+        </w:rPr>
+        <w:t xml:space="preserve"> and </w:t>
+      </w:r>
+      <w:proofErr w:type="spellStart"/>
+      <w:r>
+        <w:rPr>
+          <w:lang w:eastAsia="ca-ES"/>
+        </w:rPr>
+        <w:t>Keddy</w:t>
+      </w:r>
+      <w:proofErr w:type="spellEnd"/>
+      <w:r>
+        <w:rPr>
+          <w:lang w:eastAsia="ca-ES"/>
+        </w:rPr>
+        <w:t xml:space="preserve"> 1995</w:t>
+      </w:r>
+      <w:r>
+        <w:rPr>
+          <w:lang w:eastAsia="ca-ES"/>
+        </w:rPr>
+        <w:t>) and RaoQ</w:t>
+      </w:r>
+      <w:r>
+        <w:rPr>
+          <w:lang w:eastAsia="ca-ES"/>
+        </w:rPr>
+        <w:t xml:space="preserve"> (</w:t>
+      </w:r>
+      <w:proofErr w:type="spellStart"/>
+      <w:r>
+        <w:rPr>
+          <w:lang w:eastAsia="ca-ES"/>
+        </w:rPr>
+        <w:t>Botta-Dukat</w:t>
+      </w:r>
+      <w:proofErr w:type="spellEnd"/>
+      <w:r>
+        <w:rPr>
+          <w:lang w:eastAsia="ca-ES"/>
+        </w:rPr>
+        <w:t>, 2005)</w:t>
+      </w:r>
       <w:r>
         <w:rPr>
           <w:lang w:eastAsia="ca-ES"/>
@@ -9726,21 +9864,7 @@
         <w:rPr>
           <w:lang w:eastAsia="ca-ES"/>
         </w:rPr>
-        <w:t xml:space="preserve">MDP and </w:t>
-      </w:r>
-      <w:proofErr w:type="spellStart"/>
-      <w:r>
-        <w:rPr>
-          <w:lang w:eastAsia="ca-ES"/>
-        </w:rPr>
-        <w:t>RaoQ</w:t>
-      </w:r>
-      <w:proofErr w:type="spellEnd"/>
-      <w:r>
-        <w:rPr>
-          <w:lang w:eastAsia="ca-ES"/>
-        </w:rPr>
-        <w:t xml:space="preserve"> indices</w:t>
+        <w:t>MDP and RaoQ indices</w:t>
       </w:r>
       <w:r>
         <w:rPr>
@@ -9762,26 +9886,6 @@
         </w:rPr>
         <w:t xml:space="preserve"> function (stats package).</w:t>
       </w:r>
-    </w:p>
-    <w:p>
-      <w:pPr>
-        <w:spacing w:line="480" w:lineRule="auto"/>
-        <w:jc w:val="both"/>
-        <w:rPr>
-          <w:lang w:eastAsia="ca-ES"/>
-        </w:rPr>
-      </w:pPr>
-    </w:p>
-    <w:p>
-      <w:pPr>
-        <w:spacing w:line="480" w:lineRule="auto"/>
-        <w:jc w:val="both"/>
-        <w:rPr>
-          <w:rFonts w:eastAsia="Times New Roman" w:cstheme="minorHAnsi"/>
-          <w:color w:val="000000"/>
-          <w:lang w:eastAsia="ca-ES"/>
-        </w:rPr>
-      </w:pPr>
     </w:p>
     <w:p>
       <w:pPr>
@@ -9937,8 +10041,8 @@
       </w:pPr>
       <w:r>
         <w:pict w14:anchorId="36479C7F">
-          <v:shape id="_x0000_i1025" type="#_x0000_t75" style="width:425pt;height:241.8pt">
-            <v:imagedata r:id="rId16" o:title="fig2"/>
+          <v:shape id="_x0000_i1026" type="#_x0000_t75" style="width:425pt;height:241.8pt">
+            <v:imagedata r:id="rId17" o:title="fig2"/>
           </v:shape>
         </w:pict>
       </w:r>
@@ -10028,8 +10132,6 @@
       <w:r>
         <w:t xml:space="preserve">(weighted) </w:t>
       </w:r>
-      <w:bookmarkStart w:id="10" w:name="_GoBack"/>
-      <w:bookmarkEnd w:id="10"/>
       <w:r>
         <w:t>means in response to mi</w:t>
       </w:r>
@@ -10038,6 +10140,108 @@
       </w:r>
       <w:r>
         <w:t>roclimatic gradients</w:t>
+      </w:r>
+    </w:p>
+    <w:p>
+      <w:pPr>
+        <w:pStyle w:val="Ttulo4"/>
+      </w:pPr>
+      <w:r>
+        <w:t>CM results description per community</w:t>
+      </w:r>
+    </w:p>
+    <w:p>
+      <w:pPr>
+        <w:spacing w:line="480" w:lineRule="auto"/>
+        <w:jc w:val="both"/>
+      </w:pPr>
+      <w:r>
+        <w:t xml:space="preserve">In the Mediterranean community, the CM of germination and adult plant traits was significantly changing across microclimatic gradients, mainly across the elevation gradient. Higher elevation plots had marginally higher germination in water stress and significantly higher germination under constant temperatures; on the contrary adult plant traits had lower values of seed mass, plant height, leaf area and LDMC (marginal). Additionally we also found that colder sites (higher FDD) has lower SLA, warmer sites (higher GDD) had higher seed mass and snowy sites had marginally higher plant height. </w:t>
+      </w:r>
+    </w:p>
+    <w:p>
+      <w:pPr>
+        <w:spacing w:line="480" w:lineRule="auto"/>
+        <w:ind w:firstLine="709"/>
+        <w:jc w:val="both"/>
+      </w:pPr>
+      <w:r>
+        <w:t>In the Temperate community, the CM of germination and adult plant traits was also significantly changing across microclimatic gradients. Higher elevation plots had higher germination under water stress and constant temperatures (concordant with the results obtained in the Mediterranean community)</w:t>
+      </w:r>
+      <w:r>
+        <w:t>, and showed higher values of seed mass and SLA (opposite pattern in the Mediterranean community)</w:t>
+      </w:r>
+      <w:r>
+        <w:t xml:space="preserve">. Warmer sites also showed </w:t>
+      </w:r>
+      <w:r>
+        <w:t xml:space="preserve">lower germination in darkness, while also showing higher plant height, leaf area and LDMC. Colder sites showed lower leaf area and SLA. </w:t>
+      </w:r>
+    </w:p>
+    <w:p>
+      <w:pPr>
+        <w:pStyle w:val="Ttulo4"/>
+      </w:pPr>
+      <w:r>
+        <w:t>CWM results description per community</w:t>
+      </w:r>
+    </w:p>
+    <w:p>
+      <w:pPr>
+        <w:spacing w:line="480" w:lineRule="auto"/>
+        <w:jc w:val="both"/>
+      </w:pPr>
+      <w:r>
+        <w:t xml:space="preserve">In the Mediterranean community, </w:t>
+      </w:r>
+      <w:r>
+        <w:t>the CWM</w:t>
+      </w:r>
+      <w:r>
+        <w:t xml:space="preserve"> of germination and adult plant traits </w:t>
+      </w:r>
+      <w:r>
+        <w:t>was</w:t>
+      </w:r>
+      <w:r>
+        <w:t xml:space="preserve"> significantly changing across microclimatic gradients</w:t>
+      </w:r>
+      <w:r>
+        <w:t xml:space="preserve"> measured ad elevation, GDD and snow</w:t>
+      </w:r>
+      <w:r>
+        <w:t xml:space="preserve">. Sites with more snow cover had lower germination in darkness, water stress and constant temperatures. On the other hand warmer sites (i.e. higher GDD) showed better germination in darkness and higher elevation plots showed better germination under water stress and in constant temperatures. Interestingly, </w:t>
+      </w:r>
+      <w:r>
+        <w:t xml:space="preserve">the CWM of </w:t>
+      </w:r>
+      <w:r>
+        <w:t xml:space="preserve">adult plant traits showed significant responses to the same microclimatic gradients but in in the opposite direction. Sites with more snow cover showed higher values of seed mass and plant height. Warmer sites (higher GDD) </w:t>
+      </w:r>
+      <w:r>
+        <w:lastRenderedPageBreak/>
+        <w:t xml:space="preserve">showed lower </w:t>
+      </w:r>
+      <w:r>
+        <w:t xml:space="preserve">seed mass, lower plant height and lower leaf area while plots in lower elevations showed lower SLA values. </w:t>
+      </w:r>
+    </w:p>
+    <w:p>
+      <w:pPr>
+        <w:spacing w:line="480" w:lineRule="auto"/>
+        <w:ind w:firstLine="709"/>
+        <w:jc w:val="both"/>
+      </w:pPr>
+      <w:r>
+        <w:t xml:space="preserve">In the temperate community, the community weighted mean of germination and adult plant traits were changing significantly mainly across GDD gradients. Germination traits only showed one significant relationship with warmer sites having worse germination in darkness (contrary to what we observed in the Mediterranean community, probably due to the distinct and particular environmental limitations each community has). Here again we observed that adult plant traits responses to microclimatic gradients were found significant mostly in the opposite direction. Warmer sites </w:t>
+      </w:r>
+      <w:proofErr w:type="gramStart"/>
+      <w:r>
+        <w:t>were observed</w:t>
+      </w:r>
+      <w:proofErr w:type="gramEnd"/>
+      <w:r>
+        <w:t xml:space="preserve"> to have higher plant height, LDMC but lower SLA. Higher altitude plots only showed a significant positive relationship with seed mass, i.e. the higher the plot the higher the seed mass CMW. </w:t>
       </w:r>
     </w:p>
     <w:p>
@@ -10046,15 +10250,40 @@
         <w:spacing w:line="480" w:lineRule="auto"/>
         <w:jc w:val="both"/>
       </w:pPr>
+      <w:r>
+        <w:t xml:space="preserve">3.3 Germination niche dissimilarity </w:t>
+      </w:r>
     </w:p>
     <w:p>
       <w:pPr>
-        <w:pStyle w:val="Ttulo3"/>
         <w:spacing w:line="480" w:lineRule="auto"/>
         <w:jc w:val="both"/>
       </w:pPr>
-      <w:r>
-        <w:t xml:space="preserve">3.3 Germination niche dissimilarity </w:t>
+      <w:proofErr w:type="gramStart"/>
+      <w:r>
+        <w:t>We use two functional diversity indices of divergence</w:t>
+      </w:r>
+      <w:r>
+        <w:t xml:space="preserve"> (MPD and RaoQ)</w:t>
+      </w:r>
+      <w:r>
+        <w:t xml:space="preserve"> and calculated their values with presence/absence data as well as with species abundances.</w:t>
+      </w:r>
+      <w:proofErr w:type="gramEnd"/>
+      <w:r>
+        <w:t xml:space="preserve">  Both methods </w:t>
+      </w:r>
+      <w:r>
+        <w:t xml:space="preserve">in both indices </w:t>
+      </w:r>
+      <w:r>
+        <w:t xml:space="preserve">showed similar and consistent </w:t>
+      </w:r>
+      <w:r>
+        <w:t>patterns</w:t>
+      </w:r>
+      <w:r>
+        <w:t xml:space="preserve">. </w:t>
       </w:r>
     </w:p>
     <w:p>
@@ -10062,20 +10291,225 @@
         <w:spacing w:line="480" w:lineRule="auto"/>
         <w:jc w:val="both"/>
       </w:pPr>
+      <w:r>
+        <w:t>In Mediterranean community, germination MDP</w:t>
+      </w:r>
+      <w:r>
+        <w:t xml:space="preserve"> (ab)</w:t>
+      </w:r>
+      <w:r>
+        <w:t xml:space="preserve"> ranges from </w:t>
+      </w:r>
+      <w:r>
+        <w:t>0.27</w:t>
+      </w:r>
+      <w:r>
+        <w:t xml:space="preserve"> to </w:t>
+      </w:r>
+      <w:r>
+        <w:t xml:space="preserve">0.751 </w:t>
+      </w:r>
+      <w:r>
+        <w:t>while adult plant MDP</w:t>
+      </w:r>
+      <w:r>
+        <w:t xml:space="preserve"> </w:t>
+      </w:r>
+      <w:r>
+        <w:t>(ab)</w:t>
+      </w:r>
+      <w:r>
+        <w:t xml:space="preserve"> ranges from </w:t>
+      </w:r>
+      <w:r>
+        <w:t xml:space="preserve">0.084 </w:t>
+      </w:r>
+      <w:r>
+        <w:t xml:space="preserve">to </w:t>
+      </w:r>
+      <w:r>
+        <w:t>0.51</w:t>
+      </w:r>
+      <w:r>
+        <w:t xml:space="preserve">. Germination RaoQ </w:t>
+      </w:r>
+      <w:r>
+        <w:t xml:space="preserve">(ab) </w:t>
+      </w:r>
+      <w:r>
+        <w:t xml:space="preserve">ranges from </w:t>
+      </w:r>
+      <w:r>
+        <w:t>0.02</w:t>
+      </w:r>
+      <w:r>
+        <w:t xml:space="preserve"> to </w:t>
+      </w:r>
+      <w:r>
+        <w:t>0.449</w:t>
+      </w:r>
+      <w:r>
+        <w:t xml:space="preserve"> while adult plant RaoQ </w:t>
+      </w:r>
+      <w:r>
+        <w:t xml:space="preserve">(ab) </w:t>
+      </w:r>
+      <w:r>
+        <w:t xml:space="preserve">ranges from </w:t>
+      </w:r>
+      <w:r>
+        <w:t>0.03</w:t>
+      </w:r>
+      <w:r>
+        <w:t xml:space="preserve"> to </w:t>
+      </w:r>
+      <w:r>
+        <w:t>0.259</w:t>
+      </w:r>
+      <w:r>
+        <w:t xml:space="preserve">. In the Temperate community, </w:t>
+      </w:r>
+      <w:r>
+        <w:t xml:space="preserve">germination MDP </w:t>
+      </w:r>
+      <w:r>
+        <w:t xml:space="preserve">(ab) </w:t>
+      </w:r>
+      <w:r>
+        <w:t xml:space="preserve">ranges from </w:t>
+      </w:r>
+      <w:r>
+        <w:t>0.098</w:t>
+      </w:r>
+      <w:r>
+        <w:t xml:space="preserve"> to </w:t>
+      </w:r>
+      <w:r>
+        <w:t>0.506</w:t>
+      </w:r>
+      <w:r>
+        <w:t xml:space="preserve"> while adult plant MDP </w:t>
+      </w:r>
+      <w:r>
+        <w:t xml:space="preserve">(ab) </w:t>
+      </w:r>
+      <w:r>
+        <w:t xml:space="preserve">ranges from </w:t>
+      </w:r>
+      <w:r>
+        <w:t>0.145</w:t>
+      </w:r>
+      <w:r>
+        <w:t xml:space="preserve"> to </w:t>
+      </w:r>
+      <w:r>
+        <w:t>0.468</w:t>
+      </w:r>
+      <w:r>
+        <w:t xml:space="preserve">. Germination RaoQ </w:t>
+      </w:r>
+      <w:r>
+        <w:t xml:space="preserve">(ab) </w:t>
+      </w:r>
+      <w:r>
+        <w:t xml:space="preserve">ranges from </w:t>
+      </w:r>
+      <w:r>
+        <w:t>0.068</w:t>
+      </w:r>
+      <w:r>
+        <w:t xml:space="preserve"> to </w:t>
+      </w:r>
+      <w:r>
+        <w:t>0.347</w:t>
+      </w:r>
+      <w:r>
+        <w:t xml:space="preserve"> while adult plant RaoQ </w:t>
+      </w:r>
+      <w:r>
+        <w:t xml:space="preserve">(ab) </w:t>
+      </w:r>
+      <w:r>
+        <w:t xml:space="preserve">ranges from </w:t>
+      </w:r>
+      <w:r>
+        <w:t>0.065</w:t>
+      </w:r>
+      <w:r>
+        <w:t xml:space="preserve"> to </w:t>
+      </w:r>
+      <w:r>
+        <w:t>0.306</w:t>
+      </w:r>
+      <w:r>
+        <w:t>.</w:t>
+      </w:r>
+      <w:r>
+        <w:t xml:space="preserve"> Functional diversity is significantly higher in the germination traits compared to adult plant traits</w:t>
+      </w:r>
+      <w:r>
+        <w:t xml:space="preserve"> in the Mediterranean community</w:t>
+      </w:r>
+      <w:r>
+        <w:t xml:space="preserve">, </w:t>
+      </w:r>
+      <w:bookmarkStart w:id="10" w:name="_GoBack"/>
+      <w:bookmarkEnd w:id="10"/>
+      <w:r>
+        <w:t xml:space="preserve">considering </w:t>
+      </w:r>
+      <w:r>
+        <w:t xml:space="preserve">both </w:t>
+      </w:r>
+      <w:r>
+        <w:t>abundance and presence absence data. In the temperate community, although consistent trend of germination dissimilarity being higher than adult plant dissimilarity comparison is only significant with presence/absence data.</w:t>
+      </w:r>
+      <w:r>
+        <w:t xml:space="preserve"> </w:t>
+      </w:r>
     </w:p>
     <w:p>
       <w:pPr>
         <w:spacing w:line="480" w:lineRule="auto"/>
         <w:jc w:val="both"/>
-        <w:rPr>
-          <w:color w:val="FF0000"/>
-        </w:rPr>
-      </w:pPr>
-      <w:r>
-        <w:rPr>
-          <w:color w:val="FF0000"/>
-        </w:rPr>
-        <w:t>LIMITATIONs</w:t>
+      </w:pPr>
+      <w:r>
+        <w:lastRenderedPageBreak/>
+        <w:t>We observe that functional diversity</w:t>
+      </w:r>
+      <w:r>
+        <w:t xml:space="preserve"> divergence indices</w:t>
+      </w:r>
+      <w:r>
+        <w:t xml:space="preserve"> i.e. niche dissimilarity</w:t>
+      </w:r>
+      <w:r>
+        <w:t xml:space="preserve"> significantly differ across the microclimatic gradients present in our communities, what is more germination and adult plant niche dissimilarity show opposite responses to microclimatic gradient, if one is increasing the other is decreasing</w:t>
+      </w:r>
+      <w:r>
+        <w:t xml:space="preserve"> (consistent patterns in both indices)</w:t>
+      </w:r>
+      <w:r>
+        <w:t>.</w:t>
+      </w:r>
+      <w:r>
+        <w:t xml:space="preserve"> In the Mediterranean community, with higher </w:t>
+      </w:r>
+      <w:proofErr w:type="gramStart"/>
+      <w:r>
+        <w:t>elevation germination niche dissimilarity</w:t>
+      </w:r>
+      <w:proofErr w:type="gramEnd"/>
+      <w:r>
+        <w:t xml:space="preserve"> (RaoQ) decreases while adult plant dissimilarity (MDP) increases. In warmer plots (higher </w:t>
+      </w:r>
+      <w:proofErr w:type="gramStart"/>
+      <w:r>
+        <w:t>GDD)</w:t>
+      </w:r>
+      <w:proofErr w:type="gramEnd"/>
+      <w:r>
+        <w:t xml:space="preserve"> que observe an increase in dissimilarity (RaoQ) but only in adult plant traits. Snowy plots show a marginally significant increase of germination dissimilarity, while also showing a significant decrease in adult plant dissimilarity (both MPD and RaoQ).  In the temperate community, the only microclimatic gradient we found that was significantly affecting niche dissimilarity was GDD. Warmer plots showed a decrease in germination dissimilarity (MPD) and an increase in adult plant dissimilarity (both MPD and RaoQ).</w:t>
       </w:r>
     </w:p>
     <w:p>
@@ -10083,30 +10517,98 @@
         <w:spacing w:line="480" w:lineRule="auto"/>
         <w:jc w:val="both"/>
       </w:pPr>
-      <w:proofErr w:type="spellStart"/>
+      <w:r>
+        <w:t xml:space="preserve">It is also worth mentioning that while richness </w:t>
+      </w:r>
       <w:proofErr w:type="gramStart"/>
       <w:r>
-        <w:t>iButtons</w:t>
-      </w:r>
-      <w:proofErr w:type="spellEnd"/>
+        <w:t>was not clearly correlated</w:t>
+      </w:r>
       <w:proofErr w:type="gramEnd"/>
       <w:r>
-        <w:t xml:space="preserve"> recording period from different years! However</w:t>
-      </w:r>
-      <w:r>
-        <w:t>,</w:t>
-      </w:r>
-      <w:r>
-        <w:t xml:space="preserve"> we are not comparing it, only using it to calculate species realized niche (optimal adult conditions)</w:t>
-      </w:r>
-      <w:r>
-        <w:t xml:space="preserve"> and as response variable to CM, CWM and FD patterns. </w:t>
+        <w:t xml:space="preserve"> with any of our microclimatic gradients, it does seems to be at least partially correlated with functional diversity indices. Especially with RaoQ indices from adult plant traits. </w:t>
+      </w:r>
+      <w:r>
+        <w:rPr>
+          <w:highlight w:val="yellow"/>
+        </w:rPr>
+        <w:t>More in discussion.</w:t>
       </w:r>
     </w:p>
     <w:p>
       <w:pPr>
         <w:spacing w:line="480" w:lineRule="auto"/>
         <w:jc w:val="both"/>
+        <w:rPr>
+          <w:color w:val="FF0000"/>
+        </w:rPr>
+      </w:pPr>
+      <w:r>
+        <w:rPr>
+          <w:color w:val="FF0000"/>
+        </w:rPr>
+        <w:t>DISCUSSION</w:t>
+      </w:r>
+    </w:p>
+    <w:p>
+      <w:pPr>
+        <w:spacing w:line="480" w:lineRule="auto"/>
+        <w:jc w:val="both"/>
+        <w:rPr>
+          <w:color w:val="FF0000"/>
+        </w:rPr>
+      </w:pPr>
+      <w:r>
+        <w:rPr>
+          <w:color w:val="FF0000"/>
+        </w:rPr>
+        <w:t>Richness as driver of functional diversity indices (especially RaoQ)</w:t>
+      </w:r>
+    </w:p>
+    <w:p>
+      <w:pPr>
+        <w:spacing w:line="480" w:lineRule="auto"/>
+        <w:jc w:val="both"/>
+        <w:rPr>
+          <w:color w:val="FF0000"/>
+        </w:rPr>
+      </w:pPr>
+      <w:r>
+        <w:rPr>
+          <w:color w:val="FF0000"/>
+        </w:rPr>
+        <w:t>LIMITATIONs</w:t>
+      </w:r>
+    </w:p>
+    <w:p>
+      <w:pPr>
+        <w:spacing w:line="480" w:lineRule="auto"/>
+        <w:jc w:val="both"/>
+      </w:pPr>
+      <w:proofErr w:type="spellStart"/>
+      <w:proofErr w:type="gramStart"/>
+      <w:r>
+        <w:t>iButtons</w:t>
+      </w:r>
+      <w:proofErr w:type="spellEnd"/>
+      <w:proofErr w:type="gramEnd"/>
+      <w:r>
+        <w:t xml:space="preserve"> recording period from different years! However</w:t>
+      </w:r>
+      <w:r>
+        <w:t>,</w:t>
+      </w:r>
+      <w:r>
+        <w:t xml:space="preserve"> we are not comparing it, only using it to calculate species realized niche (optimal adult conditions)</w:t>
+      </w:r>
+      <w:r>
+        <w:t xml:space="preserve"> and as response variable to CM, CWM and FD patterns. </w:t>
+      </w:r>
+    </w:p>
+    <w:p>
+      <w:pPr>
+        <w:spacing w:line="480" w:lineRule="auto"/>
+        <w:jc w:val="both"/>
       </w:pPr>
       <w:r>
         <w:t xml:space="preserve">Different </w:t>
@@ -10127,7 +10629,7 @@
       </w:r>
     </w:p>
     <w:sectPr>
-      <w:footerReference w:type="default" r:id="rId17"/>
+      <w:footerReference w:type="default" r:id="rId18"/>
       <w:pgSz w:w="11906" w:h="16838"/>
       <w:pgMar w:top="1417" w:right="1701" w:bottom="1417" w:left="1701" w:header="708" w:footer="708" w:gutter="0"/>
       <w:lnNumType w:countBy="1" w:restart="continuous"/>
@@ -10531,16 +11033,7 @@
           <w:color w:val="FFFFFF"/>
           <w:bdr w:val="none" w:sz="0" w:space="0" w:color="auto" w:frame="1"/>
         </w:rPr>
-        <w:t xml:space="preserve">  </w:t>
-      </w:r>
-      <w:r>
-        <w:rPr>
-          <w:rStyle w:val="gntyacmba4b"/>
-          <w:rFonts w:ascii="Lucida Sans Typewriter" w:eastAsiaTheme="majorEastAsia" w:hAnsi="Lucida Sans Typewriter"/>
-          <w:color w:val="FFFFFF"/>
-          <w:bdr w:val="none" w:sz="0" w:space="0" w:color="auto" w:frame="1"/>
-        </w:rPr>
-        <w:t xml:space="preserve">Thomas </w:t>
+        <w:t xml:space="preserve">  Thomas </w:t>
       </w:r>
       <w:proofErr w:type="spellStart"/>
       <w:r>
@@ -11414,6 +11907,7 @@
         <w:docPartUnique/>
       </w:docPartObj>
     </w:sdtPr>
+    <w:sdtEndPr/>
     <w:sdtContent>
       <w:p>
         <w:pPr>
@@ -11434,7 +11928,7 @@
             <w:noProof/>
             <w:lang w:val="es-ES"/>
           </w:rPr>
-          <w:t>14</w:t>
+          <w:t>15</w:t>
         </w:r>
         <w:r>
           <w:fldChar w:fldCharType="end"/>
@@ -17368,6 +17862,18 @@
 </a:theme>
 </file>
 
+<file path=customXml/item1.xml><?xml version="1.0" encoding="utf-8"?>
+<b:Sources xmlns:b="http://schemas.openxmlformats.org/officeDocument/2006/bibliography" xmlns="http://schemas.openxmlformats.org/officeDocument/2006/bibliography" SelectedStyle="\APASixthEditionOfficeOnline.xsl" StyleName="APA" Version="6"/>
+</file>
+
+<file path=customXml/itemProps1.xml><?xml version="1.0" encoding="utf-8"?>
+<ds:datastoreItem xmlns:ds="http://schemas.openxmlformats.org/officeDocument/2006/customXml" ds:itemID="{9899D2CE-C1BD-48D1-8CF3-EE136C919655}">
+  <ds:schemaRefs>
+    <ds:schemaRef ds:uri="http://schemas.openxmlformats.org/officeDocument/2006/bibliography"/>
+  </ds:schemaRefs>
+</ds:datastoreItem>
+</file>
+
 <file path=docMetadata/LabelInfo.xml><?xml version="1.0" encoding="utf-8"?>
 <clbl:labelList xmlns:clbl="http://schemas.microsoft.com/office/2020/mipLabelMetadata">
   <clbl:label id="{05ea74a3-92c5-4c31-978a-925c3c799cd0}" enabled="0" method="" siteId="{05ea74a3-92c5-4c31-978a-925c3c799cd0}" removed="1"/>

</xml_diff>